<commit_message>
Completa il commit precedente con tutte le modifiche
Il commit 4e14176 conteneva solo la rimozione del logo segnaposto: qui
arrivano le modifiche descritte nel suo messaggio (nuova architettura di
Hall of Fame, Annuario Storico, Archivio e PDF; restyling della home).

Co-Authored-By: Claude Opus 5.5 <noreply@anthropic.com>
</commit_message>
<xml_diff>
--- a/ADMIN_GUIDE.docx
+++ b/ADMIN_GUIDE.docx
@@ -97,7 +97,7 @@
           <w:sz w:val="21"/>
           <w:szCs w:val="21"/>
         </w:rPr>
-        <w:t xml:space="preserve">Ogni volta che qualcuno invia una foto dal sito (Hall of Fame o Annuario Storico), vengono salvate due cose separate:</w:t>
+        <w:t xml:space="preserve">Ogni volta che qualcuno invia una foto dal sito (Hall of Fame, Annuario Storico o Archivio), vengono salvate due cose separate:</w:t>
       </w:r>
     </w:p>
     <w:p>
@@ -133,20 +133,20 @@
           <w:sz w:val="21"/>
           <w:szCs w:val="21"/>
         </w:rPr>
-        <w:t xml:space="preserve">I dati (nome/i, didascalia, tipo singola/gruppo, facoltà, sezione, stato di approvazione, data) → su Vercel Postgres (il database), tabella hall_of_fame_entries.</w:t>
-      </w:r>
-    </w:p>
-    <w:p>
-      <w:pPr>
-        <w:spacing w:after="150"/>
-      </w:pPr>
-      <w:r>
-        <w:rPr>
-          <w:color w:val="12161F"/>
-          <w:sz w:val="21"/>
-          <w:szCs w:val="21"/>
-        </w:rPr>
-        <w:t xml:space="preserve">L'indirizzo email di chi invia la foto NON viene mai salvato da nessuna parte: serve solo per controllare al volo che finisca con @unipi.it o @studenti.unipi.it, poi viene scartato.</w:t>
+        <w:t xml:space="preserve">I dati (nome/i, facoltà, sezione, stato di approvazione, data; per l'Archivio anche tipo singola/gruppo, frase o didascalia e anno dell'edizione) → su Vercel Postgres (il database), tabella hall_of_fame_entries.</w:t>
+      </w:r>
+    </w:p>
+    <w:p>
+      <w:pPr>
+        <w:spacing w:after="150"/>
+      </w:pPr>
+      <w:r>
+        <w:rPr>
+          <w:color w:val="12161F"/>
+          <w:sz w:val="21"/>
+          <w:szCs w:val="21"/>
+        </w:rPr>
+        <w:t xml:space="preserve">L'indirizzo email di chi invia la foto NON viene mai salvato: serve solo per controllare che finisca con @unipi.it o @studenti.unipi.it. Solo per le foto dell'Archivio si conserva un'impronta cifrata e non reversibile (colonna submitter_hash), che serve a far rispettare il limite di 1 foto singola e 3 di gruppo a persona per edizione.</w:t>
       </w:r>
     </w:p>
     <w:p>
@@ -216,7 +216,7 @@
           <w:sz w:val="21"/>
           <w:szCs w:val="21"/>
         </w:rPr>
-        <w:t xml:space="preserve">Si apre una pagina nel browser (Drizzle Studio) collegata al database vero. Apri la tabella hall_of_fame_entries: qui vedi tutte le schede, con il link diretto a ogni immagine nella colonna imageUrl.</w:t>
+        <w:t xml:space="preserve">Si apre una pagina nel browser (Drizzle Studio) collegata al database vero. Apri la tabella hall_of_fame_entries: qui vedi tutte le schede, con il link diretto a ogni immagine nella colonna image_url e la sezione di provenienza nella colonna section.</w:t>
       </w:r>
     </w:p>
     <w:p>
@@ -234,7 +234,7 @@
           <w:sz w:val="21"/>
           <w:szCs w:val="21"/>
         </w:rPr>
-        <w:t xml:space="preserve">Per scaricare le foto: apri ogni imageUrl nel browser e salva l'immagine, oppure copia i link e usali in un secondo momento per un download automatico.</w:t>
+        <w:t xml:space="preserve">Per scaricare le foto: apri ogni image_url nel browser e salva l'immagine, oppure copia i link e usali in un secondo momento per un download automatico.</w:t>
       </w:r>
     </w:p>
     <w:tbl>
@@ -319,7 +319,7 @@
           <w:sz w:val="21"/>
           <w:szCs w:val="21"/>
         </w:rPr>
-        <w:t xml:space="preserve">Ogni foto inviata nasce con stato PENDING (in attesa): non è visibile a nessuno sul sito pubblico finché non viene approvata a mano.</w:t>
+        <w:t xml:space="preserve">Ogni foto inviata nasce con stato PENDING (in attesa): non viene usata finché non la approvi a mano. Le foto di Hall of Fame e Annuario Storico, una volta approvate, compaiono nelle gallerie del sito; quelle dell'Archivio (section = ARCHIVIO) non compaiono sul sito ma finiscono nel PDF dell'edizione.</w:t>
       </w:r>
     </w:p>
     <w:p>
@@ -373,7 +373,7 @@
           <w:sz w:val="21"/>
           <w:szCs w:val="21"/>
         </w:rPr>
-        <w:t xml:space="preserve">Trova la riga della foto da approvare (puoi riconoscerla dal nome/didascalia, oppure ordina per data).</w:t>
+        <w:t xml:space="preserve">Trova la riga della foto da approvare (puoi riconoscerla dal nome o dalla sezione, oppure ordina per data).</w:t>
       </w:r>
     </w:p>
     <w:p>
@@ -409,7 +409,7 @@
           <w:sz w:val="21"/>
           <w:szCs w:val="21"/>
         </w:rPr>
-        <w:t xml:space="preserve">Salva. Entro 15 secondi la foto compare da sola sul sito (la pagina si aggiorna automaticamente), senza bisogno di rifare il deploy.</w:t>
+        <w:t xml:space="preserve">Salva. Le foto delle gallerie compaiono da sole sul sito entro 15 secondi, senza rifare il deploy. Quelle dell'Archivio entreranno nel PDF alla prossima generazione (vedi punto 5).</w:t>
       </w:r>
     </w:p>
     <w:tbl>
@@ -495,20 +495,20 @@
           <w:sz w:val="30"/>
           <w:szCs w:val="30"/>
         </w:rPr>
-        <w:t xml:space="preserve">3. Passare da "Invia la tua foto" a "Scarica l'edizione"</w:t>
-      </w:r>
-    </w:p>
-    <w:p>
-      <w:pPr>
-        <w:spacing w:after="150"/>
-      </w:pPr>
-      <w:r>
-        <w:rPr>
-          <w:color w:val="12161F"/>
-          <w:sz w:val="21"/>
-          <w:szCs w:val="21"/>
-        </w:rPr>
-        <w:t xml:space="preserve">Il box nella Home che mostra questo pulsante si comporta in automatico, in base alle date che imposti tu. Il file da modificare è:</w:t>
+        <w:t xml:space="preserve">3. Aprire e chiudere gli invii per l'annuario</w:t>
+      </w:r>
+    </w:p>
+    <w:p>
+      <w:pPr>
+        <w:spacing w:after="150"/>
+      </w:pPr>
+      <w:r>
+        <w:rPr>
+          <w:color w:val="12161F"/>
+          <w:sz w:val="21"/>
+          <w:szCs w:val="21"/>
+        </w:rPr>
+        <w:t xml:space="preserve">Le foto per l'annuario dell'anno si mandano dalla pagina Archivio. Gli invii si aprono e si chiudono in automatico in base alle date che imposti tu, e la barra in fondo alla foto della Home cambia da sola ("Invia la tua foto" oppure "Sfoglia l'Annuario"). Il file da modificare è:</w:t>
       </w:r>
     </w:p>
     <w:tbl>
@@ -585,7 +585,7 @@
           <w:sz w:val="21"/>
           <w:szCs w:val="21"/>
         </w:rPr>
-        <w:t xml:space="preserve">Lascia forceSubmissionOpen impostato su null e modifica solo le due date:</w:t>
+        <w:t xml:space="preserve">Lascia forceSubmissionOpen impostato su null e aggiorna l'anno dell'edizione (year) e le due date:</w:t>
       </w:r>
     </w:p>
     <w:p>
@@ -634,7 +634,7 @@
           <w:sz w:val="21"/>
           <w:szCs w:val="21"/>
         </w:rPr>
-        <w:t xml:space="preserve">Superata la data di chiusura, il pulsante cambia da solo in "Scarica l'annuario di quest'anno", senza bisogno di intervenire di nuovo.</w:t>
+        <w:t xml:space="preserve">Superata la data di chiusura, il modulo sparisce dall'Archivio e la Home invita a sfogliare l'Annuario, senza bisogno di intervenire di nuovo.</w:t>
       </w:r>
     </w:p>
     <w:p>
@@ -681,7 +681,7 @@
           <w:sz w:val="21"/>
           <w:szCs w:val="21"/>
         </w:rPr>
-        <w:t xml:space="preserve">true → forza sempre il pulsante "Invia la tua foto", anche se le date dicono il contrario</w:t>
+        <w:t xml:space="preserve">true → invii sempre aperti, anche se le date dicono il contrario</w:t>
       </w:r>
     </w:p>
     <w:p>
@@ -699,7 +699,7 @@
           <w:sz w:val="21"/>
           <w:szCs w:val="21"/>
         </w:rPr>
-        <w:t xml:space="preserve">false → forza sempre il pulsante "Scarica l'annuario"</w:t>
+        <w:t xml:space="preserve">false → invii sempre chiusi</w:t>
       </w:r>
     </w:p>
     <w:p>
@@ -733,20 +733,20 @@
           <w:sz w:val="24"/>
           <w:szCs w:val="24"/>
         </w:rPr>
-        <w:t xml:space="preserve">Testo e link del pulsante di download</w:t>
-      </w:r>
-    </w:p>
-    <w:p>
-      <w:pPr>
-        <w:spacing w:after="150"/>
-      </w:pPr>
-      <w:r>
-        <w:rPr>
-          <w:color w:val="12161F"/>
-          <w:sz w:val="21"/>
-          <w:szCs w:val="21"/>
-        </w:rPr>
-        <w:t xml:space="preserve">Sempre nello stesso file, il campo pdfUrl indica quale PDF viene scaricato quando il pulsante è in modalità "Download". Deve puntare a un file dentro public/pdf/ (es. "/pdf/annuario-del-pn-2026.pdf") — il nome scritto qui deve corrispondere esattamente al nome del file caricato in quella cartella.</w:t>
+        <w:t xml:space="preserve">Limite di invii per persona</w:t>
+      </w:r>
+    </w:p>
+    <w:p>
+      <w:pPr>
+        <w:spacing w:after="150"/>
+      </w:pPr>
+      <w:r>
+        <w:rPr>
+          <w:color w:val="12161F"/>
+          <w:sz w:val="21"/>
+          <w:szCs w:val="21"/>
+        </w:rPr>
+        <w:t xml:space="preserve">Sempre nello stesso file, maxSinglePerPerson e maxGroupPerPerson stabiliscono quante foto singole (1) e di gruppo (3) può mandare ogni persona per edizione. I PDF si scaricano solo dall'Archivio: per pubblicarne uno vedi "Aggiungere un'edizione all'Archivio" al punto 4.</w:t>
       </w:r>
     </w:p>
     <w:p>
@@ -971,20 +971,20 @@
           <w:sz w:val="24"/>
           <w:szCs w:val="24"/>
         </w:rPr>
-        <w:t xml:space="preserve">Aggiungere un'edizione passata all'Archivio</w:t>
-      </w:r>
-    </w:p>
-    <w:p>
-      <w:pPr>
-        <w:spacing w:after="150"/>
-      </w:pPr>
-      <w:r>
-        <w:rPr>
-          <w:color w:val="12161F"/>
-          <w:sz w:val="21"/>
-          <w:szCs w:val="21"/>
-        </w:rPr>
-        <w:t xml:space="preserve">File: src/config/editions.ts — aggiungi un nuovo elemento all'elenco con year, title, pdfUrl e coverImageUrl. Il PDF va messo in public/pdf/, la copertina in public/images/copertine/, con nomi file corrispondenti esattamente a quelli scritti nella config.</w:t>
+        <w:t xml:space="preserve">Aggiungere un'edizione all'Archivio</w:t>
+      </w:r>
+    </w:p>
+    <w:p>
+      <w:pPr>
+        <w:spacing w:after="150"/>
+      </w:pPr>
+      <w:r>
+        <w:rPr>
+          <w:color w:val="12161F"/>
+          <w:sz w:val="21"/>
+          <w:szCs w:val="21"/>
+        </w:rPr>
+        <w:t xml:space="preserve">File: src/config/editions.ts — aggiungi un nuovo elemento all'elenco con year, title, pdfUrl e coverImageUrl. Il PDF (per esempio quello generato al punto 5) va messo in public/pdf/, la copertina in public/images/copertine/, con nomi file corrispondenti esattamente a quelli scritti nella config. L'Archivio è l'unico punto del sito da cui si scaricano i PDF.</w:t>
       </w:r>
     </w:p>
     <w:p>
@@ -1065,7 +1065,7 @@
           <w:sz w:val="21"/>
           <w:szCs w:val="21"/>
         </w:rPr>
-        <w:t xml:space="preserve">Se hai aggiunto o modificato colonne del database (es. nuovi campi nel form), ricordati di eseguire npm run db:push prima che le modifiche funzionino online.</w:t>
+        <w:t xml:space="preserve">Se servono modifiche alla struttura del database (es. nuovi campi nel modulo), vanno applicate prima che il sito aggiornato funzioni online. Attenzione: con la versione attuale di drizzle-kit il comando npm run db:push si blocca su questo database (prova a cancellare vincoli esistenti): le modifiche vanno applicate a mano, con istruzioni SQL mirate.</w:t>
       </w:r>
     </w:p>
     <w:p>
@@ -1120,7 +1120,7 @@
           <w:sz w:val="21"/>
           <w:szCs w:val="21"/>
         </w:rPr>
-        <w:t xml:space="preserve">Uno script raccoglie in automatico tutte le foto APPROVATE, le ordina per cognome e genera un PDF con lo stesso stile a griglia dell'edizione storica (foto, icona della facoltà o badge "Gruppo" in alto a destra, nome e didascalia sotto).</w:t>
+        <w:t xml:space="preserve">Uno script raccoglie tutte le foto APPROVATE inviate dall'Archivio per un'edizione e genera il PDF con lo stesso template della prima edizione: copertina, pagina con premessa e legenda delle facoltà, foto singole in griglia 3×3 ordinate per cognome (foto, icona della facoltà, nome e frase) e foto di gruppo con la didascalia. Hall of Fame e Annuario Storico non hanno un PDF.</w:t>
       </w:r>
     </w:p>
     <w:p>
@@ -1174,7 +1174,7 @@
           <w:sz w:val="21"/>
           <w:szCs w:val="21"/>
         </w:rPr>
-        <w:t xml:space="preserve">Il file viene creato in output/annuario-hall_of_fame-2026.pdf (il nome cambia con l'anno configurato in current-edition.ts).</w:t>
+        <w:t xml:space="preserve">Il file viene creato in output/annuario-del-pn-&lt;anno&gt;.pdf, con l'anno configurato in current-edition.ts. Per un altro anno: npm run generate:pdf -- --year=2027. Per cambiare il sottotitolo della copertina (di default "Edizione &lt;anno&gt;"): --subtitle="Seconda edizione".</w:t>
       </w:r>
     </w:p>
     <w:tbl>
@@ -1235,7 +1235,7 @@
           <w:sz w:val="21"/>
           <w:szCs w:val="21"/>
         </w:rPr>
-        <w:t xml:space="preserve">Per generare invece l'Annuario Storico: npm run generate:pdf -- --section=ANNUARIO_STORICO</w:t>
+        <w:t xml:space="preserve">Premessa (facoltativa): scrivi il testo in content/premessa-&lt;anno&gt;.txt (es. content/premessa-2027.txt), separando i paragrafi con una riga vuota. Se il file non c'è, la pagina 1 contiene solo la legenda delle facoltà.</w:t>
       </w:r>
     </w:p>
     <w:p>

</xml_diff>

<commit_message>
Pannello /admin per moderare le foto
- Accesso con password unica (ADMIN_PASSWORD), sessione firmata di 7 giorni
- Middleware che protegge /admin; le azioni ricontrollano la sessione
- Sezioni Hall of Fame / Annuario Storico / Archivio, filtro in attesa/approvate
- Approva, Rimetti in attesa, Elimina (cancella anche l'immagine dal Blob)
- ADMIN_GUIDE.docx: moderazione dal pannello

Co-Authored-By: Claude Opus 5.5 <noreply@anthropic.com>
</commit_message>
<xml_diff>
--- a/ADMIN_GUIDE.docx
+++ b/ADMIN_GUIDE.docx
@@ -337,7 +337,7 @@
           <w:sz w:val="21"/>
           <w:szCs w:val="21"/>
         </w:rPr>
-        <w:t xml:space="preserve">Apri Drizzle Studio come al punto precedente: npm run db:studio</w:t>
+        <w:t xml:space="preserve">Apri il pannello di moderazione: annuario-pn.vercel.app/admin (in locale: localhost:3000/admin) ed entra con la password del pannello, cioè il valore della variabile ADMIN_PASSWORD impostata su Vercel. L'accesso resta valido per 7 giorni; per uscire usa "Esci".</w:t>
       </w:r>
     </w:p>
     <w:p>
@@ -355,7 +355,7 @@
           <w:sz w:val="21"/>
           <w:szCs w:val="21"/>
         </w:rPr>
-        <w:t xml:space="preserve">Vai sulla tabella hall_of_fame_entries.</w:t>
+        <w:t xml:space="preserve">Scegli la sezione (Hall of Fame, Annuario Storico o Archivio): il numero sul pulsante indica quante foto sono in attesa.</w:t>
       </w:r>
     </w:p>
     <w:p>
@@ -373,7 +373,7 @@
           <w:sz w:val="21"/>
           <w:szCs w:val="21"/>
         </w:rPr>
-        <w:t xml:space="preserve">Trova la riga della foto da approvare (puoi riconoscerla dal nome o dalla sezione, oppure ordina per data).</w:t>
+        <w:t xml:space="preserve">Nella scheda "In attesa" controlla ogni foto: cliccandola si apre l'immagine originale.</w:t>
       </w:r>
     </w:p>
     <w:p>
@@ -391,7 +391,7 @@
           <w:sz w:val="21"/>
           <w:szCs w:val="21"/>
         </w:rPr>
-        <w:t xml:space="preserve">Clicca sul valore della colonna status di quella riga e cambialo da PENDING ad APPROVED.</w:t>
+        <w:t xml:space="preserve">Clicca "Approva" per approvarla. Dalla scheda "Approvate" puoi rimetterla in attesa con "Rimetti in attesa".</w:t>
       </w:r>
     </w:p>
     <w:p>
@@ -409,7 +409,7 @@
           <w:sz w:val="21"/>
           <w:szCs w:val="21"/>
         </w:rPr>
-        <w:t xml:space="preserve">Salva. Le foto delle gallerie compaiono da sole sul sito entro 15 secondi, senza rifare il deploy. Quelle dell'Archivio entreranno nel PDF alla prossima generazione (vedi punto 5).</w:t>
+        <w:t xml:space="preserve">Le foto delle gallerie compaiono subito sul sito. Quelle dell'Archivio non compaiono sul sito ma entrano nel PDF alla prossima generazione (vedi punto 5). In alternativa resta possibile usare Drizzle Studio (npm run db:studio) e cambiare a mano la colonna status.</w:t>
       </w:r>
     </w:p>
     <w:tbl>
@@ -463,7 +463,7 @@
                 <w:sz w:val="20"/>
                 <w:szCs w:val="20"/>
               </w:rPr>
-              <w:t xml:space="preserve">Non esiste (ancora) uno stato "rifiutata": per ora, per non pubblicarla, lasciala semplicemente in PENDING, oppure cancella del tutto la riga se vuoi eliminarla definitivamente.</w:t>
+              <w:t xml:space="preserve">Clicca "Elimina" sulla foto: dopo la conferma la scheda e l'immagine vengono cancellate definitivamente, anche da Vercel Blob. L'operazione non si può annullare.</w:t>
             </w:r>
           </w:p>
         </w:tc>

</xml_diff>

<commit_message>
Guida admin: copertina automatica, premessa, stile gallerie
Co-Authored-By: Claude Opus 5.5 <noreply@anthropic.com>
</commit_message>
<xml_diff>
--- a/ADMIN_GUIDE.docx
+++ b/ADMIN_GUIDE.docx
@@ -12,7 +12,7 @@
           <w:noProof/>
         </w:rPr>
         <w:drawing>
-          <wp:inline distT="0" distB="0" distL="0" distR="0" wp14:anchorId="7A3E3BBF" wp14:editId="408709F2">
+          <wp:inline distT="0" distB="0" distL="0" distR="0" wp14:anchorId="33713E91" wp14:editId="1A7A162C">
             <wp:extent cx="1809750" cy="1809750"/>
             <wp:effectExtent l="0" t="0" r="0" b="0"/>
             <wp:docPr id="1" name="Immagine 1"/>
@@ -110,7 +110,7 @@
           <w:sz w:val="20"/>
           <w:szCs w:val="20"/>
         </w:rPr>
-        <w:t>Aggiornata a settembre 2026</w:t>
+        <w:t>Aggiornata a ottobre 2026</w:t>
       </w:r>
     </w:p>
     <w:p>
@@ -134,7 +134,7 @@
     <w:sdt>
       <w:sdtPr>
         <w:alias w:val="Indice"/>
-        <w:id w:val="-1318024954"/>
+        <w:id w:val="-595099285"/>
       </w:sdtPr>
       <w:sdtEndPr/>
       <w:sdtContent>
@@ -162,7 +162,7 @@
           <w:r>
             <w:fldChar w:fldCharType="separate"/>
           </w:r>
-          <w:hyperlink w:anchor="_Toc241395038" w:history="1">
+          <w:hyperlink w:anchor="_Toc241909277" w:history="1">
             <w:r>
               <w:rPr>
                 <w:rStyle w:val="Collegamentoipertestuale"/>
@@ -186,7 +186,7 @@
               <w:rPr>
                 <w:noProof/>
               </w:rPr>
-              <w:instrText xml:space="preserve"> PAGEREF _Toc241395038 \h </w:instrText>
+              <w:instrText xml:space="preserve"> PAGEREF _Toc241909277 \h </w:instrText>
             </w:r>
             <w:r>
               <w:rPr>
@@ -228,7 +228,7 @@
               <w14:ligatures w14:val="standardContextual"/>
             </w:rPr>
           </w:pPr>
-          <w:hyperlink w:anchor="_Toc241395039" w:history="1">
+          <w:hyperlink w:anchor="_Toc241909278" w:history="1">
             <w:r>
               <w:rPr>
                 <w:rStyle w:val="Collegamentoipertestuale"/>
@@ -252,7 +252,7 @@
               <w:rPr>
                 <w:noProof/>
               </w:rPr>
-              <w:instrText xml:space="preserve"> PAGEREF _Toc241395039 \h </w:instrText>
+              <w:instrText xml:space="preserve"> PAGEREF _Toc241909278 \h </w:instrText>
             </w:r>
             <w:r>
               <w:rPr>
@@ -294,7 +294,7 @@
               <w14:ligatures w14:val="standardContextual"/>
             </w:rPr>
           </w:pPr>
-          <w:hyperlink w:anchor="_Toc241395040" w:history="1">
+          <w:hyperlink w:anchor="_Toc241909279" w:history="1">
             <w:r>
               <w:rPr>
                 <w:rStyle w:val="Collegamentoipertestuale"/>
@@ -318,7 +318,7 @@
               <w:rPr>
                 <w:noProof/>
               </w:rPr>
-              <w:instrText xml:space="preserve"> PAGEREF _Toc241395040 \h </w:instrText>
+              <w:instrText xml:space="preserve"> PAGEREF _Toc241909279 \h </w:instrText>
             </w:r>
             <w:r>
               <w:rPr>
@@ -360,7 +360,7 @@
               <w14:ligatures w14:val="standardContextual"/>
             </w:rPr>
           </w:pPr>
-          <w:hyperlink w:anchor="_Toc241395041" w:history="1">
+          <w:hyperlink w:anchor="_Toc241909280" w:history="1">
             <w:r>
               <w:rPr>
                 <w:rStyle w:val="Collegamentoipertestuale"/>
@@ -384,7 +384,7 @@
               <w:rPr>
                 <w:noProof/>
               </w:rPr>
-              <w:instrText xml:space="preserve"> PAGEREF _Toc241395041 \h </w:instrText>
+              <w:instrText xml:space="preserve"> PAGEREF _Toc241909280 \h </w:instrText>
             </w:r>
             <w:r>
               <w:rPr>
@@ -426,7 +426,7 @@
               <w14:ligatures w14:val="standardContextual"/>
             </w:rPr>
           </w:pPr>
-          <w:hyperlink w:anchor="_Toc241395042" w:history="1">
+          <w:hyperlink w:anchor="_Toc241909281" w:history="1">
             <w:r>
               <w:rPr>
                 <w:rStyle w:val="Collegamentoipertestuale"/>
@@ -450,7 +450,7 @@
               <w:rPr>
                 <w:noProof/>
               </w:rPr>
-              <w:instrText xml:space="preserve"> PAGEREF _Toc241395042 \h </w:instrText>
+              <w:instrText xml:space="preserve"> PAGEREF _Toc241909281 \h </w:instrText>
             </w:r>
             <w:r>
               <w:rPr>
@@ -492,7 +492,7 @@
               <w14:ligatures w14:val="standardContextual"/>
             </w:rPr>
           </w:pPr>
-          <w:hyperlink w:anchor="_Toc241395043" w:history="1">
+          <w:hyperlink w:anchor="_Toc241909282" w:history="1">
             <w:r>
               <w:rPr>
                 <w:rStyle w:val="Collegamentoipertestuale"/>
@@ -516,7 +516,7 @@
               <w:rPr>
                 <w:noProof/>
               </w:rPr>
-              <w:instrText xml:space="preserve"> PAGEREF _Toc241395043 \h </w:instrText>
+              <w:instrText xml:space="preserve"> PAGEREF _Toc241909282 \h </w:instrText>
             </w:r>
             <w:r>
               <w:rPr>
@@ -558,7 +558,7 @@
               <w14:ligatures w14:val="standardContextual"/>
             </w:rPr>
           </w:pPr>
-          <w:hyperlink w:anchor="_Toc241395044" w:history="1">
+          <w:hyperlink w:anchor="_Toc241909283" w:history="1">
             <w:r>
               <w:rPr>
                 <w:rStyle w:val="Collegamentoipertestuale"/>
@@ -582,7 +582,7 @@
               <w:rPr>
                 <w:noProof/>
               </w:rPr>
-              <w:instrText xml:space="preserve"> PAGEREF _Toc241395044 \h </w:instrText>
+              <w:instrText xml:space="preserve"> PAGEREF _Toc241909283 \h </w:instrText>
             </w:r>
             <w:r>
               <w:rPr>
@@ -624,7 +624,7 @@
               <w14:ligatures w14:val="standardContextual"/>
             </w:rPr>
           </w:pPr>
-          <w:hyperlink w:anchor="_Toc241395045" w:history="1">
+          <w:hyperlink w:anchor="_Toc241909284" w:history="1">
             <w:r>
               <w:rPr>
                 <w:rStyle w:val="Collegamentoipertestuale"/>
@@ -648,7 +648,7 @@
               <w:rPr>
                 <w:noProof/>
               </w:rPr>
-              <w:instrText xml:space="preserve"> PAGEREF _Toc241395045 \h </w:instrText>
+              <w:instrText xml:space="preserve"> PAGEREF _Toc241909284 \h </w:instrText>
             </w:r>
             <w:r>
               <w:rPr>
@@ -690,7 +690,7 @@
               <w14:ligatures w14:val="standardContextual"/>
             </w:rPr>
           </w:pPr>
-          <w:hyperlink w:anchor="_Toc241395046" w:history="1">
+          <w:hyperlink w:anchor="_Toc241909285" w:history="1">
             <w:r>
               <w:rPr>
                 <w:rStyle w:val="Collegamentoipertestuale"/>
@@ -714,7 +714,7 @@
               <w:rPr>
                 <w:noProof/>
               </w:rPr>
-              <w:instrText xml:space="preserve"> PAGEREF _Toc241395046 \h </w:instrText>
+              <w:instrText xml:space="preserve"> PAGEREF _Toc241909285 \h </w:instrText>
             </w:r>
             <w:r>
               <w:rPr>
@@ -756,7 +756,7 @@
               <w14:ligatures w14:val="standardContextual"/>
             </w:rPr>
           </w:pPr>
-          <w:hyperlink w:anchor="_Toc241395047" w:history="1">
+          <w:hyperlink w:anchor="_Toc241909286" w:history="1">
             <w:r>
               <w:rPr>
                 <w:rStyle w:val="Collegamentoipertestuale"/>
@@ -780,7 +780,7 @@
               <w:rPr>
                 <w:noProof/>
               </w:rPr>
-              <w:instrText xml:space="preserve"> PAGEREF _Toc241395047 \h </w:instrText>
+              <w:instrText xml:space="preserve"> PAGEREF _Toc241909286 \h </w:instrText>
             </w:r>
             <w:r>
               <w:rPr>
@@ -822,7 +822,7 @@
               <w14:ligatures w14:val="standardContextual"/>
             </w:rPr>
           </w:pPr>
-          <w:hyperlink w:anchor="_Toc241395048" w:history="1">
+          <w:hyperlink w:anchor="_Toc241909287" w:history="1">
             <w:r>
               <w:rPr>
                 <w:rStyle w:val="Collegamentoipertestuale"/>
@@ -846,7 +846,7 @@
               <w:rPr>
                 <w:noProof/>
               </w:rPr>
-              <w:instrText xml:space="preserve"> PAGEREF _Toc241395048 \h </w:instrText>
+              <w:instrText xml:space="preserve"> PAGEREF _Toc241909287 \h </w:instrText>
             </w:r>
             <w:r>
               <w:rPr>
@@ -888,7 +888,7 @@
               <w14:ligatures w14:val="standardContextual"/>
             </w:rPr>
           </w:pPr>
-          <w:hyperlink w:anchor="_Toc241395049" w:history="1">
+          <w:hyperlink w:anchor="_Toc241909288" w:history="1">
             <w:r>
               <w:rPr>
                 <w:rStyle w:val="Collegamentoipertestuale"/>
@@ -912,7 +912,7 @@
               <w:rPr>
                 <w:noProof/>
               </w:rPr>
-              <w:instrText xml:space="preserve"> PAGEREF _Toc241395049 \h </w:instrText>
+              <w:instrText xml:space="preserve"> PAGEREF _Toc241909288 \h </w:instrText>
             </w:r>
             <w:r>
               <w:rPr>
@@ -954,7 +954,7 @@
               <w14:ligatures w14:val="standardContextual"/>
             </w:rPr>
           </w:pPr>
-          <w:hyperlink w:anchor="_Toc241395050" w:history="1">
+          <w:hyperlink w:anchor="_Toc241909289" w:history="1">
             <w:r>
               <w:rPr>
                 <w:rStyle w:val="Collegamentoipertestuale"/>
@@ -978,7 +978,7 @@
               <w:rPr>
                 <w:noProof/>
               </w:rPr>
-              <w:instrText xml:space="preserve"> PAGEREF _Toc241395050 \h </w:instrText>
+              <w:instrText xml:space="preserve"> PAGEREF _Toc241909289 \h </w:instrText>
             </w:r>
             <w:r>
               <w:rPr>
@@ -1020,7 +1020,7 @@
               <w14:ligatures w14:val="standardContextual"/>
             </w:rPr>
           </w:pPr>
-          <w:hyperlink w:anchor="_Toc241395051" w:history="1">
+          <w:hyperlink w:anchor="_Toc241909290" w:history="1">
             <w:r>
               <w:rPr>
                 <w:rStyle w:val="Collegamentoipertestuale"/>
@@ -1044,7 +1044,7 @@
               <w:rPr>
                 <w:noProof/>
               </w:rPr>
-              <w:instrText xml:space="preserve"> PAGEREF _Toc241395051 \h </w:instrText>
+              <w:instrText xml:space="preserve"> PAGEREF _Toc241909290 \h </w:instrText>
             </w:r>
             <w:r>
               <w:rPr>
@@ -1086,7 +1086,7 @@
               <w14:ligatures w14:val="standardContextual"/>
             </w:rPr>
           </w:pPr>
-          <w:hyperlink w:anchor="_Toc241395052" w:history="1">
+          <w:hyperlink w:anchor="_Toc241909291" w:history="1">
             <w:r>
               <w:rPr>
                 <w:rStyle w:val="Collegamentoipertestuale"/>
@@ -1110,7 +1110,7 @@
               <w:rPr>
                 <w:noProof/>
               </w:rPr>
-              <w:instrText xml:space="preserve"> PAGEREF _Toc241395052 \h </w:instrText>
+              <w:instrText xml:space="preserve"> PAGEREF _Toc241909291 \h </w:instrText>
             </w:r>
             <w:r>
               <w:rPr>
@@ -1152,7 +1152,7 @@
               <w14:ligatures w14:val="standardContextual"/>
             </w:rPr>
           </w:pPr>
-          <w:hyperlink w:anchor="_Toc241395053" w:history="1">
+          <w:hyperlink w:anchor="_Toc241909292" w:history="1">
             <w:r>
               <w:rPr>
                 <w:rStyle w:val="Collegamentoipertestuale"/>
@@ -1176,7 +1176,7 @@
               <w:rPr>
                 <w:noProof/>
               </w:rPr>
-              <w:instrText xml:space="preserve"> PAGEREF _Toc241395053 \h </w:instrText>
+              <w:instrText xml:space="preserve"> PAGEREF _Toc241909292 \h </w:instrText>
             </w:r>
             <w:r>
               <w:rPr>
@@ -1218,7 +1218,7 @@
               <w14:ligatures w14:val="standardContextual"/>
             </w:rPr>
           </w:pPr>
-          <w:hyperlink w:anchor="_Toc241395054" w:history="1">
+          <w:hyperlink w:anchor="_Toc241909293" w:history="1">
             <w:r>
               <w:rPr>
                 <w:rStyle w:val="Collegamentoipertestuale"/>
@@ -1242,7 +1242,7 @@
               <w:rPr>
                 <w:noProof/>
               </w:rPr>
-              <w:instrText xml:space="preserve"> PAGEREF _Toc241395054 \h </w:instrText>
+              <w:instrText xml:space="preserve"> PAGEREF _Toc241909293 \h </w:instrText>
             </w:r>
             <w:r>
               <w:rPr>
@@ -1284,7 +1284,7 @@
               <w14:ligatures w14:val="standardContextual"/>
             </w:rPr>
           </w:pPr>
-          <w:hyperlink w:anchor="_Toc241395055" w:history="1">
+          <w:hyperlink w:anchor="_Toc241909294" w:history="1">
             <w:r>
               <w:rPr>
                 <w:rStyle w:val="Collegamentoipertestuale"/>
@@ -1308,7 +1308,7 @@
               <w:rPr>
                 <w:noProof/>
               </w:rPr>
-              <w:instrText xml:space="preserve"> PAGEREF _Toc241395055 \h </w:instrText>
+              <w:instrText xml:space="preserve"> PAGEREF _Toc241909294 \h </w:instrText>
             </w:r>
             <w:r>
               <w:rPr>
@@ -1350,7 +1350,7 @@
               <w14:ligatures w14:val="standardContextual"/>
             </w:rPr>
           </w:pPr>
-          <w:hyperlink w:anchor="_Toc241395056" w:history="1">
+          <w:hyperlink w:anchor="_Toc241909295" w:history="1">
             <w:r>
               <w:rPr>
                 <w:rStyle w:val="Collegamentoipertestuale"/>
@@ -1374,7 +1374,7 @@
               <w:rPr>
                 <w:noProof/>
               </w:rPr>
-              <w:instrText xml:space="preserve"> PAGEREF _Toc241395056 \h </w:instrText>
+              <w:instrText xml:space="preserve"> PAGEREF _Toc241909295 \h </w:instrText>
             </w:r>
             <w:r>
               <w:rPr>
@@ -1416,7 +1416,7 @@
               <w14:ligatures w14:val="standardContextual"/>
             </w:rPr>
           </w:pPr>
-          <w:hyperlink w:anchor="_Toc241395057" w:history="1">
+          <w:hyperlink w:anchor="_Toc241909296" w:history="1">
             <w:r>
               <w:rPr>
                 <w:rStyle w:val="Collegamentoipertestuale"/>
@@ -1440,7 +1440,7 @@
               <w:rPr>
                 <w:noProof/>
               </w:rPr>
-              <w:instrText xml:space="preserve"> PAGEREF _Toc241395057 \h </w:instrText>
+              <w:instrText xml:space="preserve"> PAGEREF _Toc241909296 \h </w:instrText>
             </w:r>
             <w:r>
               <w:rPr>
@@ -1482,7 +1482,7 @@
               <w14:ligatures w14:val="standardContextual"/>
             </w:rPr>
           </w:pPr>
-          <w:hyperlink w:anchor="_Toc241395058" w:history="1">
+          <w:hyperlink w:anchor="_Toc241909297" w:history="1">
             <w:r>
               <w:rPr>
                 <w:rStyle w:val="Collegamentoipertestuale"/>
@@ -1506,7 +1506,7 @@
               <w:rPr>
                 <w:noProof/>
               </w:rPr>
-              <w:instrText xml:space="preserve"> PAGEREF _Toc241395058 \h </w:instrText>
+              <w:instrText xml:space="preserve"> PAGEREF _Toc241909297 \h </w:instrText>
             </w:r>
             <w:r>
               <w:rPr>
@@ -1548,13 +1548,13 @@
               <w14:ligatures w14:val="standardContextual"/>
             </w:rPr>
           </w:pPr>
-          <w:hyperlink w:anchor="_Toc241395059" w:history="1">
+          <w:hyperlink w:anchor="_Toc241909298" w:history="1">
             <w:r>
               <w:rPr>
                 <w:rStyle w:val="Collegamentoipertestuale"/>
                 <w:noProof/>
               </w:rPr>
-              <w:t>Premessa (facoltativa)</w:t>
+              <w:t>La copertina: logo e scritta "Edizione 2027-28"</w:t>
             </w:r>
             <w:r>
               <w:rPr>
@@ -1572,7 +1572,7 @@
               <w:rPr>
                 <w:noProof/>
               </w:rPr>
-              <w:instrText xml:space="preserve"> PAGEREF _Toc241395059 \h </w:instrText>
+              <w:instrText xml:space="preserve"> PAGEREF _Toc241909298 \h </w:instrText>
             </w:r>
             <w:r>
               <w:rPr>
@@ -1614,13 +1614,13 @@
               <w14:ligatures w14:val="standardContextual"/>
             </w:rPr>
           </w:pPr>
-          <w:hyperlink w:anchor="_Toc241395060" w:history="1">
+          <w:hyperlink w:anchor="_Toc241909299" w:history="1">
             <w:r>
               <w:rPr>
                 <w:rStyle w:val="Collegamentoipertestuale"/>
                 <w:noProof/>
               </w:rPr>
-              <w:t>Generare il PDF</w:t>
+              <w:t>Premessa</w:t>
             </w:r>
             <w:r>
               <w:rPr>
@@ -1638,7 +1638,7 @@
               <w:rPr>
                 <w:noProof/>
               </w:rPr>
-              <w:instrText xml:space="preserve"> PAGEREF _Toc241395060 \h </w:instrText>
+              <w:instrText xml:space="preserve"> PAGEREF _Toc241909299 \h </w:instrText>
             </w:r>
             <w:r>
               <w:rPr>
@@ -1655,7 +1655,7 @@
               <w:rPr>
                 <w:noProof/>
               </w:rPr>
-              <w:t>10</w:t>
+              <w:t>11</w:t>
             </w:r>
             <w:r>
               <w:rPr>
@@ -1680,12 +1680,78 @@
               <w14:ligatures w14:val="standardContextual"/>
             </w:rPr>
           </w:pPr>
-          <w:hyperlink w:anchor="_Toc241395061" w:history="1">
+          <w:hyperlink w:anchor="_Toc241909300" w:history="1">
             <w:r>
               <w:rPr>
                 <w:rStyle w:val="Collegamentoipertestuale"/>
                 <w:noProof/>
               </w:rPr>
+              <w:t>Generare il PDF</w:t>
+            </w:r>
+            <w:r>
+              <w:rPr>
+                <w:noProof/>
+              </w:rPr>
+              <w:tab/>
+            </w:r>
+            <w:r>
+              <w:rPr>
+                <w:noProof/>
+              </w:rPr>
+              <w:fldChar w:fldCharType="begin"/>
+            </w:r>
+            <w:r>
+              <w:rPr>
+                <w:noProof/>
+              </w:rPr>
+              <w:instrText xml:space="preserve"> PAGEREF _Toc241909300 \h </w:instrText>
+            </w:r>
+            <w:r>
+              <w:rPr>
+                <w:noProof/>
+              </w:rPr>
+            </w:r>
+            <w:r>
+              <w:rPr>
+                <w:noProof/>
+              </w:rPr>
+              <w:fldChar w:fldCharType="separate"/>
+            </w:r>
+            <w:r>
+              <w:rPr>
+                <w:noProof/>
+              </w:rPr>
+              <w:t>11</w:t>
+            </w:r>
+            <w:r>
+              <w:rPr>
+                <w:noProof/>
+              </w:rPr>
+              <w:fldChar w:fldCharType="end"/>
+            </w:r>
+          </w:hyperlink>
+        </w:p>
+        <w:p>
+          <w:pPr>
+            <w:pStyle w:val="Sommario2"/>
+            <w:tabs>
+              <w:tab w:val="right" w:leader="dot" w:pos="9296"/>
+            </w:tabs>
+            <w:rPr>
+              <w:rFonts w:asciiTheme="minorHAnsi" w:eastAsiaTheme="minorEastAsia" w:hAnsiTheme="minorHAnsi" w:cstheme="minorBidi"/>
+              <w:noProof/>
+              <w:kern w:val="2"/>
+              <w:sz w:val="24"/>
+              <w:szCs w:val="24"/>
+              <w14:ligatures w14:val="standardContextual"/>
+            </w:rPr>
+          </w:pPr>
+          <w:hyperlink w:anchor="_Toc241909301" w:history="1">
+            <w:r>
+              <w:rPr>
+                <w:rStyle w:val="Collegamentoipertestuale"/>
+                <w:noProof/>
+              </w:rPr>
               <w:t>Opzioni utili</w:t>
             </w:r>
             <w:r>
@@ -1704,7 +1770,7 @@
               <w:rPr>
                 <w:noProof/>
               </w:rPr>
-              <w:instrText xml:space="preserve"> PAGEREF _Toc241395061 \h </w:instrText>
+              <w:instrText xml:space="preserve"> PAGEREF _Toc241909301 \h </w:instrText>
             </w:r>
             <w:r>
               <w:rPr>
@@ -1721,7 +1787,7 @@
               <w:rPr>
                 <w:noProof/>
               </w:rPr>
-              <w:t>10</w:t>
+              <w:t>11</w:t>
             </w:r>
             <w:r>
               <w:rPr>
@@ -1746,7 +1812,7 @@
               <w14:ligatures w14:val="standardContextual"/>
             </w:rPr>
           </w:pPr>
-          <w:hyperlink w:anchor="_Toc241395062" w:history="1">
+          <w:hyperlink w:anchor="_Toc241909302" w:history="1">
             <w:r>
               <w:rPr>
                 <w:rStyle w:val="Collegamentoipertestuale"/>
@@ -1770,7 +1836,7 @@
               <w:rPr>
                 <w:noProof/>
               </w:rPr>
-              <w:instrText xml:space="preserve"> PAGEREF _Toc241395062 \h </w:instrText>
+              <w:instrText xml:space="preserve"> PAGEREF _Toc241909302 \h </w:instrText>
             </w:r>
             <w:r>
               <w:rPr>
@@ -1787,7 +1853,7 @@
               <w:rPr>
                 <w:noProof/>
               </w:rPr>
-              <w:t>11</w:t>
+              <w:t>12</w:t>
             </w:r>
             <w:r>
               <w:rPr>
@@ -1812,7 +1878,7 @@
               <w14:ligatures w14:val="standardContextual"/>
             </w:rPr>
           </w:pPr>
-          <w:hyperlink w:anchor="_Toc241395063" w:history="1">
+          <w:hyperlink w:anchor="_Toc241909303" w:history="1">
             <w:r>
               <w:rPr>
                 <w:rStyle w:val="Collegamentoipertestuale"/>
@@ -1836,7 +1902,7 @@
               <w:rPr>
                 <w:noProof/>
               </w:rPr>
-              <w:instrText xml:space="preserve"> PAGEREF _Toc241395063 \h </w:instrText>
+              <w:instrText xml:space="preserve"> PAGEREF _Toc241909303 \h </w:instrText>
             </w:r>
             <w:r>
               <w:rPr>
@@ -1853,7 +1919,7 @@
               <w:rPr>
                 <w:noProof/>
               </w:rPr>
-              <w:t>12</w:t>
+              <w:t>13</w:t>
             </w:r>
             <w:r>
               <w:rPr>
@@ -1878,7 +1944,7 @@
               <w14:ligatures w14:val="standardContextual"/>
             </w:rPr>
           </w:pPr>
-          <w:hyperlink w:anchor="_Toc241395064" w:history="1">
+          <w:hyperlink w:anchor="_Toc241909304" w:history="1">
             <w:r>
               <w:rPr>
                 <w:rStyle w:val="Collegamentoipertestuale"/>
@@ -1902,7 +1968,7 @@
               <w:rPr>
                 <w:noProof/>
               </w:rPr>
-              <w:instrText xml:space="preserve"> PAGEREF _Toc241395064 \h </w:instrText>
+              <w:instrText xml:space="preserve"> PAGEREF _Toc241909304 \h </w:instrText>
             </w:r>
             <w:r>
               <w:rPr>
@@ -1919,7 +1985,7 @@
               <w:rPr>
                 <w:noProof/>
               </w:rPr>
-              <w:t>12</w:t>
+              <w:t>13</w:t>
             </w:r>
             <w:r>
               <w:rPr>
@@ -1944,7 +2010,7 @@
               <w14:ligatures w14:val="standardContextual"/>
             </w:rPr>
           </w:pPr>
-          <w:hyperlink w:anchor="_Toc241395065" w:history="1">
+          <w:hyperlink w:anchor="_Toc241909305" w:history="1">
             <w:r>
               <w:rPr>
                 <w:rStyle w:val="Collegamentoipertestuale"/>
@@ -1968,7 +2034,7 @@
               <w:rPr>
                 <w:noProof/>
               </w:rPr>
-              <w:instrText xml:space="preserve"> PAGEREF _Toc241395065 \h </w:instrText>
+              <w:instrText xml:space="preserve"> PAGEREF _Toc241909305 \h </w:instrText>
             </w:r>
             <w:r>
               <w:rPr>
@@ -1985,7 +2051,7 @@
               <w:rPr>
                 <w:noProof/>
               </w:rPr>
-              <w:t>12</w:t>
+              <w:t>13</w:t>
             </w:r>
             <w:r>
               <w:rPr>
@@ -2010,7 +2076,7 @@
               <w14:ligatures w14:val="standardContextual"/>
             </w:rPr>
           </w:pPr>
-          <w:hyperlink w:anchor="_Toc241395066" w:history="1">
+          <w:hyperlink w:anchor="_Toc241909306" w:history="1">
             <w:r>
               <w:rPr>
                 <w:rStyle w:val="Collegamentoipertestuale"/>
@@ -2034,7 +2100,7 @@
               <w:rPr>
                 <w:noProof/>
               </w:rPr>
-              <w:instrText xml:space="preserve"> PAGEREF _Toc241395066 \h </w:instrText>
+              <w:instrText xml:space="preserve"> PAGEREF _Toc241909306 \h </w:instrText>
             </w:r>
             <w:r>
               <w:rPr>
@@ -2051,7 +2117,7 @@
               <w:rPr>
                 <w:noProof/>
               </w:rPr>
-              <w:t>13</w:t>
+              <w:t>14</w:t>
             </w:r>
             <w:r>
               <w:rPr>
@@ -2076,7 +2142,7 @@
               <w14:ligatures w14:val="standardContextual"/>
             </w:rPr>
           </w:pPr>
-          <w:hyperlink w:anchor="_Toc241395067" w:history="1">
+          <w:hyperlink w:anchor="_Toc241909307" w:history="1">
             <w:r>
               <w:rPr>
                 <w:rStyle w:val="Collegamentoipertestuale"/>
@@ -2100,7 +2166,7 @@
               <w:rPr>
                 <w:noProof/>
               </w:rPr>
-              <w:instrText xml:space="preserve"> PAGEREF _Toc241395067 \h </w:instrText>
+              <w:instrText xml:space="preserve"> PAGEREF _Toc241909307 \h </w:instrText>
             </w:r>
             <w:r>
               <w:rPr>
@@ -2117,7 +2183,7 @@
               <w:rPr>
                 <w:noProof/>
               </w:rPr>
-              <w:t>13</w:t>
+              <w:t>14</w:t>
             </w:r>
             <w:r>
               <w:rPr>
@@ -2142,7 +2208,7 @@
               <w14:ligatures w14:val="standardContextual"/>
             </w:rPr>
           </w:pPr>
-          <w:hyperlink w:anchor="_Toc241395068" w:history="1">
+          <w:hyperlink w:anchor="_Toc241909308" w:history="1">
             <w:r>
               <w:rPr>
                 <w:rStyle w:val="Collegamentoipertestuale"/>
@@ -2166,7 +2232,7 @@
               <w:rPr>
                 <w:noProof/>
               </w:rPr>
-              <w:instrText xml:space="preserve"> PAGEREF _Toc241395068 \h </w:instrText>
+              <w:instrText xml:space="preserve"> PAGEREF _Toc241909308 \h </w:instrText>
             </w:r>
             <w:r>
               <w:rPr>
@@ -2183,7 +2249,7 @@
               <w:rPr>
                 <w:noProof/>
               </w:rPr>
-              <w:t>14</w:t>
+              <w:t>15</w:t>
             </w:r>
             <w:r>
               <w:rPr>
@@ -2208,7 +2274,7 @@
               <w14:ligatures w14:val="standardContextual"/>
             </w:rPr>
           </w:pPr>
-          <w:hyperlink w:anchor="_Toc241395069" w:history="1">
+          <w:hyperlink w:anchor="_Toc241909309" w:history="1">
             <w:r>
               <w:rPr>
                 <w:rStyle w:val="Collegamentoipertestuale"/>
@@ -2232,7 +2298,7 @@
               <w:rPr>
                 <w:noProof/>
               </w:rPr>
-              <w:instrText xml:space="preserve"> PAGEREF _Toc241395069 \h </w:instrText>
+              <w:instrText xml:space="preserve"> PAGEREF _Toc241909309 \h </w:instrText>
             </w:r>
             <w:r>
               <w:rPr>
@@ -2249,7 +2315,7 @@
               <w:rPr>
                 <w:noProof/>
               </w:rPr>
-              <w:t>15</w:t>
+              <w:t>16</w:t>
             </w:r>
             <w:r>
               <w:rPr>
@@ -2274,7 +2340,7 @@
               <w14:ligatures w14:val="standardContextual"/>
             </w:rPr>
           </w:pPr>
-          <w:hyperlink w:anchor="_Toc241395070" w:history="1">
+          <w:hyperlink w:anchor="_Toc241909310" w:history="1">
             <w:r>
               <w:rPr>
                 <w:rStyle w:val="Collegamentoipertestuale"/>
@@ -2298,7 +2364,7 @@
               <w:rPr>
                 <w:noProof/>
               </w:rPr>
-              <w:instrText xml:space="preserve"> PAGEREF _Toc241395070 \h </w:instrText>
+              <w:instrText xml:space="preserve"> PAGEREF _Toc241909310 \h </w:instrText>
             </w:r>
             <w:r>
               <w:rPr>
@@ -2315,7 +2381,7 @@
               <w:rPr>
                 <w:noProof/>
               </w:rPr>
-              <w:t>16</w:t>
+              <w:t>17</w:t>
             </w:r>
             <w:r>
               <w:rPr>
@@ -2337,7 +2403,7 @@
         <w:pStyle w:val="Titolo1"/>
         <w:pageBreakBefore/>
       </w:pPr>
-      <w:bookmarkStart w:id="0" w:name="_Toc241395038"/>
+      <w:bookmarkStart w:id="0" w:name="_Toc241909277"/>
       <w:r>
         <w:lastRenderedPageBreak/>
         <w:t>1. Come è fatto il sito</w:t>
@@ -2689,7 +2755,7 @@
               <w:spacing w:line="276" w:lineRule="auto"/>
             </w:pPr>
             <w:r>
-              <w:t>La bacheca dei laureati: foto, facoltà e nome.</w:t>
+              <w:t>La bacheca dei laureati: foto, icona della facoltà e nome, con le schede nello stesso stile delle pagine dell'annuario e in ordine alfabetico per cognome.</w:t>
             </w:r>
           </w:p>
         </w:tc>
@@ -2714,7 +2780,7 @@
               <w:spacing w:line="276" w:lineRule="auto"/>
             </w:pPr>
             <w:r>
-              <w:t>Chi si è laureato. Solo foto singole.</w:t>
+              <w:t>Chi si è laureato. Solo foto singole, senza didascalia.</w:t>
             </w:r>
           </w:p>
         </w:tc>
@@ -2801,7 +2867,7 @@
               <w:spacing w:line="276" w:lineRule="auto"/>
             </w:pPr>
             <w:r>
-              <w:t>Come la Hall of Fame, ma per chi frequenta il PN da tempo e non ha mai mandato la foto. È sempre aperta.</w:t>
+              <w:t>Come la Hall of Fame, ma per chi frequenta il PN da tempo e non ha mai mandato la foto. È sempre aperta. Le schede hanno anche la didascalia nell'etichetta blu, come nell'annuario.</w:t>
             </w:r>
           </w:p>
         </w:tc>
@@ -2826,7 +2892,7 @@
               <w:spacing w:line="276" w:lineRule="auto"/>
             </w:pPr>
             <w:r>
-              <w:t>Chiunque abbia un'email Unipi. Solo foto singole.</w:t>
+              <w:t>Chiunque abbia un'email Unipi. Solo foto singole, con didascalia obbligatoria (max 90 caratteri).</w:t>
             </w:r>
           </w:p>
         </w:tc>
@@ -2978,7 +3044,7 @@
       <w:pPr>
         <w:pStyle w:val="Titolo2"/>
       </w:pPr>
-      <w:bookmarkStart w:id="1" w:name="_Toc241395039"/>
+      <w:bookmarkStart w:id="1" w:name="_Toc241909278"/>
       <w:r>
         <w:t>Il giro di una foto</w:t>
       </w:r>
@@ -3075,14 +3141,14 @@
         <w:spacing w:after="80" w:line="290" w:lineRule="auto"/>
       </w:pPr>
       <w:r>
-        <w:t>Se è della Hall of Fame o dell'Annuario Storico, compare subito nella galleria. Se è dell'Archivio, entrerà nel PDF quando lo generi (capitolo 6).</w:t>
+        <w:t>Se è della Hall of Fame o dell'Annuario Storico, compare subito nella galleria, al suo posto in ordine alfabetico per cognome. Se è dell'Archivio, entrerà nel PDF quando lo generi (capitolo 6).</w:t>
       </w:r>
     </w:p>
     <w:p>
       <w:pPr>
         <w:pStyle w:val="Titolo2"/>
       </w:pPr>
-      <w:bookmarkStart w:id="2" w:name="_Toc241395040"/>
+      <w:bookmarkStart w:id="2" w:name="_Toc241909279"/>
       <w:r>
         <w:t>Parole che incontrerai</w:t>
       </w:r>
@@ -3146,6 +3212,7 @@
                 <w:bCs/>
                 <w:color w:val="FFFFFF"/>
               </w:rPr>
+              <w:lastRenderedPageBreak/>
               <w:t>Parola</w:t>
             </w:r>
           </w:p>
@@ -3338,7 +3405,6 @@
                 <w:b/>
                 <w:bCs/>
               </w:rPr>
-              <w:lastRenderedPageBreak/>
               <w:t>Cartella del progetto</w:t>
             </w:r>
           </w:p>
@@ -3701,7 +3767,7 @@
         <w:pStyle w:val="Titolo1"/>
         <w:pageBreakBefore/>
       </w:pPr>
-      <w:bookmarkStart w:id="3" w:name="_Toc241395041"/>
+      <w:bookmarkStart w:id="3" w:name="_Toc241909280"/>
       <w:r>
         <w:lastRenderedPageBreak/>
         <w:t>2. Preparare il computer (una volta sola)</w:t>
@@ -3730,7 +3796,7 @@
       <w:pPr>
         <w:pStyle w:val="Titolo2"/>
       </w:pPr>
-      <w:bookmarkStart w:id="4" w:name="_Toc241395042"/>
+      <w:bookmarkStart w:id="4" w:name="_Toc241909281"/>
       <w:r>
         <w:t>Programmi da installare</w:t>
       </w:r>
@@ -3845,7 +3911,7 @@
       <w:pPr>
         <w:pStyle w:val="Titolo2"/>
       </w:pPr>
-      <w:bookmarkStart w:id="5" w:name="_Toc241395043"/>
+      <w:bookmarkStart w:id="5" w:name="_Toc241909282"/>
       <w:r>
         <w:t>Aprire il terminale nella cartella del progetto</w:t>
       </w:r>
@@ -3937,7 +4003,7 @@
       <w:pPr>
         <w:pStyle w:val="Titolo2"/>
       </w:pPr>
-      <w:bookmarkStart w:id="6" w:name="_Toc241395044"/>
+      <w:bookmarkStart w:id="6" w:name="_Toc241909283"/>
       <w:r>
         <w:t>La prima volta dopo aver scaricato il progetto</w:t>
       </w:r>
@@ -3982,7 +4048,7 @@
       <w:pPr>
         <w:pStyle w:val="Titolo2"/>
       </w:pPr>
-      <w:bookmarkStart w:id="7" w:name="_Toc241395045"/>
+      <w:bookmarkStart w:id="7" w:name="_Toc241909284"/>
       <w:r>
         <w:t>Il file segreto .env.local</w:t>
       </w:r>
@@ -4012,7 +4078,7 @@
         <w:pStyle w:val="Titolo1"/>
         <w:pageBreakBefore/>
       </w:pPr>
-      <w:bookmarkStart w:id="8" w:name="_Toc241395046"/>
+      <w:bookmarkStart w:id="8" w:name="_Toc241909285"/>
       <w:r>
         <w:lastRenderedPageBreak/>
         <w:t>3. Pubblicare una modifica sul sito online</w:t>
@@ -4149,7 +4215,7 @@
       <w:pPr>
         <w:pStyle w:val="Titolo2"/>
       </w:pPr>
-      <w:bookmarkStart w:id="9" w:name="_Toc241395047"/>
+      <w:bookmarkStart w:id="9" w:name="_Toc241909286"/>
       <w:r>
         <w:t>Controllare che sia andato tutto bene</w:t>
       </w:r>
@@ -4301,7 +4367,7 @@
         <w:pStyle w:val="Titolo1"/>
         <w:pageBreakBefore/>
       </w:pPr>
-      <w:bookmarkStart w:id="10" w:name="_Toc241395048"/>
+      <w:bookmarkStart w:id="10" w:name="_Toc241909287"/>
       <w:r>
         <w:lastRenderedPageBreak/>
         <w:t>4. Approvare ed eliminare le foto (pannello di moderazione)</w:t>
@@ -4330,7 +4396,7 @@
       <w:pPr>
         <w:pStyle w:val="Titolo2"/>
       </w:pPr>
-      <w:bookmarkStart w:id="11" w:name="_Toc241395049"/>
+      <w:bookmarkStart w:id="11" w:name="_Toc241909288"/>
       <w:r>
         <w:t>Entrare nel pannello</w:t>
       </w:r>
@@ -4419,7 +4485,7 @@
       <w:pPr>
         <w:pStyle w:val="Titolo2"/>
       </w:pPr>
-      <w:bookmarkStart w:id="12" w:name="_Toc241395050"/>
+      <w:bookmarkStart w:id="12" w:name="_Toc241909289"/>
       <w:r>
         <w:t>Com'è fatto il pannello</w:t>
       </w:r>
@@ -4518,7 +4584,7 @@
       <w:pPr>
         <w:pStyle w:val="Titolo2"/>
       </w:pPr>
-      <w:bookmarkStart w:id="13" w:name="_Toc241395051"/>
+      <w:bookmarkStart w:id="13" w:name="_Toc241909290"/>
       <w:r>
         <w:t>Cosa fanno i pulsanti</w:t>
       </w:r>
@@ -4821,7 +4887,7 @@
       <w:pPr>
         <w:pStyle w:val="Titolo2"/>
       </w:pPr>
-      <w:bookmarkStart w:id="14" w:name="_Toc241395052"/>
+      <w:bookmarkStart w:id="14" w:name="_Toc241909291"/>
       <w:r>
         <w:t>Cosa controllare prima di approvare</w:t>
       </w:r>
@@ -4850,7 +4916,7 @@
         <w:spacing w:after="60" w:line="290" w:lineRule="auto"/>
       </w:pPr>
       <w:r>
-        <w:t>Hall of Fame: la persona si è davvero laureata. Annuario Storico: è una foto singola di una persona del PN.</w:t>
+        <w:t>Hall of Fame: la persona si è davvero laureata. Annuario Storico: è una foto singola di una persona del PN e la didascalia è adatta (comparirà sul sito).</w:t>
       </w:r>
     </w:p>
     <w:p>
@@ -4883,7 +4949,7 @@
       <w:pPr>
         <w:pStyle w:val="Titolo2"/>
       </w:pPr>
-      <w:bookmarkStart w:id="15" w:name="_Toc241395053"/>
+      <w:bookmarkStart w:id="15" w:name="_Toc241909292"/>
       <w:r>
         <w:t>Impostare o cambiare la password del pannello</w:t>
       </w:r>
@@ -5143,7 +5209,7 @@
         <w:pStyle w:val="Titolo1"/>
         <w:pageBreakBefore/>
       </w:pPr>
-      <w:bookmarkStart w:id="16" w:name="_Toc241395054"/>
+      <w:bookmarkStart w:id="16" w:name="_Toc241909293"/>
       <w:r>
         <w:lastRenderedPageBreak/>
         <w:t>5. Aprire e chiudere gli invii per l'annuario</w:t>
@@ -5236,7 +5302,7 @@
       <w:pPr>
         <w:pStyle w:val="Titolo2"/>
       </w:pPr>
-      <w:bookmarkStart w:id="17" w:name="_Toc241395055"/>
+      <w:bookmarkStart w:id="17" w:name="_Toc241909294"/>
       <w:r>
         <w:t>Cambiare anno e date</w:t>
       </w:r>
@@ -5395,7 +5461,7 @@
       <w:pPr>
         <w:pStyle w:val="Titolo2"/>
       </w:pPr>
-      <w:bookmarkStart w:id="18" w:name="_Toc241395056"/>
+      <w:bookmarkStart w:id="18" w:name="_Toc241909295"/>
       <w:r>
         <w:t>Aprire o chiudere a mano, senza toccare le date</w:t>
       </w:r>
@@ -5732,7 +5798,7 @@
       <w:pPr>
         <w:pStyle w:val="Titolo2"/>
       </w:pPr>
-      <w:bookmarkStart w:id="19" w:name="_Toc241395057"/>
+      <w:bookmarkStart w:id="19" w:name="_Toc241909296"/>
       <w:r>
         <w:t>Limite di foto per persona</w:t>
       </w:r>
@@ -5805,7 +5871,7 @@
         <w:pStyle w:val="Titolo1"/>
         <w:pageBreakBefore/>
       </w:pPr>
-      <w:bookmarkStart w:id="20" w:name="_Toc241395058"/>
+      <w:bookmarkStart w:id="20" w:name="_Toc241909297"/>
       <w:r>
         <w:lastRenderedPageBreak/>
         <w:t>6. Creare il PDF dell'annuario</w:t>
@@ -5830,7 +5896,7 @@
         <w:spacing w:after="60" w:line="290" w:lineRule="auto"/>
       </w:pPr>
       <w:r>
-        <w:t>copertina con titolo, cherubino e sottotitolo;</w:t>
+        <w:t>copertina con la scritta ANNUARIO DEL PN, il cherubino e l'anno accademico (per esempio "Edizione 2026-27"), calcolato da solo;</w:t>
       </w:r>
     </w:p>
     <w:p>
@@ -5843,7 +5909,7 @@
         <w:spacing w:after="60" w:line="290" w:lineRule="auto"/>
       </w:pPr>
       <w:r>
-        <w:t>pagina 1 con la premessa (se la scrivi) e la legenda delle facoltà;</w:t>
+        <w:t>pagina 1 con la premessa e la legenda delle facoltà, uguale alla prima edizione;</w:t>
       </w:r>
     </w:p>
     <w:p>
@@ -5869,7 +5935,7 @@
         <w:spacing w:after="60" w:line="290" w:lineRule="auto"/>
       </w:pPr>
       <w:r>
-        <w:t>foto di gruppo, tre per pagina, con la didascalia;</w:t>
+        <w:t>foto di gruppo con nomi e didascalia: le verticali alternate a sinistra e a destra, le orizzontali centrate a tutta larghezza, come nella prima edizione;</w:t>
       </w:r>
     </w:p>
     <w:p>
@@ -5907,11 +5973,638 @@
       <w:pPr>
         <w:pStyle w:val="Titolo2"/>
       </w:pPr>
-      <w:bookmarkStart w:id="21" w:name="_Toc241395059"/>
-      <w:r>
-        <w:t>Premessa (facoltativa)</w:t>
+      <w:bookmarkStart w:id="21" w:name="_Toc241909298"/>
+      <w:r>
+        <w:t>La copertina: logo e scritta "Edizione 2027-28"</w:t>
       </w:r>
       <w:bookmarkEnd w:id="21"/>
+    </w:p>
+    <w:p>
+      <w:pPr>
+        <w:spacing w:after="120" w:line="290" w:lineRule="auto"/>
+      </w:pPr>
+      <w:r>
+        <w:t xml:space="preserve">La prima pagina del PDF è creata in automatico: in alto </w:t>
+      </w:r>
+      <w:r>
+        <w:rPr>
+          <w:b/>
+          <w:bCs/>
+        </w:rPr>
+        <w:t>ANNUARIO DEL PN</w:t>
+      </w:r>
+      <w:r>
+        <w:t xml:space="preserve">, al centro il cherubino e in basso la scritta dell'edizione. </w:t>
+      </w:r>
+      <w:r>
+        <w:rPr>
+          <w:b/>
+          <w:bCs/>
+        </w:rPr>
+        <w:t>Non c'è nessuna immagine da preparare a mano.</w:t>
+      </w:r>
+      <w:r>
+        <w:t xml:space="preserve"> La scritta dipende dall'anno dell'edizione (il valore </w:t>
+      </w:r>
+      <w:r>
+        <w:rPr>
+          <w:rFonts w:ascii="Consolas" w:eastAsia="Consolas" w:hAnsi="Consolas" w:cs="Consolas"/>
+          <w:color w:val="002B49"/>
+          <w:shd w:val="clear" w:color="auto" w:fill="EEF3F7"/>
+        </w:rPr>
+        <w:t>year</w:t>
+      </w:r>
+      <w:r>
+        <w:t xml:space="preserve"> del file </w:t>
+      </w:r>
+      <w:r>
+        <w:rPr>
+          <w:rFonts w:ascii="Consolas" w:eastAsia="Consolas" w:hAnsi="Consolas" w:cs="Consolas"/>
+          <w:color w:val="002B49"/>
+          <w:shd w:val="clear" w:color="auto" w:fill="EEF3F7"/>
+        </w:rPr>
+        <w:t>src/config/current-edition.ts</w:t>
+      </w:r>
+      <w:r>
+        <w:t>, capitolo 5) ed è l'anno accademico corrispondente:</w:t>
+      </w:r>
+    </w:p>
+    <w:tbl>
+      <w:tblPr>
+        <w:tblW w:w="9026" w:type="dxa"/>
+        <w:tblBorders>
+          <w:top w:val="single" w:sz="4" w:space="0" w:color="auto"/>
+          <w:left w:val="single" w:sz="4" w:space="0" w:color="auto"/>
+          <w:bottom w:val="single" w:sz="4" w:space="0" w:color="auto"/>
+          <w:right w:val="single" w:sz="4" w:space="0" w:color="auto"/>
+          <w:insideH w:val="single" w:sz="4" w:space="0" w:color="auto"/>
+          <w:insideV w:val="single" w:sz="4" w:space="0" w:color="auto"/>
+        </w:tblBorders>
+        <w:tblCellMar>
+          <w:left w:w="10" w:type="dxa"/>
+          <w:right w:w="10" w:type="dxa"/>
+        </w:tblCellMar>
+        <w:tblLook w:val="0000" w:firstRow="0" w:lastRow="0" w:firstColumn="0" w:lastColumn="0" w:noHBand="0" w:noVBand="0"/>
+      </w:tblPr>
+      <w:tblGrid>
+        <w:gridCol w:w="4000"/>
+        <w:gridCol w:w="5026"/>
+      </w:tblGrid>
+      <w:tr>
+        <w:tblPrEx>
+          <w:tblCellMar>
+            <w:top w:w="0" w:type="dxa"/>
+            <w:bottom w:w="0" w:type="dxa"/>
+          </w:tblCellMar>
+        </w:tblPrEx>
+        <w:trPr>
+          <w:tblHeader/>
+        </w:trPr>
+        <w:tc>
+          <w:tcPr>
+            <w:tcW w:w="4000" w:type="dxa"/>
+            <w:tcBorders>
+              <w:top w:val="single" w:sz="4" w:space="0" w:color="C9D6E2"/>
+              <w:left w:val="single" w:sz="4" w:space="0" w:color="C9D6E2"/>
+              <w:bottom w:val="single" w:sz="4" w:space="0" w:color="C9D6E2"/>
+              <w:right w:val="single" w:sz="4" w:space="0" w:color="C9D6E2"/>
+            </w:tcBorders>
+            <w:shd w:val="clear" w:color="auto" w:fill="002B49"/>
+            <w:tcMar>
+              <w:top w:w="80" w:type="dxa"/>
+              <w:left w:w="120" w:type="dxa"/>
+              <w:bottom w:w="80" w:type="dxa"/>
+              <w:right w:w="120" w:type="dxa"/>
+            </w:tcMar>
+          </w:tcPr>
+          <w:p>
+            <w:pPr>
+              <w:spacing w:line="276" w:lineRule="auto"/>
+            </w:pPr>
+            <w:r>
+              <w:rPr>
+                <w:b/>
+                <w:bCs/>
+                <w:color w:val="FFFFFF"/>
+              </w:rPr>
+              <w:t>Anno dell'edizione (</w:t>
+            </w:r>
+            <w:r>
+              <w:rPr>
+                <w:rFonts w:ascii="Consolas" w:eastAsia="Consolas" w:hAnsi="Consolas" w:cs="Consolas"/>
+                <w:b/>
+                <w:bCs/>
+                <w:color w:val="002B49"/>
+                <w:shd w:val="clear" w:color="auto" w:fill="EEF3F7"/>
+              </w:rPr>
+              <w:t>year</w:t>
+            </w:r>
+            <w:r>
+              <w:rPr>
+                <w:b/>
+                <w:bCs/>
+                <w:color w:val="FFFFFF"/>
+              </w:rPr>
+              <w:t>)</w:t>
+            </w:r>
+          </w:p>
+        </w:tc>
+        <w:tc>
+          <w:tcPr>
+            <w:tcW w:w="5026" w:type="dxa"/>
+            <w:tcBorders>
+              <w:top w:val="single" w:sz="4" w:space="0" w:color="C9D6E2"/>
+              <w:left w:val="single" w:sz="4" w:space="0" w:color="C9D6E2"/>
+              <w:bottom w:val="single" w:sz="4" w:space="0" w:color="C9D6E2"/>
+              <w:right w:val="single" w:sz="4" w:space="0" w:color="C9D6E2"/>
+            </w:tcBorders>
+            <w:shd w:val="clear" w:color="auto" w:fill="002B49"/>
+            <w:tcMar>
+              <w:top w:w="80" w:type="dxa"/>
+              <w:left w:w="120" w:type="dxa"/>
+              <w:bottom w:w="80" w:type="dxa"/>
+              <w:right w:w="120" w:type="dxa"/>
+            </w:tcMar>
+          </w:tcPr>
+          <w:p>
+            <w:pPr>
+              <w:spacing w:line="276" w:lineRule="auto"/>
+            </w:pPr>
+            <w:r>
+              <w:rPr>
+                <w:b/>
+                <w:bCs/>
+                <w:color w:val="FFFFFF"/>
+              </w:rPr>
+              <w:t>Scritta in copertina</w:t>
+            </w:r>
+          </w:p>
+        </w:tc>
+      </w:tr>
+      <w:tr>
+        <w:tblPrEx>
+          <w:tblCellMar>
+            <w:top w:w="0" w:type="dxa"/>
+            <w:bottom w:w="0" w:type="dxa"/>
+          </w:tblCellMar>
+        </w:tblPrEx>
+        <w:tc>
+          <w:tcPr>
+            <w:tcW w:w="4000" w:type="dxa"/>
+            <w:tcBorders>
+              <w:top w:val="single" w:sz="4" w:space="0" w:color="C9D6E2"/>
+              <w:left w:val="single" w:sz="4" w:space="0" w:color="C9D6E2"/>
+              <w:bottom w:val="single" w:sz="4" w:space="0" w:color="C9D6E2"/>
+              <w:right w:val="single" w:sz="4" w:space="0" w:color="C9D6E2"/>
+            </w:tcBorders>
+            <w:tcMar>
+              <w:top w:w="80" w:type="dxa"/>
+              <w:left w:w="120" w:type="dxa"/>
+              <w:bottom w:w="80" w:type="dxa"/>
+              <w:right w:w="120" w:type="dxa"/>
+            </w:tcMar>
+          </w:tcPr>
+          <w:p>
+            <w:pPr>
+              <w:spacing w:line="276" w:lineRule="auto"/>
+            </w:pPr>
+            <w:r>
+              <w:rPr>
+                <w:rFonts w:ascii="Consolas" w:eastAsia="Consolas" w:hAnsi="Consolas" w:cs="Consolas"/>
+                <w:color w:val="002B49"/>
+                <w:shd w:val="clear" w:color="auto" w:fill="EEF3F7"/>
+              </w:rPr>
+              <w:t>2027</w:t>
+            </w:r>
+          </w:p>
+        </w:tc>
+        <w:tc>
+          <w:tcPr>
+            <w:tcW w:w="5026" w:type="dxa"/>
+            <w:tcBorders>
+              <w:top w:val="single" w:sz="4" w:space="0" w:color="C9D6E2"/>
+              <w:left w:val="single" w:sz="4" w:space="0" w:color="C9D6E2"/>
+              <w:bottom w:val="single" w:sz="4" w:space="0" w:color="C9D6E2"/>
+              <w:right w:val="single" w:sz="4" w:space="0" w:color="C9D6E2"/>
+            </w:tcBorders>
+            <w:tcMar>
+              <w:top w:w="80" w:type="dxa"/>
+              <w:left w:w="120" w:type="dxa"/>
+              <w:bottom w:w="80" w:type="dxa"/>
+              <w:right w:w="120" w:type="dxa"/>
+            </w:tcMar>
+          </w:tcPr>
+          <w:p>
+            <w:pPr>
+              <w:spacing w:line="276" w:lineRule="auto"/>
+            </w:pPr>
+            <w:r>
+              <w:t>Edizione 2026-27</w:t>
+            </w:r>
+          </w:p>
+        </w:tc>
+      </w:tr>
+      <w:tr>
+        <w:tblPrEx>
+          <w:tblCellMar>
+            <w:top w:w="0" w:type="dxa"/>
+            <w:bottom w:w="0" w:type="dxa"/>
+          </w:tblCellMar>
+        </w:tblPrEx>
+        <w:tc>
+          <w:tcPr>
+            <w:tcW w:w="4000" w:type="dxa"/>
+            <w:tcBorders>
+              <w:top w:val="single" w:sz="4" w:space="0" w:color="C9D6E2"/>
+              <w:left w:val="single" w:sz="4" w:space="0" w:color="C9D6E2"/>
+              <w:bottom w:val="single" w:sz="4" w:space="0" w:color="C9D6E2"/>
+              <w:right w:val="single" w:sz="4" w:space="0" w:color="C9D6E2"/>
+            </w:tcBorders>
+            <w:tcMar>
+              <w:top w:w="80" w:type="dxa"/>
+              <w:left w:w="120" w:type="dxa"/>
+              <w:bottom w:w="80" w:type="dxa"/>
+              <w:right w:w="120" w:type="dxa"/>
+            </w:tcMar>
+          </w:tcPr>
+          <w:p>
+            <w:pPr>
+              <w:spacing w:line="276" w:lineRule="auto"/>
+            </w:pPr>
+            <w:r>
+              <w:rPr>
+                <w:rFonts w:ascii="Consolas" w:eastAsia="Consolas" w:hAnsi="Consolas" w:cs="Consolas"/>
+                <w:color w:val="002B49"/>
+                <w:shd w:val="clear" w:color="auto" w:fill="EEF3F7"/>
+              </w:rPr>
+              <w:t>2028</w:t>
+            </w:r>
+          </w:p>
+        </w:tc>
+        <w:tc>
+          <w:tcPr>
+            <w:tcW w:w="5026" w:type="dxa"/>
+            <w:tcBorders>
+              <w:top w:val="single" w:sz="4" w:space="0" w:color="C9D6E2"/>
+              <w:left w:val="single" w:sz="4" w:space="0" w:color="C9D6E2"/>
+              <w:bottom w:val="single" w:sz="4" w:space="0" w:color="C9D6E2"/>
+              <w:right w:val="single" w:sz="4" w:space="0" w:color="C9D6E2"/>
+            </w:tcBorders>
+            <w:tcMar>
+              <w:top w:w="80" w:type="dxa"/>
+              <w:left w:w="120" w:type="dxa"/>
+              <w:bottom w:w="80" w:type="dxa"/>
+              <w:right w:w="120" w:type="dxa"/>
+            </w:tcMar>
+          </w:tcPr>
+          <w:p>
+            <w:pPr>
+              <w:spacing w:line="276" w:lineRule="auto"/>
+            </w:pPr>
+            <w:r>
+              <w:t>Edizione 2027-28</w:t>
+            </w:r>
+          </w:p>
+        </w:tc>
+      </w:tr>
+      <w:tr>
+        <w:tblPrEx>
+          <w:tblCellMar>
+            <w:top w:w="0" w:type="dxa"/>
+            <w:bottom w:w="0" w:type="dxa"/>
+          </w:tblCellMar>
+        </w:tblPrEx>
+        <w:tc>
+          <w:tcPr>
+            <w:tcW w:w="4000" w:type="dxa"/>
+            <w:tcBorders>
+              <w:top w:val="single" w:sz="4" w:space="0" w:color="C9D6E2"/>
+              <w:left w:val="single" w:sz="4" w:space="0" w:color="C9D6E2"/>
+              <w:bottom w:val="single" w:sz="4" w:space="0" w:color="C9D6E2"/>
+              <w:right w:val="single" w:sz="4" w:space="0" w:color="C9D6E2"/>
+            </w:tcBorders>
+            <w:tcMar>
+              <w:top w:w="80" w:type="dxa"/>
+              <w:left w:w="120" w:type="dxa"/>
+              <w:bottom w:w="80" w:type="dxa"/>
+              <w:right w:w="120" w:type="dxa"/>
+            </w:tcMar>
+          </w:tcPr>
+          <w:p>
+            <w:pPr>
+              <w:spacing w:line="276" w:lineRule="auto"/>
+            </w:pPr>
+            <w:r>
+              <w:rPr>
+                <w:rFonts w:ascii="Consolas" w:eastAsia="Consolas" w:hAnsi="Consolas" w:cs="Consolas"/>
+                <w:color w:val="002B49"/>
+                <w:shd w:val="clear" w:color="auto" w:fill="EEF3F7"/>
+              </w:rPr>
+              <w:t>2029</w:t>
+            </w:r>
+          </w:p>
+        </w:tc>
+        <w:tc>
+          <w:tcPr>
+            <w:tcW w:w="5026" w:type="dxa"/>
+            <w:tcBorders>
+              <w:top w:val="single" w:sz="4" w:space="0" w:color="C9D6E2"/>
+              <w:left w:val="single" w:sz="4" w:space="0" w:color="C9D6E2"/>
+              <w:bottom w:val="single" w:sz="4" w:space="0" w:color="C9D6E2"/>
+              <w:right w:val="single" w:sz="4" w:space="0" w:color="C9D6E2"/>
+            </w:tcBorders>
+            <w:tcMar>
+              <w:top w:w="80" w:type="dxa"/>
+              <w:left w:w="120" w:type="dxa"/>
+              <w:bottom w:w="80" w:type="dxa"/>
+              <w:right w:w="120" w:type="dxa"/>
+            </w:tcMar>
+          </w:tcPr>
+          <w:p>
+            <w:pPr>
+              <w:spacing w:line="276" w:lineRule="auto"/>
+            </w:pPr>
+            <w:r>
+              <w:t>Edizione 2028-29</w:t>
+            </w:r>
+          </w:p>
+        </w:tc>
+      </w:tr>
+      <w:tr>
+        <w:tblPrEx>
+          <w:tblCellMar>
+            <w:top w:w="0" w:type="dxa"/>
+            <w:bottom w:w="0" w:type="dxa"/>
+          </w:tblCellMar>
+        </w:tblPrEx>
+        <w:tc>
+          <w:tcPr>
+            <w:tcW w:w="4000" w:type="dxa"/>
+            <w:tcBorders>
+              <w:top w:val="single" w:sz="4" w:space="0" w:color="C9D6E2"/>
+              <w:left w:val="single" w:sz="4" w:space="0" w:color="C9D6E2"/>
+              <w:bottom w:val="single" w:sz="4" w:space="0" w:color="C9D6E2"/>
+              <w:right w:val="single" w:sz="4" w:space="0" w:color="C9D6E2"/>
+            </w:tcBorders>
+            <w:tcMar>
+              <w:top w:w="80" w:type="dxa"/>
+              <w:left w:w="120" w:type="dxa"/>
+              <w:bottom w:w="80" w:type="dxa"/>
+              <w:right w:w="120" w:type="dxa"/>
+            </w:tcMar>
+          </w:tcPr>
+          <w:p>
+            <w:pPr>
+              <w:spacing w:line="276" w:lineRule="auto"/>
+            </w:pPr>
+            <w:r>
+              <w:rPr>
+                <w:rFonts w:ascii="Consolas" w:eastAsia="Consolas" w:hAnsi="Consolas" w:cs="Consolas"/>
+                <w:color w:val="002B49"/>
+                <w:shd w:val="clear" w:color="auto" w:fill="EEF3F7"/>
+              </w:rPr>
+              <w:t>2030</w:t>
+            </w:r>
+          </w:p>
+        </w:tc>
+        <w:tc>
+          <w:tcPr>
+            <w:tcW w:w="5026" w:type="dxa"/>
+            <w:tcBorders>
+              <w:top w:val="single" w:sz="4" w:space="0" w:color="C9D6E2"/>
+              <w:left w:val="single" w:sz="4" w:space="0" w:color="C9D6E2"/>
+              <w:bottom w:val="single" w:sz="4" w:space="0" w:color="C9D6E2"/>
+              <w:right w:val="single" w:sz="4" w:space="0" w:color="C9D6E2"/>
+            </w:tcBorders>
+            <w:tcMar>
+              <w:top w:w="80" w:type="dxa"/>
+              <w:left w:w="120" w:type="dxa"/>
+              <w:bottom w:w="80" w:type="dxa"/>
+              <w:right w:w="120" w:type="dxa"/>
+            </w:tcMar>
+          </w:tcPr>
+          <w:p>
+            <w:pPr>
+              <w:spacing w:line="276" w:lineRule="auto"/>
+            </w:pPr>
+            <w:r>
+              <w:t>Edizione 2029-30</w:t>
+            </w:r>
+          </w:p>
+        </w:tc>
+      </w:tr>
+    </w:tbl>
+    <w:p>
+      <w:pPr>
+        <w:spacing w:after="120"/>
+      </w:pPr>
+    </w:p>
+    <w:p>
+      <w:pPr>
+        <w:spacing w:after="120" w:line="290" w:lineRule="auto"/>
+      </w:pPr>
+      <w:r>
+        <w:t xml:space="preserve">Quindi, per ogni nuovo anno, basta aggiornare </w:t>
+      </w:r>
+      <w:r>
+        <w:rPr>
+          <w:rFonts w:ascii="Consolas" w:eastAsia="Consolas" w:hAnsi="Consolas" w:cs="Consolas"/>
+          <w:color w:val="002B49"/>
+          <w:shd w:val="clear" w:color="auto" w:fill="EEF3F7"/>
+        </w:rPr>
+        <w:t>year</w:t>
+      </w:r>
+      <w:r>
+        <w:t xml:space="preserve"> nel file </w:t>
+      </w:r>
+      <w:r>
+        <w:rPr>
+          <w:rFonts w:ascii="Consolas" w:eastAsia="Consolas" w:hAnsi="Consolas" w:cs="Consolas"/>
+          <w:color w:val="002B49"/>
+          <w:shd w:val="clear" w:color="auto" w:fill="EEF3F7"/>
+        </w:rPr>
+        <w:t>current-edition.ts</w:t>
+      </w:r>
+      <w:r>
+        <w:t xml:space="preserve"> (lo fai comunque per aprire gli invii) e la copertina si aggiorna da sola. Per esempio, per avere </w:t>
+      </w:r>
+      <w:r>
+        <w:rPr>
+          <w:b/>
+          <w:bCs/>
+        </w:rPr>
+        <w:t>Edizione 2027-28</w:t>
+      </w:r>
+      <w:r>
+        <w:t xml:space="preserve"> scrivi </w:t>
+      </w:r>
+      <w:r>
+        <w:rPr>
+          <w:rFonts w:ascii="Consolas" w:eastAsia="Consolas" w:hAnsi="Consolas" w:cs="Consolas"/>
+          <w:color w:val="002B49"/>
+          <w:shd w:val="clear" w:color="auto" w:fill="EEF3F7"/>
+        </w:rPr>
+        <w:t>year: 2028,</w:t>
+      </w:r>
+      <w:r>
+        <w:t>.</w:t>
+      </w:r>
+    </w:p>
+    <w:p>
+      <w:pPr>
+        <w:spacing w:after="120" w:line="290" w:lineRule="auto"/>
+      </w:pPr>
+      <w:r>
+        <w:t>Se un anno vuoi una scritta diversa (per esempio "Edizione speciale"), puoi indicarla al momento della generazione:</w:t>
+      </w:r>
+    </w:p>
+    <w:p>
+      <w:pPr>
+        <w:pBdr>
+          <w:left w:val="single" w:sz="12" w:space="6" w:color="0066B2"/>
+        </w:pBdr>
+        <w:shd w:val="clear" w:color="auto" w:fill="EEF3F7"/>
+        <w:spacing w:before="80" w:after="160"/>
+        <w:ind w:left="240" w:right="240"/>
+      </w:pPr>
+      <w:r>
+        <w:rPr>
+          <w:rFonts w:ascii="Consolas" w:eastAsia="Consolas" w:hAnsi="Consolas" w:cs="Consolas"/>
+          <w:color w:val="002B49"/>
+          <w:sz w:val="20"/>
+          <w:szCs w:val="20"/>
+        </w:rPr>
+        <w:t>npm run generate:pdf -- --subtitle="Edizione speciale"</w:t>
+      </w:r>
+    </w:p>
+    <w:p>
+      <w:pPr>
+        <w:spacing w:after="120" w:line="290" w:lineRule="auto"/>
+      </w:pPr>
+      <w:r>
+        <w:rPr>
+          <w:b/>
+          <w:bCs/>
+        </w:rPr>
+        <w:t>Cambiare il logo:</w:t>
+      </w:r>
+      <w:r>
+        <w:t xml:space="preserve"> il cherubino della copertina (e delle cornici di ogni pagina) è il file </w:t>
+      </w:r>
+      <w:r>
+        <w:rPr>
+          <w:rFonts w:ascii="Consolas" w:eastAsia="Consolas" w:hAnsi="Consolas" w:cs="Consolas"/>
+          <w:color w:val="002B49"/>
+          <w:shd w:val="clear" w:color="auto" w:fill="EEF3F7"/>
+        </w:rPr>
+        <w:t>public/brand/cherubino-annuario.jpg</w:t>
+      </w:r>
+      <w:r>
+        <w:t xml:space="preserve">. Per usare un logo diverso, sostituisci quel file con un'immagine </w:t>
+      </w:r>
+      <w:r>
+        <w:rPr>
+          <w:b/>
+          <w:bCs/>
+        </w:rPr>
+        <w:t>quadrata</w:t>
+      </w:r>
+      <w:r>
+        <w:t xml:space="preserve"> in formato .jpg, </w:t>
+      </w:r>
+      <w:r>
+        <w:rPr>
+          <w:b/>
+          <w:bCs/>
+        </w:rPr>
+        <w:t>con lo stesso nome</w:t>
+      </w:r>
+      <w:r>
+        <w:t>, e rigenera il PDF. Attenzione: lo stesso file è usato anche nella Home del sito.</w:t>
+      </w:r>
+    </w:p>
+    <w:p>
+      <w:pPr>
+        <w:pBdr>
+          <w:left w:val="single" w:sz="24" w:space="8" w:color="0066B2"/>
+        </w:pBdr>
+        <w:shd w:val="clear" w:color="auto" w:fill="E8F1F9"/>
+        <w:spacing w:before="120" w:after="200" w:line="290" w:lineRule="auto"/>
+        <w:ind w:left="200" w:right="200"/>
+      </w:pPr>
+      <w:r>
+        <w:rPr>
+          <w:b/>
+          <w:bCs/>
+          <w:color w:val="0066B2"/>
+        </w:rPr>
+        <w:lastRenderedPageBreak/>
+        <w:t xml:space="preserve">Nota. </w:t>
+      </w:r>
+      <w:r>
+        <w:t xml:space="preserve">La scritta in copertina si crea solo quando generi il PDF. Se hai già generato un PDF con l'anno sbagliato, correggi </w:t>
+      </w:r>
+      <w:r>
+        <w:rPr>
+          <w:rFonts w:ascii="Consolas" w:eastAsia="Consolas" w:hAnsi="Consolas" w:cs="Consolas"/>
+          <w:color w:val="002B49"/>
+          <w:shd w:val="clear" w:color="auto" w:fill="EEF3F7"/>
+        </w:rPr>
+        <w:t>year</w:t>
+      </w:r>
+      <w:r>
+        <w:t xml:space="preserve"> (oppure usa l'opzione </w:t>
+      </w:r>
+      <w:r>
+        <w:rPr>
+          <w:rFonts w:ascii="Consolas" w:eastAsia="Consolas" w:hAnsi="Consolas" w:cs="Consolas"/>
+          <w:color w:val="002B49"/>
+          <w:shd w:val="clear" w:color="auto" w:fill="EEF3F7"/>
+        </w:rPr>
+        <w:t>--year=2028</w:t>
+      </w:r>
+      <w:r>
+        <w:t>) e generalo di nuovo.</w:t>
+      </w:r>
+    </w:p>
+    <w:p>
+      <w:pPr>
+        <w:pStyle w:val="Titolo2"/>
+      </w:pPr>
+      <w:bookmarkStart w:id="22" w:name="_Toc241909299"/>
+      <w:r>
+        <w:t>Premessa</w:t>
+      </w:r>
+      <w:bookmarkEnd w:id="22"/>
+    </w:p>
+    <w:p>
+      <w:pPr>
+        <w:spacing w:after="120" w:line="290" w:lineRule="auto"/>
+      </w:pPr>
+      <w:r>
+        <w:t xml:space="preserve">Di default la pagina 1 contiene la </w:t>
+      </w:r>
+      <w:r>
+        <w:rPr>
+          <w:b/>
+          <w:bCs/>
+        </w:rPr>
+        <w:t>stessa premessa della prima edizione</w:t>
+      </w:r>
+      <w:r>
+        <w:t xml:space="preserve">, presa dal file </w:t>
+      </w:r>
+      <w:r>
+        <w:rPr>
+          <w:rFonts w:ascii="Consolas" w:eastAsia="Consolas" w:hAnsi="Consolas" w:cs="Consolas"/>
+          <w:color w:val="002B49"/>
+          <w:shd w:val="clear" w:color="auto" w:fill="EEF3F7"/>
+        </w:rPr>
+        <w:t>content/premessa.txt</w:t>
+      </w:r>
+      <w:r>
+        <w:t>. Per scrivere una premessa diversa per un certo anno:</w:t>
+      </w:r>
     </w:p>
     <w:p>
       <w:pPr>
@@ -5923,7 +6616,7 @@
         <w:spacing w:after="80" w:line="290" w:lineRule="auto"/>
       </w:pPr>
       <w:r>
-        <w:t xml:space="preserve">Nella cartella del progetto crea la cartella </w:t>
+        <w:t xml:space="preserve">Nella cartella </w:t>
       </w:r>
       <w:r>
         <w:rPr>
@@ -5934,7 +6627,18 @@
         <w:t>content</w:t>
       </w:r>
       <w:r>
-        <w:t>, se non c'è già.</w:t>
+        <w:t xml:space="preserve"> del progetto crea un file di testo chiamato </w:t>
+      </w:r>
+      <w:r>
+        <w:rPr>
+          <w:rFonts w:ascii="Consolas" w:eastAsia="Consolas" w:hAnsi="Consolas" w:cs="Consolas"/>
+          <w:color w:val="002B49"/>
+          <w:shd w:val="clear" w:color="auto" w:fill="EEF3F7"/>
+        </w:rPr>
+        <w:t>premessa-2028.txt</w:t>
+      </w:r>
+      <w:r>
+        <w:t xml:space="preserve"> (con l'anno dell'edizione).</w:t>
       </w:r>
     </w:p>
     <w:p>
@@ -5947,7 +6651,15 @@
         <w:spacing w:after="80" w:line="290" w:lineRule="auto"/>
       </w:pPr>
       <w:r>
-        <w:t xml:space="preserve">Dentro crea un file di testo chiamato </w:t>
+        <w:t>Scrivi il testo della premessa. Lascia una riga vuota tra un paragrafo e l'altro. Salva.</w:t>
+      </w:r>
+    </w:p>
+    <w:p>
+      <w:pPr>
+        <w:spacing w:after="120" w:line="290" w:lineRule="auto"/>
+      </w:pPr>
+      <w:r>
+        <w:t xml:space="preserve">Se il file dell'anno c'è, viene usato quello; altrimenti si usa </w:t>
       </w:r>
       <w:r>
         <w:rPr>
@@ -5955,42 +6667,32 @@
           <w:color w:val="002B49"/>
           <w:shd w:val="clear" w:color="auto" w:fill="EEF3F7"/>
         </w:rPr>
-        <w:t>premessa-2027.txt</w:t>
-      </w:r>
-      <w:r>
-        <w:t xml:space="preserve"> (con l'anno dell'edizione).</w:t>
-      </w:r>
-    </w:p>
-    <w:p>
-      <w:pPr>
-        <w:pStyle w:val="Paragrafoelenco"/>
-        <w:numPr>
-          <w:ilvl w:val="0"/>
-          <w:numId w:val="10"/>
-        </w:numPr>
-        <w:spacing w:after="80" w:line="290" w:lineRule="auto"/>
-      </w:pPr>
-      <w:r>
-        <w:t>Scrivi il testo della premessa. Lascia una riga vuota tra un paragrafo e l'altro. Salva.</w:t>
-      </w:r>
-    </w:p>
-    <w:p>
-      <w:pPr>
-        <w:spacing w:after="120" w:line="290" w:lineRule="auto"/>
-      </w:pPr>
-      <w:r>
-        <w:t>Se il file non c'è, la pagina 1 contiene solo la legenda delle facoltà.</w:t>
+        <w:t>content/premessa.txt</w:t>
+      </w:r>
+      <w:r>
+        <w:t xml:space="preserve">. Per cambiare la premessa di tutti gli anni futuri, modifica direttamente </w:t>
+      </w:r>
+      <w:r>
+        <w:rPr>
+          <w:rFonts w:ascii="Consolas" w:eastAsia="Consolas" w:hAnsi="Consolas" w:cs="Consolas"/>
+          <w:color w:val="002B49"/>
+          <w:shd w:val="clear" w:color="auto" w:fill="EEF3F7"/>
+        </w:rPr>
+        <w:t>content/premessa.txt</w:t>
+      </w:r>
+      <w:r>
+        <w:t>.</w:t>
       </w:r>
     </w:p>
     <w:p>
       <w:pPr>
         <w:pStyle w:val="Titolo2"/>
       </w:pPr>
-      <w:bookmarkStart w:id="22" w:name="_Toc241395060"/>
+      <w:bookmarkStart w:id="23" w:name="_Toc241909300"/>
       <w:r>
         <w:t>Generare il PDF</w:t>
       </w:r>
-      <w:bookmarkEnd w:id="22"/>
+      <w:bookmarkEnd w:id="23"/>
     </w:p>
     <w:p>
       <w:pPr>
@@ -6099,11 +6801,11 @@
       <w:pPr>
         <w:pStyle w:val="Titolo2"/>
       </w:pPr>
-      <w:bookmarkStart w:id="23" w:name="_Toc241395061"/>
+      <w:bookmarkStart w:id="24" w:name="_Toc241909301"/>
       <w:r>
         <w:t>Opzioni utili</w:t>
       </w:r>
-      <w:bookmarkEnd w:id="23"/>
+      <w:bookmarkEnd w:id="24"/>
     </w:p>
     <w:p>
       <w:pPr>
@@ -6172,7 +6874,7 @@
         <w:t>current-edition.ts</w:t>
       </w:r>
       <w:r>
-        <w:t>).</w:t>
+        <w:t>); cambia anche la scritta in copertina.</w:t>
       </w:r>
     </w:p>
     <w:p>
@@ -6193,7 +6895,7 @@
         <w:t>--subtitle</w:t>
       </w:r>
       <w:r>
-        <w:t>: il testo sotto il cherubino in copertina (di default "Edizione 2027").</w:t>
+        <w:t>: sostituisce la scritta automatica della copertina (di default l'anno accademico, per esempio "Edizione 2026-27").</w:t>
       </w:r>
     </w:p>
     <w:p>
@@ -6222,12 +6924,12 @@
         <w:pStyle w:val="Titolo1"/>
         <w:pageBreakBefore/>
       </w:pPr>
-      <w:bookmarkStart w:id="24" w:name="_Toc241395062"/>
+      <w:bookmarkStart w:id="25" w:name="_Toc241909302"/>
       <w:r>
         <w:lastRenderedPageBreak/>
         <w:t>7. Pubblicare una nuova edizione nell'Archivio</w:t>
       </w:r>
-      <w:bookmarkEnd w:id="24"/>
+      <w:bookmarkEnd w:id="25"/>
     </w:p>
     <w:p>
       <w:pPr>
@@ -6292,7 +6994,17 @@
         <w:spacing w:after="80" w:line="290" w:lineRule="auto"/>
       </w:pPr>
       <w:r>
-        <w:t xml:space="preserve">Prepara l'immagine di copertina (per esempio uno screenshot della prima pagina del PDF, in formato .jpg) e copiala nella cartella </w:t>
+        <w:t xml:space="preserve">Prepara l'immagine che rappresenta l'edizione nella pagina Archivio del sito: apri il PDF, fai uno screenshot della </w:t>
+      </w:r>
+      <w:r>
+        <w:rPr>
+          <w:b/>
+          <w:bCs/>
+        </w:rPr>
+        <w:t>prima pagina</w:t>
+      </w:r>
+      <w:r>
+        <w:t xml:space="preserve"> (quella con il logo e la scritta "Edizione 2026-27"), salvalo in formato .jpg e copialo nella cartella </w:t>
       </w:r>
       <w:r>
         <w:rPr>
@@ -6513,22 +7225,22 @@
         <w:pStyle w:val="Titolo1"/>
         <w:pageBreakBefore/>
       </w:pPr>
-      <w:bookmarkStart w:id="25" w:name="_Toc241395063"/>
+      <w:bookmarkStart w:id="26" w:name="_Toc241909303"/>
       <w:r>
         <w:lastRenderedPageBreak/>
         <w:t>8. Altre modifiche frequenti</w:t>
       </w:r>
-      <w:bookmarkEnd w:id="25"/>
+      <w:bookmarkEnd w:id="26"/>
     </w:p>
     <w:p>
       <w:pPr>
         <w:pStyle w:val="Titolo2"/>
       </w:pPr>
-      <w:bookmarkStart w:id="26" w:name="_Toc241395064"/>
+      <w:bookmarkStart w:id="27" w:name="_Toc241909304"/>
       <w:r>
         <w:t>Cambiare la foto di sfondo della Home</w:t>
       </w:r>
-      <w:bookmarkEnd w:id="26"/>
+      <w:bookmarkEnd w:id="27"/>
     </w:p>
     <w:p>
       <w:pPr>
@@ -6608,11 +7320,11 @@
       <w:pPr>
         <w:pStyle w:val="Titolo2"/>
       </w:pPr>
-      <w:bookmarkStart w:id="27" w:name="_Toc241395065"/>
+      <w:bookmarkStart w:id="28" w:name="_Toc241909305"/>
       <w:r>
         <w:t>Cambiare i testi del sito</w:t>
       </w:r>
-      <w:bookmarkEnd w:id="27"/>
+      <w:bookmarkEnd w:id="28"/>
     </w:p>
     <w:p>
       <w:pPr>
@@ -7310,12 +8022,12 @@
         <w:pStyle w:val="Titolo1"/>
         <w:pageBreakBefore/>
       </w:pPr>
-      <w:bookmarkStart w:id="28" w:name="_Toc241395066"/>
+      <w:bookmarkStart w:id="29" w:name="_Toc241909306"/>
       <w:r>
         <w:lastRenderedPageBreak/>
         <w:t>9. Password, chiavi e variabili d'ambiente</w:t>
       </w:r>
-      <w:bookmarkEnd w:id="28"/>
+      <w:bookmarkEnd w:id="29"/>
     </w:p>
     <w:p>
       <w:pPr>
@@ -7897,11 +8609,11 @@
       <w:pPr>
         <w:pStyle w:val="Titolo2"/>
       </w:pPr>
-      <w:bookmarkStart w:id="29" w:name="_Toc241395067"/>
+      <w:bookmarkStart w:id="30" w:name="_Toc241909307"/>
       <w:r>
         <w:t>Recuperare il file .env.local su un nuovo computer</w:t>
       </w:r>
-      <w:bookmarkEnd w:id="29"/>
+      <w:bookmarkEnd w:id="30"/>
     </w:p>
     <w:p>
       <w:pPr>
@@ -8116,12 +8828,12 @@
         <w:pStyle w:val="Titolo1"/>
         <w:pageBreakBefore/>
       </w:pPr>
-      <w:bookmarkStart w:id="30" w:name="_Toc241395068"/>
+      <w:bookmarkStart w:id="31" w:name="_Toc241909308"/>
       <w:r>
         <w:lastRenderedPageBreak/>
         <w:t>10. Privacy e regole</w:t>
       </w:r>
-      <w:bookmarkEnd w:id="30"/>
+      <w:bookmarkEnd w:id="31"/>
     </w:p>
     <w:p>
       <w:pPr>
@@ -8220,12 +8932,12 @@
         <w:pStyle w:val="Titolo1"/>
         <w:pageBreakBefore/>
       </w:pPr>
-      <w:bookmarkStart w:id="31" w:name="_Toc241395069"/>
+      <w:bookmarkStart w:id="32" w:name="_Toc241909309"/>
       <w:r>
         <w:lastRenderedPageBreak/>
         <w:t>11. Se qualcosa va storto</w:t>
       </w:r>
-      <w:bookmarkEnd w:id="31"/>
+      <w:bookmarkEnd w:id="32"/>
     </w:p>
     <w:tbl>
       <w:tblPr>
@@ -8807,12 +9519,12 @@
         <w:pStyle w:val="Titolo1"/>
         <w:pageBreakBefore/>
       </w:pPr>
-      <w:bookmarkStart w:id="32" w:name="_Toc241395070"/>
+      <w:bookmarkStart w:id="33" w:name="_Toc241909310"/>
       <w:r>
         <w:lastRenderedPageBreak/>
         <w:t>12. Promemoria di ogni anno</w:t>
       </w:r>
-      <w:bookmarkEnd w:id="32"/>
+      <w:bookmarkEnd w:id="33"/>
     </w:p>
     <w:p>
       <w:pPr>
@@ -8903,7 +9615,7 @@
         <w:spacing w:after="80" w:line="290" w:lineRule="auto"/>
       </w:pPr>
       <w:r>
-        <w:t xml:space="preserve">Scrivi la premessa in </w:t>
+        <w:t xml:space="preserve">Se vuoi una premessa diversa da quella della prima edizione, scrivila in </w:t>
       </w:r>
       <w:r>
         <w:rPr>
@@ -8914,7 +9626,7 @@
         <w:t>content/premessa-ANNO.txt</w:t>
       </w:r>
       <w:r>
-        <w:t xml:space="preserve"> (facoltativa) e genera il PDF (capitolo 6). Controllalo bene.</w:t>
+        <w:t>. Genera il PDF (capitolo 6) e controlla che in copertina ci sia l'anno accademico giusto (per esempio "Edizione 2027-28" per l'edizione 2028).</w:t>
       </w:r>
     </w:p>
     <w:p>
@@ -9062,10 +9774,67 @@
 <file path=word/numbering.xml><?xml version="1.0" encoding="utf-8"?>
 <w:numbering xmlns:wpc="http://schemas.microsoft.com/office/word/2010/wordprocessingCanvas" xmlns:cx="http://schemas.microsoft.com/office/drawing/2014/chartex" xmlns:cx1="http://schemas.microsoft.com/office/drawing/2015/9/8/chartex" xmlns:cx2="http://schemas.microsoft.com/office/drawing/2015/10/21/chartex" xmlns:cx3="http://schemas.microsoft.com/office/drawing/2016/5/9/chartex" xmlns:cx4="http://schemas.microsoft.com/office/drawing/2016/5/10/chartex" xmlns:cx5="http://schemas.microsoft.com/office/drawing/2016/5/11/chartex" xmlns:cx6="http://schemas.microsoft.com/office/drawing/2016/5/12/chartex" xmlns:cx7="http://schemas.microsoft.com/office/drawing/2016/5/13/chartex" xmlns:cx8="http://schemas.microsoft.com/office/drawing/2016/5/14/chartex" xmlns:mc="http://schemas.openxmlformats.org/markup-compatibility/2006" xmlns:aink="http://schemas.microsoft.com/office/drawing/2016/ink" xmlns:am3d="http://schemas.microsoft.com/office/drawing/2017/model3d" xmlns:o="urn:schemas-microsoft-com:office:office" xmlns:oel="http://schemas.microsoft.com/office/2019/extlst" xmlns:r="http://schemas.openxmlformats.org/officeDocument/2006/relationships" xmlns:m="http://schemas.openxmlformats.org/officeDocument/2006/math" xmlns:v="urn:schemas-microsoft-com:vml" xmlns:wp14="http://schemas.microsoft.com/office/word/2010/wordprocessingDrawing" xmlns:wp="http://schemas.openxmlformats.org/drawingml/2006/wordprocessingDrawing" xmlns:w10="urn:schemas-microsoft-com:office:word" xmlns:w="http://schemas.openxmlformats.org/wordprocessingml/2006/main" xmlns:w14="http://schemas.microsoft.com/office/word/2010/wordml" xmlns:w15="http://schemas.microsoft.com/office/word/2012/wordml" xmlns:w16cex="http://schemas.microsoft.com/office/word/2018/wordml/cex" xmlns:w16cid="http://schemas.microsoft.com/office/word/2016/wordml/cid" xmlns:w16="http://schemas.microsoft.com/office/word/2018/wordml" xmlns:w16sdtdh="http://schemas.microsoft.com/office/word/2020/wordml/sdtdatahash" xmlns:w16se="http://schemas.microsoft.com/office/word/2015/wordml/symex" xmlns:wpg="http://schemas.microsoft.com/office/word/2010/wordprocessingGroup" xmlns:wpi="http://schemas.microsoft.com/office/word/2010/wordprocessingInk" xmlns:wne="http://schemas.microsoft.com/office/word/2006/wordml" xmlns:wps="http://schemas.microsoft.com/office/word/2010/wordprocessingShape" mc:Ignorable="w14 w15 w16se w16cid w16 w16cex w16sdtdh wp14">
   <w:abstractNum w:abstractNumId="0" w15:restartNumberingAfterBreak="0">
-    <w:nsid w:val="24E35DD6"/>
+    <w:nsid w:val="55F140F7"/>
     <w:multiLevelType w:val="hybridMultilevel"/>
-    <w:tmpl w:val="496AEF9A"/>
-    <w:lvl w:ilvl="0" w:tplc="784ECA50">
+    <w:tmpl w:val="F698AFB6"/>
+    <w:lvl w:ilvl="0" w:tplc="44D04238">
+      <w:start w:val="1"/>
+      <w:numFmt w:val="bullet"/>
+      <w:lvlText w:val="•"/>
+      <w:lvlJc w:val="left"/>
+      <w:pPr>
+        <w:ind w:left="540" w:hanging="300"/>
+      </w:pPr>
+      <w:rPr>
+        <w:color w:val="0066B2"/>
+      </w:rPr>
+    </w:lvl>
+    <w:lvl w:ilvl="1" w:tplc="D07CAA9E">
+      <w:numFmt w:val="decimal"/>
+      <w:lvlText w:val=""/>
+      <w:lvlJc w:val="left"/>
+    </w:lvl>
+    <w:lvl w:ilvl="2" w:tplc="E2F44304">
+      <w:numFmt w:val="decimal"/>
+      <w:lvlText w:val=""/>
+      <w:lvlJc w:val="left"/>
+    </w:lvl>
+    <w:lvl w:ilvl="3" w:tplc="5E042AEC">
+      <w:numFmt w:val="decimal"/>
+      <w:lvlText w:val=""/>
+      <w:lvlJc w:val="left"/>
+    </w:lvl>
+    <w:lvl w:ilvl="4" w:tplc="280A6CE2">
+      <w:numFmt w:val="decimal"/>
+      <w:lvlText w:val=""/>
+      <w:lvlJc w:val="left"/>
+    </w:lvl>
+    <w:lvl w:ilvl="5" w:tplc="93AC90B8">
+      <w:numFmt w:val="decimal"/>
+      <w:lvlText w:val=""/>
+      <w:lvlJc w:val="left"/>
+    </w:lvl>
+    <w:lvl w:ilvl="6" w:tplc="5E24EFB0">
+      <w:numFmt w:val="decimal"/>
+      <w:lvlText w:val=""/>
+      <w:lvlJc w:val="left"/>
+    </w:lvl>
+    <w:lvl w:ilvl="7" w:tplc="C3424618">
+      <w:numFmt w:val="decimal"/>
+      <w:lvlText w:val=""/>
+      <w:lvlJc w:val="left"/>
+    </w:lvl>
+    <w:lvl w:ilvl="8" w:tplc="5C06B898">
+      <w:numFmt w:val="decimal"/>
+      <w:lvlText w:val=""/>
+      <w:lvlJc w:val="left"/>
+    </w:lvl>
+  </w:abstractNum>
+  <w:abstractNum w:abstractNumId="1" w15:restartNumberingAfterBreak="0">
+    <w:nsid w:val="5B9E7E8A"/>
+    <w:multiLevelType w:val="hybridMultilevel"/>
+    <w:tmpl w:val="97340ABE"/>
+    <w:lvl w:ilvl="0" w:tplc="9B465610">
       <w:start w:val="1"/>
       <w:numFmt w:val="decimal"/>
       <w:lvlText w:val="%1."/>
@@ -9079,109 +9848,52 @@
         <w:color w:val="002B49"/>
       </w:rPr>
     </w:lvl>
-    <w:lvl w:ilvl="1" w:tplc="DC7AE864">
+    <w:lvl w:ilvl="1" w:tplc="FB72020A">
       <w:numFmt w:val="decimal"/>
       <w:lvlText w:val=""/>
       <w:lvlJc w:val="left"/>
     </w:lvl>
-    <w:lvl w:ilvl="2" w:tplc="C896B14E">
+    <w:lvl w:ilvl="2" w:tplc="939414FA">
       <w:numFmt w:val="decimal"/>
       <w:lvlText w:val=""/>
       <w:lvlJc w:val="left"/>
     </w:lvl>
-    <w:lvl w:ilvl="3" w:tplc="A74CBDE4">
+    <w:lvl w:ilvl="3" w:tplc="1D5A87DC">
       <w:numFmt w:val="decimal"/>
       <w:lvlText w:val=""/>
       <w:lvlJc w:val="left"/>
     </w:lvl>
-    <w:lvl w:ilvl="4" w:tplc="69ECE244">
+    <w:lvl w:ilvl="4" w:tplc="9C169530">
       <w:numFmt w:val="decimal"/>
       <w:lvlText w:val=""/>
       <w:lvlJc w:val="left"/>
     </w:lvl>
-    <w:lvl w:ilvl="5" w:tplc="CD9EDD82">
+    <w:lvl w:ilvl="5" w:tplc="FF4A72F4">
       <w:numFmt w:val="decimal"/>
       <w:lvlText w:val=""/>
       <w:lvlJc w:val="left"/>
     </w:lvl>
-    <w:lvl w:ilvl="6" w:tplc="4EB27A4C">
+    <w:lvl w:ilvl="6" w:tplc="89F27A28">
       <w:numFmt w:val="decimal"/>
       <w:lvlText w:val=""/>
       <w:lvlJc w:val="left"/>
     </w:lvl>
-    <w:lvl w:ilvl="7" w:tplc="4AE6CEC6">
+    <w:lvl w:ilvl="7" w:tplc="DC6259D0">
       <w:numFmt w:val="decimal"/>
       <w:lvlText w:val=""/>
       <w:lvlJc w:val="left"/>
     </w:lvl>
-    <w:lvl w:ilvl="8" w:tplc="1B12F672">
-      <w:numFmt w:val="decimal"/>
-      <w:lvlText w:val=""/>
-      <w:lvlJc w:val="left"/>
-    </w:lvl>
-  </w:abstractNum>
-  <w:abstractNum w:abstractNumId="1" w15:restartNumberingAfterBreak="0">
-    <w:nsid w:val="2D3B74F7"/>
-    <w:multiLevelType w:val="hybridMultilevel"/>
-    <w:tmpl w:val="F006DE6A"/>
-    <w:lvl w:ilvl="0" w:tplc="2CE4B460">
-      <w:start w:val="1"/>
-      <w:numFmt w:val="bullet"/>
-      <w:lvlText w:val="•"/>
-      <w:lvlJc w:val="left"/>
-      <w:pPr>
-        <w:ind w:left="540" w:hanging="300"/>
-      </w:pPr>
-      <w:rPr>
-        <w:color w:val="0066B2"/>
-      </w:rPr>
-    </w:lvl>
-    <w:lvl w:ilvl="1" w:tplc="3636392E">
-      <w:numFmt w:val="decimal"/>
-      <w:lvlText w:val=""/>
-      <w:lvlJc w:val="left"/>
-    </w:lvl>
-    <w:lvl w:ilvl="2" w:tplc="FE1C3A7E">
-      <w:numFmt w:val="decimal"/>
-      <w:lvlText w:val=""/>
-      <w:lvlJc w:val="left"/>
-    </w:lvl>
-    <w:lvl w:ilvl="3" w:tplc="4398AA48">
-      <w:numFmt w:val="decimal"/>
-      <w:lvlText w:val=""/>
-      <w:lvlJc w:val="left"/>
-    </w:lvl>
-    <w:lvl w:ilvl="4" w:tplc="31B07E40">
-      <w:numFmt w:val="decimal"/>
-      <w:lvlText w:val=""/>
-      <w:lvlJc w:val="left"/>
-    </w:lvl>
-    <w:lvl w:ilvl="5" w:tplc="C3A4EE24">
-      <w:numFmt w:val="decimal"/>
-      <w:lvlText w:val=""/>
-      <w:lvlJc w:val="left"/>
-    </w:lvl>
-    <w:lvl w:ilvl="6" w:tplc="96E8D732">
-      <w:numFmt w:val="decimal"/>
-      <w:lvlText w:val=""/>
-      <w:lvlJc w:val="left"/>
-    </w:lvl>
-    <w:lvl w:ilvl="7" w:tplc="4B6CD57C">
-      <w:numFmt w:val="decimal"/>
-      <w:lvlText w:val=""/>
-      <w:lvlJc w:val="left"/>
-    </w:lvl>
-    <w:lvl w:ilvl="8" w:tplc="81B22F24">
+    <w:lvl w:ilvl="8" w:tplc="0568AA6E">
       <w:numFmt w:val="decimal"/>
       <w:lvlText w:val=""/>
       <w:lvlJc w:val="left"/>
     </w:lvl>
   </w:abstractNum>
   <w:abstractNum w:abstractNumId="2" w15:restartNumberingAfterBreak="0">
-    <w:nsid w:val="7E974A0B"/>
+    <w:nsid w:val="607C2DB2"/>
     <w:multiLevelType w:val="hybridMultilevel"/>
-    <w:tmpl w:val="A3AA413A"/>
-    <w:lvl w:ilvl="0" w:tplc="C4269F26">
+    <w:tmpl w:val="7898EC08"/>
+    <w:lvl w:ilvl="0" w:tplc="7DF0EFAE">
       <w:start w:val="1"/>
       <w:numFmt w:val="bullet"/>
       <w:lvlText w:val="●"/>
@@ -9190,7 +9902,7 @@
         <w:ind w:left="720" w:hanging="360"/>
       </w:pPr>
     </w:lvl>
-    <w:lvl w:ilvl="1" w:tplc="E3468876">
+    <w:lvl w:ilvl="1" w:tplc="7082A4DE">
       <w:start w:val="1"/>
       <w:numFmt w:val="bullet"/>
       <w:lvlText w:val="○"/>
@@ -9199,7 +9911,7 @@
         <w:ind w:left="1440" w:hanging="360"/>
       </w:pPr>
     </w:lvl>
-    <w:lvl w:ilvl="2" w:tplc="BBB6C006">
+    <w:lvl w:ilvl="2" w:tplc="41F6E890">
       <w:start w:val="1"/>
       <w:numFmt w:val="bullet"/>
       <w:lvlText w:val="■"/>
@@ -9208,7 +9920,7 @@
         <w:ind w:left="2160" w:hanging="360"/>
       </w:pPr>
     </w:lvl>
-    <w:lvl w:ilvl="3" w:tplc="39FCF794">
+    <w:lvl w:ilvl="3" w:tplc="8B5CF142">
       <w:start w:val="1"/>
       <w:numFmt w:val="bullet"/>
       <w:lvlText w:val="●"/>
@@ -9217,7 +9929,7 @@
         <w:ind w:left="2880" w:hanging="360"/>
       </w:pPr>
     </w:lvl>
-    <w:lvl w:ilvl="4" w:tplc="9C3E9FC8">
+    <w:lvl w:ilvl="4" w:tplc="2F1EF4E6">
       <w:start w:val="1"/>
       <w:numFmt w:val="bullet"/>
       <w:lvlText w:val="○"/>
@@ -9226,7 +9938,7 @@
         <w:ind w:left="3600" w:hanging="360"/>
       </w:pPr>
     </w:lvl>
-    <w:lvl w:ilvl="5" w:tplc="51A2262E">
+    <w:lvl w:ilvl="5" w:tplc="C292F326">
       <w:start w:val="1"/>
       <w:numFmt w:val="bullet"/>
       <w:lvlText w:val="■"/>
@@ -9235,7 +9947,7 @@
         <w:ind w:left="4320" w:hanging="360"/>
       </w:pPr>
     </w:lvl>
-    <w:lvl w:ilvl="6" w:tplc="331C1524">
+    <w:lvl w:ilvl="6" w:tplc="B31CBE1A">
       <w:start w:val="1"/>
       <w:numFmt w:val="bullet"/>
       <w:lvlText w:val="●"/>
@@ -9244,7 +9956,7 @@
         <w:ind w:left="5040" w:hanging="360"/>
       </w:pPr>
     </w:lvl>
-    <w:lvl w:ilvl="7" w:tplc="5C70B692">
+    <w:lvl w:ilvl="7" w:tplc="7B7CB746">
       <w:start w:val="1"/>
       <w:numFmt w:val="bullet"/>
       <w:lvlText w:val="●"/>
@@ -9253,7 +9965,7 @@
         <w:ind w:left="5760" w:hanging="360"/>
       </w:pPr>
     </w:lvl>
-    <w:lvl w:ilvl="8" w:tplc="7A102060">
+    <w:lvl w:ilvl="8" w:tplc="B14E6BB8">
       <w:start w:val="1"/>
       <w:numFmt w:val="bullet"/>
       <w:lvlText w:val="●"/>
@@ -9263,98 +9975,98 @@
       </w:pPr>
     </w:lvl>
   </w:abstractNum>
-  <w:num w:numId="1" w16cid:durableId="801582172">
+  <w:num w:numId="1" w16cid:durableId="145753300">
     <w:abstractNumId w:val="2"/>
     <w:lvlOverride w:ilvl="0">
       <w:startOverride w:val="1"/>
     </w:lvlOverride>
   </w:num>
-  <w:num w:numId="2" w16cid:durableId="603075568">
+  <w:num w:numId="2" w16cid:durableId="2091730286">
+    <w:abstractNumId w:val="1"/>
+    <w:lvlOverride w:ilvl="0">
+      <w:startOverride w:val="1"/>
+    </w:lvlOverride>
+  </w:num>
+  <w:num w:numId="3" w16cid:durableId="279842536">
     <w:abstractNumId w:val="0"/>
     <w:lvlOverride w:ilvl="0">
       <w:startOverride w:val="1"/>
     </w:lvlOverride>
   </w:num>
-  <w:num w:numId="3" w16cid:durableId="1481997612">
+  <w:num w:numId="4" w16cid:durableId="860705044">
     <w:abstractNumId w:val="1"/>
     <w:lvlOverride w:ilvl="0">
       <w:startOverride w:val="1"/>
     </w:lvlOverride>
   </w:num>
-  <w:num w:numId="4" w16cid:durableId="53941847">
-    <w:abstractNumId w:val="0"/>
+  <w:num w:numId="5" w16cid:durableId="118031864">
+    <w:abstractNumId w:val="1"/>
     <w:lvlOverride w:ilvl="0">
       <w:startOverride w:val="1"/>
     </w:lvlOverride>
   </w:num>
-  <w:num w:numId="5" w16cid:durableId="1795445210">
-    <w:abstractNumId w:val="0"/>
+  <w:num w:numId="6" w16cid:durableId="1093359762">
+    <w:abstractNumId w:val="1"/>
     <w:lvlOverride w:ilvl="0">
       <w:startOverride w:val="1"/>
     </w:lvlOverride>
   </w:num>
-  <w:num w:numId="6" w16cid:durableId="1351184643">
-    <w:abstractNumId w:val="0"/>
+  <w:num w:numId="7" w16cid:durableId="1474517420">
+    <w:abstractNumId w:val="1"/>
     <w:lvlOverride w:ilvl="0">
       <w:startOverride w:val="1"/>
     </w:lvlOverride>
   </w:num>
-  <w:num w:numId="7" w16cid:durableId="1512715102">
-    <w:abstractNumId w:val="0"/>
+  <w:num w:numId="8" w16cid:durableId="1741558732">
+    <w:abstractNumId w:val="1"/>
     <w:lvlOverride w:ilvl="0">
       <w:startOverride w:val="1"/>
     </w:lvlOverride>
   </w:num>
-  <w:num w:numId="8" w16cid:durableId="367949183">
-    <w:abstractNumId w:val="0"/>
+  <w:num w:numId="9" w16cid:durableId="2015109602">
+    <w:abstractNumId w:val="1"/>
     <w:lvlOverride w:ilvl="0">
       <w:startOverride w:val="1"/>
     </w:lvlOverride>
   </w:num>
-  <w:num w:numId="9" w16cid:durableId="271254931">
-    <w:abstractNumId w:val="0"/>
+  <w:num w:numId="10" w16cid:durableId="1104955691">
+    <w:abstractNumId w:val="1"/>
     <w:lvlOverride w:ilvl="0">
       <w:startOverride w:val="1"/>
     </w:lvlOverride>
   </w:num>
-  <w:num w:numId="10" w16cid:durableId="90779833">
-    <w:abstractNumId w:val="0"/>
+  <w:num w:numId="11" w16cid:durableId="1391617149">
+    <w:abstractNumId w:val="1"/>
     <w:lvlOverride w:ilvl="0">
       <w:startOverride w:val="1"/>
     </w:lvlOverride>
   </w:num>
-  <w:num w:numId="11" w16cid:durableId="890967532">
-    <w:abstractNumId w:val="0"/>
+  <w:num w:numId="12" w16cid:durableId="1067652133">
+    <w:abstractNumId w:val="1"/>
     <w:lvlOverride w:ilvl="0">
       <w:startOverride w:val="1"/>
     </w:lvlOverride>
   </w:num>
-  <w:num w:numId="12" w16cid:durableId="260723266">
-    <w:abstractNumId w:val="0"/>
+  <w:num w:numId="13" w16cid:durableId="860126689">
+    <w:abstractNumId w:val="1"/>
     <w:lvlOverride w:ilvl="0">
       <w:startOverride w:val="1"/>
     </w:lvlOverride>
   </w:num>
-  <w:num w:numId="13" w16cid:durableId="1396245818">
-    <w:abstractNumId w:val="0"/>
+  <w:num w:numId="14" w16cid:durableId="1990358405">
+    <w:abstractNumId w:val="1"/>
     <w:lvlOverride w:ilvl="0">
       <w:startOverride w:val="1"/>
     </w:lvlOverride>
   </w:num>
-  <w:num w:numId="14" w16cid:durableId="215750443">
-    <w:abstractNumId w:val="0"/>
+  <w:num w:numId="15" w16cid:durableId="1125149986">
+    <w:abstractNumId w:val="1"/>
     <w:lvlOverride w:ilvl="0">
       <w:startOverride w:val="1"/>
     </w:lvlOverride>
   </w:num>
-  <w:num w:numId="15" w16cid:durableId="30807197">
-    <w:abstractNumId w:val="0"/>
-    <w:lvlOverride w:ilvl="0">
-      <w:startOverride w:val="1"/>
-    </w:lvlOverride>
-  </w:num>
-  <w:num w:numId="16" w16cid:durableId="1787189238">
-    <w:abstractNumId w:val="0"/>
+  <w:num w:numId="16" w16cid:durableId="1912039260">
+    <w:abstractNumId w:val="1"/>
     <w:lvlOverride w:ilvl="0">
       <w:startOverride w:val="1"/>
     </w:lvlOverride>
@@ -9976,7 +10688,7 @@
     <w:autoRedefine/>
     <w:uiPriority w:val="39"/>
     <w:unhideWhenUsed/>
-    <w:rsid w:val="00B239CE"/>
+    <w:rsid w:val="00BC1188"/>
     <w:pPr>
       <w:spacing w:after="100"/>
     </w:pPr>
@@ -9988,7 +10700,7 @@
     <w:autoRedefine/>
     <w:uiPriority w:val="39"/>
     <w:unhideWhenUsed/>
-    <w:rsid w:val="00B239CE"/>
+    <w:rsid w:val="00BC1188"/>
     <w:pPr>
       <w:spacing w:after="100"/>
       <w:ind w:left="220"/>

</xml_diff>

<commit_message>
Sicurezza: password admin con impronta, header, limiti di invio
- Pannello admin: solo l'impronta PBKDF2 della password (ADMIN_PASSWORD_HASH,
  creata con npm run admin:hash); sessione di 12 ore, cookie __Host-,
  logout effettivo, revoca con ADMIN_SESSION_VERSION.
- Gallerie: letture pubbliche limitate a Hall of Fame e Annuario Storico e
  ai soli campi pubblici; le azioni di invio non restituiscono la scheda.
- Archivio: limite di invii per persona garantito da un indice unico
  (submission_slot), anche con richieste simultanee; EMAIL_HASH_SECRET
  obbligatorio; immagini cancellate da Blob se il salvataggio fallisce.
- Header: CSP, X-Frame-Options, nosniff, Referrer-Policy,
  Permissions-Policy; niente X-Powered-By; next/image solo dallo store Blob
  del progetto.
- npm run dev raggiungibile solo da 127.0.0.1.
- Guida admin aggiornata.

Co-Authored-By: Claude Opus 5.5 <noreply@anthropic.com>
</commit_message>
<xml_diff>
--- a/ADMIN_GUIDE.docx
+++ b/ADMIN_GUIDE.docx
@@ -12,7 +12,7 @@
           <w:noProof/>
         </w:rPr>
         <w:drawing>
-          <wp:inline distT="0" distB="0" distL="0" distR="0" wp14:anchorId="33713E91" wp14:editId="1A7A162C">
+          <wp:inline distT="0" distB="0" distL="0" distR="0" wp14:anchorId="338191A9" wp14:editId="0CBDC4A8">
             <wp:extent cx="1809750" cy="1809750"/>
             <wp:effectExtent l="0" t="0" r="0" b="0"/>
             <wp:docPr id="1" name="Immagine 1"/>
@@ -134,7 +134,7 @@
     <w:sdt>
       <w:sdtPr>
         <w:alias w:val="Indice"/>
-        <w:id w:val="-595099285"/>
+        <w:id w:val="2065058456"/>
       </w:sdtPr>
       <w:sdtEndPr/>
       <w:sdtContent>
@@ -162,7 +162,7 @@
           <w:r>
             <w:fldChar w:fldCharType="separate"/>
           </w:r>
-          <w:hyperlink w:anchor="_Toc241909277" w:history="1">
+          <w:hyperlink w:anchor="_Toc241913454" w:history="1">
             <w:r>
               <w:rPr>
                 <w:rStyle w:val="Collegamentoipertestuale"/>
@@ -186,7 +186,7 @@
               <w:rPr>
                 <w:noProof/>
               </w:rPr>
-              <w:instrText xml:space="preserve"> PAGEREF _Toc241909277 \h </w:instrText>
+              <w:instrText xml:space="preserve"> PAGEREF _Toc241913454 \h </w:instrText>
             </w:r>
             <w:r>
               <w:rPr>
@@ -228,7 +228,7 @@
               <w14:ligatures w14:val="standardContextual"/>
             </w:rPr>
           </w:pPr>
-          <w:hyperlink w:anchor="_Toc241909278" w:history="1">
+          <w:hyperlink w:anchor="_Toc241913455" w:history="1">
             <w:r>
               <w:rPr>
                 <w:rStyle w:val="Collegamentoipertestuale"/>
@@ -252,7 +252,7 @@
               <w:rPr>
                 <w:noProof/>
               </w:rPr>
-              <w:instrText xml:space="preserve"> PAGEREF _Toc241909278 \h </w:instrText>
+              <w:instrText xml:space="preserve"> PAGEREF _Toc241913455 \h </w:instrText>
             </w:r>
             <w:r>
               <w:rPr>
@@ -294,7 +294,7 @@
               <w14:ligatures w14:val="standardContextual"/>
             </w:rPr>
           </w:pPr>
-          <w:hyperlink w:anchor="_Toc241909279" w:history="1">
+          <w:hyperlink w:anchor="_Toc241913456" w:history="1">
             <w:r>
               <w:rPr>
                 <w:rStyle w:val="Collegamentoipertestuale"/>
@@ -318,7 +318,7 @@
               <w:rPr>
                 <w:noProof/>
               </w:rPr>
-              <w:instrText xml:space="preserve"> PAGEREF _Toc241909279 \h </w:instrText>
+              <w:instrText xml:space="preserve"> PAGEREF _Toc241913456 \h </w:instrText>
             </w:r>
             <w:r>
               <w:rPr>
@@ -360,7 +360,7 @@
               <w14:ligatures w14:val="standardContextual"/>
             </w:rPr>
           </w:pPr>
-          <w:hyperlink w:anchor="_Toc241909280" w:history="1">
+          <w:hyperlink w:anchor="_Toc241913457" w:history="1">
             <w:r>
               <w:rPr>
                 <w:rStyle w:val="Collegamentoipertestuale"/>
@@ -384,7 +384,7 @@
               <w:rPr>
                 <w:noProof/>
               </w:rPr>
-              <w:instrText xml:space="preserve"> PAGEREF _Toc241909280 \h </w:instrText>
+              <w:instrText xml:space="preserve"> PAGEREF _Toc241913457 \h </w:instrText>
             </w:r>
             <w:r>
               <w:rPr>
@@ -426,7 +426,7 @@
               <w14:ligatures w14:val="standardContextual"/>
             </w:rPr>
           </w:pPr>
-          <w:hyperlink w:anchor="_Toc241909281" w:history="1">
+          <w:hyperlink w:anchor="_Toc241913458" w:history="1">
             <w:r>
               <w:rPr>
                 <w:rStyle w:val="Collegamentoipertestuale"/>
@@ -450,7 +450,7 @@
               <w:rPr>
                 <w:noProof/>
               </w:rPr>
-              <w:instrText xml:space="preserve"> PAGEREF _Toc241909281 \h </w:instrText>
+              <w:instrText xml:space="preserve"> PAGEREF _Toc241913458 \h </w:instrText>
             </w:r>
             <w:r>
               <w:rPr>
@@ -492,7 +492,7 @@
               <w14:ligatures w14:val="standardContextual"/>
             </w:rPr>
           </w:pPr>
-          <w:hyperlink w:anchor="_Toc241909282" w:history="1">
+          <w:hyperlink w:anchor="_Toc241913459" w:history="1">
             <w:r>
               <w:rPr>
                 <w:rStyle w:val="Collegamentoipertestuale"/>
@@ -516,7 +516,7 @@
               <w:rPr>
                 <w:noProof/>
               </w:rPr>
-              <w:instrText xml:space="preserve"> PAGEREF _Toc241909282 \h </w:instrText>
+              <w:instrText xml:space="preserve"> PAGEREF _Toc241913459 \h </w:instrText>
             </w:r>
             <w:r>
               <w:rPr>
@@ -558,7 +558,7 @@
               <w14:ligatures w14:val="standardContextual"/>
             </w:rPr>
           </w:pPr>
-          <w:hyperlink w:anchor="_Toc241909283" w:history="1">
+          <w:hyperlink w:anchor="_Toc241913460" w:history="1">
             <w:r>
               <w:rPr>
                 <w:rStyle w:val="Collegamentoipertestuale"/>
@@ -582,7 +582,7 @@
               <w:rPr>
                 <w:noProof/>
               </w:rPr>
-              <w:instrText xml:space="preserve"> PAGEREF _Toc241909283 \h </w:instrText>
+              <w:instrText xml:space="preserve"> PAGEREF _Toc241913460 \h </w:instrText>
             </w:r>
             <w:r>
               <w:rPr>
@@ -624,7 +624,7 @@
               <w14:ligatures w14:val="standardContextual"/>
             </w:rPr>
           </w:pPr>
-          <w:hyperlink w:anchor="_Toc241909284" w:history="1">
+          <w:hyperlink w:anchor="_Toc241913461" w:history="1">
             <w:r>
               <w:rPr>
                 <w:rStyle w:val="Collegamentoipertestuale"/>
@@ -648,7 +648,7 @@
               <w:rPr>
                 <w:noProof/>
               </w:rPr>
-              <w:instrText xml:space="preserve"> PAGEREF _Toc241909284 \h </w:instrText>
+              <w:instrText xml:space="preserve"> PAGEREF _Toc241913461 \h </w:instrText>
             </w:r>
             <w:r>
               <w:rPr>
@@ -690,7 +690,7 @@
               <w14:ligatures w14:val="standardContextual"/>
             </w:rPr>
           </w:pPr>
-          <w:hyperlink w:anchor="_Toc241909285" w:history="1">
+          <w:hyperlink w:anchor="_Toc241913462" w:history="1">
             <w:r>
               <w:rPr>
                 <w:rStyle w:val="Collegamentoipertestuale"/>
@@ -714,7 +714,7 @@
               <w:rPr>
                 <w:noProof/>
               </w:rPr>
-              <w:instrText xml:space="preserve"> PAGEREF _Toc241909285 \h </w:instrText>
+              <w:instrText xml:space="preserve"> PAGEREF _Toc241913462 \h </w:instrText>
             </w:r>
             <w:r>
               <w:rPr>
@@ -756,7 +756,7 @@
               <w14:ligatures w14:val="standardContextual"/>
             </w:rPr>
           </w:pPr>
-          <w:hyperlink w:anchor="_Toc241909286" w:history="1">
+          <w:hyperlink w:anchor="_Toc241913463" w:history="1">
             <w:r>
               <w:rPr>
                 <w:rStyle w:val="Collegamentoipertestuale"/>
@@ -780,7 +780,7 @@
               <w:rPr>
                 <w:noProof/>
               </w:rPr>
-              <w:instrText xml:space="preserve"> PAGEREF _Toc241909286 \h </w:instrText>
+              <w:instrText xml:space="preserve"> PAGEREF _Toc241913463 \h </w:instrText>
             </w:r>
             <w:r>
               <w:rPr>
@@ -822,7 +822,7 @@
               <w14:ligatures w14:val="standardContextual"/>
             </w:rPr>
           </w:pPr>
-          <w:hyperlink w:anchor="_Toc241909287" w:history="1">
+          <w:hyperlink w:anchor="_Toc241913464" w:history="1">
             <w:r>
               <w:rPr>
                 <w:rStyle w:val="Collegamentoipertestuale"/>
@@ -846,7 +846,7 @@
               <w:rPr>
                 <w:noProof/>
               </w:rPr>
-              <w:instrText xml:space="preserve"> PAGEREF _Toc241909287 \h </w:instrText>
+              <w:instrText xml:space="preserve"> PAGEREF _Toc241913464 \h </w:instrText>
             </w:r>
             <w:r>
               <w:rPr>
@@ -888,7 +888,7 @@
               <w14:ligatures w14:val="standardContextual"/>
             </w:rPr>
           </w:pPr>
-          <w:hyperlink w:anchor="_Toc241909288" w:history="1">
+          <w:hyperlink w:anchor="_Toc241913465" w:history="1">
             <w:r>
               <w:rPr>
                 <w:rStyle w:val="Collegamentoipertestuale"/>
@@ -912,7 +912,7 @@
               <w:rPr>
                 <w:noProof/>
               </w:rPr>
-              <w:instrText xml:space="preserve"> PAGEREF _Toc241909288 \h </w:instrText>
+              <w:instrText xml:space="preserve"> PAGEREF _Toc241913465 \h </w:instrText>
             </w:r>
             <w:r>
               <w:rPr>
@@ -954,7 +954,7 @@
               <w14:ligatures w14:val="standardContextual"/>
             </w:rPr>
           </w:pPr>
-          <w:hyperlink w:anchor="_Toc241909289" w:history="1">
+          <w:hyperlink w:anchor="_Toc241913466" w:history="1">
             <w:r>
               <w:rPr>
                 <w:rStyle w:val="Collegamentoipertestuale"/>
@@ -978,7 +978,7 @@
               <w:rPr>
                 <w:noProof/>
               </w:rPr>
-              <w:instrText xml:space="preserve"> PAGEREF _Toc241909289 \h </w:instrText>
+              <w:instrText xml:space="preserve"> PAGEREF _Toc241913466 \h </w:instrText>
             </w:r>
             <w:r>
               <w:rPr>
@@ -1020,7 +1020,7 @@
               <w14:ligatures w14:val="standardContextual"/>
             </w:rPr>
           </w:pPr>
-          <w:hyperlink w:anchor="_Toc241909290" w:history="1">
+          <w:hyperlink w:anchor="_Toc241913467" w:history="1">
             <w:r>
               <w:rPr>
                 <w:rStyle w:val="Collegamentoipertestuale"/>
@@ -1044,7 +1044,7 @@
               <w:rPr>
                 <w:noProof/>
               </w:rPr>
-              <w:instrText xml:space="preserve"> PAGEREF _Toc241909290 \h </w:instrText>
+              <w:instrText xml:space="preserve"> PAGEREF _Toc241913467 \h </w:instrText>
             </w:r>
             <w:r>
               <w:rPr>
@@ -1086,7 +1086,7 @@
               <w14:ligatures w14:val="standardContextual"/>
             </w:rPr>
           </w:pPr>
-          <w:hyperlink w:anchor="_Toc241909291" w:history="1">
+          <w:hyperlink w:anchor="_Toc241913468" w:history="1">
             <w:r>
               <w:rPr>
                 <w:rStyle w:val="Collegamentoipertestuale"/>
@@ -1110,7 +1110,7 @@
               <w:rPr>
                 <w:noProof/>
               </w:rPr>
-              <w:instrText xml:space="preserve"> PAGEREF _Toc241909291 \h </w:instrText>
+              <w:instrText xml:space="preserve"> PAGEREF _Toc241913468 \h </w:instrText>
             </w:r>
             <w:r>
               <w:rPr>
@@ -1152,7 +1152,7 @@
               <w14:ligatures w14:val="standardContextual"/>
             </w:rPr>
           </w:pPr>
-          <w:hyperlink w:anchor="_Toc241909292" w:history="1">
+          <w:hyperlink w:anchor="_Toc241913469" w:history="1">
             <w:r>
               <w:rPr>
                 <w:rStyle w:val="Collegamentoipertestuale"/>
@@ -1176,7 +1176,7 @@
               <w:rPr>
                 <w:noProof/>
               </w:rPr>
-              <w:instrText xml:space="preserve"> PAGEREF _Toc241909292 \h </w:instrText>
+              <w:instrText xml:space="preserve"> PAGEREF _Toc241913469 \h </w:instrText>
             </w:r>
             <w:r>
               <w:rPr>
@@ -1194,6 +1194,72 @@
                 <w:noProof/>
               </w:rPr>
               <w:t>7</w:t>
+            </w:r>
+            <w:r>
+              <w:rPr>
+                <w:noProof/>
+              </w:rPr>
+              <w:fldChar w:fldCharType="end"/>
+            </w:r>
+          </w:hyperlink>
+        </w:p>
+        <w:p>
+          <w:pPr>
+            <w:pStyle w:val="Sommario2"/>
+            <w:tabs>
+              <w:tab w:val="right" w:leader="dot" w:pos="9296"/>
+            </w:tabs>
+            <w:rPr>
+              <w:rFonts w:asciiTheme="minorHAnsi" w:eastAsiaTheme="minorEastAsia" w:hAnsiTheme="minorHAnsi" w:cstheme="minorBidi"/>
+              <w:noProof/>
+              <w:kern w:val="2"/>
+              <w:sz w:val="24"/>
+              <w:szCs w:val="24"/>
+              <w14:ligatures w14:val="standardContextual"/>
+            </w:rPr>
+          </w:pPr>
+          <w:hyperlink w:anchor="_Toc241913470" w:history="1">
+            <w:r>
+              <w:rPr>
+                <w:rStyle w:val="Collegamentoipertestuale"/>
+                <w:noProof/>
+              </w:rPr>
+              <w:t>Disconnettere tutti i dispositivi</w:t>
+            </w:r>
+            <w:r>
+              <w:rPr>
+                <w:noProof/>
+              </w:rPr>
+              <w:tab/>
+            </w:r>
+            <w:r>
+              <w:rPr>
+                <w:noProof/>
+              </w:rPr>
+              <w:fldChar w:fldCharType="begin"/>
+            </w:r>
+            <w:r>
+              <w:rPr>
+                <w:noProof/>
+              </w:rPr>
+              <w:instrText xml:space="preserve"> PAGEREF _Toc241913470 \h </w:instrText>
+            </w:r>
+            <w:r>
+              <w:rPr>
+                <w:noProof/>
+              </w:rPr>
+            </w:r>
+            <w:r>
+              <w:rPr>
+                <w:noProof/>
+              </w:rPr>
+              <w:fldChar w:fldCharType="separate"/>
+            </w:r>
+            <w:r>
+              <w:rPr>
+                <w:noProof/>
+              </w:rPr>
+              <w:t>8</w:t>
             </w:r>
             <w:r>
               <w:rPr>
@@ -1218,7 +1284,7 @@
               <w14:ligatures w14:val="standardContextual"/>
             </w:rPr>
           </w:pPr>
-          <w:hyperlink w:anchor="_Toc241909293" w:history="1">
+          <w:hyperlink w:anchor="_Toc241913471" w:history="1">
             <w:r>
               <w:rPr>
                 <w:rStyle w:val="Collegamentoipertestuale"/>
@@ -1242,7 +1308,7 @@
               <w:rPr>
                 <w:noProof/>
               </w:rPr>
-              <w:instrText xml:space="preserve"> PAGEREF _Toc241909293 \h </w:instrText>
+              <w:instrText xml:space="preserve"> PAGEREF _Toc241913471 \h </w:instrText>
             </w:r>
             <w:r>
               <w:rPr>
@@ -1259,7 +1325,7 @@
               <w:rPr>
                 <w:noProof/>
               </w:rPr>
-              <w:t>9</w:t>
+              <w:t>10</w:t>
             </w:r>
             <w:r>
               <w:rPr>
@@ -1284,7 +1350,7 @@
               <w14:ligatures w14:val="standardContextual"/>
             </w:rPr>
           </w:pPr>
-          <w:hyperlink w:anchor="_Toc241909294" w:history="1">
+          <w:hyperlink w:anchor="_Toc241913472" w:history="1">
             <w:r>
               <w:rPr>
                 <w:rStyle w:val="Collegamentoipertestuale"/>
@@ -1308,7 +1374,7 @@
               <w:rPr>
                 <w:noProof/>
               </w:rPr>
-              <w:instrText xml:space="preserve"> PAGEREF _Toc241909294 \h </w:instrText>
+              <w:instrText xml:space="preserve"> PAGEREF _Toc241913472 \h </w:instrText>
             </w:r>
             <w:r>
               <w:rPr>
@@ -1325,7 +1391,7 @@
               <w:rPr>
                 <w:noProof/>
               </w:rPr>
-              <w:t>9</w:t>
+              <w:t>10</w:t>
             </w:r>
             <w:r>
               <w:rPr>
@@ -1350,7 +1416,7 @@
               <w14:ligatures w14:val="standardContextual"/>
             </w:rPr>
           </w:pPr>
-          <w:hyperlink w:anchor="_Toc241909295" w:history="1">
+          <w:hyperlink w:anchor="_Toc241913473" w:history="1">
             <w:r>
               <w:rPr>
                 <w:rStyle w:val="Collegamentoipertestuale"/>
@@ -1374,7 +1440,7 @@
               <w:rPr>
                 <w:noProof/>
               </w:rPr>
-              <w:instrText xml:space="preserve"> PAGEREF _Toc241909295 \h </w:instrText>
+              <w:instrText xml:space="preserve"> PAGEREF _Toc241913473 \h </w:instrText>
             </w:r>
             <w:r>
               <w:rPr>
@@ -1391,7 +1457,7 @@
               <w:rPr>
                 <w:noProof/>
               </w:rPr>
-              <w:t>9</w:t>
+              <w:t>10</w:t>
             </w:r>
             <w:r>
               <w:rPr>
@@ -1416,7 +1482,7 @@
               <w14:ligatures w14:val="standardContextual"/>
             </w:rPr>
           </w:pPr>
-          <w:hyperlink w:anchor="_Toc241909296" w:history="1">
+          <w:hyperlink w:anchor="_Toc241913474" w:history="1">
             <w:r>
               <w:rPr>
                 <w:rStyle w:val="Collegamentoipertestuale"/>
@@ -1440,7 +1506,7 @@
               <w:rPr>
                 <w:noProof/>
               </w:rPr>
-              <w:instrText xml:space="preserve"> PAGEREF _Toc241909296 \h </w:instrText>
+              <w:instrText xml:space="preserve"> PAGEREF _Toc241913474 \h </w:instrText>
             </w:r>
             <w:r>
               <w:rPr>
@@ -1457,7 +1523,7 @@
               <w:rPr>
                 <w:noProof/>
               </w:rPr>
-              <w:t>9</w:t>
+              <w:t>10</w:t>
             </w:r>
             <w:r>
               <w:rPr>
@@ -1482,7 +1548,7 @@
               <w14:ligatures w14:val="standardContextual"/>
             </w:rPr>
           </w:pPr>
-          <w:hyperlink w:anchor="_Toc241909297" w:history="1">
+          <w:hyperlink w:anchor="_Toc241913475" w:history="1">
             <w:r>
               <w:rPr>
                 <w:rStyle w:val="Collegamentoipertestuale"/>
@@ -1506,7 +1572,7 @@
               <w:rPr>
                 <w:noProof/>
               </w:rPr>
-              <w:instrText xml:space="preserve"> PAGEREF _Toc241909297 \h </w:instrText>
+              <w:instrText xml:space="preserve"> PAGEREF _Toc241913475 \h </w:instrText>
             </w:r>
             <w:r>
               <w:rPr>
@@ -1523,7 +1589,7 @@
               <w:rPr>
                 <w:noProof/>
               </w:rPr>
-              <w:t>10</w:t>
+              <w:t>11</w:t>
             </w:r>
             <w:r>
               <w:rPr>
@@ -1548,7 +1614,7 @@
               <w14:ligatures w14:val="standardContextual"/>
             </w:rPr>
           </w:pPr>
-          <w:hyperlink w:anchor="_Toc241909298" w:history="1">
+          <w:hyperlink w:anchor="_Toc241913476" w:history="1">
             <w:r>
               <w:rPr>
                 <w:rStyle w:val="Collegamentoipertestuale"/>
@@ -1572,7 +1638,7 @@
               <w:rPr>
                 <w:noProof/>
               </w:rPr>
-              <w:instrText xml:space="preserve"> PAGEREF _Toc241909298 \h </w:instrText>
+              <w:instrText xml:space="preserve"> PAGEREF _Toc241913476 \h </w:instrText>
             </w:r>
             <w:r>
               <w:rPr>
@@ -1589,7 +1655,7 @@
               <w:rPr>
                 <w:noProof/>
               </w:rPr>
-              <w:t>10</w:t>
+              <w:t>11</w:t>
             </w:r>
             <w:r>
               <w:rPr>
@@ -1614,7 +1680,7 @@
               <w14:ligatures w14:val="standardContextual"/>
             </w:rPr>
           </w:pPr>
-          <w:hyperlink w:anchor="_Toc241909299" w:history="1">
+          <w:hyperlink w:anchor="_Toc241913477" w:history="1">
             <w:r>
               <w:rPr>
                 <w:rStyle w:val="Collegamentoipertestuale"/>
@@ -1638,7 +1704,7 @@
               <w:rPr>
                 <w:noProof/>
               </w:rPr>
-              <w:instrText xml:space="preserve"> PAGEREF _Toc241909299 \h </w:instrText>
+              <w:instrText xml:space="preserve"> PAGEREF _Toc241913477 \h </w:instrText>
             </w:r>
             <w:r>
               <w:rPr>
@@ -1655,7 +1721,7 @@
               <w:rPr>
                 <w:noProof/>
               </w:rPr>
-              <w:t>11</w:t>
+              <w:t>12</w:t>
             </w:r>
             <w:r>
               <w:rPr>
@@ -1680,7 +1746,7 @@
               <w14:ligatures w14:val="standardContextual"/>
             </w:rPr>
           </w:pPr>
-          <w:hyperlink w:anchor="_Toc241909300" w:history="1">
+          <w:hyperlink w:anchor="_Toc241913478" w:history="1">
             <w:r>
               <w:rPr>
                 <w:rStyle w:val="Collegamentoipertestuale"/>
@@ -1704,7 +1770,7 @@
               <w:rPr>
                 <w:noProof/>
               </w:rPr>
-              <w:instrText xml:space="preserve"> PAGEREF _Toc241909300 \h </w:instrText>
+              <w:instrText xml:space="preserve"> PAGEREF _Toc241913478 \h </w:instrText>
             </w:r>
             <w:r>
               <w:rPr>
@@ -1721,7 +1787,7 @@
               <w:rPr>
                 <w:noProof/>
               </w:rPr>
-              <w:t>11</w:t>
+              <w:t>12</w:t>
             </w:r>
             <w:r>
               <w:rPr>
@@ -1746,7 +1812,7 @@
               <w14:ligatures w14:val="standardContextual"/>
             </w:rPr>
           </w:pPr>
-          <w:hyperlink w:anchor="_Toc241909301" w:history="1">
+          <w:hyperlink w:anchor="_Toc241913479" w:history="1">
             <w:r>
               <w:rPr>
                 <w:rStyle w:val="Collegamentoipertestuale"/>
@@ -1770,7 +1836,7 @@
               <w:rPr>
                 <w:noProof/>
               </w:rPr>
-              <w:instrText xml:space="preserve"> PAGEREF _Toc241909301 \h </w:instrText>
+              <w:instrText xml:space="preserve"> PAGEREF _Toc241913479 \h </w:instrText>
             </w:r>
             <w:r>
               <w:rPr>
@@ -1787,7 +1853,7 @@
               <w:rPr>
                 <w:noProof/>
               </w:rPr>
-              <w:t>11</w:t>
+              <w:t>12</w:t>
             </w:r>
             <w:r>
               <w:rPr>
@@ -1812,7 +1878,7 @@
               <w14:ligatures w14:val="standardContextual"/>
             </w:rPr>
           </w:pPr>
-          <w:hyperlink w:anchor="_Toc241909302" w:history="1">
+          <w:hyperlink w:anchor="_Toc241913480" w:history="1">
             <w:r>
               <w:rPr>
                 <w:rStyle w:val="Collegamentoipertestuale"/>
@@ -1836,7 +1902,7 @@
               <w:rPr>
                 <w:noProof/>
               </w:rPr>
-              <w:instrText xml:space="preserve"> PAGEREF _Toc241909302 \h </w:instrText>
+              <w:instrText xml:space="preserve"> PAGEREF _Toc241913480 \h </w:instrText>
             </w:r>
             <w:r>
               <w:rPr>
@@ -1853,7 +1919,7 @@
               <w:rPr>
                 <w:noProof/>
               </w:rPr>
-              <w:t>12</w:t>
+              <w:t>13</w:t>
             </w:r>
             <w:r>
               <w:rPr>
@@ -1878,7 +1944,7 @@
               <w14:ligatures w14:val="standardContextual"/>
             </w:rPr>
           </w:pPr>
-          <w:hyperlink w:anchor="_Toc241909303" w:history="1">
+          <w:hyperlink w:anchor="_Toc241913481" w:history="1">
             <w:r>
               <w:rPr>
                 <w:rStyle w:val="Collegamentoipertestuale"/>
@@ -1902,7 +1968,7 @@
               <w:rPr>
                 <w:noProof/>
               </w:rPr>
-              <w:instrText xml:space="preserve"> PAGEREF _Toc241909303 \h </w:instrText>
+              <w:instrText xml:space="preserve"> PAGEREF _Toc241913481 \h </w:instrText>
             </w:r>
             <w:r>
               <w:rPr>
@@ -1919,7 +1985,7 @@
               <w:rPr>
                 <w:noProof/>
               </w:rPr>
-              <w:t>13</w:t>
+              <w:t>14</w:t>
             </w:r>
             <w:r>
               <w:rPr>
@@ -1944,7 +2010,7 @@
               <w14:ligatures w14:val="standardContextual"/>
             </w:rPr>
           </w:pPr>
-          <w:hyperlink w:anchor="_Toc241909304" w:history="1">
+          <w:hyperlink w:anchor="_Toc241913482" w:history="1">
             <w:r>
               <w:rPr>
                 <w:rStyle w:val="Collegamentoipertestuale"/>
@@ -1968,7 +2034,7 @@
               <w:rPr>
                 <w:noProof/>
               </w:rPr>
-              <w:instrText xml:space="preserve"> PAGEREF _Toc241909304 \h </w:instrText>
+              <w:instrText xml:space="preserve"> PAGEREF _Toc241913482 \h </w:instrText>
             </w:r>
             <w:r>
               <w:rPr>
@@ -1985,7 +2051,7 @@
               <w:rPr>
                 <w:noProof/>
               </w:rPr>
-              <w:t>13</w:t>
+              <w:t>14</w:t>
             </w:r>
             <w:r>
               <w:rPr>
@@ -2010,7 +2076,7 @@
               <w14:ligatures w14:val="standardContextual"/>
             </w:rPr>
           </w:pPr>
-          <w:hyperlink w:anchor="_Toc241909305" w:history="1">
+          <w:hyperlink w:anchor="_Toc241913483" w:history="1">
             <w:r>
               <w:rPr>
                 <w:rStyle w:val="Collegamentoipertestuale"/>
@@ -2034,7 +2100,7 @@
               <w:rPr>
                 <w:noProof/>
               </w:rPr>
-              <w:instrText xml:space="preserve"> PAGEREF _Toc241909305 \h </w:instrText>
+              <w:instrText xml:space="preserve"> PAGEREF _Toc241913483 \h </w:instrText>
             </w:r>
             <w:r>
               <w:rPr>
@@ -2051,7 +2117,7 @@
               <w:rPr>
                 <w:noProof/>
               </w:rPr>
-              <w:t>13</w:t>
+              <w:t>14</w:t>
             </w:r>
             <w:r>
               <w:rPr>
@@ -2076,7 +2142,7 @@
               <w14:ligatures w14:val="standardContextual"/>
             </w:rPr>
           </w:pPr>
-          <w:hyperlink w:anchor="_Toc241909306" w:history="1">
+          <w:hyperlink w:anchor="_Toc241913484" w:history="1">
             <w:r>
               <w:rPr>
                 <w:rStyle w:val="Collegamentoipertestuale"/>
@@ -2100,7 +2166,7 @@
               <w:rPr>
                 <w:noProof/>
               </w:rPr>
-              <w:instrText xml:space="preserve"> PAGEREF _Toc241909306 \h </w:instrText>
+              <w:instrText xml:space="preserve"> PAGEREF _Toc241913484 \h </w:instrText>
             </w:r>
             <w:r>
               <w:rPr>
@@ -2117,7 +2183,7 @@
               <w:rPr>
                 <w:noProof/>
               </w:rPr>
-              <w:t>14</w:t>
+              <w:t>15</w:t>
             </w:r>
             <w:r>
               <w:rPr>
@@ -2142,7 +2208,7 @@
               <w14:ligatures w14:val="standardContextual"/>
             </w:rPr>
           </w:pPr>
-          <w:hyperlink w:anchor="_Toc241909307" w:history="1">
+          <w:hyperlink w:anchor="_Toc241913485" w:history="1">
             <w:r>
               <w:rPr>
                 <w:rStyle w:val="Collegamentoipertestuale"/>
@@ -2166,7 +2232,7 @@
               <w:rPr>
                 <w:noProof/>
               </w:rPr>
-              <w:instrText xml:space="preserve"> PAGEREF _Toc241909307 \h </w:instrText>
+              <w:instrText xml:space="preserve"> PAGEREF _Toc241913485 \h </w:instrText>
             </w:r>
             <w:r>
               <w:rPr>
@@ -2183,7 +2249,7 @@
               <w:rPr>
                 <w:noProof/>
               </w:rPr>
-              <w:t>14</w:t>
+              <w:t>15</w:t>
             </w:r>
             <w:r>
               <w:rPr>
@@ -2208,7 +2274,7 @@
               <w14:ligatures w14:val="standardContextual"/>
             </w:rPr>
           </w:pPr>
-          <w:hyperlink w:anchor="_Toc241909308" w:history="1">
+          <w:hyperlink w:anchor="_Toc241913486" w:history="1">
             <w:r>
               <w:rPr>
                 <w:rStyle w:val="Collegamentoipertestuale"/>
@@ -2232,7 +2298,7 @@
               <w:rPr>
                 <w:noProof/>
               </w:rPr>
-              <w:instrText xml:space="preserve"> PAGEREF _Toc241909308 \h </w:instrText>
+              <w:instrText xml:space="preserve"> PAGEREF _Toc241913486 \h </w:instrText>
             </w:r>
             <w:r>
               <w:rPr>
@@ -2249,7 +2315,7 @@
               <w:rPr>
                 <w:noProof/>
               </w:rPr>
-              <w:t>15</w:t>
+              <w:t>16</w:t>
             </w:r>
             <w:r>
               <w:rPr>
@@ -2274,7 +2340,7 @@
               <w14:ligatures w14:val="standardContextual"/>
             </w:rPr>
           </w:pPr>
-          <w:hyperlink w:anchor="_Toc241909309" w:history="1">
+          <w:hyperlink w:anchor="_Toc241913487" w:history="1">
             <w:r>
               <w:rPr>
                 <w:rStyle w:val="Collegamentoipertestuale"/>
@@ -2298,7 +2364,7 @@
               <w:rPr>
                 <w:noProof/>
               </w:rPr>
-              <w:instrText xml:space="preserve"> PAGEREF _Toc241909309 \h </w:instrText>
+              <w:instrText xml:space="preserve"> PAGEREF _Toc241913487 \h </w:instrText>
             </w:r>
             <w:r>
               <w:rPr>
@@ -2315,7 +2381,7 @@
               <w:rPr>
                 <w:noProof/>
               </w:rPr>
-              <w:t>16</w:t>
+              <w:t>17</w:t>
             </w:r>
             <w:r>
               <w:rPr>
@@ -2340,7 +2406,7 @@
               <w14:ligatures w14:val="standardContextual"/>
             </w:rPr>
           </w:pPr>
-          <w:hyperlink w:anchor="_Toc241909310" w:history="1">
+          <w:hyperlink w:anchor="_Toc241913488" w:history="1">
             <w:r>
               <w:rPr>
                 <w:rStyle w:val="Collegamentoipertestuale"/>
@@ -2364,7 +2430,7 @@
               <w:rPr>
                 <w:noProof/>
               </w:rPr>
-              <w:instrText xml:space="preserve"> PAGEREF _Toc241909310 \h </w:instrText>
+              <w:instrText xml:space="preserve"> PAGEREF _Toc241913488 \h </w:instrText>
             </w:r>
             <w:r>
               <w:rPr>
@@ -2381,7 +2447,7 @@
               <w:rPr>
                 <w:noProof/>
               </w:rPr>
-              <w:t>17</w:t>
+              <w:t>18</w:t>
             </w:r>
             <w:r>
               <w:rPr>
@@ -2403,7 +2469,7 @@
         <w:pStyle w:val="Titolo1"/>
         <w:pageBreakBefore/>
       </w:pPr>
-      <w:bookmarkStart w:id="0" w:name="_Toc241909277"/>
+      <w:bookmarkStart w:id="0" w:name="_Toc241913454"/>
       <w:r>
         <w:lastRenderedPageBreak/>
         <w:t>1. Come è fatto il sito</w:t>
@@ -3044,7 +3110,7 @@
       <w:pPr>
         <w:pStyle w:val="Titolo2"/>
       </w:pPr>
-      <w:bookmarkStart w:id="1" w:name="_Toc241909278"/>
+      <w:bookmarkStart w:id="1" w:name="_Toc241913455"/>
       <w:r>
         <w:t>Il giro di una foto</w:t>
       </w:r>
@@ -3148,7 +3214,7 @@
       <w:pPr>
         <w:pStyle w:val="Titolo2"/>
       </w:pPr>
-      <w:bookmarkStart w:id="2" w:name="_Toc241909279"/>
+      <w:bookmarkStart w:id="2" w:name="_Toc241913456"/>
       <w:r>
         <w:t>Parole che incontrerai</w:t>
       </w:r>
@@ -3306,7 +3372,7 @@
               <w:spacing w:line="276" w:lineRule="auto"/>
             </w:pPr>
             <w:r>
-              <w:t>Il servizio che tiene il sito online. Da vercel.com vedi lo stato del sito, le impostazioni e le password segrete (variabili d'ambiente).</w:t>
+              <w:t>Il servizio che tiene il sito online. Da vercel.com vedi lo stato del sito e le impostazioni segrete (variabili d'ambiente).</w:t>
             </w:r>
           </w:p>
         </w:tc>
@@ -3767,7 +3833,7 @@
         <w:pStyle w:val="Titolo1"/>
         <w:pageBreakBefore/>
       </w:pPr>
-      <w:bookmarkStart w:id="3" w:name="_Toc241909280"/>
+      <w:bookmarkStart w:id="3" w:name="_Toc241913457"/>
       <w:r>
         <w:lastRenderedPageBreak/>
         <w:t>2. Preparare il computer (una volta sola)</w:t>
@@ -3796,7 +3862,7 @@
       <w:pPr>
         <w:pStyle w:val="Titolo2"/>
       </w:pPr>
-      <w:bookmarkStart w:id="4" w:name="_Toc241909281"/>
+      <w:bookmarkStart w:id="4" w:name="_Toc241913458"/>
       <w:r>
         <w:t>Programmi da installare</w:t>
       </w:r>
@@ -3911,7 +3977,7 @@
       <w:pPr>
         <w:pStyle w:val="Titolo2"/>
       </w:pPr>
-      <w:bookmarkStart w:id="5" w:name="_Toc241909282"/>
+      <w:bookmarkStart w:id="5" w:name="_Toc241913459"/>
       <w:r>
         <w:t>Aprire il terminale nella cartella del progetto</w:t>
       </w:r>
@@ -4003,7 +4069,7 @@
       <w:pPr>
         <w:pStyle w:val="Titolo2"/>
       </w:pPr>
-      <w:bookmarkStart w:id="6" w:name="_Toc241909283"/>
+      <w:bookmarkStart w:id="6" w:name="_Toc241913460"/>
       <w:r>
         <w:t>La prima volta dopo aver scaricato il progetto</w:t>
       </w:r>
@@ -4048,7 +4114,7 @@
       <w:pPr>
         <w:pStyle w:val="Titolo2"/>
       </w:pPr>
-      <w:bookmarkStart w:id="7" w:name="_Toc241909284"/>
+      <w:bookmarkStart w:id="7" w:name="_Toc241913461"/>
       <w:r>
         <w:t>Il file segreto .env.local</w:t>
       </w:r>
@@ -4078,7 +4144,7 @@
         <w:pStyle w:val="Titolo1"/>
         <w:pageBreakBefore/>
       </w:pPr>
-      <w:bookmarkStart w:id="8" w:name="_Toc241909285"/>
+      <w:bookmarkStart w:id="8" w:name="_Toc241913462"/>
       <w:r>
         <w:lastRenderedPageBreak/>
         <w:t>3. Pubblicare una modifica sul sito online</w:t>
@@ -4215,7 +4281,7 @@
       <w:pPr>
         <w:pStyle w:val="Titolo2"/>
       </w:pPr>
-      <w:bookmarkStart w:id="9" w:name="_Toc241909286"/>
+      <w:bookmarkStart w:id="9" w:name="_Toc241913463"/>
       <w:r>
         <w:t>Controllare che sia andato tutto bene</w:t>
       </w:r>
@@ -4359,7 +4425,7 @@
         <w:t>http://localhost:3000</w:t>
       </w:r>
       <w:r>
-        <w:t xml:space="preserve"> nel browser. Per fermarlo, premi Ctrl+C nel terminale. Attenzione: anche in locale il sito usa il database vero, quindi una foto caricata in prova finisce tra quelle reali.</w:t>
+        <w:t xml:space="preserve"> nel browser. Per fermarlo, premi Ctrl+C nel terminale. Attenzione: anche in locale il sito usa il database vero, quindi una foto caricata in prova finisce tra quelle reali. Per sicurezza il sito in locale è raggiungibile solo dal tuo computer, non da altri dispositivi della stessa rete Wi-Fi.</w:t>
       </w:r>
     </w:p>
     <w:p>
@@ -4367,7 +4433,7 @@
         <w:pStyle w:val="Titolo1"/>
         <w:pageBreakBefore/>
       </w:pPr>
-      <w:bookmarkStart w:id="10" w:name="_Toc241909287"/>
+      <w:bookmarkStart w:id="10" w:name="_Toc241913464"/>
       <w:r>
         <w:lastRenderedPageBreak/>
         <w:t>4. Approvare ed eliminare le foto (pannello di moderazione)</w:t>
@@ -4396,7 +4462,7 @@
       <w:pPr>
         <w:pStyle w:val="Titolo2"/>
       </w:pPr>
-      <w:bookmarkStart w:id="11" w:name="_Toc241909288"/>
+      <w:bookmarkStart w:id="11" w:name="_Toc241913465"/>
       <w:r>
         <w:t>Entrare nel pannello</w:t>
       </w:r>
@@ -4455,7 +4521,7 @@
         <w:t>Entra</w:t>
       </w:r>
       <w:r>
-        <w:t>. L'accesso resta valido per 7 giorni su quel dispositivo.</w:t>
+        <w:t>. L'accesso resta valido per 12 ore su quel dispositivo, poi il sito chiede di nuovo la password.</w:t>
       </w:r>
     </w:p>
     <w:p>
@@ -4468,7 +4534,7 @@
         <w:spacing w:after="80" w:line="290" w:lineRule="auto"/>
       </w:pPr>
       <w:r>
-        <w:t xml:space="preserve">Quando hai finito, se il computer non è tuo, clicca </w:t>
+        <w:t xml:space="preserve">Quando hai finito, clicca </w:t>
       </w:r>
       <w:r>
         <w:rPr>
@@ -4478,14 +4544,14 @@
         <w:t>Esci</w:t>
       </w:r>
       <w:r>
-        <w:t xml:space="preserve"> in alto a destra.</w:t>
+        <w:t xml:space="preserve"> in alto a destra (soprattutto se il computer non è tuo).</w:t>
       </w:r>
     </w:p>
     <w:p>
       <w:pPr>
         <w:pStyle w:val="Titolo2"/>
       </w:pPr>
-      <w:bookmarkStart w:id="12" w:name="_Toc241909289"/>
+      <w:bookmarkStart w:id="12" w:name="_Toc241913466"/>
       <w:r>
         <w:t>Com'è fatto il pannello</w:t>
       </w:r>
@@ -4584,7 +4650,7 @@
       <w:pPr>
         <w:pStyle w:val="Titolo2"/>
       </w:pPr>
-      <w:bookmarkStart w:id="13" w:name="_Toc241909290"/>
+      <w:bookmarkStart w:id="13" w:name="_Toc241913467"/>
       <w:r>
         <w:t>Cosa fanno i pulsanti</w:t>
       </w:r>
@@ -4887,7 +4953,7 @@
       <w:pPr>
         <w:pStyle w:val="Titolo2"/>
       </w:pPr>
-      <w:bookmarkStart w:id="14" w:name="_Toc241909291"/>
+      <w:bookmarkStart w:id="14" w:name="_Toc241913468"/>
       <w:r>
         <w:t>Cosa controllare prima di approvare</w:t>
       </w:r>
@@ -4949,7 +5015,7 @@
       <w:pPr>
         <w:pStyle w:val="Titolo2"/>
       </w:pPr>
-      <w:bookmarkStart w:id="15" w:name="_Toc241909292"/>
+      <w:bookmarkStart w:id="15" w:name="_Toc241913469"/>
       <w:r>
         <w:t>Impostare o cambiare la password del pannello</w:t>
       </w:r>
@@ -4961,7 +5027,27 @@
       </w:pPr>
       <w:r>
         <w:lastRenderedPageBreak/>
-        <w:t xml:space="preserve">La password è la variabile d'ambiente </w:t>
+        <w:t xml:space="preserve">Per sicurezza la password </w:t>
+      </w:r>
+      <w:r>
+        <w:rPr>
+          <w:b/>
+          <w:bCs/>
+        </w:rPr>
+        <w:t>non è salvata da nessuna parte</w:t>
+      </w:r>
+      <w:r>
+        <w:t xml:space="preserve">, nemmeno su Vercel. Su Vercel c'è solo la sua </w:t>
+      </w:r>
+      <w:r>
+        <w:rPr>
+          <w:b/>
+          <w:bCs/>
+        </w:rPr>
+        <w:t>impronta</w:t>
+      </w:r>
+      <w:r>
+        <w:t xml:space="preserve"> (in inglese "hash"): una lunga sequenza di caratteri ricavata dalla password, da cui non si può risalire alla password stessa. Quando entri nel pannello, il sito ricalcola l'impronta della password che hai scritto e la confronta con quella salvata. L'impronta sta nella variabile d'ambiente </w:t>
       </w:r>
       <w:r>
         <w:rPr>
@@ -4969,10 +5055,18 @@
           <w:color w:val="002B49"/>
           <w:shd w:val="clear" w:color="auto" w:fill="EEF3F7"/>
         </w:rPr>
-        <w:t>ADMIN_PASSWORD</w:t>
-      </w:r>
-      <w:r>
-        <w:t xml:space="preserve"> su Vercel. Finché non è impostata, il pannello resta chiuso e la pagina di accesso lo segnala. Per impostarla o cambiarla:</w:t>
+        <w:t>ADMIN_PASSWORD_HASH</w:t>
+      </w:r>
+      <w:r>
+        <w:t>; finché non è impostata, il pannello resta chiuso e la pagina di accesso lo segnala.</w:t>
+      </w:r>
+    </w:p>
+    <w:p>
+      <w:pPr>
+        <w:spacing w:after="120" w:line="290" w:lineRule="auto"/>
+      </w:pPr>
+      <w:r>
+        <w:t>Per impostare o cambiare la password:</w:t>
       </w:r>
     </w:p>
     <w:p>
@@ -4985,47 +5079,18 @@
         <w:spacing w:after="80" w:line="290" w:lineRule="auto"/>
       </w:pPr>
       <w:r>
-        <w:t xml:space="preserve">Vai su </w:t>
-      </w:r>
-      <w:r>
-        <w:rPr>
-          <w:b/>
-          <w:bCs/>
-        </w:rPr>
-        <w:t>vercel.com</w:t>
-      </w:r>
-      <w:r>
-        <w:t xml:space="preserve"> → progetto </w:t>
-      </w:r>
-      <w:r>
-        <w:rPr>
-          <w:b/>
-          <w:bCs/>
-        </w:rPr>
-        <w:t>annuario-pn</w:t>
-      </w:r>
-      <w:r>
-        <w:t xml:space="preserve"> → </w:t>
-      </w:r>
-      <w:r>
-        <w:rPr>
-          <w:b/>
-          <w:bCs/>
-        </w:rPr>
-        <w:t>Settings</w:t>
-      </w:r>
-      <w:r>
-        <w:t xml:space="preserve"> → </w:t>
-      </w:r>
-      <w:r>
-        <w:rPr>
-          <w:b/>
-          <w:bCs/>
-        </w:rPr>
-        <w:t>Environment Variables</w:t>
-      </w:r>
-      <w:r>
-        <w:t>.</w:t>
+        <w:t xml:space="preserve">Apri il terminale nella cartella del progetto (capitolo 2) e scrivi </w:t>
+      </w:r>
+      <w:r>
+        <w:rPr>
+          <w:rFonts w:ascii="Consolas" w:eastAsia="Consolas" w:hAnsi="Consolas" w:cs="Consolas"/>
+          <w:color w:val="002B49"/>
+          <w:shd w:val="clear" w:color="auto" w:fill="EEF3F7"/>
+        </w:rPr>
+        <w:t>npm run admin:hash</w:t>
+      </w:r>
+      <w:r>
+        <w:t>, poi premi Invio.</w:t>
       </w:r>
     </w:p>
     <w:p>
@@ -5038,49 +5103,17 @@
         <w:spacing w:after="80" w:line="290" w:lineRule="auto"/>
       </w:pPr>
       <w:r>
-        <w:t xml:space="preserve">Se </w:t>
-      </w:r>
-      <w:r>
-        <w:rPr>
-          <w:rFonts w:ascii="Consolas" w:eastAsia="Consolas" w:hAnsi="Consolas" w:cs="Consolas"/>
-          <w:color w:val="002B49"/>
-          <w:shd w:val="clear" w:color="auto" w:fill="EEF3F7"/>
-        </w:rPr>
-        <w:t>ADMIN_PASSWORD</w:t>
-      </w:r>
-      <w:r>
-        <w:t xml:space="preserve"> esiste già e vuoi cambiarla: clicca i tre puntini sulla sua riga → </w:t>
+        <w:t xml:space="preserve">Scrivi la nuova password (almeno 12 caratteri) e premi Invio. </w:t>
       </w:r>
       <w:r>
         <w:rPr>
           <w:b/>
           <w:bCs/>
         </w:rPr>
-        <w:t>Edit</w:t>
-      </w:r>
-      <w:r>
-        <w:t xml:space="preserve">, scrivi la nuova password e salva. Se non esiste: in alto scrivi </w:t>
-      </w:r>
-      <w:r>
-        <w:rPr>
-          <w:rFonts w:ascii="Consolas" w:eastAsia="Consolas" w:hAnsi="Consolas" w:cs="Consolas"/>
-          <w:color w:val="002B49"/>
-          <w:shd w:val="clear" w:color="auto" w:fill="EEF3F7"/>
-        </w:rPr>
-        <w:t>ADMIN_PASSWORD</w:t>
-      </w:r>
-      <w:r>
-        <w:t xml:space="preserve"> come nome, la password come valore, seleziona </w:t>
-      </w:r>
-      <w:r>
-        <w:rPr>
-          <w:b/>
-          <w:bCs/>
-        </w:rPr>
-        <w:t>Production</w:t>
-      </w:r>
-      <w:r>
-        <w:t xml:space="preserve"> e salva.</w:t>
+        <w:t>Mentre scrivi non compare nulla a schermo: è normale.</w:t>
+      </w:r>
+      <w:r>
+        <w:t xml:space="preserve"> Poi riscrivila una seconda volta per conferma.</w:t>
       </w:r>
     </w:p>
     <w:p>
@@ -5093,27 +5126,18 @@
         <w:spacing w:after="80" w:line="290" w:lineRule="auto"/>
       </w:pPr>
       <w:r>
-        <w:t xml:space="preserve">Perché la nuova password valga serve una nuova pubblicazione: scheda </w:t>
-      </w:r>
-      <w:r>
-        <w:rPr>
-          <w:b/>
-          <w:bCs/>
-        </w:rPr>
-        <w:t>Deployments</w:t>
-      </w:r>
-      <w:r>
-        <w:t xml:space="preserve"> → tre puntini sulla prima riga → </w:t>
-      </w:r>
-      <w:r>
-        <w:rPr>
-          <w:b/>
-          <w:bCs/>
-        </w:rPr>
-        <w:t>Redeploy</w:t>
-      </w:r>
-      <w:r>
-        <w:t xml:space="preserve"> → conferma.</w:t>
+        <w:t xml:space="preserve">Il terminale mostra una riga che inizia con </w:t>
+      </w:r>
+      <w:r>
+        <w:rPr>
+          <w:rFonts w:ascii="Consolas" w:eastAsia="Consolas" w:hAnsi="Consolas" w:cs="Consolas"/>
+          <w:color w:val="002B49"/>
+          <w:shd w:val="clear" w:color="auto" w:fill="EEF3F7"/>
+        </w:rPr>
+        <w:t>pbkdf2-sha256:</w:t>
+      </w:r>
+      <w:r>
+        <w:t>. Selezionala tutta e copiala: è l'impronta.</w:t>
       </w:r>
     </w:p>
     <w:p>
@@ -5126,7 +5150,60 @@
         <w:spacing w:after="80" w:line="290" w:lineRule="auto"/>
       </w:pPr>
       <w:r>
-        <w:t xml:space="preserve">Per usare il pannello anche in locale, aggiungi la stessa riga in fondo al file </w:t>
+        <w:t xml:space="preserve">Vai su </w:t>
+      </w:r>
+      <w:r>
+        <w:rPr>
+          <w:b/>
+          <w:bCs/>
+        </w:rPr>
+        <w:t>vercel.com</w:t>
+      </w:r>
+      <w:r>
+        <w:t xml:space="preserve"> → progetto </w:t>
+      </w:r>
+      <w:r>
+        <w:rPr>
+          <w:b/>
+          <w:bCs/>
+        </w:rPr>
+        <w:t>annuario-pn</w:t>
+      </w:r>
+      <w:r>
+        <w:t xml:space="preserve"> → </w:t>
+      </w:r>
+      <w:r>
+        <w:rPr>
+          <w:b/>
+          <w:bCs/>
+        </w:rPr>
+        <w:t>Settings</w:t>
+      </w:r>
+      <w:r>
+        <w:t xml:space="preserve"> → </w:t>
+      </w:r>
+      <w:r>
+        <w:rPr>
+          <w:b/>
+          <w:bCs/>
+        </w:rPr>
+        <w:t>Environment Variables</w:t>
+      </w:r>
+      <w:r>
+        <w:t>.</w:t>
+      </w:r>
+    </w:p>
+    <w:p>
+      <w:pPr>
+        <w:pStyle w:val="Paragrafoelenco"/>
+        <w:numPr>
+          <w:ilvl w:val="0"/>
+          <w:numId w:val="8"/>
+        </w:numPr>
+        <w:spacing w:after="80" w:line="290" w:lineRule="auto"/>
+      </w:pPr>
+      <w:r>
+        <w:t xml:space="preserve">Se </w:t>
       </w:r>
       <w:r>
         <w:rPr>
@@ -5134,10 +5211,20 @@
           <w:color w:val="002B49"/>
           <w:shd w:val="clear" w:color="auto" w:fill="EEF3F7"/>
         </w:rPr>
-        <w:t>.env.local</w:t>
-      </w:r>
-      <w:r>
-        <w:t xml:space="preserve">: </w:t>
+        <w:t>ADMIN_PASSWORD_HASH</w:t>
+      </w:r>
+      <w:r>
+        <w:t xml:space="preserve"> esiste già: clicca i tre puntini sulla sua riga → </w:t>
+      </w:r>
+      <w:r>
+        <w:rPr>
+          <w:b/>
+          <w:bCs/>
+        </w:rPr>
+        <w:t>Edit</w:t>
+      </w:r>
+      <w:r>
+        <w:t xml:space="preserve">, incolla la nuova impronta al posto della vecchia e salva. Se non esiste: in alto scrivi </w:t>
       </w:r>
       <w:r>
         <w:rPr>
@@ -5145,10 +5232,88 @@
           <w:color w:val="002B49"/>
           <w:shd w:val="clear" w:color="auto" w:fill="EEF3F7"/>
         </w:rPr>
-        <w:t>ADMIN_PASSWORD="la-tua-password"</w:t>
-      </w:r>
-      <w:r>
-        <w:t>.</w:t>
+        <w:t>ADMIN_PASSWORD_HASH</w:t>
+      </w:r>
+      <w:r>
+        <w:t xml:space="preserve"> come nome, incolla l'impronta come valore, seleziona </w:t>
+      </w:r>
+      <w:r>
+        <w:rPr>
+          <w:b/>
+          <w:bCs/>
+        </w:rPr>
+        <w:t>Production</w:t>
+      </w:r>
+      <w:r>
+        <w:t xml:space="preserve"> e salva.</w:t>
+      </w:r>
+    </w:p>
+    <w:p>
+      <w:pPr>
+        <w:pStyle w:val="Paragrafoelenco"/>
+        <w:numPr>
+          <w:ilvl w:val="0"/>
+          <w:numId w:val="8"/>
+        </w:numPr>
+        <w:spacing w:after="80" w:line="290" w:lineRule="auto"/>
+      </w:pPr>
+      <w:r>
+        <w:t xml:space="preserve">Perché la nuova password valga serve una nuova pubblicazione: scheda </w:t>
+      </w:r>
+      <w:r>
+        <w:rPr>
+          <w:b/>
+          <w:bCs/>
+        </w:rPr>
+        <w:t>Deployments</w:t>
+      </w:r>
+      <w:r>
+        <w:t xml:space="preserve"> → tre puntini sulla prima riga → </w:t>
+      </w:r>
+      <w:r>
+        <w:rPr>
+          <w:b/>
+          <w:bCs/>
+        </w:rPr>
+        <w:t>Redeploy</w:t>
+      </w:r>
+      <w:r>
+        <w:t xml:space="preserve"> → conferma.</w:t>
+      </w:r>
+    </w:p>
+    <w:p>
+      <w:pPr>
+        <w:pStyle w:val="Paragrafoelenco"/>
+        <w:numPr>
+          <w:ilvl w:val="0"/>
+          <w:numId w:val="8"/>
+        </w:numPr>
+        <w:spacing w:after="80" w:line="290" w:lineRule="auto"/>
+      </w:pPr>
+      <w:r>
+        <w:t xml:space="preserve">Per usare il pannello anche in locale, aggiungi in fondo al file </w:t>
+      </w:r>
+      <w:r>
+        <w:rPr>
+          <w:rFonts w:ascii="Consolas" w:eastAsia="Consolas" w:hAnsi="Consolas" w:cs="Consolas"/>
+          <w:color w:val="002B49"/>
+          <w:shd w:val="clear" w:color="auto" w:fill="EEF3F7"/>
+        </w:rPr>
+        <w:t>.env.local</w:t>
+      </w:r>
+      <w:r>
+        <w:t xml:space="preserve"> la riga </w:t>
+      </w:r>
+      <w:r>
+        <w:rPr>
+          <w:rFonts w:ascii="Consolas" w:eastAsia="Consolas" w:hAnsi="Consolas" w:cs="Consolas"/>
+          <w:color w:val="002B49"/>
+          <w:shd w:val="clear" w:color="auto" w:fill="EEF3F7"/>
+        </w:rPr>
+        <w:t>ADMIN_PASSWORD_HASH="pbkdf2-sha256:..."</w:t>
+      </w:r>
+      <w:r>
+        <w:t>, con l'impronta tra virgolette.</w:t>
       </w:r>
     </w:p>
     <w:p>
@@ -5169,7 +5334,18 @@
         <w:t xml:space="preserve">Attenzione. </w:t>
       </w:r>
       <w:r>
-        <w:t>Usa una password lunga (almeno 12 caratteri) e non condividerla in chat o per email. Cambiandola, chi era già entrato nel pannello viene disconnesso.</w:t>
+        <w:t xml:space="preserve">Usa una password lunga (almeno 12 caratteri), tienila in un gestore di password e non condividerla in chat o per email. Non scrivere mai la password in chiaro su Vercel o nel file </w:t>
+      </w:r>
+      <w:r>
+        <w:rPr>
+          <w:rFonts w:ascii="Consolas" w:eastAsia="Consolas" w:hAnsi="Consolas" w:cs="Consolas"/>
+          <w:color w:val="002B49"/>
+          <w:shd w:val="clear" w:color="auto" w:fill="EEF3F7"/>
+        </w:rPr>
+        <w:t>.env.local</w:t>
+      </w:r>
+      <w:r>
+        <w:t>: lì va solo l'impronta. Cambiandola, chi era già entrato nel pannello viene disconnesso.</w:t>
       </w:r>
     </w:p>
     <w:p>
@@ -5190,7 +5366,91 @@
         <w:t xml:space="preserve">Nota. </w:t>
       </w:r>
       <w:r>
-        <w:t xml:space="preserve">In alternativa al pannello, resta possibile modificare il database a mano con Drizzle Studio (comando </w:t>
+        <w:t>Quando scrivi la password nella pagina di accesso, questa viaggia verso il sito dentro una connessione cifrata (HTTPS, il lucchetto nella barra del browser): nessuno può leggerla lungo il percorso. Il sito la usa solo per ricalcolare l'impronta e non la salva.</w:t>
+      </w:r>
+    </w:p>
+    <w:p>
+      <w:pPr>
+        <w:pStyle w:val="Titolo2"/>
+      </w:pPr>
+      <w:bookmarkStart w:id="16" w:name="_Toc241913470"/>
+      <w:r>
+        <w:t>Disconnettere tutti i dispositivi</w:t>
+      </w:r>
+      <w:bookmarkEnd w:id="16"/>
+    </w:p>
+    <w:p>
+      <w:pPr>
+        <w:spacing w:after="120" w:line="290" w:lineRule="auto"/>
+      </w:pPr>
+      <w:r>
+        <w:t xml:space="preserve">Se hai usato il pannello su un computer non tuo e hai dimenticato di cliccare </w:t>
+      </w:r>
+      <w:r>
+        <w:rPr>
+          <w:b/>
+          <w:bCs/>
+        </w:rPr>
+        <w:t>Esci</w:t>
+      </w:r>
+      <w:r>
+        <w:t>, o temi che qualcuno sia entrato, puoi chiudere tutte le sessioni aperte senza cambiare password:</w:t>
+      </w:r>
+    </w:p>
+    <w:p>
+      <w:pPr>
+        <w:pStyle w:val="Paragrafoelenco"/>
+        <w:numPr>
+          <w:ilvl w:val="0"/>
+          <w:numId w:val="9"/>
+        </w:numPr>
+        <w:spacing w:after="80" w:line="290" w:lineRule="auto"/>
+      </w:pPr>
+      <w:r>
+        <w:t xml:space="preserve">Su vercel.com → progetto </w:t>
+      </w:r>
+      <w:r>
+        <w:rPr>
+          <w:b/>
+          <w:bCs/>
+        </w:rPr>
+        <w:t>annuario-pn</w:t>
+      </w:r>
+      <w:r>
+        <w:t xml:space="preserve"> → </w:t>
+      </w:r>
+      <w:r>
+        <w:rPr>
+          <w:b/>
+          <w:bCs/>
+        </w:rPr>
+        <w:t>Settings</w:t>
+      </w:r>
+      <w:r>
+        <w:t xml:space="preserve"> → </w:t>
+      </w:r>
+      <w:r>
+        <w:rPr>
+          <w:b/>
+          <w:bCs/>
+        </w:rPr>
+        <w:t>Environment Variables</w:t>
+      </w:r>
+      <w:r>
+        <w:t>.</w:t>
+      </w:r>
+    </w:p>
+    <w:p>
+      <w:pPr>
+        <w:pStyle w:val="Paragrafoelenco"/>
+        <w:numPr>
+          <w:ilvl w:val="0"/>
+          <w:numId w:val="9"/>
+        </w:numPr>
+        <w:spacing w:after="80" w:line="290" w:lineRule="auto"/>
+      </w:pPr>
+      <w:r>
+        <w:t xml:space="preserve">Se </w:t>
       </w:r>
       <w:r>
         <w:rPr>
@@ -5198,6 +5458,124 @@
           <w:color w:val="002B49"/>
           <w:shd w:val="clear" w:color="auto" w:fill="EEF3F7"/>
         </w:rPr>
+        <w:t>ADMIN_SESSION_VERSION</w:t>
+      </w:r>
+      <w:r>
+        <w:t xml:space="preserve"> non esiste, creala: nome </w:t>
+      </w:r>
+      <w:r>
+        <w:rPr>
+          <w:rFonts w:ascii="Consolas" w:eastAsia="Consolas" w:hAnsi="Consolas" w:cs="Consolas"/>
+          <w:color w:val="002B49"/>
+          <w:shd w:val="clear" w:color="auto" w:fill="EEF3F7"/>
+        </w:rPr>
+        <w:t>ADMIN_SESSION_VERSION</w:t>
+      </w:r>
+      <w:r>
+        <w:t xml:space="preserve">, valore </w:t>
+      </w:r>
+      <w:r>
+        <w:rPr>
+          <w:rFonts w:ascii="Consolas" w:eastAsia="Consolas" w:hAnsi="Consolas" w:cs="Consolas"/>
+          <w:color w:val="002B49"/>
+          <w:shd w:val="clear" w:color="auto" w:fill="EEF3F7"/>
+        </w:rPr>
+        <w:t>2</w:t>
+      </w:r>
+      <w:r>
+        <w:t xml:space="preserve">, ambiente </w:t>
+      </w:r>
+      <w:r>
+        <w:rPr>
+          <w:b/>
+          <w:bCs/>
+        </w:rPr>
+        <w:t>Production</w:t>
+      </w:r>
+      <w:r>
+        <w:t xml:space="preserve">. Se esiste già, aumenta il numero di uno (per esempio da </w:t>
+      </w:r>
+      <w:r>
+        <w:rPr>
+          <w:rFonts w:ascii="Consolas" w:eastAsia="Consolas" w:hAnsi="Consolas" w:cs="Consolas"/>
+          <w:color w:val="002B49"/>
+          <w:shd w:val="clear" w:color="auto" w:fill="EEF3F7"/>
+        </w:rPr>
+        <w:t>2</w:t>
+      </w:r>
+      <w:r>
+        <w:t xml:space="preserve"> a </w:t>
+      </w:r>
+      <w:r>
+        <w:rPr>
+          <w:rFonts w:ascii="Consolas" w:eastAsia="Consolas" w:hAnsi="Consolas" w:cs="Consolas"/>
+          <w:color w:val="002B49"/>
+          <w:shd w:val="clear" w:color="auto" w:fill="EEF3F7"/>
+        </w:rPr>
+        <w:t>3</w:t>
+      </w:r>
+      <w:r>
+        <w:t>).</w:t>
+      </w:r>
+    </w:p>
+    <w:p>
+      <w:pPr>
+        <w:pStyle w:val="Paragrafoelenco"/>
+        <w:numPr>
+          <w:ilvl w:val="0"/>
+          <w:numId w:val="9"/>
+        </w:numPr>
+        <w:spacing w:after="80" w:line="290" w:lineRule="auto"/>
+      </w:pPr>
+      <w:r>
+        <w:t xml:space="preserve">Fai il </w:t>
+      </w:r>
+      <w:r>
+        <w:rPr>
+          <w:b/>
+          <w:bCs/>
+        </w:rPr>
+        <w:t>Redeploy</w:t>
+      </w:r>
+      <w:r>
+        <w:t xml:space="preserve"> (scheda Deployments → tre puntini sulla prima riga → Redeploy).</w:t>
+      </w:r>
+    </w:p>
+    <w:p>
+      <w:pPr>
+        <w:spacing w:after="120" w:line="290" w:lineRule="auto"/>
+      </w:pPr>
+      <w:r>
+        <w:t>Da quel momento chiunque fosse dentro il pannello, tu compreso, deve rientrare con la password. Se temi che qualcuno conosca la password, cambiala (sezione precedente): anche questo disconnette tutti.</w:t>
+      </w:r>
+    </w:p>
+    <w:p>
+      <w:pPr>
+        <w:pBdr>
+          <w:left w:val="single" w:sz="24" w:space="8" w:color="0066B2"/>
+        </w:pBdr>
+        <w:shd w:val="clear" w:color="auto" w:fill="E8F1F9"/>
+        <w:spacing w:before="120" w:after="200" w:line="290" w:lineRule="auto"/>
+        <w:ind w:left="200" w:right="200"/>
+      </w:pPr>
+      <w:r>
+        <w:rPr>
+          <w:b/>
+          <w:bCs/>
+          <w:color w:val="0066B2"/>
+        </w:rPr>
+        <w:lastRenderedPageBreak/>
+        <w:t xml:space="preserve">Nota. </w:t>
+      </w:r>
+      <w:r>
+        <w:t xml:space="preserve">In alternativa al pannello, resta possibile modificare il database a mano con Drizzle Studio (comando </w:t>
+      </w:r>
+      <w:r>
+        <w:rPr>
+          <w:rFonts w:ascii="Consolas" w:eastAsia="Consolas" w:hAnsi="Consolas" w:cs="Consolas"/>
+          <w:color w:val="002B49"/>
+          <w:shd w:val="clear" w:color="auto" w:fill="EEF3F7"/>
+        </w:rPr>
         <w:t>npm run db:studio</w:t>
       </w:r>
       <w:r>
@@ -5209,12 +5587,12 @@
         <w:pStyle w:val="Titolo1"/>
         <w:pageBreakBefore/>
       </w:pPr>
-      <w:bookmarkStart w:id="16" w:name="_Toc241909293"/>
+      <w:bookmarkStart w:id="17" w:name="_Toc241913471"/>
       <w:r>
         <w:lastRenderedPageBreak/>
         <w:t>5. Aprire e chiudere gli invii per l'annuario</w:t>
       </w:r>
-      <w:bookmarkEnd w:id="16"/>
+      <w:bookmarkEnd w:id="17"/>
     </w:p>
     <w:p>
       <w:pPr>
@@ -5302,18 +5680,18 @@
       <w:pPr>
         <w:pStyle w:val="Titolo2"/>
       </w:pPr>
-      <w:bookmarkStart w:id="17" w:name="_Toc241909294"/>
+      <w:bookmarkStart w:id="18" w:name="_Toc241913472"/>
       <w:r>
         <w:t>Cambiare anno e date</w:t>
       </w:r>
-      <w:bookmarkEnd w:id="17"/>
+      <w:bookmarkEnd w:id="18"/>
     </w:p>
     <w:p>
       <w:pPr>
         <w:pStyle w:val="Paragrafoelenco"/>
         <w:numPr>
           <w:ilvl w:val="0"/>
-          <w:numId w:val="9"/>
+          <w:numId w:val="10"/>
         </w:numPr>
         <w:spacing w:after="80" w:line="290" w:lineRule="auto"/>
       </w:pPr>
@@ -5337,7 +5715,7 @@
         <w:pStyle w:val="Paragrafoelenco"/>
         <w:numPr>
           <w:ilvl w:val="0"/>
-          <w:numId w:val="9"/>
+          <w:numId w:val="10"/>
         </w:numPr>
         <w:spacing w:after="80" w:line="290" w:lineRule="auto"/>
       </w:pPr>
@@ -5406,7 +5784,7 @@
         <w:pStyle w:val="Paragrafoelenco"/>
         <w:numPr>
           <w:ilvl w:val="0"/>
-          <w:numId w:val="9"/>
+          <w:numId w:val="10"/>
         </w:numPr>
         <w:spacing w:after="80" w:line="290" w:lineRule="auto"/>
       </w:pPr>
@@ -5461,11 +5839,11 @@
       <w:pPr>
         <w:pStyle w:val="Titolo2"/>
       </w:pPr>
-      <w:bookmarkStart w:id="18" w:name="_Toc241909295"/>
+      <w:bookmarkStart w:id="19" w:name="_Toc241913473"/>
       <w:r>
         <w:t>Aprire o chiudere a mano, senza toccare le date</w:t>
       </w:r>
-      <w:bookmarkEnd w:id="18"/>
+      <w:bookmarkEnd w:id="19"/>
     </w:p>
     <w:p>
       <w:pPr>
@@ -5798,11 +6176,11 @@
       <w:pPr>
         <w:pStyle w:val="Titolo2"/>
       </w:pPr>
-      <w:bookmarkStart w:id="19" w:name="_Toc241909296"/>
+      <w:bookmarkStart w:id="20" w:name="_Toc241913474"/>
       <w:r>
         <w:t>Limite di foto per persona</w:t>
       </w:r>
-      <w:bookmarkEnd w:id="19"/>
+      <w:bookmarkEnd w:id="20"/>
     </w:p>
     <w:p>
       <w:pPr>
@@ -5871,12 +6249,12 @@
         <w:pStyle w:val="Titolo1"/>
         <w:pageBreakBefore/>
       </w:pPr>
-      <w:bookmarkStart w:id="20" w:name="_Toc241909297"/>
+      <w:bookmarkStart w:id="21" w:name="_Toc241913475"/>
       <w:r>
         <w:lastRenderedPageBreak/>
         <w:t>6. Creare il PDF dell'annuario</w:t>
       </w:r>
-      <w:bookmarkEnd w:id="20"/>
+      <w:bookmarkEnd w:id="21"/>
     </w:p>
     <w:p>
       <w:pPr>
@@ -5973,11 +6351,11 @@
       <w:pPr>
         <w:pStyle w:val="Titolo2"/>
       </w:pPr>
-      <w:bookmarkStart w:id="21" w:name="_Toc241909298"/>
+      <w:bookmarkStart w:id="22" w:name="_Toc241913476"/>
       <w:r>
         <w:t>La copertina: logo e scritta "Edizione 2027-28"</w:t>
       </w:r>
-      <w:bookmarkEnd w:id="21"/>
+      <w:bookmarkEnd w:id="22"/>
     </w:p>
     <w:p>
       <w:pPr>
@@ -6571,11 +6949,11 @@
       <w:pPr>
         <w:pStyle w:val="Titolo2"/>
       </w:pPr>
-      <w:bookmarkStart w:id="22" w:name="_Toc241909299"/>
+      <w:bookmarkStart w:id="23" w:name="_Toc241913477"/>
       <w:r>
         <w:t>Premessa</w:t>
       </w:r>
-      <w:bookmarkEnd w:id="22"/>
+      <w:bookmarkEnd w:id="23"/>
     </w:p>
     <w:p>
       <w:pPr>
@@ -6605,94 +6983,6 @@
       <w:r>
         <w:t>. Per scrivere una premessa diversa per un certo anno:</w:t>
       </w:r>
-    </w:p>
-    <w:p>
-      <w:pPr>
-        <w:pStyle w:val="Paragrafoelenco"/>
-        <w:numPr>
-          <w:ilvl w:val="0"/>
-          <w:numId w:val="10"/>
-        </w:numPr>
-        <w:spacing w:after="80" w:line="290" w:lineRule="auto"/>
-      </w:pPr>
-      <w:r>
-        <w:t xml:space="preserve">Nella cartella </w:t>
-      </w:r>
-      <w:r>
-        <w:rPr>
-          <w:rFonts w:ascii="Consolas" w:eastAsia="Consolas" w:hAnsi="Consolas" w:cs="Consolas"/>
-          <w:color w:val="002B49"/>
-          <w:shd w:val="clear" w:color="auto" w:fill="EEF3F7"/>
-        </w:rPr>
-        <w:t>content</w:t>
-      </w:r>
-      <w:r>
-        <w:t xml:space="preserve"> del progetto crea un file di testo chiamato </w:t>
-      </w:r>
-      <w:r>
-        <w:rPr>
-          <w:rFonts w:ascii="Consolas" w:eastAsia="Consolas" w:hAnsi="Consolas" w:cs="Consolas"/>
-          <w:color w:val="002B49"/>
-          <w:shd w:val="clear" w:color="auto" w:fill="EEF3F7"/>
-        </w:rPr>
-        <w:t>premessa-2028.txt</w:t>
-      </w:r>
-      <w:r>
-        <w:t xml:space="preserve"> (con l'anno dell'edizione).</w:t>
-      </w:r>
-    </w:p>
-    <w:p>
-      <w:pPr>
-        <w:pStyle w:val="Paragrafoelenco"/>
-        <w:numPr>
-          <w:ilvl w:val="0"/>
-          <w:numId w:val="10"/>
-        </w:numPr>
-        <w:spacing w:after="80" w:line="290" w:lineRule="auto"/>
-      </w:pPr>
-      <w:r>
-        <w:t>Scrivi il testo della premessa. Lascia una riga vuota tra un paragrafo e l'altro. Salva.</w:t>
-      </w:r>
-    </w:p>
-    <w:p>
-      <w:pPr>
-        <w:spacing w:after="120" w:line="290" w:lineRule="auto"/>
-      </w:pPr>
-      <w:r>
-        <w:t xml:space="preserve">Se il file dell'anno c'è, viene usato quello; altrimenti si usa </w:t>
-      </w:r>
-      <w:r>
-        <w:rPr>
-          <w:rFonts w:ascii="Consolas" w:eastAsia="Consolas" w:hAnsi="Consolas" w:cs="Consolas"/>
-          <w:color w:val="002B49"/>
-          <w:shd w:val="clear" w:color="auto" w:fill="EEF3F7"/>
-        </w:rPr>
-        <w:t>content/premessa.txt</w:t>
-      </w:r>
-      <w:r>
-        <w:t xml:space="preserve">. Per cambiare la premessa di tutti gli anni futuri, modifica direttamente </w:t>
-      </w:r>
-      <w:r>
-        <w:rPr>
-          <w:rFonts w:ascii="Consolas" w:eastAsia="Consolas" w:hAnsi="Consolas" w:cs="Consolas"/>
-          <w:color w:val="002B49"/>
-          <w:shd w:val="clear" w:color="auto" w:fill="EEF3F7"/>
-        </w:rPr>
-        <w:t>content/premessa.txt</w:t>
-      </w:r>
-      <w:r>
-        <w:t>.</w:t>
-      </w:r>
-    </w:p>
-    <w:p>
-      <w:pPr>
-        <w:pStyle w:val="Titolo2"/>
-      </w:pPr>
-      <w:bookmarkStart w:id="23" w:name="_Toc241909300"/>
-      <w:r>
-        <w:t>Generare il PDF</w:t>
-      </w:r>
-      <w:bookmarkEnd w:id="23"/>
     </w:p>
     <w:p>
       <w:pPr>
@@ -6704,7 +6994,29 @@
         <w:spacing w:after="80" w:line="290" w:lineRule="auto"/>
       </w:pPr>
       <w:r>
-        <w:t>Apri il terminale nella cartella del progetto.</w:t>
+        <w:t xml:space="preserve">Nella cartella </w:t>
+      </w:r>
+      <w:r>
+        <w:rPr>
+          <w:rFonts w:ascii="Consolas" w:eastAsia="Consolas" w:hAnsi="Consolas" w:cs="Consolas"/>
+          <w:color w:val="002B49"/>
+          <w:shd w:val="clear" w:color="auto" w:fill="EEF3F7"/>
+        </w:rPr>
+        <w:t>content</w:t>
+      </w:r>
+      <w:r>
+        <w:t xml:space="preserve"> del progetto crea un file di testo chiamato </w:t>
+      </w:r>
+      <w:r>
+        <w:rPr>
+          <w:rFonts w:ascii="Consolas" w:eastAsia="Consolas" w:hAnsi="Consolas" w:cs="Consolas"/>
+          <w:color w:val="002B49"/>
+          <w:shd w:val="clear" w:color="auto" w:fill="EEF3F7"/>
+        </w:rPr>
+        <w:t>premessa-2028.txt</w:t>
+      </w:r>
+      <w:r>
+        <w:t xml:space="preserve"> (con l'anno dell'edizione).</w:t>
       </w:r>
     </w:p>
     <w:p>
@@ -6717,6 +7029,72 @@
         <w:spacing w:after="80" w:line="290" w:lineRule="auto"/>
       </w:pPr>
       <w:r>
+        <w:t>Scrivi il testo della premessa. Lascia una riga vuota tra un paragrafo e l'altro. Salva.</w:t>
+      </w:r>
+    </w:p>
+    <w:p>
+      <w:pPr>
+        <w:spacing w:after="120" w:line="290" w:lineRule="auto"/>
+      </w:pPr>
+      <w:r>
+        <w:t xml:space="preserve">Se il file dell'anno c'è, viene usato quello; altrimenti si usa </w:t>
+      </w:r>
+      <w:r>
+        <w:rPr>
+          <w:rFonts w:ascii="Consolas" w:eastAsia="Consolas" w:hAnsi="Consolas" w:cs="Consolas"/>
+          <w:color w:val="002B49"/>
+          <w:shd w:val="clear" w:color="auto" w:fill="EEF3F7"/>
+        </w:rPr>
+        <w:t>content/premessa.txt</w:t>
+      </w:r>
+      <w:r>
+        <w:t xml:space="preserve">. Per cambiare la premessa di tutti gli anni futuri, modifica direttamente </w:t>
+      </w:r>
+      <w:r>
+        <w:rPr>
+          <w:rFonts w:ascii="Consolas" w:eastAsia="Consolas" w:hAnsi="Consolas" w:cs="Consolas"/>
+          <w:color w:val="002B49"/>
+          <w:shd w:val="clear" w:color="auto" w:fill="EEF3F7"/>
+        </w:rPr>
+        <w:t>content/premessa.txt</w:t>
+      </w:r>
+      <w:r>
+        <w:t>.</w:t>
+      </w:r>
+    </w:p>
+    <w:p>
+      <w:pPr>
+        <w:pStyle w:val="Titolo2"/>
+      </w:pPr>
+      <w:bookmarkStart w:id="24" w:name="_Toc241913478"/>
+      <w:r>
+        <w:t>Generare il PDF</w:t>
+      </w:r>
+      <w:bookmarkEnd w:id="24"/>
+    </w:p>
+    <w:p>
+      <w:pPr>
+        <w:pStyle w:val="Paragrafoelenco"/>
+        <w:numPr>
+          <w:ilvl w:val="0"/>
+          <w:numId w:val="12"/>
+        </w:numPr>
+        <w:spacing w:after="80" w:line="290" w:lineRule="auto"/>
+      </w:pPr>
+      <w:r>
+        <w:t>Apri il terminale nella cartella del progetto.</w:t>
+      </w:r>
+    </w:p>
+    <w:p>
+      <w:pPr>
+        <w:pStyle w:val="Paragrafoelenco"/>
+        <w:numPr>
+          <w:ilvl w:val="0"/>
+          <w:numId w:val="12"/>
+        </w:numPr>
+        <w:spacing w:after="80" w:line="290" w:lineRule="auto"/>
+      </w:pPr>
+      <w:r>
         <w:t>Scrivi il comando qui sotto e premi Invio:</w:t>
       </w:r>
     </w:p>
@@ -6744,7 +7122,7 @@
         <w:pStyle w:val="Paragrafoelenco"/>
         <w:numPr>
           <w:ilvl w:val="0"/>
-          <w:numId w:val="11"/>
+          <w:numId w:val="12"/>
         </w:numPr>
         <w:spacing w:after="80" w:line="290" w:lineRule="auto"/>
       </w:pPr>
@@ -6789,7 +7167,7 @@
         <w:pStyle w:val="Paragrafoelenco"/>
         <w:numPr>
           <w:ilvl w:val="0"/>
-          <w:numId w:val="11"/>
+          <w:numId w:val="12"/>
         </w:numPr>
         <w:spacing w:after="80" w:line="290" w:lineRule="auto"/>
       </w:pPr>
@@ -6801,11 +7179,11 @@
       <w:pPr>
         <w:pStyle w:val="Titolo2"/>
       </w:pPr>
-      <w:bookmarkStart w:id="24" w:name="_Toc241909301"/>
+      <w:bookmarkStart w:id="25" w:name="_Toc241913479"/>
       <w:r>
         <w:t>Opzioni utili</w:t>
       </w:r>
-      <w:bookmarkEnd w:id="24"/>
+      <w:bookmarkEnd w:id="25"/>
     </w:p>
     <w:p>
       <w:pPr>
@@ -6924,12 +7302,12 @@
         <w:pStyle w:val="Titolo1"/>
         <w:pageBreakBefore/>
       </w:pPr>
-      <w:bookmarkStart w:id="25" w:name="_Toc241909302"/>
+      <w:bookmarkStart w:id="26" w:name="_Toc241913480"/>
       <w:r>
         <w:lastRenderedPageBreak/>
         <w:t>7. Pubblicare una nuova edizione nell'Archivio</w:t>
       </w:r>
-      <w:bookmarkEnd w:id="25"/>
+      <w:bookmarkEnd w:id="26"/>
     </w:p>
     <w:p>
       <w:pPr>
@@ -6954,7 +7332,7 @@
         <w:pStyle w:val="Paragrafoelenco"/>
         <w:numPr>
           <w:ilvl w:val="0"/>
-          <w:numId w:val="12"/>
+          <w:numId w:val="13"/>
         </w:numPr>
         <w:spacing w:after="80" w:line="290" w:lineRule="auto"/>
       </w:pPr>
@@ -6989,7 +7367,7 @@
         <w:pStyle w:val="Paragrafoelenco"/>
         <w:numPr>
           <w:ilvl w:val="0"/>
-          <w:numId w:val="12"/>
+          <w:numId w:val="13"/>
         </w:numPr>
         <w:spacing w:after="80" w:line="290" w:lineRule="auto"/>
       </w:pPr>
@@ -7034,7 +7412,7 @@
         <w:pStyle w:val="Paragrafoelenco"/>
         <w:numPr>
           <w:ilvl w:val="0"/>
-          <w:numId w:val="12"/>
+          <w:numId w:val="13"/>
         </w:numPr>
         <w:spacing w:after="80" w:line="290" w:lineRule="auto"/>
       </w:pPr>
@@ -7168,7 +7546,7 @@
         <w:pStyle w:val="Paragrafoelenco"/>
         <w:numPr>
           <w:ilvl w:val="0"/>
-          <w:numId w:val="12"/>
+          <w:numId w:val="13"/>
         </w:numPr>
         <w:spacing w:after="80" w:line="290" w:lineRule="auto"/>
       </w:pPr>
@@ -7191,7 +7569,7 @@
         <w:pStyle w:val="Paragrafoelenco"/>
         <w:numPr>
           <w:ilvl w:val="0"/>
-          <w:numId w:val="12"/>
+          <w:numId w:val="13"/>
         </w:numPr>
         <w:spacing w:after="80" w:line="290" w:lineRule="auto"/>
       </w:pPr>
@@ -7225,29 +7603,29 @@
         <w:pStyle w:val="Titolo1"/>
         <w:pageBreakBefore/>
       </w:pPr>
-      <w:bookmarkStart w:id="26" w:name="_Toc241909303"/>
+      <w:bookmarkStart w:id="27" w:name="_Toc241913481"/>
       <w:r>
         <w:lastRenderedPageBreak/>
         <w:t>8. Altre modifiche frequenti</w:t>
       </w:r>
-      <w:bookmarkEnd w:id="26"/>
+      <w:bookmarkEnd w:id="27"/>
     </w:p>
     <w:p>
       <w:pPr>
         <w:pStyle w:val="Titolo2"/>
       </w:pPr>
-      <w:bookmarkStart w:id="27" w:name="_Toc241909304"/>
+      <w:bookmarkStart w:id="28" w:name="_Toc241913482"/>
       <w:r>
         <w:t>Cambiare la foto di sfondo della Home</w:t>
       </w:r>
-      <w:bookmarkEnd w:id="27"/>
+      <w:bookmarkEnd w:id="28"/>
     </w:p>
     <w:p>
       <w:pPr>
         <w:pStyle w:val="Paragrafoelenco"/>
         <w:numPr>
           <w:ilvl w:val="0"/>
-          <w:numId w:val="13"/>
+          <w:numId w:val="14"/>
         </w:numPr>
         <w:spacing w:after="80" w:line="290" w:lineRule="auto"/>
       </w:pPr>
@@ -7260,7 +7638,7 @@
         <w:pStyle w:val="Paragrafoelenco"/>
         <w:numPr>
           <w:ilvl w:val="0"/>
-          <w:numId w:val="13"/>
+          <w:numId w:val="14"/>
         </w:numPr>
         <w:spacing w:after="80" w:line="290" w:lineRule="auto"/>
       </w:pPr>
@@ -7284,7 +7662,7 @@
         <w:pStyle w:val="Paragrafoelenco"/>
         <w:numPr>
           <w:ilvl w:val="0"/>
-          <w:numId w:val="13"/>
+          <w:numId w:val="14"/>
         </w:numPr>
         <w:spacing w:after="80" w:line="290" w:lineRule="auto"/>
       </w:pPr>
@@ -7308,7 +7686,7 @@
         <w:pStyle w:val="Paragrafoelenco"/>
         <w:numPr>
           <w:ilvl w:val="0"/>
-          <w:numId w:val="13"/>
+          <w:numId w:val="14"/>
         </w:numPr>
         <w:spacing w:after="80" w:line="290" w:lineRule="auto"/>
       </w:pPr>
@@ -7320,11 +7698,11 @@
       <w:pPr>
         <w:pStyle w:val="Titolo2"/>
       </w:pPr>
-      <w:bookmarkStart w:id="28" w:name="_Toc241909305"/>
+      <w:bookmarkStart w:id="29" w:name="_Toc241913483"/>
       <w:r>
         <w:t>Cambiare i testi del sito</w:t>
       </w:r>
-      <w:bookmarkEnd w:id="28"/>
+      <w:bookmarkEnd w:id="29"/>
     </w:p>
     <w:p>
       <w:pPr>
@@ -7905,7 +8283,7 @@
         <w:pStyle w:val="Paragrafoelenco"/>
         <w:numPr>
           <w:ilvl w:val="0"/>
-          <w:numId w:val="14"/>
+          <w:numId w:val="15"/>
         </w:numPr>
         <w:spacing w:after="80" w:line="290" w:lineRule="auto"/>
       </w:pPr>
@@ -7928,7 +8306,7 @@
         <w:pStyle w:val="Paragrafoelenco"/>
         <w:numPr>
           <w:ilvl w:val="0"/>
-          <w:numId w:val="14"/>
+          <w:numId w:val="15"/>
         </w:numPr>
         <w:spacing w:after="80" w:line="290" w:lineRule="auto"/>
       </w:pPr>
@@ -7985,7 +8363,7 @@
         <w:pStyle w:val="Paragrafoelenco"/>
         <w:numPr>
           <w:ilvl w:val="0"/>
-          <w:numId w:val="14"/>
+          <w:numId w:val="15"/>
         </w:numPr>
         <w:spacing w:after="80" w:line="290" w:lineRule="auto"/>
       </w:pPr>
@@ -7998,7 +8376,7 @@
         <w:pStyle w:val="Paragrafoelenco"/>
         <w:numPr>
           <w:ilvl w:val="0"/>
-          <w:numId w:val="14"/>
+          <w:numId w:val="15"/>
         </w:numPr>
         <w:spacing w:after="80" w:line="290" w:lineRule="auto"/>
       </w:pPr>
@@ -8022,12 +8400,12 @@
         <w:pStyle w:val="Titolo1"/>
         <w:pageBreakBefore/>
       </w:pPr>
-      <w:bookmarkStart w:id="29" w:name="_Toc241909306"/>
+      <w:bookmarkStart w:id="30" w:name="_Toc241913484"/>
       <w:r>
         <w:lastRenderedPageBreak/>
         <w:t>9. Password, chiavi e variabili d'ambiente</w:t>
       </w:r>
-      <w:bookmarkEnd w:id="29"/>
+      <w:bookmarkEnd w:id="30"/>
     </w:p>
     <w:p>
       <w:pPr>
@@ -8456,7 +8834,7 @@
                 <w:color w:val="002B49"/>
                 <w:shd w:val="clear" w:color="auto" w:fill="EEF3F7"/>
               </w:rPr>
-              <w:t>ADMIN_PASSWORD</w:t>
+              <w:t>ADMIN_PASSWORD_HASH</w:t>
             </w:r>
           </w:p>
         </w:tc>
@@ -8481,7 +8859,7 @@
               <w:spacing w:line="276" w:lineRule="auto"/>
             </w:pPr>
             <w:r>
-              <w:t>Password del pannello di moderazione.</w:t>
+              <w:t>Impronta della password del pannello di moderazione (non la password).</w:t>
             </w:r>
           </w:p>
         </w:tc>
@@ -8506,7 +8884,18 @@
               <w:spacing w:line="276" w:lineRule="auto"/>
             </w:pPr>
             <w:r>
-              <w:t>La scegli tu (capitolo 4).</w:t>
+              <w:t xml:space="preserve">La crei con </w:t>
+            </w:r>
+            <w:r>
+              <w:rPr>
+                <w:rFonts w:ascii="Consolas" w:eastAsia="Consolas" w:hAnsi="Consolas" w:cs="Consolas"/>
+                <w:color w:val="002B49"/>
+                <w:shd w:val="clear" w:color="auto" w:fill="EEF3F7"/>
+              </w:rPr>
+              <w:t>npm run admin:hash</w:t>
+            </w:r>
+            <w:r>
+              <w:t xml:space="preserve"> (capitolo 4).</w:t>
             </w:r>
           </w:p>
         </w:tc>
@@ -8544,6 +8933,94 @@
                 <w:color w:val="002B49"/>
                 <w:shd w:val="clear" w:color="auto" w:fill="EEF3F7"/>
               </w:rPr>
+              <w:t>ADMIN_SESSION_VERSION</w:t>
+            </w:r>
+          </w:p>
+        </w:tc>
+        <w:tc>
+          <w:tcPr>
+            <w:tcW w:w="3300" w:type="dxa"/>
+            <w:tcBorders>
+              <w:top w:val="single" w:sz="4" w:space="0" w:color="C9D6E2"/>
+              <w:left w:val="single" w:sz="4" w:space="0" w:color="C9D6E2"/>
+              <w:bottom w:val="single" w:sz="4" w:space="0" w:color="C9D6E2"/>
+              <w:right w:val="single" w:sz="4" w:space="0" w:color="C9D6E2"/>
+            </w:tcBorders>
+            <w:tcMar>
+              <w:top w:w="80" w:type="dxa"/>
+              <w:left w:w="120" w:type="dxa"/>
+              <w:bottom w:w="80" w:type="dxa"/>
+              <w:right w:w="120" w:type="dxa"/>
+            </w:tcMar>
+          </w:tcPr>
+          <w:p>
+            <w:pPr>
+              <w:spacing w:line="276" w:lineRule="auto"/>
+            </w:pPr>
+            <w:r>
+              <w:t>Facoltativa. Cambiandola si chiudono tutte le sessioni aperte del pannello.</w:t>
+            </w:r>
+          </w:p>
+        </w:tc>
+        <w:tc>
+          <w:tcPr>
+            <w:tcW w:w="2826" w:type="dxa"/>
+            <w:tcBorders>
+              <w:top w:val="single" w:sz="4" w:space="0" w:color="C9D6E2"/>
+              <w:left w:val="single" w:sz="4" w:space="0" w:color="C9D6E2"/>
+              <w:bottom w:val="single" w:sz="4" w:space="0" w:color="C9D6E2"/>
+              <w:right w:val="single" w:sz="4" w:space="0" w:color="C9D6E2"/>
+            </w:tcBorders>
+            <w:tcMar>
+              <w:top w:w="80" w:type="dxa"/>
+              <w:left w:w="120" w:type="dxa"/>
+              <w:bottom w:w="80" w:type="dxa"/>
+              <w:right w:w="120" w:type="dxa"/>
+            </w:tcMar>
+          </w:tcPr>
+          <w:p>
+            <w:pPr>
+              <w:spacing w:line="276" w:lineRule="auto"/>
+            </w:pPr>
+            <w:r>
+              <w:t>Un numero qualsiasi; vedi capitolo 4, Disconnettere tutti i dispositivi.</w:t>
+            </w:r>
+          </w:p>
+        </w:tc>
+      </w:tr>
+      <w:tr>
+        <w:tblPrEx>
+          <w:tblCellMar>
+            <w:top w:w="0" w:type="dxa"/>
+            <w:bottom w:w="0" w:type="dxa"/>
+          </w:tblCellMar>
+        </w:tblPrEx>
+        <w:tc>
+          <w:tcPr>
+            <w:tcW w:w="2900" w:type="dxa"/>
+            <w:tcBorders>
+              <w:top w:val="single" w:sz="4" w:space="0" w:color="C9D6E2"/>
+              <w:left w:val="single" w:sz="4" w:space="0" w:color="C9D6E2"/>
+              <w:bottom w:val="single" w:sz="4" w:space="0" w:color="C9D6E2"/>
+              <w:right w:val="single" w:sz="4" w:space="0" w:color="C9D6E2"/>
+            </w:tcBorders>
+            <w:tcMar>
+              <w:top w:w="80" w:type="dxa"/>
+              <w:left w:w="120" w:type="dxa"/>
+              <w:bottom w:w="80" w:type="dxa"/>
+              <w:right w:w="120" w:type="dxa"/>
+            </w:tcMar>
+          </w:tcPr>
+          <w:p>
+            <w:pPr>
+              <w:spacing w:line="276" w:lineRule="auto"/>
+            </w:pPr>
+            <w:r>
+              <w:rPr>
+                <w:rFonts w:ascii="Consolas" w:eastAsia="Consolas" w:hAnsi="Consolas" w:cs="Consolas"/>
+                <w:color w:val="002B49"/>
+                <w:shd w:val="clear" w:color="auto" w:fill="EEF3F7"/>
+              </w:rPr>
               <w:t>EMAIL_HASH_SECRET</w:t>
             </w:r>
           </w:p>
@@ -8594,7 +9071,7 @@
               <w:spacing w:line="276" w:lineRule="auto"/>
             </w:pPr>
             <w:r>
-              <w:t>Già impostata. Non cambiarla mentre gli invii sono aperti.</w:t>
+              <w:t>Già impostata. Non cambiarla mentre gli invii sono aperti. Se manca, gli invii per l'Archivio vengono sospesi.</w:t>
             </w:r>
           </w:p>
         </w:tc>
@@ -8609,11 +9086,11 @@
       <w:pPr>
         <w:pStyle w:val="Titolo2"/>
       </w:pPr>
-      <w:bookmarkStart w:id="30" w:name="_Toc241909307"/>
+      <w:bookmarkStart w:id="31" w:name="_Toc241913485"/>
       <w:r>
         <w:t>Recuperare il file .env.local su un nuovo computer</w:t>
       </w:r>
-      <w:bookmarkEnd w:id="30"/>
+      <w:bookmarkEnd w:id="31"/>
     </w:p>
     <w:p>
       <w:pPr>
@@ -8628,7 +9105,7 @@
         <w:pStyle w:val="Paragrafoelenco"/>
         <w:numPr>
           <w:ilvl w:val="0"/>
-          <w:numId w:val="15"/>
+          <w:numId w:val="16"/>
         </w:numPr>
         <w:spacing w:after="80" w:line="290" w:lineRule="auto"/>
       </w:pPr>
@@ -8661,7 +9138,7 @@
         <w:pStyle w:val="Paragrafoelenco"/>
         <w:numPr>
           <w:ilvl w:val="0"/>
-          <w:numId w:val="15"/>
+          <w:numId w:val="16"/>
         </w:numPr>
         <w:spacing w:after="80" w:line="290" w:lineRule="auto"/>
       </w:pPr>
@@ -8704,7 +9181,7 @@
         <w:pStyle w:val="Paragrafoelenco"/>
         <w:numPr>
           <w:ilvl w:val="0"/>
-          <w:numId w:val="15"/>
+          <w:numId w:val="16"/>
         </w:numPr>
         <w:spacing w:after="80" w:line="290" w:lineRule="auto"/>
       </w:pPr>
@@ -8728,7 +9205,7 @@
         <w:pStyle w:val="Paragrafoelenco"/>
         <w:numPr>
           <w:ilvl w:val="0"/>
-          <w:numId w:val="15"/>
+          <w:numId w:val="16"/>
         </w:numPr>
         <w:spacing w:after="80" w:line="290" w:lineRule="auto"/>
       </w:pPr>
@@ -8763,7 +9240,7 @@
           <w:color w:val="002B49"/>
           <w:shd w:val="clear" w:color="auto" w:fill="EEF3F7"/>
         </w:rPr>
-        <w:t>ADMIN_PASSWORD</w:t>
+        <w:t>ADMIN_PASSWORD_HASH</w:t>
       </w:r>
       <w:r>
         <w:t xml:space="preserve"> (i valori li trovi o li reimposti su Vercel, Settings → Environment Variables).</w:t>
@@ -8828,12 +9305,12 @@
         <w:pStyle w:val="Titolo1"/>
         <w:pageBreakBefore/>
       </w:pPr>
-      <w:bookmarkStart w:id="31" w:name="_Toc241909308"/>
+      <w:bookmarkStart w:id="32" w:name="_Toc241913486"/>
       <w:r>
         <w:lastRenderedPageBreak/>
         <w:t>10. Privacy e regole</w:t>
       </w:r>
-      <w:bookmarkEnd w:id="31"/>
+      <w:bookmarkEnd w:id="32"/>
     </w:p>
     <w:p>
       <w:pPr>
@@ -8932,12 +9409,12 @@
         <w:pStyle w:val="Titolo1"/>
         <w:pageBreakBefore/>
       </w:pPr>
-      <w:bookmarkStart w:id="32" w:name="_Toc241909309"/>
+      <w:bookmarkStart w:id="33" w:name="_Toc241913487"/>
       <w:r>
         <w:lastRenderedPageBreak/>
         <w:t>11. Se qualcosa va storto</w:t>
       </w:r>
-      <w:bookmarkEnd w:id="32"/>
+      <w:bookmarkEnd w:id="33"/>
     </w:p>
     <w:tbl>
       <w:tblPr>
@@ -9177,7 +9654,7 @@
               <w:spacing w:line="276" w:lineRule="auto"/>
             </w:pPr>
             <w:r>
-              <w:t>Il pannello dice che manca ADMIN_PASSWORD.</w:t>
+              <w:t>Il pannello dice che manca ADMIN_PASSWORD_HASH.</w:t>
             </w:r>
           </w:p>
         </w:tc>
@@ -9202,7 +9679,7 @@
               <w:spacing w:line="276" w:lineRule="auto"/>
             </w:pPr>
             <w:r>
-              <w:t>La password non è impostata su Vercel, oppure dopo averla impostata non hai fatto il Redeploy (capitolo 4).</w:t>
+              <w:t>L'impronta della password non è impostata su Vercel, oppure dopo averla impostata non hai fatto il Redeploy (capitolo 4).</w:t>
             </w:r>
           </w:p>
         </w:tc>
@@ -9235,7 +9712,7 @@
               <w:spacing w:line="276" w:lineRule="auto"/>
             </w:pPr>
             <w:r>
-              <w:t>Ho dimenticato la password del pannello.</w:t>
+              <w:t>La password giusta viene rifiutata.</w:t>
             </w:r>
           </w:p>
         </w:tc>
@@ -9260,7 +9737,18 @@
               <w:spacing w:line="276" w:lineRule="auto"/>
             </w:pPr>
             <w:r>
-              <w:t>Impostane una nuova su Vercel (capitolo 4) e fai il Redeploy.</w:t>
+              <w:t xml:space="preserve">Controlla di aver incollato su Vercel l'impronta intera (inizia con </w:t>
+            </w:r>
+            <w:r>
+              <w:rPr>
+                <w:rFonts w:ascii="Consolas" w:eastAsia="Consolas" w:hAnsi="Consolas" w:cs="Consolas"/>
+                <w:color w:val="002B49"/>
+                <w:shd w:val="clear" w:color="auto" w:fill="EEF3F7"/>
+              </w:rPr>
+              <w:t>pbkdf2-sha256:</w:t>
+            </w:r>
+            <w:r>
+              <w:t xml:space="preserve"> e non deve avere spazi in più) e di aver fatto il Redeploy.</w:t>
             </w:r>
           </w:p>
         </w:tc>
@@ -9293,7 +9781,7 @@
               <w:spacing w:line="276" w:lineRule="auto"/>
             </w:pPr>
             <w:r>
-              <w:t>Una persona dice che il sito rifiuta la sua foto.</w:t>
+              <w:t>Ho dimenticato la password del pannello.</w:t>
             </w:r>
           </w:p>
         </w:tc>
@@ -9318,7 +9806,18 @@
               <w:spacing w:line="276" w:lineRule="auto"/>
             </w:pPr>
             <w:r>
-              <w:t>Il messaggio sul sito spiega il motivo: email non Unipi, immagine oltre 5 MB, limite di invii raggiunto, oppure invii chiusi. Per l'Archivio il limite è 1 singola e 3 di gruppo a persona.</w:t>
+              <w:t xml:space="preserve">Non si può recuperare, perché non è salvata da nessuna parte: creane una nuova con </w:t>
+            </w:r>
+            <w:r>
+              <w:rPr>
+                <w:rFonts w:ascii="Consolas" w:eastAsia="Consolas" w:hAnsi="Consolas" w:cs="Consolas"/>
+                <w:color w:val="002B49"/>
+                <w:shd w:val="clear" w:color="auto" w:fill="EEF3F7"/>
+              </w:rPr>
+              <w:t>npm run admin:hash</w:t>
+            </w:r>
+            <w:r>
+              <w:t xml:space="preserve"> (capitolo 4), aggiorna l'impronta su Vercel e fai il Redeploy.</w:t>
             </w:r>
           </w:p>
         </w:tc>
@@ -9351,7 +9850,7 @@
               <w:spacing w:line="276" w:lineRule="auto"/>
             </w:pPr>
             <w:r>
-              <w:t>Lo script del PDF dice "Nessuna foto approvata".</w:t>
+              <w:t>Una persona dice che il sito rifiuta la sua foto.</w:t>
             </w:r>
           </w:p>
         </w:tc>
@@ -9376,7 +9875,7 @@
               <w:spacing w:line="276" w:lineRule="auto"/>
             </w:pPr>
             <w:r>
-              <w:t>Nel pannello, sezione Archivio, controlla di aver approvato le foto. Verifica anche l'anno (capitolo 5 e opzione --year).</w:t>
+              <w:t>Il messaggio sul sito spiega il motivo: email non Unipi, immagine oltre 5 MB, limite di invii raggiunto, oppure invii chiusi. Per l'Archivio il limite è 1 singola e 3 di gruppo a persona.</w:t>
             </w:r>
           </w:p>
         </w:tc>
@@ -9409,7 +9908,7 @@
               <w:spacing w:line="276" w:lineRule="auto"/>
             </w:pPr>
             <w:r>
-              <w:t>Il terminale dice che un comando non esiste (npm, git, vercel).</w:t>
+              <w:t>Lo script del PDF dice "Nessuna foto approvata".</w:t>
             </w:r>
           </w:p>
         </w:tc>
@@ -9434,7 +9933,7 @@
               <w:spacing w:line="276" w:lineRule="auto"/>
             </w:pPr>
             <w:r>
-              <w:t>Manca il programma: installalo (capitolo 2), poi chiudi e riapri il terminale.</w:t>
+              <w:t>Nel pannello, sezione Archivio, controlla di aver approvato le foto. Verifica anche l'anno (capitolo 5 e opzione --year).</w:t>
             </w:r>
           </w:p>
         </w:tc>
@@ -9467,6 +9966,64 @@
               <w:spacing w:line="276" w:lineRule="auto"/>
             </w:pPr>
             <w:r>
+              <w:t>Il terminale dice che un comando non esiste (npm, git, vercel).</w:t>
+            </w:r>
+          </w:p>
+        </w:tc>
+        <w:tc>
+          <w:tcPr>
+            <w:tcW w:w="5626" w:type="dxa"/>
+            <w:tcBorders>
+              <w:top w:val="single" w:sz="4" w:space="0" w:color="C9D6E2"/>
+              <w:left w:val="single" w:sz="4" w:space="0" w:color="C9D6E2"/>
+              <w:bottom w:val="single" w:sz="4" w:space="0" w:color="C9D6E2"/>
+              <w:right w:val="single" w:sz="4" w:space="0" w:color="C9D6E2"/>
+            </w:tcBorders>
+            <w:tcMar>
+              <w:top w:w="80" w:type="dxa"/>
+              <w:left w:w="120" w:type="dxa"/>
+              <w:bottom w:w="80" w:type="dxa"/>
+              <w:right w:w="120" w:type="dxa"/>
+            </w:tcMar>
+          </w:tcPr>
+          <w:p>
+            <w:pPr>
+              <w:spacing w:line="276" w:lineRule="auto"/>
+            </w:pPr>
+            <w:r>
+              <w:t>Manca il programma: installalo (capitolo 2), poi chiudi e riapri il terminale.</w:t>
+            </w:r>
+          </w:p>
+        </w:tc>
+      </w:tr>
+      <w:tr>
+        <w:tblPrEx>
+          <w:tblCellMar>
+            <w:top w:w="0" w:type="dxa"/>
+            <w:bottom w:w="0" w:type="dxa"/>
+          </w:tblCellMar>
+        </w:tblPrEx>
+        <w:tc>
+          <w:tcPr>
+            <w:tcW w:w="3400" w:type="dxa"/>
+            <w:tcBorders>
+              <w:top w:val="single" w:sz="4" w:space="0" w:color="C9D6E2"/>
+              <w:left w:val="single" w:sz="4" w:space="0" w:color="C9D6E2"/>
+              <w:bottom w:val="single" w:sz="4" w:space="0" w:color="C9D6E2"/>
+              <w:right w:val="single" w:sz="4" w:space="0" w:color="C9D6E2"/>
+            </w:tcBorders>
+            <w:tcMar>
+              <w:top w:w="80" w:type="dxa"/>
+              <w:left w:w="120" w:type="dxa"/>
+              <w:bottom w:w="80" w:type="dxa"/>
+              <w:right w:w="120" w:type="dxa"/>
+            </w:tcMar>
+          </w:tcPr>
+          <w:p>
+            <w:pPr>
+              <w:spacing w:line="276" w:lineRule="auto"/>
+            </w:pPr>
+            <w:r>
               <w:t xml:space="preserve">Il comando </w:t>
             </w:r>
             <w:r>
@@ -9519,12 +10076,12 @@
         <w:pStyle w:val="Titolo1"/>
         <w:pageBreakBefore/>
       </w:pPr>
-      <w:bookmarkStart w:id="33" w:name="_Toc241909310"/>
+      <w:bookmarkStart w:id="34" w:name="_Toc241913488"/>
       <w:r>
         <w:lastRenderedPageBreak/>
         <w:t>12. Promemoria di ogni anno</w:t>
       </w:r>
-      <w:bookmarkEnd w:id="33"/>
+      <w:bookmarkEnd w:id="34"/>
     </w:p>
     <w:p>
       <w:pPr>
@@ -9539,7 +10096,7 @@
         <w:pStyle w:val="Paragrafoelenco"/>
         <w:numPr>
           <w:ilvl w:val="0"/>
-          <w:numId w:val="16"/>
+          <w:numId w:val="17"/>
         </w:numPr>
         <w:spacing w:after="80" w:line="290" w:lineRule="auto"/>
       </w:pPr>
@@ -9570,7 +10127,7 @@
         <w:pStyle w:val="Paragrafoelenco"/>
         <w:numPr>
           <w:ilvl w:val="0"/>
-          <w:numId w:val="16"/>
+          <w:numId w:val="17"/>
         </w:numPr>
         <w:spacing w:after="80" w:line="290" w:lineRule="auto"/>
       </w:pPr>
@@ -9590,7 +10147,7 @@
         <w:pStyle w:val="Paragrafoelenco"/>
         <w:numPr>
           <w:ilvl w:val="0"/>
-          <w:numId w:val="16"/>
+          <w:numId w:val="17"/>
         </w:numPr>
         <w:spacing w:after="80" w:line="290" w:lineRule="auto"/>
       </w:pPr>
@@ -9610,7 +10167,7 @@
         <w:pStyle w:val="Paragrafoelenco"/>
         <w:numPr>
           <w:ilvl w:val="0"/>
-          <w:numId w:val="16"/>
+          <w:numId w:val="17"/>
         </w:numPr>
         <w:spacing w:after="80" w:line="290" w:lineRule="auto"/>
       </w:pPr>
@@ -9634,7 +10191,7 @@
         <w:pStyle w:val="Paragrafoelenco"/>
         <w:numPr>
           <w:ilvl w:val="0"/>
-          <w:numId w:val="16"/>
+          <w:numId w:val="17"/>
         </w:numPr>
         <w:spacing w:after="80" w:line="290" w:lineRule="auto"/>
       </w:pPr>
@@ -9647,7 +10204,7 @@
         <w:pStyle w:val="Paragrafoelenco"/>
         <w:numPr>
           <w:ilvl w:val="0"/>
-          <w:numId w:val="16"/>
+          <w:numId w:val="17"/>
         </w:numPr>
         <w:spacing w:after="80" w:line="290" w:lineRule="auto"/>
       </w:pPr>
@@ -9774,10 +10331,10 @@
 <file path=word/numbering.xml><?xml version="1.0" encoding="utf-8"?>
 <w:numbering xmlns:wpc="http://schemas.microsoft.com/office/word/2010/wordprocessingCanvas" xmlns:cx="http://schemas.microsoft.com/office/drawing/2014/chartex" xmlns:cx1="http://schemas.microsoft.com/office/drawing/2015/9/8/chartex" xmlns:cx2="http://schemas.microsoft.com/office/drawing/2015/10/21/chartex" xmlns:cx3="http://schemas.microsoft.com/office/drawing/2016/5/9/chartex" xmlns:cx4="http://schemas.microsoft.com/office/drawing/2016/5/10/chartex" xmlns:cx5="http://schemas.microsoft.com/office/drawing/2016/5/11/chartex" xmlns:cx6="http://schemas.microsoft.com/office/drawing/2016/5/12/chartex" xmlns:cx7="http://schemas.microsoft.com/office/drawing/2016/5/13/chartex" xmlns:cx8="http://schemas.microsoft.com/office/drawing/2016/5/14/chartex" xmlns:mc="http://schemas.openxmlformats.org/markup-compatibility/2006" xmlns:aink="http://schemas.microsoft.com/office/drawing/2016/ink" xmlns:am3d="http://schemas.microsoft.com/office/drawing/2017/model3d" xmlns:o="urn:schemas-microsoft-com:office:office" xmlns:oel="http://schemas.microsoft.com/office/2019/extlst" xmlns:r="http://schemas.openxmlformats.org/officeDocument/2006/relationships" xmlns:m="http://schemas.openxmlformats.org/officeDocument/2006/math" xmlns:v="urn:schemas-microsoft-com:vml" xmlns:wp14="http://schemas.microsoft.com/office/word/2010/wordprocessingDrawing" xmlns:wp="http://schemas.openxmlformats.org/drawingml/2006/wordprocessingDrawing" xmlns:w10="urn:schemas-microsoft-com:office:word" xmlns:w="http://schemas.openxmlformats.org/wordprocessingml/2006/main" xmlns:w14="http://schemas.microsoft.com/office/word/2010/wordml" xmlns:w15="http://schemas.microsoft.com/office/word/2012/wordml" xmlns:w16cex="http://schemas.microsoft.com/office/word/2018/wordml/cex" xmlns:w16cid="http://schemas.microsoft.com/office/word/2016/wordml/cid" xmlns:w16="http://schemas.microsoft.com/office/word/2018/wordml" xmlns:w16sdtdh="http://schemas.microsoft.com/office/word/2020/wordml/sdtdatahash" xmlns:w16se="http://schemas.microsoft.com/office/word/2015/wordml/symex" xmlns:wpg="http://schemas.microsoft.com/office/word/2010/wordprocessingGroup" xmlns:wpi="http://schemas.microsoft.com/office/word/2010/wordprocessingInk" xmlns:wne="http://schemas.microsoft.com/office/word/2006/wordml" xmlns:wps="http://schemas.microsoft.com/office/word/2010/wordprocessingShape" mc:Ignorable="w14 w15 w16se w16cid w16 w16cex w16sdtdh wp14">
   <w:abstractNum w:abstractNumId="0" w15:restartNumberingAfterBreak="0">
-    <w:nsid w:val="55F140F7"/>
+    <w:nsid w:val="0E82363E"/>
     <w:multiLevelType w:val="hybridMultilevel"/>
-    <w:tmpl w:val="F698AFB6"/>
-    <w:lvl w:ilvl="0" w:tplc="44D04238">
+    <w:tmpl w:val="338019B6"/>
+    <w:lvl w:ilvl="0" w:tplc="C8D89F50">
       <w:start w:val="1"/>
       <w:numFmt w:val="bullet"/>
       <w:lvlText w:val="•"/>
@@ -9789,52 +10346,52 @@
         <w:color w:val="0066B2"/>
       </w:rPr>
     </w:lvl>
-    <w:lvl w:ilvl="1" w:tplc="D07CAA9E">
+    <w:lvl w:ilvl="1" w:tplc="2A52151C">
       <w:numFmt w:val="decimal"/>
       <w:lvlText w:val=""/>
       <w:lvlJc w:val="left"/>
     </w:lvl>
-    <w:lvl w:ilvl="2" w:tplc="E2F44304">
+    <w:lvl w:ilvl="2" w:tplc="12906F66">
       <w:numFmt w:val="decimal"/>
       <w:lvlText w:val=""/>
       <w:lvlJc w:val="left"/>
     </w:lvl>
-    <w:lvl w:ilvl="3" w:tplc="5E042AEC">
+    <w:lvl w:ilvl="3" w:tplc="05BC75BC">
       <w:numFmt w:val="decimal"/>
       <w:lvlText w:val=""/>
       <w:lvlJc w:val="left"/>
     </w:lvl>
-    <w:lvl w:ilvl="4" w:tplc="280A6CE2">
+    <w:lvl w:ilvl="4" w:tplc="1AFA5392">
       <w:numFmt w:val="decimal"/>
       <w:lvlText w:val=""/>
       <w:lvlJc w:val="left"/>
     </w:lvl>
-    <w:lvl w:ilvl="5" w:tplc="93AC90B8">
+    <w:lvl w:ilvl="5" w:tplc="97540770">
       <w:numFmt w:val="decimal"/>
       <w:lvlText w:val=""/>
       <w:lvlJc w:val="left"/>
     </w:lvl>
-    <w:lvl w:ilvl="6" w:tplc="5E24EFB0">
+    <w:lvl w:ilvl="6" w:tplc="C2EC5094">
       <w:numFmt w:val="decimal"/>
       <w:lvlText w:val=""/>
       <w:lvlJc w:val="left"/>
     </w:lvl>
-    <w:lvl w:ilvl="7" w:tplc="C3424618">
+    <w:lvl w:ilvl="7" w:tplc="B97EBF72">
       <w:numFmt w:val="decimal"/>
       <w:lvlText w:val=""/>
       <w:lvlJc w:val="left"/>
     </w:lvl>
-    <w:lvl w:ilvl="8" w:tplc="5C06B898">
+    <w:lvl w:ilvl="8" w:tplc="321A5D0E">
       <w:numFmt w:val="decimal"/>
       <w:lvlText w:val=""/>
       <w:lvlJc w:val="left"/>
     </w:lvl>
   </w:abstractNum>
   <w:abstractNum w:abstractNumId="1" w15:restartNumberingAfterBreak="0">
-    <w:nsid w:val="5B9E7E8A"/>
+    <w:nsid w:val="4A200174"/>
     <w:multiLevelType w:val="hybridMultilevel"/>
-    <w:tmpl w:val="97340ABE"/>
-    <w:lvl w:ilvl="0" w:tplc="9B465610">
+    <w:tmpl w:val="F23C748C"/>
+    <w:lvl w:ilvl="0" w:tplc="94EA6796">
       <w:start w:val="1"/>
       <w:numFmt w:val="decimal"/>
       <w:lvlText w:val="%1."/>
@@ -9848,52 +10405,52 @@
         <w:color w:val="002B49"/>
       </w:rPr>
     </w:lvl>
-    <w:lvl w:ilvl="1" w:tplc="FB72020A">
+    <w:lvl w:ilvl="1" w:tplc="57CED858">
       <w:numFmt w:val="decimal"/>
       <w:lvlText w:val=""/>
       <w:lvlJc w:val="left"/>
     </w:lvl>
-    <w:lvl w:ilvl="2" w:tplc="939414FA">
+    <w:lvl w:ilvl="2" w:tplc="4DEA8328">
       <w:numFmt w:val="decimal"/>
       <w:lvlText w:val=""/>
       <w:lvlJc w:val="left"/>
     </w:lvl>
-    <w:lvl w:ilvl="3" w:tplc="1D5A87DC">
+    <w:lvl w:ilvl="3" w:tplc="3F2852E0">
       <w:numFmt w:val="decimal"/>
       <w:lvlText w:val=""/>
       <w:lvlJc w:val="left"/>
     </w:lvl>
-    <w:lvl w:ilvl="4" w:tplc="9C169530">
+    <w:lvl w:ilvl="4" w:tplc="D3A26928">
       <w:numFmt w:val="decimal"/>
       <w:lvlText w:val=""/>
       <w:lvlJc w:val="left"/>
     </w:lvl>
-    <w:lvl w:ilvl="5" w:tplc="FF4A72F4">
+    <w:lvl w:ilvl="5" w:tplc="A2B8E450">
       <w:numFmt w:val="decimal"/>
       <w:lvlText w:val=""/>
       <w:lvlJc w:val="left"/>
     </w:lvl>
-    <w:lvl w:ilvl="6" w:tplc="89F27A28">
+    <w:lvl w:ilvl="6" w:tplc="93A25ADE">
       <w:numFmt w:val="decimal"/>
       <w:lvlText w:val=""/>
       <w:lvlJc w:val="left"/>
     </w:lvl>
-    <w:lvl w:ilvl="7" w:tplc="DC6259D0">
+    <w:lvl w:ilvl="7" w:tplc="5FF6E9C8">
       <w:numFmt w:val="decimal"/>
       <w:lvlText w:val=""/>
       <w:lvlJc w:val="left"/>
     </w:lvl>
-    <w:lvl w:ilvl="8" w:tplc="0568AA6E">
+    <w:lvl w:ilvl="8" w:tplc="4418C1DA">
       <w:numFmt w:val="decimal"/>
       <w:lvlText w:val=""/>
       <w:lvlJc w:val="left"/>
     </w:lvl>
   </w:abstractNum>
   <w:abstractNum w:abstractNumId="2" w15:restartNumberingAfterBreak="0">
-    <w:nsid w:val="607C2DB2"/>
+    <w:nsid w:val="5EB644C4"/>
     <w:multiLevelType w:val="hybridMultilevel"/>
-    <w:tmpl w:val="7898EC08"/>
-    <w:lvl w:ilvl="0" w:tplc="7DF0EFAE">
+    <w:tmpl w:val="AD7A966C"/>
+    <w:lvl w:ilvl="0" w:tplc="24F077D2">
       <w:start w:val="1"/>
       <w:numFmt w:val="bullet"/>
       <w:lvlText w:val="●"/>
@@ -9902,7 +10459,7 @@
         <w:ind w:left="720" w:hanging="360"/>
       </w:pPr>
     </w:lvl>
-    <w:lvl w:ilvl="1" w:tplc="7082A4DE">
+    <w:lvl w:ilvl="1" w:tplc="28F2274A">
       <w:start w:val="1"/>
       <w:numFmt w:val="bullet"/>
       <w:lvlText w:val="○"/>
@@ -9911,7 +10468,7 @@
         <w:ind w:left="1440" w:hanging="360"/>
       </w:pPr>
     </w:lvl>
-    <w:lvl w:ilvl="2" w:tplc="41F6E890">
+    <w:lvl w:ilvl="2" w:tplc="8598A166">
       <w:start w:val="1"/>
       <w:numFmt w:val="bullet"/>
       <w:lvlText w:val="■"/>
@@ -9920,7 +10477,7 @@
         <w:ind w:left="2160" w:hanging="360"/>
       </w:pPr>
     </w:lvl>
-    <w:lvl w:ilvl="3" w:tplc="8B5CF142">
+    <w:lvl w:ilvl="3" w:tplc="5712B066">
       <w:start w:val="1"/>
       <w:numFmt w:val="bullet"/>
       <w:lvlText w:val="●"/>
@@ -9929,7 +10486,7 @@
         <w:ind w:left="2880" w:hanging="360"/>
       </w:pPr>
     </w:lvl>
-    <w:lvl w:ilvl="4" w:tplc="2F1EF4E6">
+    <w:lvl w:ilvl="4" w:tplc="C180F738">
       <w:start w:val="1"/>
       <w:numFmt w:val="bullet"/>
       <w:lvlText w:val="○"/>
@@ -9938,7 +10495,7 @@
         <w:ind w:left="3600" w:hanging="360"/>
       </w:pPr>
     </w:lvl>
-    <w:lvl w:ilvl="5" w:tplc="C292F326">
+    <w:lvl w:ilvl="5" w:tplc="D04815C0">
       <w:start w:val="1"/>
       <w:numFmt w:val="bullet"/>
       <w:lvlText w:val="■"/>
@@ -9947,7 +10504,7 @@
         <w:ind w:left="4320" w:hanging="360"/>
       </w:pPr>
     </w:lvl>
-    <w:lvl w:ilvl="6" w:tplc="B31CBE1A">
+    <w:lvl w:ilvl="6" w:tplc="A92A2032">
       <w:start w:val="1"/>
       <w:numFmt w:val="bullet"/>
       <w:lvlText w:val="●"/>
@@ -9956,7 +10513,7 @@
         <w:ind w:left="5040" w:hanging="360"/>
       </w:pPr>
     </w:lvl>
-    <w:lvl w:ilvl="7" w:tplc="7B7CB746">
+    <w:lvl w:ilvl="7" w:tplc="68D65192">
       <w:start w:val="1"/>
       <w:numFmt w:val="bullet"/>
       <w:lvlText w:val="●"/>
@@ -9965,7 +10522,7 @@
         <w:ind w:left="5760" w:hanging="360"/>
       </w:pPr>
     </w:lvl>
-    <w:lvl w:ilvl="8" w:tplc="B14E6BB8">
+    <w:lvl w:ilvl="8" w:tplc="A7B4284C">
       <w:start w:val="1"/>
       <w:numFmt w:val="bullet"/>
       <w:lvlText w:val="●"/>
@@ -9975,97 +10532,103 @@
       </w:pPr>
     </w:lvl>
   </w:abstractNum>
-  <w:num w:numId="1" w16cid:durableId="145753300">
+  <w:num w:numId="1" w16cid:durableId="130287572">
     <w:abstractNumId w:val="2"/>
     <w:lvlOverride w:ilvl="0">
       <w:startOverride w:val="1"/>
     </w:lvlOverride>
   </w:num>
-  <w:num w:numId="2" w16cid:durableId="2091730286">
+  <w:num w:numId="2" w16cid:durableId="1983348292">
     <w:abstractNumId w:val="1"/>
     <w:lvlOverride w:ilvl="0">
       <w:startOverride w:val="1"/>
     </w:lvlOverride>
   </w:num>
-  <w:num w:numId="3" w16cid:durableId="279842536">
+  <w:num w:numId="3" w16cid:durableId="798038849">
     <w:abstractNumId w:val="0"/>
     <w:lvlOverride w:ilvl="0">
       <w:startOverride w:val="1"/>
     </w:lvlOverride>
   </w:num>
-  <w:num w:numId="4" w16cid:durableId="860705044">
+  <w:num w:numId="4" w16cid:durableId="653415309">
     <w:abstractNumId w:val="1"/>
     <w:lvlOverride w:ilvl="0">
       <w:startOverride w:val="1"/>
     </w:lvlOverride>
   </w:num>
-  <w:num w:numId="5" w16cid:durableId="118031864">
+  <w:num w:numId="5" w16cid:durableId="1719159053">
     <w:abstractNumId w:val="1"/>
     <w:lvlOverride w:ilvl="0">
       <w:startOverride w:val="1"/>
     </w:lvlOverride>
   </w:num>
-  <w:num w:numId="6" w16cid:durableId="1093359762">
+  <w:num w:numId="6" w16cid:durableId="1560285612">
     <w:abstractNumId w:val="1"/>
     <w:lvlOverride w:ilvl="0">
       <w:startOverride w:val="1"/>
     </w:lvlOverride>
   </w:num>
-  <w:num w:numId="7" w16cid:durableId="1474517420">
+  <w:num w:numId="7" w16cid:durableId="2040621989">
     <w:abstractNumId w:val="1"/>
     <w:lvlOverride w:ilvl="0">
       <w:startOverride w:val="1"/>
     </w:lvlOverride>
   </w:num>
-  <w:num w:numId="8" w16cid:durableId="1741558732">
+  <w:num w:numId="8" w16cid:durableId="191503399">
     <w:abstractNumId w:val="1"/>
     <w:lvlOverride w:ilvl="0">
       <w:startOverride w:val="1"/>
     </w:lvlOverride>
   </w:num>
-  <w:num w:numId="9" w16cid:durableId="2015109602">
+  <w:num w:numId="9" w16cid:durableId="1668360100">
     <w:abstractNumId w:val="1"/>
     <w:lvlOverride w:ilvl="0">
       <w:startOverride w:val="1"/>
     </w:lvlOverride>
   </w:num>
-  <w:num w:numId="10" w16cid:durableId="1104955691">
+  <w:num w:numId="10" w16cid:durableId="1836649018">
     <w:abstractNumId w:val="1"/>
     <w:lvlOverride w:ilvl="0">
       <w:startOverride w:val="1"/>
     </w:lvlOverride>
   </w:num>
-  <w:num w:numId="11" w16cid:durableId="1391617149">
+  <w:num w:numId="11" w16cid:durableId="986976408">
     <w:abstractNumId w:val="1"/>
     <w:lvlOverride w:ilvl="0">
       <w:startOverride w:val="1"/>
     </w:lvlOverride>
   </w:num>
-  <w:num w:numId="12" w16cid:durableId="1067652133">
+  <w:num w:numId="12" w16cid:durableId="932012205">
     <w:abstractNumId w:val="1"/>
     <w:lvlOverride w:ilvl="0">
       <w:startOverride w:val="1"/>
     </w:lvlOverride>
   </w:num>
-  <w:num w:numId="13" w16cid:durableId="860126689">
+  <w:num w:numId="13" w16cid:durableId="1318415436">
     <w:abstractNumId w:val="1"/>
     <w:lvlOverride w:ilvl="0">
       <w:startOverride w:val="1"/>
     </w:lvlOverride>
   </w:num>
-  <w:num w:numId="14" w16cid:durableId="1990358405">
+  <w:num w:numId="14" w16cid:durableId="1396586728">
     <w:abstractNumId w:val="1"/>
     <w:lvlOverride w:ilvl="0">
       <w:startOverride w:val="1"/>
     </w:lvlOverride>
   </w:num>
-  <w:num w:numId="15" w16cid:durableId="1125149986">
+  <w:num w:numId="15" w16cid:durableId="1035740490">
     <w:abstractNumId w:val="1"/>
     <w:lvlOverride w:ilvl="0">
       <w:startOverride w:val="1"/>
     </w:lvlOverride>
   </w:num>
-  <w:num w:numId="16" w16cid:durableId="1912039260">
+  <w:num w:numId="16" w16cid:durableId="2016301461">
+    <w:abstractNumId w:val="1"/>
+    <w:lvlOverride w:ilvl="0">
+      <w:startOverride w:val="1"/>
+    </w:lvlOverride>
+  </w:num>
+  <w:num w:numId="17" w16cid:durableId="670177171">
     <w:abstractNumId w:val="1"/>
     <w:lvlOverride w:ilvl="0">
       <w:startOverride w:val="1"/>
@@ -10688,7 +11251,7 @@
     <w:autoRedefine/>
     <w:uiPriority w:val="39"/>
     <w:unhideWhenUsed/>
-    <w:rsid w:val="00BC1188"/>
+    <w:rsid w:val="006B610A"/>
     <w:pPr>
       <w:spacing w:after="100"/>
     </w:pPr>
@@ -10700,7 +11263,7 @@
     <w:autoRedefine/>
     <w:uiPriority w:val="39"/>
     <w:unhideWhenUsed/>
-    <w:rsid w:val="00BC1188"/>
+    <w:rsid w:val="006B610A"/>
     <w:pPr>
       <w:spacing w:after="100"/>
       <w:ind w:left="220"/>

</xml_diff>

<commit_message>
Next 15.5, upload ripulito con sharp, foto originali solo per l'admin
- Aggiornamento a Next.js 15.5 e React 19 (cookies() e searchParams
  asincroni, useActionState), Drizzle 0.45, @vercel/blob 2.8; postcss
  forzato alla versione corretta: npm audit senza vulnerabilità.
- Upload: ogni immagine viene decodificata e ricodificata in JPEG con sharp
  (solo JPG, PNG, WebP riconosciuti dal contenuto), senza metadati EXIF/GPS,
  raddrizzata e ridimensionata; rifiutate SVG, HTML travestiti, AVIF e
  immagini oltre 50 megapixel.
- Foto: gli indirizzi su Vercel Blob non arrivano più al browser. Le
  gallerie usano /foto/<id> (versione ridotta a 800 px, solo foto approvate
  di Hall of Fame e Annuario Storico); gli originali si aprono solo da
  /admin/foto/<id> con la sessione admin. Tasto destro e trascinamento
  disattivati sulle foto delle gallerie.
- CSP e next/image senza domini esterni.
- Guida admin aggiornata.

Co-Authored-By: Claude Opus 5.5 <noreply@anthropic.com>
</commit_message>
<xml_diff>
--- a/ADMIN_GUIDE.docx
+++ b/ADMIN_GUIDE.docx
@@ -12,7 +12,7 @@
           <w:noProof/>
         </w:rPr>
         <w:drawing>
-          <wp:inline distT="0" distB="0" distL="0" distR="0" wp14:anchorId="338191A9" wp14:editId="0CBDC4A8">
+          <wp:inline distT="0" distB="0" distL="0" distR="0" wp14:anchorId="1C2D7CF3" wp14:editId="181F25A3">
             <wp:extent cx="1809750" cy="1809750"/>
             <wp:effectExtent l="0" t="0" r="0" b="0"/>
             <wp:docPr id="1" name="Immagine 1"/>
@@ -134,7 +134,7 @@
     <w:sdt>
       <w:sdtPr>
         <w:alias w:val="Indice"/>
-        <w:id w:val="2065058456"/>
+        <w:id w:val="1985432386"/>
       </w:sdtPr>
       <w:sdtEndPr/>
       <w:sdtContent>
@@ -162,7 +162,7 @@
           <w:r>
             <w:fldChar w:fldCharType="separate"/>
           </w:r>
-          <w:hyperlink w:anchor="_Toc241913454" w:history="1">
+          <w:hyperlink w:anchor="_Toc241915699" w:history="1">
             <w:r>
               <w:rPr>
                 <w:rStyle w:val="Collegamentoipertestuale"/>
@@ -186,7 +186,7 @@
               <w:rPr>
                 <w:noProof/>
               </w:rPr>
-              <w:instrText xml:space="preserve"> PAGEREF _Toc241913454 \h </w:instrText>
+              <w:instrText xml:space="preserve"> PAGEREF _Toc241915699 \h </w:instrText>
             </w:r>
             <w:r>
               <w:rPr>
@@ -228,7 +228,7 @@
               <w14:ligatures w14:val="standardContextual"/>
             </w:rPr>
           </w:pPr>
-          <w:hyperlink w:anchor="_Toc241913455" w:history="1">
+          <w:hyperlink w:anchor="_Toc241915700" w:history="1">
             <w:r>
               <w:rPr>
                 <w:rStyle w:val="Collegamentoipertestuale"/>
@@ -252,7 +252,7 @@
               <w:rPr>
                 <w:noProof/>
               </w:rPr>
-              <w:instrText xml:space="preserve"> PAGEREF _Toc241913455 \h </w:instrText>
+              <w:instrText xml:space="preserve"> PAGEREF _Toc241915700 \h </w:instrText>
             </w:r>
             <w:r>
               <w:rPr>
@@ -294,7 +294,7 @@
               <w14:ligatures w14:val="standardContextual"/>
             </w:rPr>
           </w:pPr>
-          <w:hyperlink w:anchor="_Toc241913456" w:history="1">
+          <w:hyperlink w:anchor="_Toc241915701" w:history="1">
             <w:r>
               <w:rPr>
                 <w:rStyle w:val="Collegamentoipertestuale"/>
@@ -318,7 +318,7 @@
               <w:rPr>
                 <w:noProof/>
               </w:rPr>
-              <w:instrText xml:space="preserve"> PAGEREF _Toc241913456 \h </w:instrText>
+              <w:instrText xml:space="preserve"> PAGEREF _Toc241915701 \h </w:instrText>
             </w:r>
             <w:r>
               <w:rPr>
@@ -360,7 +360,7 @@
               <w14:ligatures w14:val="standardContextual"/>
             </w:rPr>
           </w:pPr>
-          <w:hyperlink w:anchor="_Toc241913457" w:history="1">
+          <w:hyperlink w:anchor="_Toc241915702" w:history="1">
             <w:r>
               <w:rPr>
                 <w:rStyle w:val="Collegamentoipertestuale"/>
@@ -384,7 +384,7 @@
               <w:rPr>
                 <w:noProof/>
               </w:rPr>
-              <w:instrText xml:space="preserve"> PAGEREF _Toc241913457 \h </w:instrText>
+              <w:instrText xml:space="preserve"> PAGEREF _Toc241915702 \h </w:instrText>
             </w:r>
             <w:r>
               <w:rPr>
@@ -426,7 +426,7 @@
               <w14:ligatures w14:val="standardContextual"/>
             </w:rPr>
           </w:pPr>
-          <w:hyperlink w:anchor="_Toc241913458" w:history="1">
+          <w:hyperlink w:anchor="_Toc241915703" w:history="1">
             <w:r>
               <w:rPr>
                 <w:rStyle w:val="Collegamentoipertestuale"/>
@@ -450,7 +450,7 @@
               <w:rPr>
                 <w:noProof/>
               </w:rPr>
-              <w:instrText xml:space="preserve"> PAGEREF _Toc241913458 \h </w:instrText>
+              <w:instrText xml:space="preserve"> PAGEREF _Toc241915703 \h </w:instrText>
             </w:r>
             <w:r>
               <w:rPr>
@@ -492,7 +492,7 @@
               <w14:ligatures w14:val="standardContextual"/>
             </w:rPr>
           </w:pPr>
-          <w:hyperlink w:anchor="_Toc241913459" w:history="1">
+          <w:hyperlink w:anchor="_Toc241915704" w:history="1">
             <w:r>
               <w:rPr>
                 <w:rStyle w:val="Collegamentoipertestuale"/>
@@ -516,7 +516,7 @@
               <w:rPr>
                 <w:noProof/>
               </w:rPr>
-              <w:instrText xml:space="preserve"> PAGEREF _Toc241913459 \h </w:instrText>
+              <w:instrText xml:space="preserve"> PAGEREF _Toc241915704 \h </w:instrText>
             </w:r>
             <w:r>
               <w:rPr>
@@ -558,7 +558,7 @@
               <w14:ligatures w14:val="standardContextual"/>
             </w:rPr>
           </w:pPr>
-          <w:hyperlink w:anchor="_Toc241913460" w:history="1">
+          <w:hyperlink w:anchor="_Toc241915705" w:history="1">
             <w:r>
               <w:rPr>
                 <w:rStyle w:val="Collegamentoipertestuale"/>
@@ -582,7 +582,7 @@
               <w:rPr>
                 <w:noProof/>
               </w:rPr>
-              <w:instrText xml:space="preserve"> PAGEREF _Toc241913460 \h </w:instrText>
+              <w:instrText xml:space="preserve"> PAGEREF _Toc241915705 \h </w:instrText>
             </w:r>
             <w:r>
               <w:rPr>
@@ -624,7 +624,7 @@
               <w14:ligatures w14:val="standardContextual"/>
             </w:rPr>
           </w:pPr>
-          <w:hyperlink w:anchor="_Toc241913461" w:history="1">
+          <w:hyperlink w:anchor="_Toc241915706" w:history="1">
             <w:r>
               <w:rPr>
                 <w:rStyle w:val="Collegamentoipertestuale"/>
@@ -648,7 +648,7 @@
               <w:rPr>
                 <w:noProof/>
               </w:rPr>
-              <w:instrText xml:space="preserve"> PAGEREF _Toc241913461 \h </w:instrText>
+              <w:instrText xml:space="preserve"> PAGEREF _Toc241915706 \h </w:instrText>
             </w:r>
             <w:r>
               <w:rPr>
@@ -690,7 +690,7 @@
               <w14:ligatures w14:val="standardContextual"/>
             </w:rPr>
           </w:pPr>
-          <w:hyperlink w:anchor="_Toc241913462" w:history="1">
+          <w:hyperlink w:anchor="_Toc241915707" w:history="1">
             <w:r>
               <w:rPr>
                 <w:rStyle w:val="Collegamentoipertestuale"/>
@@ -714,7 +714,7 @@
               <w:rPr>
                 <w:noProof/>
               </w:rPr>
-              <w:instrText xml:space="preserve"> PAGEREF _Toc241913462 \h </w:instrText>
+              <w:instrText xml:space="preserve"> PAGEREF _Toc241915707 \h </w:instrText>
             </w:r>
             <w:r>
               <w:rPr>
@@ -756,7 +756,7 @@
               <w14:ligatures w14:val="standardContextual"/>
             </w:rPr>
           </w:pPr>
-          <w:hyperlink w:anchor="_Toc241913463" w:history="1">
+          <w:hyperlink w:anchor="_Toc241915708" w:history="1">
             <w:r>
               <w:rPr>
                 <w:rStyle w:val="Collegamentoipertestuale"/>
@@ -780,7 +780,7 @@
               <w:rPr>
                 <w:noProof/>
               </w:rPr>
-              <w:instrText xml:space="preserve"> PAGEREF _Toc241913463 \h </w:instrText>
+              <w:instrText xml:space="preserve"> PAGEREF _Toc241915708 \h </w:instrText>
             </w:r>
             <w:r>
               <w:rPr>
@@ -822,7 +822,7 @@
               <w14:ligatures w14:val="standardContextual"/>
             </w:rPr>
           </w:pPr>
-          <w:hyperlink w:anchor="_Toc241913464" w:history="1">
+          <w:hyperlink w:anchor="_Toc241915709" w:history="1">
             <w:r>
               <w:rPr>
                 <w:rStyle w:val="Collegamentoipertestuale"/>
@@ -846,7 +846,7 @@
               <w:rPr>
                 <w:noProof/>
               </w:rPr>
-              <w:instrText xml:space="preserve"> PAGEREF _Toc241913464 \h </w:instrText>
+              <w:instrText xml:space="preserve"> PAGEREF _Toc241915709 \h </w:instrText>
             </w:r>
             <w:r>
               <w:rPr>
@@ -888,7 +888,7 @@
               <w14:ligatures w14:val="standardContextual"/>
             </w:rPr>
           </w:pPr>
-          <w:hyperlink w:anchor="_Toc241913465" w:history="1">
+          <w:hyperlink w:anchor="_Toc241915710" w:history="1">
             <w:r>
               <w:rPr>
                 <w:rStyle w:val="Collegamentoipertestuale"/>
@@ -912,7 +912,7 @@
               <w:rPr>
                 <w:noProof/>
               </w:rPr>
-              <w:instrText xml:space="preserve"> PAGEREF _Toc241913465 \h </w:instrText>
+              <w:instrText xml:space="preserve"> PAGEREF _Toc241915710 \h </w:instrText>
             </w:r>
             <w:r>
               <w:rPr>
@@ -954,7 +954,7 @@
               <w14:ligatures w14:val="standardContextual"/>
             </w:rPr>
           </w:pPr>
-          <w:hyperlink w:anchor="_Toc241913466" w:history="1">
+          <w:hyperlink w:anchor="_Toc241915711" w:history="1">
             <w:r>
               <w:rPr>
                 <w:rStyle w:val="Collegamentoipertestuale"/>
@@ -978,7 +978,7 @@
               <w:rPr>
                 <w:noProof/>
               </w:rPr>
-              <w:instrText xml:space="preserve"> PAGEREF _Toc241913466 \h </w:instrText>
+              <w:instrText xml:space="preserve"> PAGEREF _Toc241915711 \h </w:instrText>
             </w:r>
             <w:r>
               <w:rPr>
@@ -1020,7 +1020,7 @@
               <w14:ligatures w14:val="standardContextual"/>
             </w:rPr>
           </w:pPr>
-          <w:hyperlink w:anchor="_Toc241913467" w:history="1">
+          <w:hyperlink w:anchor="_Toc241915712" w:history="1">
             <w:r>
               <w:rPr>
                 <w:rStyle w:val="Collegamentoipertestuale"/>
@@ -1044,7 +1044,7 @@
               <w:rPr>
                 <w:noProof/>
               </w:rPr>
-              <w:instrText xml:space="preserve"> PAGEREF _Toc241913467 \h </w:instrText>
+              <w:instrText xml:space="preserve"> PAGEREF _Toc241915712 \h </w:instrText>
             </w:r>
             <w:r>
               <w:rPr>
@@ -1086,7 +1086,7 @@
               <w14:ligatures w14:val="standardContextual"/>
             </w:rPr>
           </w:pPr>
-          <w:hyperlink w:anchor="_Toc241913468" w:history="1">
+          <w:hyperlink w:anchor="_Toc241915713" w:history="1">
             <w:r>
               <w:rPr>
                 <w:rStyle w:val="Collegamentoipertestuale"/>
@@ -1110,7 +1110,7 @@
               <w:rPr>
                 <w:noProof/>
               </w:rPr>
-              <w:instrText xml:space="preserve"> PAGEREF _Toc241913468 \h </w:instrText>
+              <w:instrText xml:space="preserve"> PAGEREF _Toc241915713 \h </w:instrText>
             </w:r>
             <w:r>
               <w:rPr>
@@ -1152,7 +1152,7 @@
               <w14:ligatures w14:val="standardContextual"/>
             </w:rPr>
           </w:pPr>
-          <w:hyperlink w:anchor="_Toc241913469" w:history="1">
+          <w:hyperlink w:anchor="_Toc241915714" w:history="1">
             <w:r>
               <w:rPr>
                 <w:rStyle w:val="Collegamentoipertestuale"/>
@@ -1176,7 +1176,7 @@
               <w:rPr>
                 <w:noProof/>
               </w:rPr>
-              <w:instrText xml:space="preserve"> PAGEREF _Toc241913469 \h </w:instrText>
+              <w:instrText xml:space="preserve"> PAGEREF _Toc241915714 \h </w:instrText>
             </w:r>
             <w:r>
               <w:rPr>
@@ -1218,7 +1218,7 @@
               <w14:ligatures w14:val="standardContextual"/>
             </w:rPr>
           </w:pPr>
-          <w:hyperlink w:anchor="_Toc241913470" w:history="1">
+          <w:hyperlink w:anchor="_Toc241915715" w:history="1">
             <w:r>
               <w:rPr>
                 <w:rStyle w:val="Collegamentoipertestuale"/>
@@ -1242,7 +1242,7 @@
               <w:rPr>
                 <w:noProof/>
               </w:rPr>
-              <w:instrText xml:space="preserve"> PAGEREF _Toc241913470 \h </w:instrText>
+              <w:instrText xml:space="preserve"> PAGEREF _Toc241915715 \h </w:instrText>
             </w:r>
             <w:r>
               <w:rPr>
@@ -1284,7 +1284,7 @@
               <w14:ligatures w14:val="standardContextual"/>
             </w:rPr>
           </w:pPr>
-          <w:hyperlink w:anchor="_Toc241913471" w:history="1">
+          <w:hyperlink w:anchor="_Toc241915716" w:history="1">
             <w:r>
               <w:rPr>
                 <w:rStyle w:val="Collegamentoipertestuale"/>
@@ -1308,7 +1308,7 @@
               <w:rPr>
                 <w:noProof/>
               </w:rPr>
-              <w:instrText xml:space="preserve"> PAGEREF _Toc241913471 \h </w:instrText>
+              <w:instrText xml:space="preserve"> PAGEREF _Toc241915716 \h </w:instrText>
             </w:r>
             <w:r>
               <w:rPr>
@@ -1350,7 +1350,7 @@
               <w14:ligatures w14:val="standardContextual"/>
             </w:rPr>
           </w:pPr>
-          <w:hyperlink w:anchor="_Toc241913472" w:history="1">
+          <w:hyperlink w:anchor="_Toc241915717" w:history="1">
             <w:r>
               <w:rPr>
                 <w:rStyle w:val="Collegamentoipertestuale"/>
@@ -1374,7 +1374,7 @@
               <w:rPr>
                 <w:noProof/>
               </w:rPr>
-              <w:instrText xml:space="preserve"> PAGEREF _Toc241913472 \h </w:instrText>
+              <w:instrText xml:space="preserve"> PAGEREF _Toc241915717 \h </w:instrText>
             </w:r>
             <w:r>
               <w:rPr>
@@ -1416,7 +1416,7 @@
               <w14:ligatures w14:val="standardContextual"/>
             </w:rPr>
           </w:pPr>
-          <w:hyperlink w:anchor="_Toc241913473" w:history="1">
+          <w:hyperlink w:anchor="_Toc241915718" w:history="1">
             <w:r>
               <w:rPr>
                 <w:rStyle w:val="Collegamentoipertestuale"/>
@@ -1440,7 +1440,7 @@
               <w:rPr>
                 <w:noProof/>
               </w:rPr>
-              <w:instrText xml:space="preserve"> PAGEREF _Toc241913473 \h </w:instrText>
+              <w:instrText xml:space="preserve"> PAGEREF _Toc241915718 \h </w:instrText>
             </w:r>
             <w:r>
               <w:rPr>
@@ -1482,7 +1482,7 @@
               <w14:ligatures w14:val="standardContextual"/>
             </w:rPr>
           </w:pPr>
-          <w:hyperlink w:anchor="_Toc241913474" w:history="1">
+          <w:hyperlink w:anchor="_Toc241915719" w:history="1">
             <w:r>
               <w:rPr>
                 <w:rStyle w:val="Collegamentoipertestuale"/>
@@ -1506,7 +1506,7 @@
               <w:rPr>
                 <w:noProof/>
               </w:rPr>
-              <w:instrText xml:space="preserve"> PAGEREF _Toc241913474 \h </w:instrText>
+              <w:instrText xml:space="preserve"> PAGEREF _Toc241915719 \h </w:instrText>
             </w:r>
             <w:r>
               <w:rPr>
@@ -1548,7 +1548,7 @@
               <w14:ligatures w14:val="standardContextual"/>
             </w:rPr>
           </w:pPr>
-          <w:hyperlink w:anchor="_Toc241913475" w:history="1">
+          <w:hyperlink w:anchor="_Toc241915720" w:history="1">
             <w:r>
               <w:rPr>
                 <w:rStyle w:val="Collegamentoipertestuale"/>
@@ -1572,7 +1572,7 @@
               <w:rPr>
                 <w:noProof/>
               </w:rPr>
-              <w:instrText xml:space="preserve"> PAGEREF _Toc241913475 \h </w:instrText>
+              <w:instrText xml:space="preserve"> PAGEREF _Toc241915720 \h </w:instrText>
             </w:r>
             <w:r>
               <w:rPr>
@@ -1614,7 +1614,7 @@
               <w14:ligatures w14:val="standardContextual"/>
             </w:rPr>
           </w:pPr>
-          <w:hyperlink w:anchor="_Toc241913476" w:history="1">
+          <w:hyperlink w:anchor="_Toc241915721" w:history="1">
             <w:r>
               <w:rPr>
                 <w:rStyle w:val="Collegamentoipertestuale"/>
@@ -1638,7 +1638,7 @@
               <w:rPr>
                 <w:noProof/>
               </w:rPr>
-              <w:instrText xml:space="preserve"> PAGEREF _Toc241913476 \h </w:instrText>
+              <w:instrText xml:space="preserve"> PAGEREF _Toc241915721 \h </w:instrText>
             </w:r>
             <w:r>
               <w:rPr>
@@ -1680,7 +1680,7 @@
               <w14:ligatures w14:val="standardContextual"/>
             </w:rPr>
           </w:pPr>
-          <w:hyperlink w:anchor="_Toc241913477" w:history="1">
+          <w:hyperlink w:anchor="_Toc241915722" w:history="1">
             <w:r>
               <w:rPr>
                 <w:rStyle w:val="Collegamentoipertestuale"/>
@@ -1704,7 +1704,7 @@
               <w:rPr>
                 <w:noProof/>
               </w:rPr>
-              <w:instrText xml:space="preserve"> PAGEREF _Toc241913477 \h </w:instrText>
+              <w:instrText xml:space="preserve"> PAGEREF _Toc241915722 \h </w:instrText>
             </w:r>
             <w:r>
               <w:rPr>
@@ -1746,7 +1746,7 @@
               <w14:ligatures w14:val="standardContextual"/>
             </w:rPr>
           </w:pPr>
-          <w:hyperlink w:anchor="_Toc241913478" w:history="1">
+          <w:hyperlink w:anchor="_Toc241915723" w:history="1">
             <w:r>
               <w:rPr>
                 <w:rStyle w:val="Collegamentoipertestuale"/>
@@ -1770,7 +1770,7 @@
               <w:rPr>
                 <w:noProof/>
               </w:rPr>
-              <w:instrText xml:space="preserve"> PAGEREF _Toc241913478 \h </w:instrText>
+              <w:instrText xml:space="preserve"> PAGEREF _Toc241915723 \h </w:instrText>
             </w:r>
             <w:r>
               <w:rPr>
@@ -1812,7 +1812,7 @@
               <w14:ligatures w14:val="standardContextual"/>
             </w:rPr>
           </w:pPr>
-          <w:hyperlink w:anchor="_Toc241913479" w:history="1">
+          <w:hyperlink w:anchor="_Toc241915724" w:history="1">
             <w:r>
               <w:rPr>
                 <w:rStyle w:val="Collegamentoipertestuale"/>
@@ -1836,7 +1836,7 @@
               <w:rPr>
                 <w:noProof/>
               </w:rPr>
-              <w:instrText xml:space="preserve"> PAGEREF _Toc241913479 \h </w:instrText>
+              <w:instrText xml:space="preserve"> PAGEREF _Toc241915724 \h </w:instrText>
             </w:r>
             <w:r>
               <w:rPr>
@@ -1878,7 +1878,7 @@
               <w14:ligatures w14:val="standardContextual"/>
             </w:rPr>
           </w:pPr>
-          <w:hyperlink w:anchor="_Toc241913480" w:history="1">
+          <w:hyperlink w:anchor="_Toc241915725" w:history="1">
             <w:r>
               <w:rPr>
                 <w:rStyle w:val="Collegamentoipertestuale"/>
@@ -1902,7 +1902,7 @@
               <w:rPr>
                 <w:noProof/>
               </w:rPr>
-              <w:instrText xml:space="preserve"> PAGEREF _Toc241913480 \h </w:instrText>
+              <w:instrText xml:space="preserve"> PAGEREF _Toc241915725 \h </w:instrText>
             </w:r>
             <w:r>
               <w:rPr>
@@ -1944,7 +1944,7 @@
               <w14:ligatures w14:val="standardContextual"/>
             </w:rPr>
           </w:pPr>
-          <w:hyperlink w:anchor="_Toc241913481" w:history="1">
+          <w:hyperlink w:anchor="_Toc241915726" w:history="1">
             <w:r>
               <w:rPr>
                 <w:rStyle w:val="Collegamentoipertestuale"/>
@@ -1968,7 +1968,7 @@
               <w:rPr>
                 <w:noProof/>
               </w:rPr>
-              <w:instrText xml:space="preserve"> PAGEREF _Toc241913481 \h </w:instrText>
+              <w:instrText xml:space="preserve"> PAGEREF _Toc241915726 \h </w:instrText>
             </w:r>
             <w:r>
               <w:rPr>
@@ -2010,7 +2010,7 @@
               <w14:ligatures w14:val="standardContextual"/>
             </w:rPr>
           </w:pPr>
-          <w:hyperlink w:anchor="_Toc241913482" w:history="1">
+          <w:hyperlink w:anchor="_Toc241915727" w:history="1">
             <w:r>
               <w:rPr>
                 <w:rStyle w:val="Collegamentoipertestuale"/>
@@ -2034,7 +2034,7 @@
               <w:rPr>
                 <w:noProof/>
               </w:rPr>
-              <w:instrText xml:space="preserve"> PAGEREF _Toc241913482 \h </w:instrText>
+              <w:instrText xml:space="preserve"> PAGEREF _Toc241915727 \h </w:instrText>
             </w:r>
             <w:r>
               <w:rPr>
@@ -2076,7 +2076,7 @@
               <w14:ligatures w14:val="standardContextual"/>
             </w:rPr>
           </w:pPr>
-          <w:hyperlink w:anchor="_Toc241913483" w:history="1">
+          <w:hyperlink w:anchor="_Toc241915728" w:history="1">
             <w:r>
               <w:rPr>
                 <w:rStyle w:val="Collegamentoipertestuale"/>
@@ -2100,7 +2100,7 @@
               <w:rPr>
                 <w:noProof/>
               </w:rPr>
-              <w:instrText xml:space="preserve"> PAGEREF _Toc241913483 \h </w:instrText>
+              <w:instrText xml:space="preserve"> PAGEREF _Toc241915728 \h </w:instrText>
             </w:r>
             <w:r>
               <w:rPr>
@@ -2142,7 +2142,7 @@
               <w14:ligatures w14:val="standardContextual"/>
             </w:rPr>
           </w:pPr>
-          <w:hyperlink w:anchor="_Toc241913484" w:history="1">
+          <w:hyperlink w:anchor="_Toc241915729" w:history="1">
             <w:r>
               <w:rPr>
                 <w:rStyle w:val="Collegamentoipertestuale"/>
@@ -2166,7 +2166,7 @@
               <w:rPr>
                 <w:noProof/>
               </w:rPr>
-              <w:instrText xml:space="preserve"> PAGEREF _Toc241913484 \h </w:instrText>
+              <w:instrText xml:space="preserve"> PAGEREF _Toc241915729 \h </w:instrText>
             </w:r>
             <w:r>
               <w:rPr>
@@ -2208,7 +2208,7 @@
               <w14:ligatures w14:val="standardContextual"/>
             </w:rPr>
           </w:pPr>
-          <w:hyperlink w:anchor="_Toc241913485" w:history="1">
+          <w:hyperlink w:anchor="_Toc241915730" w:history="1">
             <w:r>
               <w:rPr>
                 <w:rStyle w:val="Collegamentoipertestuale"/>
@@ -2232,7 +2232,7 @@
               <w:rPr>
                 <w:noProof/>
               </w:rPr>
-              <w:instrText xml:space="preserve"> PAGEREF _Toc241913485 \h </w:instrText>
+              <w:instrText xml:space="preserve"> PAGEREF _Toc241915730 \h </w:instrText>
             </w:r>
             <w:r>
               <w:rPr>
@@ -2274,7 +2274,7 @@
               <w14:ligatures w14:val="standardContextual"/>
             </w:rPr>
           </w:pPr>
-          <w:hyperlink w:anchor="_Toc241913486" w:history="1">
+          <w:hyperlink w:anchor="_Toc241915731" w:history="1">
             <w:r>
               <w:rPr>
                 <w:rStyle w:val="Collegamentoipertestuale"/>
@@ -2298,7 +2298,7 @@
               <w:rPr>
                 <w:noProof/>
               </w:rPr>
-              <w:instrText xml:space="preserve"> PAGEREF _Toc241913486 \h </w:instrText>
+              <w:instrText xml:space="preserve"> PAGEREF _Toc241915731 \h </w:instrText>
             </w:r>
             <w:r>
               <w:rPr>
@@ -2340,7 +2340,7 @@
               <w14:ligatures w14:val="standardContextual"/>
             </w:rPr>
           </w:pPr>
-          <w:hyperlink w:anchor="_Toc241913487" w:history="1">
+          <w:hyperlink w:anchor="_Toc241915732" w:history="1">
             <w:r>
               <w:rPr>
                 <w:rStyle w:val="Collegamentoipertestuale"/>
@@ -2364,7 +2364,7 @@
               <w:rPr>
                 <w:noProof/>
               </w:rPr>
-              <w:instrText xml:space="preserve"> PAGEREF _Toc241913487 \h </w:instrText>
+              <w:instrText xml:space="preserve"> PAGEREF _Toc241915732 \h </w:instrText>
             </w:r>
             <w:r>
               <w:rPr>
@@ -2406,7 +2406,7 @@
               <w14:ligatures w14:val="standardContextual"/>
             </w:rPr>
           </w:pPr>
-          <w:hyperlink w:anchor="_Toc241913488" w:history="1">
+          <w:hyperlink w:anchor="_Toc241915733" w:history="1">
             <w:r>
               <w:rPr>
                 <w:rStyle w:val="Collegamentoipertestuale"/>
@@ -2430,7 +2430,7 @@
               <w:rPr>
                 <w:noProof/>
               </w:rPr>
-              <w:instrText xml:space="preserve"> PAGEREF _Toc241913488 \h </w:instrText>
+              <w:instrText xml:space="preserve"> PAGEREF _Toc241915733 \h </w:instrText>
             </w:r>
             <w:r>
               <w:rPr>
@@ -2469,7 +2469,7 @@
         <w:pStyle w:val="Titolo1"/>
         <w:pageBreakBefore/>
       </w:pPr>
-      <w:bookmarkStart w:id="0" w:name="_Toc241913454"/>
+      <w:bookmarkStart w:id="0" w:name="_Toc241915699"/>
       <w:r>
         <w:lastRenderedPageBreak/>
         <w:t>1. Come è fatto il sito</w:t>
@@ -2509,7 +2509,7 @@
           <w:left w:w="10" w:type="dxa"/>
           <w:right w:w="10" w:type="dxa"/>
         </w:tblCellMar>
-        <w:tblLook w:val="0000" w:firstRow="0" w:lastRow="0" w:firstColumn="0" w:lastColumn="0" w:noHBand="0" w:noVBand="0"/>
+        <w:tblLook w:val="04A0" w:firstRow="1" w:lastRow="0" w:firstColumn="1" w:lastColumn="0" w:noHBand="0" w:noVBand="1"/>
       </w:tblPr>
       <w:tblGrid>
         <w:gridCol w:w="1700"/>
@@ -3110,7 +3110,7 @@
       <w:pPr>
         <w:pStyle w:val="Titolo2"/>
       </w:pPr>
-      <w:bookmarkStart w:id="1" w:name="_Toc241913455"/>
+      <w:bookmarkStart w:id="1" w:name="_Toc241915700"/>
       <w:r>
         <w:t>Il giro di una foto</w:t>
       </w:r>
@@ -3214,7 +3214,7 @@
       <w:pPr>
         <w:pStyle w:val="Titolo2"/>
       </w:pPr>
-      <w:bookmarkStart w:id="2" w:name="_Toc241913456"/>
+      <w:bookmarkStart w:id="2" w:name="_Toc241915701"/>
       <w:r>
         <w:t>Parole che incontrerai</w:t>
       </w:r>
@@ -3235,7 +3235,7 @@
           <w:left w:w="10" w:type="dxa"/>
           <w:right w:w="10" w:type="dxa"/>
         </w:tblCellMar>
-        <w:tblLook w:val="0000" w:firstRow="0" w:lastRow="0" w:firstColumn="0" w:lastColumn="0" w:noHBand="0" w:noVBand="0"/>
+        <w:tblLook w:val="04A0" w:firstRow="1" w:lastRow="0" w:firstColumn="1" w:lastColumn="0" w:noHBand="0" w:noVBand="1"/>
       </w:tblPr>
       <w:tblGrid>
         <w:gridCol w:w="2600"/>
@@ -3833,7 +3833,7 @@
         <w:pStyle w:val="Titolo1"/>
         <w:pageBreakBefore/>
       </w:pPr>
-      <w:bookmarkStart w:id="3" w:name="_Toc241913457"/>
+      <w:bookmarkStart w:id="3" w:name="_Toc241915702"/>
       <w:r>
         <w:lastRenderedPageBreak/>
         <w:t>2. Preparare il computer (una volta sola)</w:t>
@@ -3862,7 +3862,7 @@
       <w:pPr>
         <w:pStyle w:val="Titolo2"/>
       </w:pPr>
-      <w:bookmarkStart w:id="4" w:name="_Toc241913458"/>
+      <w:bookmarkStart w:id="4" w:name="_Toc241915703"/>
       <w:r>
         <w:t>Programmi da installare</w:t>
       </w:r>
@@ -3977,7 +3977,7 @@
       <w:pPr>
         <w:pStyle w:val="Titolo2"/>
       </w:pPr>
-      <w:bookmarkStart w:id="5" w:name="_Toc241913459"/>
+      <w:bookmarkStart w:id="5" w:name="_Toc241915704"/>
       <w:r>
         <w:t>Aprire il terminale nella cartella del progetto</w:t>
       </w:r>
@@ -4069,7 +4069,7 @@
       <w:pPr>
         <w:pStyle w:val="Titolo2"/>
       </w:pPr>
-      <w:bookmarkStart w:id="6" w:name="_Toc241913460"/>
+      <w:bookmarkStart w:id="6" w:name="_Toc241915705"/>
       <w:r>
         <w:t>La prima volta dopo aver scaricato il progetto</w:t>
       </w:r>
@@ -4114,7 +4114,7 @@
       <w:pPr>
         <w:pStyle w:val="Titolo2"/>
       </w:pPr>
-      <w:bookmarkStart w:id="7" w:name="_Toc241913461"/>
+      <w:bookmarkStart w:id="7" w:name="_Toc241915706"/>
       <w:r>
         <w:t>Il file segreto .env.local</w:t>
       </w:r>
@@ -4144,7 +4144,7 @@
         <w:pStyle w:val="Titolo1"/>
         <w:pageBreakBefore/>
       </w:pPr>
-      <w:bookmarkStart w:id="8" w:name="_Toc241913462"/>
+      <w:bookmarkStart w:id="8" w:name="_Toc241915707"/>
       <w:r>
         <w:lastRenderedPageBreak/>
         <w:t>3. Pubblicare una modifica sul sito online</w:t>
@@ -4281,7 +4281,7 @@
       <w:pPr>
         <w:pStyle w:val="Titolo2"/>
       </w:pPr>
-      <w:bookmarkStart w:id="9" w:name="_Toc241913463"/>
+      <w:bookmarkStart w:id="9" w:name="_Toc241915708"/>
       <w:r>
         <w:t>Controllare che sia andato tutto bene</w:t>
       </w:r>
@@ -4433,7 +4433,7 @@
         <w:pStyle w:val="Titolo1"/>
         <w:pageBreakBefore/>
       </w:pPr>
-      <w:bookmarkStart w:id="10" w:name="_Toc241913464"/>
+      <w:bookmarkStart w:id="10" w:name="_Toc241915709"/>
       <w:r>
         <w:lastRenderedPageBreak/>
         <w:t>4. Approvare ed eliminare le foto (pannello di moderazione)</w:t>
@@ -4462,7 +4462,7 @@
       <w:pPr>
         <w:pStyle w:val="Titolo2"/>
       </w:pPr>
-      <w:bookmarkStart w:id="11" w:name="_Toc241913465"/>
+      <w:bookmarkStart w:id="11" w:name="_Toc241915710"/>
       <w:r>
         <w:t>Entrare nel pannello</w:t>
       </w:r>
@@ -4551,7 +4551,7 @@
       <w:pPr>
         <w:pStyle w:val="Titolo2"/>
       </w:pPr>
-      <w:bookmarkStart w:id="12" w:name="_Toc241913466"/>
+      <w:bookmarkStart w:id="12" w:name="_Toc241915711"/>
       <w:r>
         <w:t>Com'è fatto il pannello</w:t>
       </w:r>
@@ -4650,7 +4650,7 @@
       <w:pPr>
         <w:pStyle w:val="Titolo2"/>
       </w:pPr>
-      <w:bookmarkStart w:id="13" w:name="_Toc241913467"/>
+      <w:bookmarkStart w:id="13" w:name="_Toc241915712"/>
       <w:r>
         <w:t>Cosa fanno i pulsanti</w:t>
       </w:r>
@@ -4671,7 +4671,7 @@
           <w:left w:w="10" w:type="dxa"/>
           <w:right w:w="10" w:type="dxa"/>
         </w:tblCellMar>
-        <w:tblLook w:val="0000" w:firstRow="0" w:lastRow="0" w:firstColumn="0" w:lastColumn="0" w:noHBand="0" w:noVBand="0"/>
+        <w:tblLook w:val="04A0" w:firstRow="1" w:lastRow="0" w:firstColumn="1" w:lastColumn="0" w:noHBand="0" w:noVBand="1"/>
       </w:tblPr>
       <w:tblGrid>
         <w:gridCol w:w="2400"/>
@@ -4953,7 +4953,7 @@
       <w:pPr>
         <w:pStyle w:val="Titolo2"/>
       </w:pPr>
-      <w:bookmarkStart w:id="14" w:name="_Toc241913468"/>
+      <w:bookmarkStart w:id="14" w:name="_Toc241915713"/>
       <w:r>
         <w:t>Cosa controllare prima di approvare</w:t>
       </w:r>
@@ -5015,7 +5015,7 @@
       <w:pPr>
         <w:pStyle w:val="Titolo2"/>
       </w:pPr>
-      <w:bookmarkStart w:id="15" w:name="_Toc241913469"/>
+      <w:bookmarkStart w:id="15" w:name="_Toc241915714"/>
       <w:r>
         <w:t>Impostare o cambiare la password del pannello</w:t>
       </w:r>
@@ -5373,7 +5373,7 @@
       <w:pPr>
         <w:pStyle w:val="Titolo2"/>
       </w:pPr>
-      <w:bookmarkStart w:id="16" w:name="_Toc241913470"/>
+      <w:bookmarkStart w:id="16" w:name="_Toc241915715"/>
       <w:r>
         <w:t>Disconnettere tutti i dispositivi</w:t>
       </w:r>
@@ -5587,7 +5587,7 @@
         <w:pStyle w:val="Titolo1"/>
         <w:pageBreakBefore/>
       </w:pPr>
-      <w:bookmarkStart w:id="17" w:name="_Toc241913471"/>
+      <w:bookmarkStart w:id="17" w:name="_Toc241915716"/>
       <w:r>
         <w:lastRenderedPageBreak/>
         <w:t>5. Aprire e chiudere gli invii per l'annuario</w:t>
@@ -5680,7 +5680,7 @@
       <w:pPr>
         <w:pStyle w:val="Titolo2"/>
       </w:pPr>
-      <w:bookmarkStart w:id="18" w:name="_Toc241913472"/>
+      <w:bookmarkStart w:id="18" w:name="_Toc241915717"/>
       <w:r>
         <w:t>Cambiare anno e date</w:t>
       </w:r>
@@ -5839,7 +5839,7 @@
       <w:pPr>
         <w:pStyle w:val="Titolo2"/>
       </w:pPr>
-      <w:bookmarkStart w:id="19" w:name="_Toc241913473"/>
+      <w:bookmarkStart w:id="19" w:name="_Toc241915718"/>
       <w:r>
         <w:t>Aprire o chiudere a mano, senza toccare le date</w:t>
       </w:r>
@@ -5879,7 +5879,7 @@
           <w:left w:w="10" w:type="dxa"/>
           <w:right w:w="10" w:type="dxa"/>
         </w:tblCellMar>
-        <w:tblLook w:val="0000" w:firstRow="0" w:lastRow="0" w:firstColumn="0" w:lastColumn="0" w:noHBand="0" w:noVBand="0"/>
+        <w:tblLook w:val="04A0" w:firstRow="1" w:lastRow="0" w:firstColumn="1" w:lastColumn="0" w:noHBand="0" w:noVBand="1"/>
       </w:tblPr>
       <w:tblGrid>
         <w:gridCol w:w="2200"/>
@@ -6176,7 +6176,7 @@
       <w:pPr>
         <w:pStyle w:val="Titolo2"/>
       </w:pPr>
-      <w:bookmarkStart w:id="20" w:name="_Toc241913474"/>
+      <w:bookmarkStart w:id="20" w:name="_Toc241915719"/>
       <w:r>
         <w:t>Limite di foto per persona</w:t>
       </w:r>
@@ -6249,7 +6249,7 @@
         <w:pStyle w:val="Titolo1"/>
         <w:pageBreakBefore/>
       </w:pPr>
-      <w:bookmarkStart w:id="21" w:name="_Toc241913475"/>
+      <w:bookmarkStart w:id="21" w:name="_Toc241915720"/>
       <w:r>
         <w:lastRenderedPageBreak/>
         <w:t>6. Creare il PDF dell'annuario</w:t>
@@ -6351,7 +6351,7 @@
       <w:pPr>
         <w:pStyle w:val="Titolo2"/>
       </w:pPr>
-      <w:bookmarkStart w:id="22" w:name="_Toc241913476"/>
+      <w:bookmarkStart w:id="22" w:name="_Toc241915721"/>
       <w:r>
         <w:t>La copertina: logo e scritta "Edizione 2027-28"</w:t>
       </w:r>
@@ -6422,7 +6422,7 @@
           <w:left w:w="10" w:type="dxa"/>
           <w:right w:w="10" w:type="dxa"/>
         </w:tblCellMar>
-        <w:tblLook w:val="0000" w:firstRow="0" w:lastRow="0" w:firstColumn="0" w:lastColumn="0" w:noHBand="0" w:noVBand="0"/>
+        <w:tblLook w:val="04A0" w:firstRow="1" w:lastRow="0" w:firstColumn="1" w:lastColumn="0" w:noHBand="0" w:noVBand="1"/>
       </w:tblPr>
       <w:tblGrid>
         <w:gridCol w:w="4000"/>
@@ -6949,7 +6949,7 @@
       <w:pPr>
         <w:pStyle w:val="Titolo2"/>
       </w:pPr>
-      <w:bookmarkStart w:id="23" w:name="_Toc241913477"/>
+      <w:bookmarkStart w:id="23" w:name="_Toc241915722"/>
       <w:r>
         <w:t>Premessa</w:t>
       </w:r>
@@ -7066,7 +7066,7 @@
       <w:pPr>
         <w:pStyle w:val="Titolo2"/>
       </w:pPr>
-      <w:bookmarkStart w:id="24" w:name="_Toc241913478"/>
+      <w:bookmarkStart w:id="24" w:name="_Toc241915723"/>
       <w:r>
         <w:t>Generare il PDF</w:t>
       </w:r>
@@ -7179,7 +7179,7 @@
       <w:pPr>
         <w:pStyle w:val="Titolo2"/>
       </w:pPr>
-      <w:bookmarkStart w:id="25" w:name="_Toc241913479"/>
+      <w:bookmarkStart w:id="25" w:name="_Toc241915724"/>
       <w:r>
         <w:t>Opzioni utili</w:t>
       </w:r>
@@ -7302,7 +7302,7 @@
         <w:pStyle w:val="Titolo1"/>
         <w:pageBreakBefore/>
       </w:pPr>
-      <w:bookmarkStart w:id="26" w:name="_Toc241913480"/>
+      <w:bookmarkStart w:id="26" w:name="_Toc241915725"/>
       <w:r>
         <w:lastRenderedPageBreak/>
         <w:t>7. Pubblicare una nuova edizione nell'Archivio</w:t>
@@ -7603,7 +7603,7 @@
         <w:pStyle w:val="Titolo1"/>
         <w:pageBreakBefore/>
       </w:pPr>
-      <w:bookmarkStart w:id="27" w:name="_Toc241913481"/>
+      <w:bookmarkStart w:id="27" w:name="_Toc241915726"/>
       <w:r>
         <w:lastRenderedPageBreak/>
         <w:t>8. Altre modifiche frequenti</w:t>
@@ -7614,7 +7614,7 @@
       <w:pPr>
         <w:pStyle w:val="Titolo2"/>
       </w:pPr>
-      <w:bookmarkStart w:id="28" w:name="_Toc241913482"/>
+      <w:bookmarkStart w:id="28" w:name="_Toc241915727"/>
       <w:r>
         <w:t>Cambiare la foto di sfondo della Home</w:t>
       </w:r>
@@ -7698,7 +7698,7 @@
       <w:pPr>
         <w:pStyle w:val="Titolo2"/>
       </w:pPr>
-      <w:bookmarkStart w:id="29" w:name="_Toc241913483"/>
+      <w:bookmarkStart w:id="29" w:name="_Toc241915728"/>
       <w:r>
         <w:t>Cambiare i testi del sito</w:t>
       </w:r>
@@ -7738,7 +7738,7 @@
           <w:left w:w="10" w:type="dxa"/>
           <w:right w:w="10" w:type="dxa"/>
         </w:tblCellMar>
-        <w:tblLook w:val="0000" w:firstRow="0" w:lastRow="0" w:firstColumn="0" w:lastColumn="0" w:noHBand="0" w:noVBand="0"/>
+        <w:tblLook w:val="04A0" w:firstRow="1" w:lastRow="0" w:firstColumn="1" w:lastColumn="0" w:noHBand="0" w:noVBand="1"/>
       </w:tblPr>
       <w:tblGrid>
         <w:gridCol w:w="4600"/>
@@ -8400,7 +8400,7 @@
         <w:pStyle w:val="Titolo1"/>
         <w:pageBreakBefore/>
       </w:pPr>
-      <w:bookmarkStart w:id="30" w:name="_Toc241913484"/>
+      <w:bookmarkStart w:id="30" w:name="_Toc241915729"/>
       <w:r>
         <w:lastRenderedPageBreak/>
         <w:t>9. Password, chiavi e variabili d'ambiente</w:t>
@@ -8481,7 +8481,7 @@
           <w:left w:w="10" w:type="dxa"/>
           <w:right w:w="10" w:type="dxa"/>
         </w:tblCellMar>
-        <w:tblLook w:val="0000" w:firstRow="0" w:lastRow="0" w:firstColumn="0" w:lastColumn="0" w:noHBand="0" w:noVBand="0"/>
+        <w:tblLook w:val="04A0" w:firstRow="1" w:lastRow="0" w:firstColumn="1" w:lastColumn="0" w:noHBand="0" w:noVBand="1"/>
       </w:tblPr>
       <w:tblGrid>
         <w:gridCol w:w="2900"/>
@@ -9086,7 +9086,7 @@
       <w:pPr>
         <w:pStyle w:val="Titolo2"/>
       </w:pPr>
-      <w:bookmarkStart w:id="31" w:name="_Toc241913485"/>
+      <w:bookmarkStart w:id="31" w:name="_Toc241915730"/>
       <w:r>
         <w:t>Recuperare il file .env.local su un nuovo computer</w:t>
       </w:r>
@@ -9305,7 +9305,7 @@
         <w:pStyle w:val="Titolo1"/>
         <w:pageBreakBefore/>
       </w:pPr>
-      <w:bookmarkStart w:id="32" w:name="_Toc241913486"/>
+      <w:bookmarkStart w:id="32" w:name="_Toc241915731"/>
       <w:r>
         <w:lastRenderedPageBreak/>
         <w:t>10. Privacy e regole</w:t>
@@ -9365,17 +9365,24 @@
         <w:spacing w:after="60" w:line="290" w:lineRule="auto"/>
       </w:pPr>
       <w:r>
-        <w:t>Il sito è un'</w:t>
-      </w:r>
-      <w:r>
         <w:rPr>
           <w:b/>
           <w:bCs/>
         </w:rPr>
-        <w:t>attività non ufficiale</w:t>
-      </w:r>
-      <w:r>
-        <w:t>: non usa loghi dell'Università di Pisa. Non aggiungerli.</w:t>
+        <w:t>Le foto vengono ripulite automaticamente.</w:t>
+      </w:r>
+      <w:r>
+        <w:t xml:space="preserve"> Ogni immagine inviata viene ricodificata dal sito: si tolgono i dati nascosti che i telefoni aggiungono (la </w:t>
+      </w:r>
+      <w:r>
+        <w:rPr>
+          <w:b/>
+          <w:bCs/>
+        </w:rPr>
+        <w:t>posizione GPS</w:t>
+      </w:r>
+      <w:r>
+        <w:t xml:space="preserve"> in cui è stata scattata, il modello del telefono, data e ora) e la si ridimensiona. Si accettano solo foto JPG, PNG o WebP.</w:t>
       </w:r>
     </w:p>
     <w:p>
@@ -9388,7 +9395,14 @@
         <w:spacing w:after="60" w:line="290" w:lineRule="auto"/>
       </w:pPr>
       <w:r>
-        <w:t>Se qualcuno chiede di togliere la propria foto, eliminala dal pannello (capitolo 4). Se era già in un PDF pubblicato, rigenera il PDF e sostituisci il file nell'Archivio (capitoli 6 e 7).</w:t>
+        <w:rPr>
+          <w:b/>
+          <w:bCs/>
+        </w:rPr>
+        <w:t>Le foto originali le vedi solo tu.</w:t>
+      </w:r>
+      <w:r>
+        <w:t xml:space="preserve"> Nelle gallerie i visitatori vedono una versione ridotta, servita dal sito, e non possono salvarla con il tasto destro o trascinandola. Gli indirizzi dei file originali non compaiono mai nelle pagine: si aprono solo dal pannello di moderazione, dopo il login. Nessun sito può impedire uno screenshot, ma l'originale in alta risoluzione resta riservato.</w:t>
       </w:r>
     </w:p>
     <w:p>
@@ -9401,6 +9415,42 @@
         <w:spacing w:after="60" w:line="290" w:lineRule="auto"/>
       </w:pPr>
       <w:r>
+        <w:t>Il sito è un'</w:t>
+      </w:r>
+      <w:r>
+        <w:rPr>
+          <w:b/>
+          <w:bCs/>
+        </w:rPr>
+        <w:t>attività non ufficiale</w:t>
+      </w:r>
+      <w:r>
+        <w:t>: non usa loghi dell'Università di Pisa. Non aggiungerli.</w:t>
+      </w:r>
+    </w:p>
+    <w:p>
+      <w:pPr>
+        <w:pStyle w:val="Paragrafoelenco"/>
+        <w:numPr>
+          <w:ilvl w:val="0"/>
+          <w:numId w:val="3"/>
+        </w:numPr>
+        <w:spacing w:after="60" w:line="290" w:lineRule="auto"/>
+      </w:pPr>
+      <w:r>
+        <w:t>Se qualcuno chiede di togliere la propria foto, eliminala dal pannello (capitolo 4). Se era già in un PDF pubblicato, rigenera il PDF e sostituisci il file nell'Archivio (capitoli 6 e 7).</w:t>
+      </w:r>
+    </w:p>
+    <w:p>
+      <w:pPr>
+        <w:pStyle w:val="Paragrafoelenco"/>
+        <w:numPr>
+          <w:ilvl w:val="0"/>
+          <w:numId w:val="3"/>
+        </w:numPr>
+        <w:spacing w:after="60" w:line="290" w:lineRule="auto"/>
+      </w:pPr>
+      <w:r>
         <w:t>Le segnalazioni arrivano all'indirizzo scritto in fondo al sito: pn.leggenda@outlook.it.</w:t>
       </w:r>
     </w:p>
@@ -9409,7 +9459,7 @@
         <w:pStyle w:val="Titolo1"/>
         <w:pageBreakBefore/>
       </w:pPr>
-      <w:bookmarkStart w:id="33" w:name="_Toc241913487"/>
+      <w:bookmarkStart w:id="33" w:name="_Toc241915732"/>
       <w:r>
         <w:lastRenderedPageBreak/>
         <w:t>11. Se qualcosa va storto</w:t>
@@ -9431,7 +9481,7 @@
           <w:left w:w="10" w:type="dxa"/>
           <w:right w:w="10" w:type="dxa"/>
         </w:tblCellMar>
-        <w:tblLook w:val="0000" w:firstRow="0" w:lastRow="0" w:firstColumn="0" w:lastColumn="0" w:noHBand="0" w:noVBand="0"/>
+        <w:tblLook w:val="04A0" w:firstRow="1" w:lastRow="0" w:firstColumn="1" w:lastColumn="0" w:noHBand="0" w:noVBand="1"/>
       </w:tblPr>
       <w:tblGrid>
         <w:gridCol w:w="3400"/>
@@ -9875,7 +9925,7 @@
               <w:spacing w:line="276" w:lineRule="auto"/>
             </w:pPr>
             <w:r>
-              <w:t>Il messaggio sul sito spiega il motivo: email non Unipi, immagine oltre 5 MB, limite di invii raggiunto, oppure invii chiusi. Per l'Archivio il limite è 1 singola e 3 di gruppo a persona.</w:t>
+              <w:t>Il messaggio sul sito spiega il motivo: email non Unipi, immagine oltre 5 MB, formato non supportato (si accettano solo JPG, PNG e WebP: le foto HEIC dell'iPhone vanno prima convertite, ma di solito l'iPhone lo fa da solo), limite di invii raggiunto, oppure invii chiusi. Per l'Archivio il limite è 1 singola e 3 di gruppo a persona.</w:t>
             </w:r>
           </w:p>
         </w:tc>
@@ -10076,7 +10126,7 @@
         <w:pStyle w:val="Titolo1"/>
         <w:pageBreakBefore/>
       </w:pPr>
-      <w:bookmarkStart w:id="34" w:name="_Toc241913488"/>
+      <w:bookmarkStart w:id="34" w:name="_Toc241915733"/>
       <w:r>
         <w:lastRenderedPageBreak/>
         <w:t>12. Promemoria di ogni anno</w:t>
@@ -10331,305 +10381,305 @@
 <file path=word/numbering.xml><?xml version="1.0" encoding="utf-8"?>
 <w:numbering xmlns:wpc="http://schemas.microsoft.com/office/word/2010/wordprocessingCanvas" xmlns:cx="http://schemas.microsoft.com/office/drawing/2014/chartex" xmlns:cx1="http://schemas.microsoft.com/office/drawing/2015/9/8/chartex" xmlns:cx2="http://schemas.microsoft.com/office/drawing/2015/10/21/chartex" xmlns:cx3="http://schemas.microsoft.com/office/drawing/2016/5/9/chartex" xmlns:cx4="http://schemas.microsoft.com/office/drawing/2016/5/10/chartex" xmlns:cx5="http://schemas.microsoft.com/office/drawing/2016/5/11/chartex" xmlns:cx6="http://schemas.microsoft.com/office/drawing/2016/5/12/chartex" xmlns:cx7="http://schemas.microsoft.com/office/drawing/2016/5/13/chartex" xmlns:cx8="http://schemas.microsoft.com/office/drawing/2016/5/14/chartex" xmlns:mc="http://schemas.openxmlformats.org/markup-compatibility/2006" xmlns:aink="http://schemas.microsoft.com/office/drawing/2016/ink" xmlns:am3d="http://schemas.microsoft.com/office/drawing/2017/model3d" xmlns:o="urn:schemas-microsoft-com:office:office" xmlns:oel="http://schemas.microsoft.com/office/2019/extlst" xmlns:r="http://schemas.openxmlformats.org/officeDocument/2006/relationships" xmlns:m="http://schemas.openxmlformats.org/officeDocument/2006/math" xmlns:v="urn:schemas-microsoft-com:vml" xmlns:wp14="http://schemas.microsoft.com/office/word/2010/wordprocessingDrawing" xmlns:wp="http://schemas.openxmlformats.org/drawingml/2006/wordprocessingDrawing" xmlns:w10="urn:schemas-microsoft-com:office:word" xmlns:w="http://schemas.openxmlformats.org/wordprocessingml/2006/main" xmlns:w14="http://schemas.microsoft.com/office/word/2010/wordml" xmlns:w15="http://schemas.microsoft.com/office/word/2012/wordml" xmlns:w16cex="http://schemas.microsoft.com/office/word/2018/wordml/cex" xmlns:w16cid="http://schemas.microsoft.com/office/word/2016/wordml/cid" xmlns:w16="http://schemas.microsoft.com/office/word/2018/wordml" xmlns:w16sdtdh="http://schemas.microsoft.com/office/word/2020/wordml/sdtdatahash" xmlns:w16se="http://schemas.microsoft.com/office/word/2015/wordml/symex" xmlns:wpg="http://schemas.microsoft.com/office/word/2010/wordprocessingGroup" xmlns:wpi="http://schemas.microsoft.com/office/word/2010/wordprocessingInk" xmlns:wne="http://schemas.microsoft.com/office/word/2006/wordml" xmlns:wps="http://schemas.microsoft.com/office/word/2010/wordprocessingShape" mc:Ignorable="w14 w15 w16se w16cid w16 w16cex w16sdtdh wp14">
   <w:abstractNum w:abstractNumId="0" w15:restartNumberingAfterBreak="0">
-    <w:nsid w:val="0E82363E"/>
+    <w:nsid w:val="20D670ED"/>
     <w:multiLevelType w:val="hybridMultilevel"/>
-    <w:tmpl w:val="338019B6"/>
-    <w:lvl w:ilvl="0" w:tplc="C8D89F50">
+    <w:tmpl w:val="E424B8D2"/>
+    <w:lvl w:ilvl="0" w:tplc="D794F624">
       <w:start w:val="1"/>
-      <w:numFmt w:val="bullet"/>
-      <w:lvlText w:val="•"/>
+      <w:numFmt w:val="decimal"/>
+      <w:lvlText w:val="%1."/>
       <w:lvlJc w:val="left"/>
       <w:pPr>
-        <w:ind w:left="540" w:hanging="300"/>
+        <w:ind w:left="540" w:hanging="360"/>
       </w:pPr>
       <w:rPr>
-        <w:color w:val="0066B2"/>
+        <w:b/>
+        <w:bCs/>
+        <w:color w:val="002B49"/>
       </w:rPr>
     </w:lvl>
-    <w:lvl w:ilvl="1" w:tplc="2A52151C">
+    <w:lvl w:ilvl="1" w:tplc="89E45C98">
       <w:numFmt w:val="decimal"/>
       <w:lvlText w:val=""/>
       <w:lvlJc w:val="left"/>
     </w:lvl>
-    <w:lvl w:ilvl="2" w:tplc="12906F66">
+    <w:lvl w:ilvl="2" w:tplc="A48E5DB8">
       <w:numFmt w:val="decimal"/>
       <w:lvlText w:val=""/>
       <w:lvlJc w:val="left"/>
     </w:lvl>
-    <w:lvl w:ilvl="3" w:tplc="05BC75BC">
+    <w:lvl w:ilvl="3" w:tplc="BAAC0648">
       <w:numFmt w:val="decimal"/>
       <w:lvlText w:val=""/>
       <w:lvlJc w:val="left"/>
     </w:lvl>
-    <w:lvl w:ilvl="4" w:tplc="1AFA5392">
+    <w:lvl w:ilvl="4" w:tplc="3C329932">
       <w:numFmt w:val="decimal"/>
       <w:lvlText w:val=""/>
       <w:lvlJc w:val="left"/>
     </w:lvl>
-    <w:lvl w:ilvl="5" w:tplc="97540770">
+    <w:lvl w:ilvl="5" w:tplc="BC70A7AC">
       <w:numFmt w:val="decimal"/>
       <w:lvlText w:val=""/>
       <w:lvlJc w:val="left"/>
     </w:lvl>
-    <w:lvl w:ilvl="6" w:tplc="C2EC5094">
+    <w:lvl w:ilvl="6" w:tplc="ECA884D6">
       <w:numFmt w:val="decimal"/>
       <w:lvlText w:val=""/>
       <w:lvlJc w:val="left"/>
     </w:lvl>
-    <w:lvl w:ilvl="7" w:tplc="B97EBF72">
+    <w:lvl w:ilvl="7" w:tplc="6610F902">
       <w:numFmt w:val="decimal"/>
       <w:lvlText w:val=""/>
       <w:lvlJc w:val="left"/>
     </w:lvl>
-    <w:lvl w:ilvl="8" w:tplc="321A5D0E">
+    <w:lvl w:ilvl="8" w:tplc="48C06C06">
       <w:numFmt w:val="decimal"/>
       <w:lvlText w:val=""/>
       <w:lvlJc w:val="left"/>
     </w:lvl>
   </w:abstractNum>
   <w:abstractNum w:abstractNumId="1" w15:restartNumberingAfterBreak="0">
-    <w:nsid w:val="4A200174"/>
+    <w:nsid w:val="24B57F82"/>
     <w:multiLevelType w:val="hybridMultilevel"/>
-    <w:tmpl w:val="F23C748C"/>
-    <w:lvl w:ilvl="0" w:tplc="94EA6796">
+    <w:tmpl w:val="F73C3EF4"/>
+    <w:lvl w:ilvl="0" w:tplc="71DA4E84">
       <w:start w:val="1"/>
-      <w:numFmt w:val="decimal"/>
-      <w:lvlText w:val="%1."/>
+      <w:numFmt w:val="bullet"/>
+      <w:lvlText w:val="●"/>
       <w:lvlJc w:val="left"/>
       <w:pPr>
-        <w:ind w:left="540" w:hanging="360"/>
+        <w:ind w:left="720" w:hanging="360"/>
+      </w:pPr>
+    </w:lvl>
+    <w:lvl w:ilvl="1" w:tplc="B1B03188">
+      <w:start w:val="1"/>
+      <w:numFmt w:val="bullet"/>
+      <w:lvlText w:val="○"/>
+      <w:lvlJc w:val="left"/>
+      <w:pPr>
+        <w:ind w:left="1440" w:hanging="360"/>
+      </w:pPr>
+    </w:lvl>
+    <w:lvl w:ilvl="2" w:tplc="A15CB96E">
+      <w:start w:val="1"/>
+      <w:numFmt w:val="bullet"/>
+      <w:lvlText w:val="■"/>
+      <w:lvlJc w:val="left"/>
+      <w:pPr>
+        <w:ind w:left="2160" w:hanging="360"/>
+      </w:pPr>
+    </w:lvl>
+    <w:lvl w:ilvl="3" w:tplc="44480360">
+      <w:start w:val="1"/>
+      <w:numFmt w:val="bullet"/>
+      <w:lvlText w:val="●"/>
+      <w:lvlJc w:val="left"/>
+      <w:pPr>
+        <w:ind w:left="2880" w:hanging="360"/>
+      </w:pPr>
+    </w:lvl>
+    <w:lvl w:ilvl="4" w:tplc="EA0A19B4">
+      <w:start w:val="1"/>
+      <w:numFmt w:val="bullet"/>
+      <w:lvlText w:val="○"/>
+      <w:lvlJc w:val="left"/>
+      <w:pPr>
+        <w:ind w:left="3600" w:hanging="360"/>
+      </w:pPr>
+    </w:lvl>
+    <w:lvl w:ilvl="5" w:tplc="95F2D5A6">
+      <w:start w:val="1"/>
+      <w:numFmt w:val="bullet"/>
+      <w:lvlText w:val="■"/>
+      <w:lvlJc w:val="left"/>
+      <w:pPr>
+        <w:ind w:left="4320" w:hanging="360"/>
+      </w:pPr>
+    </w:lvl>
+    <w:lvl w:ilvl="6" w:tplc="EF96F204">
+      <w:start w:val="1"/>
+      <w:numFmt w:val="bullet"/>
+      <w:lvlText w:val="●"/>
+      <w:lvlJc w:val="left"/>
+      <w:pPr>
+        <w:ind w:left="5040" w:hanging="360"/>
+      </w:pPr>
+    </w:lvl>
+    <w:lvl w:ilvl="7" w:tplc="246EFEE8">
+      <w:start w:val="1"/>
+      <w:numFmt w:val="bullet"/>
+      <w:lvlText w:val="●"/>
+      <w:lvlJc w:val="left"/>
+      <w:pPr>
+        <w:ind w:left="5760" w:hanging="360"/>
+      </w:pPr>
+    </w:lvl>
+    <w:lvl w:ilvl="8" w:tplc="D7627D4A">
+      <w:start w:val="1"/>
+      <w:numFmt w:val="bullet"/>
+      <w:lvlText w:val="●"/>
+      <w:lvlJc w:val="left"/>
+      <w:pPr>
+        <w:ind w:left="6480" w:hanging="360"/>
+      </w:pPr>
+    </w:lvl>
+  </w:abstractNum>
+  <w:abstractNum w:abstractNumId="2" w15:restartNumberingAfterBreak="0">
+    <w:nsid w:val="4CD72A35"/>
+    <w:multiLevelType w:val="hybridMultilevel"/>
+    <w:tmpl w:val="F65EF4D8"/>
+    <w:lvl w:ilvl="0" w:tplc="C6740260">
+      <w:start w:val="1"/>
+      <w:numFmt w:val="bullet"/>
+      <w:lvlText w:val="•"/>
+      <w:lvlJc w:val="left"/>
+      <w:pPr>
+        <w:ind w:left="540" w:hanging="300"/>
       </w:pPr>
       <w:rPr>
-        <w:b/>
-        <w:bCs/>
-        <w:color w:val="002B49"/>
+        <w:color w:val="0066B2"/>
       </w:rPr>
     </w:lvl>
-    <w:lvl w:ilvl="1" w:tplc="57CED858">
+    <w:lvl w:ilvl="1" w:tplc="7AD85028">
       <w:numFmt w:val="decimal"/>
       <w:lvlText w:val=""/>
       <w:lvlJc w:val="left"/>
     </w:lvl>
-    <w:lvl w:ilvl="2" w:tplc="4DEA8328">
+    <w:lvl w:ilvl="2" w:tplc="99ACC4D2">
       <w:numFmt w:val="decimal"/>
       <w:lvlText w:val=""/>
       <w:lvlJc w:val="left"/>
     </w:lvl>
-    <w:lvl w:ilvl="3" w:tplc="3F2852E0">
+    <w:lvl w:ilvl="3" w:tplc="4260F2F6">
       <w:numFmt w:val="decimal"/>
       <w:lvlText w:val=""/>
       <w:lvlJc w:val="left"/>
     </w:lvl>
-    <w:lvl w:ilvl="4" w:tplc="D3A26928">
+    <w:lvl w:ilvl="4" w:tplc="8D50D95E">
       <w:numFmt w:val="decimal"/>
       <w:lvlText w:val=""/>
       <w:lvlJc w:val="left"/>
     </w:lvl>
-    <w:lvl w:ilvl="5" w:tplc="A2B8E450">
+    <w:lvl w:ilvl="5" w:tplc="64D01F90">
       <w:numFmt w:val="decimal"/>
       <w:lvlText w:val=""/>
       <w:lvlJc w:val="left"/>
     </w:lvl>
-    <w:lvl w:ilvl="6" w:tplc="93A25ADE">
+    <w:lvl w:ilvl="6" w:tplc="42F883BE">
       <w:numFmt w:val="decimal"/>
       <w:lvlText w:val=""/>
       <w:lvlJc w:val="left"/>
     </w:lvl>
-    <w:lvl w:ilvl="7" w:tplc="5FF6E9C8">
+    <w:lvl w:ilvl="7" w:tplc="749012DC">
       <w:numFmt w:val="decimal"/>
       <w:lvlText w:val=""/>
       <w:lvlJc w:val="left"/>
     </w:lvl>
-    <w:lvl w:ilvl="8" w:tplc="4418C1DA">
+    <w:lvl w:ilvl="8" w:tplc="F95C045A">
       <w:numFmt w:val="decimal"/>
       <w:lvlText w:val=""/>
       <w:lvlJc w:val="left"/>
     </w:lvl>
   </w:abstractNum>
-  <w:abstractNum w:abstractNumId="2" w15:restartNumberingAfterBreak="0">
-    <w:nsid w:val="5EB644C4"/>
-    <w:multiLevelType w:val="hybridMultilevel"/>
-    <w:tmpl w:val="AD7A966C"/>
-    <w:lvl w:ilvl="0" w:tplc="24F077D2">
-      <w:start w:val="1"/>
-      <w:numFmt w:val="bullet"/>
-      <w:lvlText w:val="●"/>
-      <w:lvlJc w:val="left"/>
-      <w:pPr>
-        <w:ind w:left="720" w:hanging="360"/>
-      </w:pPr>
-    </w:lvl>
-    <w:lvl w:ilvl="1" w:tplc="28F2274A">
-      <w:start w:val="1"/>
-      <w:numFmt w:val="bullet"/>
-      <w:lvlText w:val="○"/>
-      <w:lvlJc w:val="left"/>
-      <w:pPr>
-        <w:ind w:left="1440" w:hanging="360"/>
-      </w:pPr>
-    </w:lvl>
-    <w:lvl w:ilvl="2" w:tplc="8598A166">
-      <w:start w:val="1"/>
-      <w:numFmt w:val="bullet"/>
-      <w:lvlText w:val="■"/>
-      <w:lvlJc w:val="left"/>
-      <w:pPr>
-        <w:ind w:left="2160" w:hanging="360"/>
-      </w:pPr>
-    </w:lvl>
-    <w:lvl w:ilvl="3" w:tplc="5712B066">
-      <w:start w:val="1"/>
-      <w:numFmt w:val="bullet"/>
-      <w:lvlText w:val="●"/>
-      <w:lvlJc w:val="left"/>
-      <w:pPr>
-        <w:ind w:left="2880" w:hanging="360"/>
-      </w:pPr>
-    </w:lvl>
-    <w:lvl w:ilvl="4" w:tplc="C180F738">
-      <w:start w:val="1"/>
-      <w:numFmt w:val="bullet"/>
-      <w:lvlText w:val="○"/>
-      <w:lvlJc w:val="left"/>
-      <w:pPr>
-        <w:ind w:left="3600" w:hanging="360"/>
-      </w:pPr>
-    </w:lvl>
-    <w:lvl w:ilvl="5" w:tplc="D04815C0">
-      <w:start w:val="1"/>
-      <w:numFmt w:val="bullet"/>
-      <w:lvlText w:val="■"/>
-      <w:lvlJc w:val="left"/>
-      <w:pPr>
-        <w:ind w:left="4320" w:hanging="360"/>
-      </w:pPr>
-    </w:lvl>
-    <w:lvl w:ilvl="6" w:tplc="A92A2032">
-      <w:start w:val="1"/>
-      <w:numFmt w:val="bullet"/>
-      <w:lvlText w:val="●"/>
-      <w:lvlJc w:val="left"/>
-      <w:pPr>
-        <w:ind w:left="5040" w:hanging="360"/>
-      </w:pPr>
-    </w:lvl>
-    <w:lvl w:ilvl="7" w:tplc="68D65192">
-      <w:start w:val="1"/>
-      <w:numFmt w:val="bullet"/>
-      <w:lvlText w:val="●"/>
-      <w:lvlJc w:val="left"/>
-      <w:pPr>
-        <w:ind w:left="5760" w:hanging="360"/>
-      </w:pPr>
-    </w:lvl>
-    <w:lvl w:ilvl="8" w:tplc="A7B4284C">
-      <w:start w:val="1"/>
-      <w:numFmt w:val="bullet"/>
-      <w:lvlText w:val="●"/>
-      <w:lvlJc w:val="left"/>
-      <w:pPr>
-        <w:ind w:left="6480" w:hanging="360"/>
-      </w:pPr>
-    </w:lvl>
-  </w:abstractNum>
-  <w:num w:numId="1" w16cid:durableId="130287572">
+  <w:num w:numId="1" w16cid:durableId="750615673">
+    <w:abstractNumId w:val="1"/>
+    <w:lvlOverride w:ilvl="0">
+      <w:startOverride w:val="1"/>
+    </w:lvlOverride>
+  </w:num>
+  <w:num w:numId="2" w16cid:durableId="1226723053">
+    <w:abstractNumId w:val="0"/>
+    <w:lvlOverride w:ilvl="0">
+      <w:startOverride w:val="1"/>
+    </w:lvlOverride>
+  </w:num>
+  <w:num w:numId="3" w16cid:durableId="970669113">
     <w:abstractNumId w:val="2"/>
     <w:lvlOverride w:ilvl="0">
       <w:startOverride w:val="1"/>
     </w:lvlOverride>
   </w:num>
-  <w:num w:numId="2" w16cid:durableId="1983348292">
-    <w:abstractNumId w:val="1"/>
-    <w:lvlOverride w:ilvl="0">
-      <w:startOverride w:val="1"/>
-    </w:lvlOverride>
-  </w:num>
-  <w:num w:numId="3" w16cid:durableId="798038849">
+  <w:num w:numId="4" w16cid:durableId="392823363">
     <w:abstractNumId w:val="0"/>
     <w:lvlOverride w:ilvl="0">
       <w:startOverride w:val="1"/>
     </w:lvlOverride>
   </w:num>
-  <w:num w:numId="4" w16cid:durableId="653415309">
-    <w:abstractNumId w:val="1"/>
+  <w:num w:numId="5" w16cid:durableId="55016399">
+    <w:abstractNumId w:val="0"/>
     <w:lvlOverride w:ilvl="0">
       <w:startOverride w:val="1"/>
     </w:lvlOverride>
   </w:num>
-  <w:num w:numId="5" w16cid:durableId="1719159053">
-    <w:abstractNumId w:val="1"/>
+  <w:num w:numId="6" w16cid:durableId="200214350">
+    <w:abstractNumId w:val="0"/>
     <w:lvlOverride w:ilvl="0">
       <w:startOverride w:val="1"/>
     </w:lvlOverride>
   </w:num>
-  <w:num w:numId="6" w16cid:durableId="1560285612">
-    <w:abstractNumId w:val="1"/>
+  <w:num w:numId="7" w16cid:durableId="1357387081">
+    <w:abstractNumId w:val="0"/>
     <w:lvlOverride w:ilvl="0">
       <w:startOverride w:val="1"/>
     </w:lvlOverride>
   </w:num>
-  <w:num w:numId="7" w16cid:durableId="2040621989">
-    <w:abstractNumId w:val="1"/>
+  <w:num w:numId="8" w16cid:durableId="1853370167">
+    <w:abstractNumId w:val="0"/>
     <w:lvlOverride w:ilvl="0">
       <w:startOverride w:val="1"/>
     </w:lvlOverride>
   </w:num>
-  <w:num w:numId="8" w16cid:durableId="191503399">
-    <w:abstractNumId w:val="1"/>
+  <w:num w:numId="9" w16cid:durableId="2025668061">
+    <w:abstractNumId w:val="0"/>
     <w:lvlOverride w:ilvl="0">
       <w:startOverride w:val="1"/>
     </w:lvlOverride>
   </w:num>
-  <w:num w:numId="9" w16cid:durableId="1668360100">
-    <w:abstractNumId w:val="1"/>
+  <w:num w:numId="10" w16cid:durableId="1103841507">
+    <w:abstractNumId w:val="0"/>
     <w:lvlOverride w:ilvl="0">
       <w:startOverride w:val="1"/>
     </w:lvlOverride>
   </w:num>
-  <w:num w:numId="10" w16cid:durableId="1836649018">
-    <w:abstractNumId w:val="1"/>
+  <w:num w:numId="11" w16cid:durableId="1702126535">
+    <w:abstractNumId w:val="0"/>
     <w:lvlOverride w:ilvl="0">
       <w:startOverride w:val="1"/>
     </w:lvlOverride>
   </w:num>
-  <w:num w:numId="11" w16cid:durableId="986976408">
-    <w:abstractNumId w:val="1"/>
+  <w:num w:numId="12" w16cid:durableId="24715560">
+    <w:abstractNumId w:val="0"/>
     <w:lvlOverride w:ilvl="0">
       <w:startOverride w:val="1"/>
     </w:lvlOverride>
   </w:num>
-  <w:num w:numId="12" w16cid:durableId="932012205">
-    <w:abstractNumId w:val="1"/>
+  <w:num w:numId="13" w16cid:durableId="639698407">
+    <w:abstractNumId w:val="0"/>
     <w:lvlOverride w:ilvl="0">
       <w:startOverride w:val="1"/>
     </w:lvlOverride>
   </w:num>
-  <w:num w:numId="13" w16cid:durableId="1318415436">
-    <w:abstractNumId w:val="1"/>
+  <w:num w:numId="14" w16cid:durableId="1603949823">
+    <w:abstractNumId w:val="0"/>
     <w:lvlOverride w:ilvl="0">
       <w:startOverride w:val="1"/>
     </w:lvlOverride>
   </w:num>
-  <w:num w:numId="14" w16cid:durableId="1396586728">
-    <w:abstractNumId w:val="1"/>
+  <w:num w:numId="15" w16cid:durableId="2048606337">
+    <w:abstractNumId w:val="0"/>
     <w:lvlOverride w:ilvl="0">
       <w:startOverride w:val="1"/>
     </w:lvlOverride>
   </w:num>
-  <w:num w:numId="15" w16cid:durableId="1035740490">
-    <w:abstractNumId w:val="1"/>
+  <w:num w:numId="16" w16cid:durableId="867108805">
+    <w:abstractNumId w:val="0"/>
     <w:lvlOverride w:ilvl="0">
       <w:startOverride w:val="1"/>
     </w:lvlOverride>
   </w:num>
-  <w:num w:numId="16" w16cid:durableId="2016301461">
-    <w:abstractNumId w:val="1"/>
-    <w:lvlOverride w:ilvl="0">
-      <w:startOverride w:val="1"/>
-    </w:lvlOverride>
-  </w:num>
-  <w:num w:numId="17" w16cid:durableId="670177171">
-    <w:abstractNumId w:val="1"/>
+  <w:num w:numId="17" w16cid:durableId="676007193">
+    <w:abstractNumId w:val="0"/>
     <w:lvlOverride w:ilvl="0">
       <w:startOverride w:val="1"/>
     </w:lvlOverride>
@@ -11251,7 +11301,7 @@
     <w:autoRedefine/>
     <w:uiPriority w:val="39"/>
     <w:unhideWhenUsed/>
-    <w:rsid w:val="006B610A"/>
+    <w:rsid w:val="00FB7500"/>
     <w:pPr>
       <w:spacing w:after="100"/>
     </w:pPr>
@@ -11263,7 +11313,7 @@
     <w:autoRedefine/>
     <w:uiPriority w:val="39"/>
     <w:unhideWhenUsed/>
-    <w:rsid w:val="006B610A"/>
+    <w:rsid w:val="00FB7500"/>
     <w:pPr>
       <w:spacing w:after="100"/>
       <w:ind w:left="220"/>

</xml_diff>

<commit_message>
Pannello admin: stato del sito (invio foto / download) dal database
- Nuovo riquadro "Stato del sito" in /admin: modalità invio foto o
  download, anno dell'edizione, apertura e chiusura (ora italiana) ed
  edizione da scaricare. Salvato nella tabella site_settings, vale subito.
- Home, Archivio, invio delle foto e script del PDF leggono queste
  impostazioni invece di src/config/current-edition.ts.
- editions.ts ripristinato (un solo elenco, edizione 2026); rimosso il file
  temporaneo di Word e ignorati i file ~$*.
- Guida admin aggiornata (capitoli 4, 5, 6, 7, 11, 12).

Co-Authored-By: Claude Opus 5.5 <noreply@anthropic.com>
</commit_message>
<xml_diff>
--- a/ADMIN_GUIDE.docx
+++ b/ADMIN_GUIDE.docx
@@ -12,7 +12,7 @@
           <w:noProof/>
         </w:rPr>
         <w:drawing>
-          <wp:inline distT="0" distB="0" distL="0" distR="0" wp14:anchorId="1C2D7CF3" wp14:editId="181F25A3">
+          <wp:inline distT="0" distB="0" distL="0" distR="0" wp14:anchorId="6396ADF5" wp14:editId="269C8066">
             <wp:extent cx="1809750" cy="1809750"/>
             <wp:effectExtent l="0" t="0" r="0" b="0"/>
             <wp:docPr id="1" name="Immagine 1"/>
@@ -134,7 +134,7 @@
     <w:sdt>
       <w:sdtPr>
         <w:alias w:val="Indice"/>
-        <w:id w:val="1985432386"/>
+        <w:id w:val="-1223983555"/>
       </w:sdtPr>
       <w:sdtEndPr/>
       <w:sdtContent>
@@ -162,7 +162,7 @@
           <w:r>
             <w:fldChar w:fldCharType="separate"/>
           </w:r>
-          <w:hyperlink w:anchor="_Toc241915699" w:history="1">
+          <w:hyperlink w:anchor="_Toc243217756" w:history="1">
             <w:r>
               <w:rPr>
                 <w:rStyle w:val="Collegamentoipertestuale"/>
@@ -186,7 +186,7 @@
               <w:rPr>
                 <w:noProof/>
               </w:rPr>
-              <w:instrText xml:space="preserve"> PAGEREF _Toc241915699 \h </w:instrText>
+              <w:instrText xml:space="preserve"> PAGEREF _Toc243217756 \h </w:instrText>
             </w:r>
             <w:r>
               <w:rPr>
@@ -228,7 +228,7 @@
               <w14:ligatures w14:val="standardContextual"/>
             </w:rPr>
           </w:pPr>
-          <w:hyperlink w:anchor="_Toc241915700" w:history="1">
+          <w:hyperlink w:anchor="_Toc243217757" w:history="1">
             <w:r>
               <w:rPr>
                 <w:rStyle w:val="Collegamentoipertestuale"/>
@@ -252,7 +252,7 @@
               <w:rPr>
                 <w:noProof/>
               </w:rPr>
-              <w:instrText xml:space="preserve"> PAGEREF _Toc241915700 \h </w:instrText>
+              <w:instrText xml:space="preserve"> PAGEREF _Toc243217757 \h </w:instrText>
             </w:r>
             <w:r>
               <w:rPr>
@@ -294,7 +294,7 @@
               <w14:ligatures w14:val="standardContextual"/>
             </w:rPr>
           </w:pPr>
-          <w:hyperlink w:anchor="_Toc241915701" w:history="1">
+          <w:hyperlink w:anchor="_Toc243217758" w:history="1">
             <w:r>
               <w:rPr>
                 <w:rStyle w:val="Collegamentoipertestuale"/>
@@ -318,7 +318,7 @@
               <w:rPr>
                 <w:noProof/>
               </w:rPr>
-              <w:instrText xml:space="preserve"> PAGEREF _Toc241915701 \h </w:instrText>
+              <w:instrText xml:space="preserve"> PAGEREF _Toc243217758 \h </w:instrText>
             </w:r>
             <w:r>
               <w:rPr>
@@ -360,7 +360,7 @@
               <w14:ligatures w14:val="standardContextual"/>
             </w:rPr>
           </w:pPr>
-          <w:hyperlink w:anchor="_Toc241915702" w:history="1">
+          <w:hyperlink w:anchor="_Toc243217759" w:history="1">
             <w:r>
               <w:rPr>
                 <w:rStyle w:val="Collegamentoipertestuale"/>
@@ -384,7 +384,7 @@
               <w:rPr>
                 <w:noProof/>
               </w:rPr>
-              <w:instrText xml:space="preserve"> PAGEREF _Toc241915702 \h </w:instrText>
+              <w:instrText xml:space="preserve"> PAGEREF _Toc243217759 \h </w:instrText>
             </w:r>
             <w:r>
               <w:rPr>
@@ -426,7 +426,7 @@
               <w14:ligatures w14:val="standardContextual"/>
             </w:rPr>
           </w:pPr>
-          <w:hyperlink w:anchor="_Toc241915703" w:history="1">
+          <w:hyperlink w:anchor="_Toc243217760" w:history="1">
             <w:r>
               <w:rPr>
                 <w:rStyle w:val="Collegamentoipertestuale"/>
@@ -450,7 +450,7 @@
               <w:rPr>
                 <w:noProof/>
               </w:rPr>
-              <w:instrText xml:space="preserve"> PAGEREF _Toc241915703 \h </w:instrText>
+              <w:instrText xml:space="preserve"> PAGEREF _Toc243217760 \h </w:instrText>
             </w:r>
             <w:r>
               <w:rPr>
@@ -492,7 +492,7 @@
               <w14:ligatures w14:val="standardContextual"/>
             </w:rPr>
           </w:pPr>
-          <w:hyperlink w:anchor="_Toc241915704" w:history="1">
+          <w:hyperlink w:anchor="_Toc243217761" w:history="1">
             <w:r>
               <w:rPr>
                 <w:rStyle w:val="Collegamentoipertestuale"/>
@@ -516,7 +516,7 @@
               <w:rPr>
                 <w:noProof/>
               </w:rPr>
-              <w:instrText xml:space="preserve"> PAGEREF _Toc241915704 \h </w:instrText>
+              <w:instrText xml:space="preserve"> PAGEREF _Toc243217761 \h </w:instrText>
             </w:r>
             <w:r>
               <w:rPr>
@@ -558,7 +558,7 @@
               <w14:ligatures w14:val="standardContextual"/>
             </w:rPr>
           </w:pPr>
-          <w:hyperlink w:anchor="_Toc241915705" w:history="1">
+          <w:hyperlink w:anchor="_Toc243217762" w:history="1">
             <w:r>
               <w:rPr>
                 <w:rStyle w:val="Collegamentoipertestuale"/>
@@ -582,7 +582,7 @@
               <w:rPr>
                 <w:noProof/>
               </w:rPr>
-              <w:instrText xml:space="preserve"> PAGEREF _Toc241915705 \h </w:instrText>
+              <w:instrText xml:space="preserve"> PAGEREF _Toc243217762 \h </w:instrText>
             </w:r>
             <w:r>
               <w:rPr>
@@ -624,7 +624,7 @@
               <w14:ligatures w14:val="standardContextual"/>
             </w:rPr>
           </w:pPr>
-          <w:hyperlink w:anchor="_Toc241915706" w:history="1">
+          <w:hyperlink w:anchor="_Toc243217763" w:history="1">
             <w:r>
               <w:rPr>
                 <w:rStyle w:val="Collegamentoipertestuale"/>
@@ -648,7 +648,7 @@
               <w:rPr>
                 <w:noProof/>
               </w:rPr>
-              <w:instrText xml:space="preserve"> PAGEREF _Toc241915706 \h </w:instrText>
+              <w:instrText xml:space="preserve"> PAGEREF _Toc243217763 \h </w:instrText>
             </w:r>
             <w:r>
               <w:rPr>
@@ -690,7 +690,7 @@
               <w14:ligatures w14:val="standardContextual"/>
             </w:rPr>
           </w:pPr>
-          <w:hyperlink w:anchor="_Toc241915707" w:history="1">
+          <w:hyperlink w:anchor="_Toc243217764" w:history="1">
             <w:r>
               <w:rPr>
                 <w:rStyle w:val="Collegamentoipertestuale"/>
@@ -714,7 +714,7 @@
               <w:rPr>
                 <w:noProof/>
               </w:rPr>
-              <w:instrText xml:space="preserve"> PAGEREF _Toc241915707 \h </w:instrText>
+              <w:instrText xml:space="preserve"> PAGEREF _Toc243217764 \h </w:instrText>
             </w:r>
             <w:r>
               <w:rPr>
@@ -756,7 +756,7 @@
               <w14:ligatures w14:val="standardContextual"/>
             </w:rPr>
           </w:pPr>
-          <w:hyperlink w:anchor="_Toc241915708" w:history="1">
+          <w:hyperlink w:anchor="_Toc243217765" w:history="1">
             <w:r>
               <w:rPr>
                 <w:rStyle w:val="Collegamentoipertestuale"/>
@@ -780,7 +780,7 @@
               <w:rPr>
                 <w:noProof/>
               </w:rPr>
-              <w:instrText xml:space="preserve"> PAGEREF _Toc241915708 \h </w:instrText>
+              <w:instrText xml:space="preserve"> PAGEREF _Toc243217765 \h </w:instrText>
             </w:r>
             <w:r>
               <w:rPr>
@@ -822,13 +822,13 @@
               <w14:ligatures w14:val="standardContextual"/>
             </w:rPr>
           </w:pPr>
-          <w:hyperlink w:anchor="_Toc241915709" w:history="1">
+          <w:hyperlink w:anchor="_Toc243217766" w:history="1">
             <w:r>
               <w:rPr>
                 <w:rStyle w:val="Collegamentoipertestuale"/>
                 <w:noProof/>
               </w:rPr>
-              <w:t>4. Approvare ed eliminare le foto (pannello di moderazione)</w:t>
+              <w:t>4. Il pannello admin: stato del sito e moderazione</w:t>
             </w:r>
             <w:r>
               <w:rPr>
@@ -846,7 +846,7 @@
               <w:rPr>
                 <w:noProof/>
               </w:rPr>
-              <w:instrText xml:space="preserve"> PAGEREF _Toc241915709 \h </w:instrText>
+              <w:instrText xml:space="preserve"> PAGEREF _Toc243217766 \h </w:instrText>
             </w:r>
             <w:r>
               <w:rPr>
@@ -888,7 +888,7 @@
               <w14:ligatures w14:val="standardContextual"/>
             </w:rPr>
           </w:pPr>
-          <w:hyperlink w:anchor="_Toc241915710" w:history="1">
+          <w:hyperlink w:anchor="_Toc243217767" w:history="1">
             <w:r>
               <w:rPr>
                 <w:rStyle w:val="Collegamentoipertestuale"/>
@@ -912,7 +912,7 @@
               <w:rPr>
                 <w:noProof/>
               </w:rPr>
-              <w:instrText xml:space="preserve"> PAGEREF _Toc241915710 \h </w:instrText>
+              <w:instrText xml:space="preserve"> PAGEREF _Toc243217767 \h </w:instrText>
             </w:r>
             <w:r>
               <w:rPr>
@@ -954,7 +954,7 @@
               <w14:ligatures w14:val="standardContextual"/>
             </w:rPr>
           </w:pPr>
-          <w:hyperlink w:anchor="_Toc241915711" w:history="1">
+          <w:hyperlink w:anchor="_Toc243217768" w:history="1">
             <w:r>
               <w:rPr>
                 <w:rStyle w:val="Collegamentoipertestuale"/>
@@ -978,7 +978,7 @@
               <w:rPr>
                 <w:noProof/>
               </w:rPr>
-              <w:instrText xml:space="preserve"> PAGEREF _Toc241915711 \h </w:instrText>
+              <w:instrText xml:space="preserve"> PAGEREF _Toc243217768 \h </w:instrText>
             </w:r>
             <w:r>
               <w:rPr>
@@ -1020,7 +1020,7 @@
               <w14:ligatures w14:val="standardContextual"/>
             </w:rPr>
           </w:pPr>
-          <w:hyperlink w:anchor="_Toc241915712" w:history="1">
+          <w:hyperlink w:anchor="_Toc243217769" w:history="1">
             <w:r>
               <w:rPr>
                 <w:rStyle w:val="Collegamentoipertestuale"/>
@@ -1044,7 +1044,7 @@
               <w:rPr>
                 <w:noProof/>
               </w:rPr>
-              <w:instrText xml:space="preserve"> PAGEREF _Toc241915712 \h </w:instrText>
+              <w:instrText xml:space="preserve"> PAGEREF _Toc243217769 \h </w:instrText>
             </w:r>
             <w:r>
               <w:rPr>
@@ -1086,7 +1086,7 @@
               <w14:ligatures w14:val="standardContextual"/>
             </w:rPr>
           </w:pPr>
-          <w:hyperlink w:anchor="_Toc241915713" w:history="1">
+          <w:hyperlink w:anchor="_Toc243217770" w:history="1">
             <w:r>
               <w:rPr>
                 <w:rStyle w:val="Collegamentoipertestuale"/>
@@ -1110,7 +1110,7 @@
               <w:rPr>
                 <w:noProof/>
               </w:rPr>
-              <w:instrText xml:space="preserve"> PAGEREF _Toc241915713 \h </w:instrText>
+              <w:instrText xml:space="preserve"> PAGEREF _Toc243217770 \h </w:instrText>
             </w:r>
             <w:r>
               <w:rPr>
@@ -1152,7 +1152,7 @@
               <w14:ligatures w14:val="standardContextual"/>
             </w:rPr>
           </w:pPr>
-          <w:hyperlink w:anchor="_Toc241915714" w:history="1">
+          <w:hyperlink w:anchor="_Toc243217771" w:history="1">
             <w:r>
               <w:rPr>
                 <w:rStyle w:val="Collegamentoipertestuale"/>
@@ -1176,7 +1176,7 @@
               <w:rPr>
                 <w:noProof/>
               </w:rPr>
-              <w:instrText xml:space="preserve"> PAGEREF _Toc241915714 \h </w:instrText>
+              <w:instrText xml:space="preserve"> PAGEREF _Toc243217771 \h </w:instrText>
             </w:r>
             <w:r>
               <w:rPr>
@@ -1193,7 +1193,7 @@
               <w:rPr>
                 <w:noProof/>
               </w:rPr>
-              <w:t>7</w:t>
+              <w:t>8</w:t>
             </w:r>
             <w:r>
               <w:rPr>
@@ -1218,7 +1218,7 @@
               <w14:ligatures w14:val="standardContextual"/>
             </w:rPr>
           </w:pPr>
-          <w:hyperlink w:anchor="_Toc241915715" w:history="1">
+          <w:hyperlink w:anchor="_Toc243217772" w:history="1">
             <w:r>
               <w:rPr>
                 <w:rStyle w:val="Collegamentoipertestuale"/>
@@ -1242,7 +1242,7 @@
               <w:rPr>
                 <w:noProof/>
               </w:rPr>
-              <w:instrText xml:space="preserve"> PAGEREF _Toc241915715 \h </w:instrText>
+              <w:instrText xml:space="preserve"> PAGEREF _Toc243217772 \h </w:instrText>
             </w:r>
             <w:r>
               <w:rPr>
@@ -1284,7 +1284,7 @@
               <w14:ligatures w14:val="standardContextual"/>
             </w:rPr>
           </w:pPr>
-          <w:hyperlink w:anchor="_Toc241915716" w:history="1">
+          <w:hyperlink w:anchor="_Toc243217773" w:history="1">
             <w:r>
               <w:rPr>
                 <w:rStyle w:val="Collegamentoipertestuale"/>
@@ -1308,7 +1308,7 @@
               <w:rPr>
                 <w:noProof/>
               </w:rPr>
-              <w:instrText xml:space="preserve"> PAGEREF _Toc241915716 \h </w:instrText>
+              <w:instrText xml:space="preserve"> PAGEREF _Toc243217773 \h </w:instrText>
             </w:r>
             <w:r>
               <w:rPr>
@@ -1350,13 +1350,13 @@
               <w14:ligatures w14:val="standardContextual"/>
             </w:rPr>
           </w:pPr>
-          <w:hyperlink w:anchor="_Toc241915717" w:history="1">
+          <w:hyperlink w:anchor="_Toc243217774" w:history="1">
             <w:r>
               <w:rPr>
                 <w:rStyle w:val="Collegamentoipertestuale"/>
                 <w:noProof/>
               </w:rPr>
-              <w:t>Cambiare anno e date</w:t>
+              <w:t>Invio foto: raccogliere le foto per l'annuario</w:t>
             </w:r>
             <w:r>
               <w:rPr>
@@ -1374,7 +1374,7 @@
               <w:rPr>
                 <w:noProof/>
               </w:rPr>
-              <w:instrText xml:space="preserve"> PAGEREF _Toc241915717 \h </w:instrText>
+              <w:instrText xml:space="preserve"> PAGEREF _Toc243217774 \h </w:instrText>
             </w:r>
             <w:r>
               <w:rPr>
@@ -1416,13 +1416,13 @@
               <w14:ligatures w14:val="standardContextual"/>
             </w:rPr>
           </w:pPr>
-          <w:hyperlink w:anchor="_Toc241915718" w:history="1">
+          <w:hyperlink w:anchor="_Toc243217775" w:history="1">
             <w:r>
               <w:rPr>
                 <w:rStyle w:val="Collegamentoipertestuale"/>
                 <w:noProof/>
               </w:rPr>
-              <w:t>Aprire o chiudere a mano, senza toccare le date</w:t>
+              <w:t>Scarica edizione: invii chiusi</w:t>
             </w:r>
             <w:r>
               <w:rPr>
@@ -1440,7 +1440,7 @@
               <w:rPr>
                 <w:noProof/>
               </w:rPr>
-              <w:instrText xml:space="preserve"> PAGEREF _Toc241915718 \h </w:instrText>
+              <w:instrText xml:space="preserve"> PAGEREF _Toc243217775 \h </w:instrText>
             </w:r>
             <w:r>
               <w:rPr>
@@ -1482,7 +1482,7 @@
               <w14:ligatures w14:val="standardContextual"/>
             </w:rPr>
           </w:pPr>
-          <w:hyperlink w:anchor="_Toc241915719" w:history="1">
+          <w:hyperlink w:anchor="_Toc243217776" w:history="1">
             <w:r>
               <w:rPr>
                 <w:rStyle w:val="Collegamentoipertestuale"/>
@@ -1506,7 +1506,7 @@
               <w:rPr>
                 <w:noProof/>
               </w:rPr>
-              <w:instrText xml:space="preserve"> PAGEREF _Toc241915719 \h </w:instrText>
+              <w:instrText xml:space="preserve"> PAGEREF _Toc243217776 \h </w:instrText>
             </w:r>
             <w:r>
               <w:rPr>
@@ -1548,7 +1548,7 @@
               <w14:ligatures w14:val="standardContextual"/>
             </w:rPr>
           </w:pPr>
-          <w:hyperlink w:anchor="_Toc241915720" w:history="1">
+          <w:hyperlink w:anchor="_Toc243217777" w:history="1">
             <w:r>
               <w:rPr>
                 <w:rStyle w:val="Collegamentoipertestuale"/>
@@ -1572,7 +1572,7 @@
               <w:rPr>
                 <w:noProof/>
               </w:rPr>
-              <w:instrText xml:space="preserve"> PAGEREF _Toc241915720 \h </w:instrText>
+              <w:instrText xml:space="preserve"> PAGEREF _Toc243217777 \h </w:instrText>
             </w:r>
             <w:r>
               <w:rPr>
@@ -1614,7 +1614,7 @@
               <w14:ligatures w14:val="standardContextual"/>
             </w:rPr>
           </w:pPr>
-          <w:hyperlink w:anchor="_Toc241915721" w:history="1">
+          <w:hyperlink w:anchor="_Toc243217778" w:history="1">
             <w:r>
               <w:rPr>
                 <w:rStyle w:val="Collegamentoipertestuale"/>
@@ -1638,7 +1638,7 @@
               <w:rPr>
                 <w:noProof/>
               </w:rPr>
-              <w:instrText xml:space="preserve"> PAGEREF _Toc241915721 \h </w:instrText>
+              <w:instrText xml:space="preserve"> PAGEREF _Toc243217778 \h </w:instrText>
             </w:r>
             <w:r>
               <w:rPr>
@@ -1680,7 +1680,7 @@
               <w14:ligatures w14:val="standardContextual"/>
             </w:rPr>
           </w:pPr>
-          <w:hyperlink w:anchor="_Toc241915722" w:history="1">
+          <w:hyperlink w:anchor="_Toc243217779" w:history="1">
             <w:r>
               <w:rPr>
                 <w:rStyle w:val="Collegamentoipertestuale"/>
@@ -1704,7 +1704,7 @@
               <w:rPr>
                 <w:noProof/>
               </w:rPr>
-              <w:instrText xml:space="preserve"> PAGEREF _Toc241915722 \h </w:instrText>
+              <w:instrText xml:space="preserve"> PAGEREF _Toc243217779 \h </w:instrText>
             </w:r>
             <w:r>
               <w:rPr>
@@ -1746,7 +1746,7 @@
               <w14:ligatures w14:val="standardContextual"/>
             </w:rPr>
           </w:pPr>
-          <w:hyperlink w:anchor="_Toc241915723" w:history="1">
+          <w:hyperlink w:anchor="_Toc243217780" w:history="1">
             <w:r>
               <w:rPr>
                 <w:rStyle w:val="Collegamentoipertestuale"/>
@@ -1770,7 +1770,7 @@
               <w:rPr>
                 <w:noProof/>
               </w:rPr>
-              <w:instrText xml:space="preserve"> PAGEREF _Toc241915723 \h </w:instrText>
+              <w:instrText xml:space="preserve"> PAGEREF _Toc243217780 \h </w:instrText>
             </w:r>
             <w:r>
               <w:rPr>
@@ -1812,7 +1812,7 @@
               <w14:ligatures w14:val="standardContextual"/>
             </w:rPr>
           </w:pPr>
-          <w:hyperlink w:anchor="_Toc241915724" w:history="1">
+          <w:hyperlink w:anchor="_Toc243217781" w:history="1">
             <w:r>
               <w:rPr>
                 <w:rStyle w:val="Collegamentoipertestuale"/>
@@ -1836,7 +1836,7 @@
               <w:rPr>
                 <w:noProof/>
               </w:rPr>
-              <w:instrText xml:space="preserve"> PAGEREF _Toc241915724 \h </w:instrText>
+              <w:instrText xml:space="preserve"> PAGEREF _Toc243217781 \h </w:instrText>
             </w:r>
             <w:r>
               <w:rPr>
@@ -1878,7 +1878,7 @@
               <w14:ligatures w14:val="standardContextual"/>
             </w:rPr>
           </w:pPr>
-          <w:hyperlink w:anchor="_Toc241915725" w:history="1">
+          <w:hyperlink w:anchor="_Toc243217782" w:history="1">
             <w:r>
               <w:rPr>
                 <w:rStyle w:val="Collegamentoipertestuale"/>
@@ -1902,7 +1902,7 @@
               <w:rPr>
                 <w:noProof/>
               </w:rPr>
-              <w:instrText xml:space="preserve"> PAGEREF _Toc241915725 \h </w:instrText>
+              <w:instrText xml:space="preserve"> PAGEREF _Toc243217782 \h </w:instrText>
             </w:r>
             <w:r>
               <w:rPr>
@@ -1944,7 +1944,7 @@
               <w14:ligatures w14:val="standardContextual"/>
             </w:rPr>
           </w:pPr>
-          <w:hyperlink w:anchor="_Toc241915726" w:history="1">
+          <w:hyperlink w:anchor="_Toc243217783" w:history="1">
             <w:r>
               <w:rPr>
                 <w:rStyle w:val="Collegamentoipertestuale"/>
@@ -1968,7 +1968,7 @@
               <w:rPr>
                 <w:noProof/>
               </w:rPr>
-              <w:instrText xml:space="preserve"> PAGEREF _Toc241915726 \h </w:instrText>
+              <w:instrText xml:space="preserve"> PAGEREF _Toc243217783 \h </w:instrText>
             </w:r>
             <w:r>
               <w:rPr>
@@ -2010,7 +2010,7 @@
               <w14:ligatures w14:val="standardContextual"/>
             </w:rPr>
           </w:pPr>
-          <w:hyperlink w:anchor="_Toc241915727" w:history="1">
+          <w:hyperlink w:anchor="_Toc243217784" w:history="1">
             <w:r>
               <w:rPr>
                 <w:rStyle w:val="Collegamentoipertestuale"/>
@@ -2034,7 +2034,7 @@
               <w:rPr>
                 <w:noProof/>
               </w:rPr>
-              <w:instrText xml:space="preserve"> PAGEREF _Toc241915727 \h </w:instrText>
+              <w:instrText xml:space="preserve"> PAGEREF _Toc243217784 \h </w:instrText>
             </w:r>
             <w:r>
               <w:rPr>
@@ -2076,7 +2076,7 @@
               <w14:ligatures w14:val="standardContextual"/>
             </w:rPr>
           </w:pPr>
-          <w:hyperlink w:anchor="_Toc241915728" w:history="1">
+          <w:hyperlink w:anchor="_Toc243217785" w:history="1">
             <w:r>
               <w:rPr>
                 <w:rStyle w:val="Collegamentoipertestuale"/>
@@ -2100,7 +2100,7 @@
               <w:rPr>
                 <w:noProof/>
               </w:rPr>
-              <w:instrText xml:space="preserve"> PAGEREF _Toc241915728 \h </w:instrText>
+              <w:instrText xml:space="preserve"> PAGEREF _Toc243217785 \h </w:instrText>
             </w:r>
             <w:r>
               <w:rPr>
@@ -2142,7 +2142,7 @@
               <w14:ligatures w14:val="standardContextual"/>
             </w:rPr>
           </w:pPr>
-          <w:hyperlink w:anchor="_Toc241915729" w:history="1">
+          <w:hyperlink w:anchor="_Toc243217786" w:history="1">
             <w:r>
               <w:rPr>
                 <w:rStyle w:val="Collegamentoipertestuale"/>
@@ -2166,7 +2166,7 @@
               <w:rPr>
                 <w:noProof/>
               </w:rPr>
-              <w:instrText xml:space="preserve"> PAGEREF _Toc241915729 \h </w:instrText>
+              <w:instrText xml:space="preserve"> PAGEREF _Toc243217786 \h </w:instrText>
             </w:r>
             <w:r>
               <w:rPr>
@@ -2208,7 +2208,7 @@
               <w14:ligatures w14:val="standardContextual"/>
             </w:rPr>
           </w:pPr>
-          <w:hyperlink w:anchor="_Toc241915730" w:history="1">
+          <w:hyperlink w:anchor="_Toc243217787" w:history="1">
             <w:r>
               <w:rPr>
                 <w:rStyle w:val="Collegamentoipertestuale"/>
@@ -2232,7 +2232,7 @@
               <w:rPr>
                 <w:noProof/>
               </w:rPr>
-              <w:instrText xml:space="preserve"> PAGEREF _Toc241915730 \h </w:instrText>
+              <w:instrText xml:space="preserve"> PAGEREF _Toc243217787 \h </w:instrText>
             </w:r>
             <w:r>
               <w:rPr>
@@ -2274,7 +2274,7 @@
               <w14:ligatures w14:val="standardContextual"/>
             </w:rPr>
           </w:pPr>
-          <w:hyperlink w:anchor="_Toc241915731" w:history="1">
+          <w:hyperlink w:anchor="_Toc243217788" w:history="1">
             <w:r>
               <w:rPr>
                 <w:rStyle w:val="Collegamentoipertestuale"/>
@@ -2298,7 +2298,7 @@
               <w:rPr>
                 <w:noProof/>
               </w:rPr>
-              <w:instrText xml:space="preserve"> PAGEREF _Toc241915731 \h </w:instrText>
+              <w:instrText xml:space="preserve"> PAGEREF _Toc243217788 \h </w:instrText>
             </w:r>
             <w:r>
               <w:rPr>
@@ -2340,7 +2340,7 @@
               <w14:ligatures w14:val="standardContextual"/>
             </w:rPr>
           </w:pPr>
-          <w:hyperlink w:anchor="_Toc241915732" w:history="1">
+          <w:hyperlink w:anchor="_Toc243217789" w:history="1">
             <w:r>
               <w:rPr>
                 <w:rStyle w:val="Collegamentoipertestuale"/>
@@ -2364,7 +2364,7 @@
               <w:rPr>
                 <w:noProof/>
               </w:rPr>
-              <w:instrText xml:space="preserve"> PAGEREF _Toc241915732 \h </w:instrText>
+              <w:instrText xml:space="preserve"> PAGEREF _Toc243217789 \h </w:instrText>
             </w:r>
             <w:r>
               <w:rPr>
@@ -2406,7 +2406,7 @@
               <w14:ligatures w14:val="standardContextual"/>
             </w:rPr>
           </w:pPr>
-          <w:hyperlink w:anchor="_Toc241915733" w:history="1">
+          <w:hyperlink w:anchor="_Toc243217790" w:history="1">
             <w:r>
               <w:rPr>
                 <w:rStyle w:val="Collegamentoipertestuale"/>
@@ -2430,7 +2430,7 @@
               <w:rPr>
                 <w:noProof/>
               </w:rPr>
-              <w:instrText xml:space="preserve"> PAGEREF _Toc241915733 \h </w:instrText>
+              <w:instrText xml:space="preserve"> PAGEREF _Toc243217790 \h </w:instrText>
             </w:r>
             <w:r>
               <w:rPr>
@@ -2469,7 +2469,7 @@
         <w:pStyle w:val="Titolo1"/>
         <w:pageBreakBefore/>
       </w:pPr>
-      <w:bookmarkStart w:id="0" w:name="_Toc241915699"/>
+      <w:bookmarkStart w:id="0" w:name="_Toc243217756"/>
       <w:r>
         <w:lastRenderedPageBreak/>
         <w:t>1. Come è fatto il sito</w:t>
@@ -2509,7 +2509,7 @@
           <w:left w:w="10" w:type="dxa"/>
           <w:right w:w="10" w:type="dxa"/>
         </w:tblCellMar>
-        <w:tblLook w:val="04A0" w:firstRow="1" w:lastRow="0" w:firstColumn="1" w:lastColumn="0" w:noHBand="0" w:noVBand="1"/>
+        <w:tblLook w:val="0000" w:firstRow="0" w:lastRow="0" w:firstColumn="0" w:lastColumn="0" w:noHBand="0" w:noVBand="0"/>
       </w:tblPr>
       <w:tblGrid>
         <w:gridCol w:w="1700"/>
@@ -3110,7 +3110,7 @@
       <w:pPr>
         <w:pStyle w:val="Titolo2"/>
       </w:pPr>
-      <w:bookmarkStart w:id="1" w:name="_Toc241915700"/>
+      <w:bookmarkStart w:id="1" w:name="_Toc243217757"/>
       <w:r>
         <w:t>Il giro di una foto</w:t>
       </w:r>
@@ -3214,7 +3214,7 @@
       <w:pPr>
         <w:pStyle w:val="Titolo2"/>
       </w:pPr>
-      <w:bookmarkStart w:id="2" w:name="_Toc241915701"/>
+      <w:bookmarkStart w:id="2" w:name="_Toc243217758"/>
       <w:r>
         <w:t>Parole che incontrerai</w:t>
       </w:r>
@@ -3235,7 +3235,7 @@
           <w:left w:w="10" w:type="dxa"/>
           <w:right w:w="10" w:type="dxa"/>
         </w:tblCellMar>
-        <w:tblLook w:val="04A0" w:firstRow="1" w:lastRow="0" w:firstColumn="1" w:lastColumn="0" w:noHBand="0" w:noVBand="1"/>
+        <w:tblLook w:val="0000" w:firstRow="0" w:lastRow="0" w:firstColumn="0" w:lastColumn="0" w:noHBand="0" w:noVBand="0"/>
       </w:tblPr>
       <w:tblGrid>
         <w:gridCol w:w="2600"/>
@@ -3833,7 +3833,7 @@
         <w:pStyle w:val="Titolo1"/>
         <w:pageBreakBefore/>
       </w:pPr>
-      <w:bookmarkStart w:id="3" w:name="_Toc241915702"/>
+      <w:bookmarkStart w:id="3" w:name="_Toc243217759"/>
       <w:r>
         <w:lastRenderedPageBreak/>
         <w:t>2. Preparare il computer (una volta sola)</w:t>
@@ -3862,7 +3862,7 @@
       <w:pPr>
         <w:pStyle w:val="Titolo2"/>
       </w:pPr>
-      <w:bookmarkStart w:id="4" w:name="_Toc241915703"/>
+      <w:bookmarkStart w:id="4" w:name="_Toc243217760"/>
       <w:r>
         <w:t>Programmi da installare</w:t>
       </w:r>
@@ -3977,7 +3977,7 @@
       <w:pPr>
         <w:pStyle w:val="Titolo2"/>
       </w:pPr>
-      <w:bookmarkStart w:id="5" w:name="_Toc241915704"/>
+      <w:bookmarkStart w:id="5" w:name="_Toc243217761"/>
       <w:r>
         <w:t>Aprire il terminale nella cartella del progetto</w:t>
       </w:r>
@@ -4069,7 +4069,7 @@
       <w:pPr>
         <w:pStyle w:val="Titolo2"/>
       </w:pPr>
-      <w:bookmarkStart w:id="6" w:name="_Toc241915705"/>
+      <w:bookmarkStart w:id="6" w:name="_Toc243217762"/>
       <w:r>
         <w:t>La prima volta dopo aver scaricato il progetto</w:t>
       </w:r>
@@ -4114,7 +4114,7 @@
       <w:pPr>
         <w:pStyle w:val="Titolo2"/>
       </w:pPr>
-      <w:bookmarkStart w:id="7" w:name="_Toc241915706"/>
+      <w:bookmarkStart w:id="7" w:name="_Toc243217763"/>
       <w:r>
         <w:t>Il file segreto .env.local</w:t>
       </w:r>
@@ -4144,7 +4144,7 @@
         <w:pStyle w:val="Titolo1"/>
         <w:pageBreakBefore/>
       </w:pPr>
-      <w:bookmarkStart w:id="8" w:name="_Toc241915707"/>
+      <w:bookmarkStart w:id="8" w:name="_Toc243217764"/>
       <w:r>
         <w:lastRenderedPageBreak/>
         <w:t>3. Pubblicare una modifica sul sito online</w:t>
@@ -4281,7 +4281,7 @@
       <w:pPr>
         <w:pStyle w:val="Titolo2"/>
       </w:pPr>
-      <w:bookmarkStart w:id="9" w:name="_Toc241915708"/>
+      <w:bookmarkStart w:id="9" w:name="_Toc243217765"/>
       <w:r>
         <w:t>Controllare che sia andato tutto bene</w:t>
       </w:r>
@@ -4433,10 +4433,10 @@
         <w:pStyle w:val="Titolo1"/>
         <w:pageBreakBefore/>
       </w:pPr>
-      <w:bookmarkStart w:id="10" w:name="_Toc241915709"/>
+      <w:bookmarkStart w:id="10" w:name="_Toc243217766"/>
       <w:r>
         <w:lastRenderedPageBreak/>
-        <w:t>4. Approvare ed eliminare le foto (pannello di moderazione)</w:t>
+        <w:t>4. Il pannello admin: stato del sito e moderazione</w:t>
       </w:r>
       <w:bookmarkEnd w:id="10"/>
     </w:p>
@@ -4462,7 +4462,7 @@
       <w:pPr>
         <w:pStyle w:val="Titolo2"/>
       </w:pPr>
-      <w:bookmarkStart w:id="11" w:name="_Toc241915710"/>
+      <w:bookmarkStart w:id="11" w:name="_Toc243217767"/>
       <w:r>
         <w:t>Entrare nel pannello</w:t>
       </w:r>
@@ -4551,7 +4551,7 @@
       <w:pPr>
         <w:pStyle w:val="Titolo2"/>
       </w:pPr>
-      <w:bookmarkStart w:id="12" w:name="_Toc241915711"/>
+      <w:bookmarkStart w:id="12" w:name="_Toc243217768"/>
       <w:r>
         <w:t>Com'è fatto il pannello</w:t>
       </w:r>
@@ -4567,37 +4567,17 @@
         <w:spacing w:after="60" w:line="290" w:lineRule="auto"/>
       </w:pPr>
       <w:r>
-        <w:t xml:space="preserve">In alto ci sono tre pulsanti: </w:t>
-      </w:r>
-      <w:r>
-        <w:rPr>
-          <w:b/>
-          <w:bCs/>
-        </w:rPr>
-        <w:t>Hall of Fame</w:t>
-      </w:r>
-      <w:r>
-        <w:t xml:space="preserve">, </w:t>
-      </w:r>
-      <w:r>
-        <w:rPr>
-          <w:b/>
-          <w:bCs/>
-        </w:rPr>
-        <w:t>Annuario Storico</w:t>
-      </w:r>
-      <w:r>
-        <w:t xml:space="preserve"> e </w:t>
-      </w:r>
-      <w:r>
-        <w:rPr>
-          <w:b/>
-          <w:bCs/>
-        </w:rPr>
-        <w:t>Archivio (annuario)</w:t>
-      </w:r>
-      <w:r>
-        <w:t>. Il numerino sul pulsante indica quante foto aspettano una tua decisione.</w:t>
+        <w:t xml:space="preserve">In cima c'è il riquadro </w:t>
+      </w:r>
+      <w:r>
+        <w:rPr>
+          <w:b/>
+          <w:bCs/>
+        </w:rPr>
+        <w:t>Stato del sito</w:t>
+      </w:r>
+      <w:r>
+        <w:t>, da cui apri e chiudi gli invii per l'annuario e scegli l'edizione da scaricare (capitolo 5).</w:t>
       </w:r>
     </w:p>
     <w:p>
@@ -4610,27 +4590,47 @@
         <w:spacing w:after="60" w:line="290" w:lineRule="auto"/>
       </w:pPr>
       <w:r>
-        <w:t xml:space="preserve">Sotto ci sono due schede: </w:t>
-      </w:r>
-      <w:r>
-        <w:rPr>
-          <w:b/>
-          <w:bCs/>
-        </w:rPr>
-        <w:t>In attesa</w:t>
-      </w:r>
-      <w:r>
-        <w:t xml:space="preserve"> (da controllare) e </w:t>
-      </w:r>
-      <w:r>
-        <w:rPr>
-          <w:b/>
-          <w:bCs/>
-        </w:rPr>
-        <w:t>Approvate</w:t>
-      </w:r>
-      <w:r>
-        <w:t>.</w:t>
+        <w:t xml:space="preserve">Sotto, in </w:t>
+      </w:r>
+      <w:r>
+        <w:rPr>
+          <w:b/>
+          <w:bCs/>
+        </w:rPr>
+        <w:t>Moderazione delle foto</w:t>
+      </w:r>
+      <w:r>
+        <w:t xml:space="preserve">, ci sono tre pulsanti: </w:t>
+      </w:r>
+      <w:r>
+        <w:rPr>
+          <w:b/>
+          <w:bCs/>
+        </w:rPr>
+        <w:t>Hall of Fame</w:t>
+      </w:r>
+      <w:r>
+        <w:t xml:space="preserve">, </w:t>
+      </w:r>
+      <w:r>
+        <w:rPr>
+          <w:b/>
+          <w:bCs/>
+        </w:rPr>
+        <w:t>Annuario Storico</w:t>
+      </w:r>
+      <w:r>
+        <w:t xml:space="preserve"> e </w:t>
+      </w:r>
+      <w:r>
+        <w:rPr>
+          <w:b/>
+          <w:bCs/>
+        </w:rPr>
+        <w:t>Archivio (annuario)</w:t>
+      </w:r>
+      <w:r>
+        <w:t>. Il numerino sul pulsante indica quante foto aspettano una tua decisione.</w:t>
       </w:r>
     </w:p>
     <w:p>
@@ -4643,6 +4643,39 @@
         <w:spacing w:after="60" w:line="290" w:lineRule="auto"/>
       </w:pPr>
       <w:r>
+        <w:t xml:space="preserve">Sotto ci sono due schede: </w:t>
+      </w:r>
+      <w:r>
+        <w:rPr>
+          <w:b/>
+          <w:bCs/>
+        </w:rPr>
+        <w:t>In attesa</w:t>
+      </w:r>
+      <w:r>
+        <w:t xml:space="preserve"> (da controllare) e </w:t>
+      </w:r>
+      <w:r>
+        <w:rPr>
+          <w:b/>
+          <w:bCs/>
+        </w:rPr>
+        <w:t>Approvate</w:t>
+      </w:r>
+      <w:r>
+        <w:t>.</w:t>
+      </w:r>
+    </w:p>
+    <w:p>
+      <w:pPr>
+        <w:pStyle w:val="Paragrafoelenco"/>
+        <w:numPr>
+          <w:ilvl w:val="0"/>
+          <w:numId w:val="3"/>
+        </w:numPr>
+        <w:spacing w:after="60" w:line="290" w:lineRule="auto"/>
+      </w:pPr>
+      <w:r>
         <w:t>Ogni foto mostra nome, facoltà, frase o didascalia (per l'Archivio) e data di invio. Cliccando sull'immagine la apri a grandezza piena.</w:t>
       </w:r>
     </w:p>
@@ -4650,7 +4683,7 @@
       <w:pPr>
         <w:pStyle w:val="Titolo2"/>
       </w:pPr>
-      <w:bookmarkStart w:id="13" w:name="_Toc241915712"/>
+      <w:bookmarkStart w:id="13" w:name="_Toc243217769"/>
       <w:r>
         <w:t>Cosa fanno i pulsanti</w:t>
       </w:r>
@@ -4671,7 +4704,7 @@
           <w:left w:w="10" w:type="dxa"/>
           <w:right w:w="10" w:type="dxa"/>
         </w:tblCellMar>
-        <w:tblLook w:val="04A0" w:firstRow="1" w:lastRow="0" w:firstColumn="1" w:lastColumn="0" w:noHBand="0" w:noVBand="1"/>
+        <w:tblLook w:val="0000" w:firstRow="0" w:lastRow="0" w:firstColumn="0" w:lastColumn="0" w:noHBand="0" w:noVBand="0"/>
       </w:tblPr>
       <w:tblGrid>
         <w:gridCol w:w="2400"/>
@@ -4953,7 +4986,7 @@
       <w:pPr>
         <w:pStyle w:val="Titolo2"/>
       </w:pPr>
-      <w:bookmarkStart w:id="14" w:name="_Toc241915713"/>
+      <w:bookmarkStart w:id="14" w:name="_Toc243217770"/>
       <w:r>
         <w:t>Cosa controllare prima di approvare</w:t>
       </w:r>
@@ -5015,8 +5048,9 @@
       <w:pPr>
         <w:pStyle w:val="Titolo2"/>
       </w:pPr>
-      <w:bookmarkStart w:id="15" w:name="_Toc241915714"/>
-      <w:r>
+      <w:bookmarkStart w:id="15" w:name="_Toc243217771"/>
+      <w:r>
+        <w:lastRenderedPageBreak/>
         <w:t>Impostare o cambiare la password del pannello</w:t>
       </w:r>
       <w:bookmarkEnd w:id="15"/>
@@ -5026,7 +5060,6 @@
         <w:spacing w:after="120" w:line="290" w:lineRule="auto"/>
       </w:pPr>
       <w:r>
-        <w:lastRenderedPageBreak/>
         <w:t xml:space="preserve">Per sicurezza la password </w:t>
       </w:r>
       <w:r>
@@ -5373,7 +5406,7 @@
       <w:pPr>
         <w:pStyle w:val="Titolo2"/>
       </w:pPr>
-      <w:bookmarkStart w:id="16" w:name="_Toc241915715"/>
+      <w:bookmarkStart w:id="16" w:name="_Toc243217772"/>
       <w:r>
         <w:t>Disconnettere tutti i dispositivi</w:t>
       </w:r>
@@ -5587,7 +5620,7 @@
         <w:pStyle w:val="Titolo1"/>
         <w:pageBreakBefore/>
       </w:pPr>
-      <w:bookmarkStart w:id="17" w:name="_Toc241915716"/>
+      <w:bookmarkStart w:id="17" w:name="_Toc243217773"/>
       <w:r>
         <w:lastRenderedPageBreak/>
         <w:t>5. Aprire e chiudere gli invii per l'annuario</w:t>
@@ -5599,17 +5632,177 @@
         <w:spacing w:after="120" w:line="290" w:lineRule="auto"/>
       </w:pPr>
       <w:r>
-        <w:t xml:space="preserve">Le foto per l'annuario dell'anno si mandano dalla pagina </w:t>
-      </w:r>
-      <w:r>
-        <w:rPr>
-          <w:b/>
-          <w:bCs/>
-        </w:rPr>
-        <w:t>Archivio</w:t>
-      </w:r>
-      <w:r>
-        <w:t>, solo durante il periodo che decidi tu. Quando gli invii sono aperti:</w:t>
+        <w:t xml:space="preserve">Si fa tutto dal </w:t>
+      </w:r>
+      <w:r>
+        <w:rPr>
+          <w:b/>
+          <w:bCs/>
+        </w:rPr>
+        <w:t>pannello admin</w:t>
+      </w:r>
+      <w:r>
+        <w:t xml:space="preserve">, senza modificare file e senza pubblicare nulla: quello che salvi vale </w:t>
+      </w:r>
+      <w:r>
+        <w:rPr>
+          <w:b/>
+          <w:bCs/>
+        </w:rPr>
+        <w:t>subito</w:t>
+      </w:r>
+      <w:r>
+        <w:t xml:space="preserve"> sul sito.</w:t>
+      </w:r>
+    </w:p>
+    <w:p>
+      <w:pPr>
+        <w:pStyle w:val="Paragrafoelenco"/>
+        <w:numPr>
+          <w:ilvl w:val="0"/>
+          <w:numId w:val="10"/>
+        </w:numPr>
+        <w:spacing w:after="80" w:line="290" w:lineRule="auto"/>
+      </w:pPr>
+      <w:r>
+        <w:t xml:space="preserve">Entra nel pannello: </w:t>
+      </w:r>
+      <w:r>
+        <w:rPr>
+          <w:b/>
+          <w:bCs/>
+        </w:rPr>
+        <w:t>annuario-pn.vercel.app/admin</w:t>
+      </w:r>
+      <w:r>
+        <w:t xml:space="preserve"> (capitolo 4).</w:t>
+      </w:r>
+    </w:p>
+    <w:p>
+      <w:pPr>
+        <w:pStyle w:val="Paragrafoelenco"/>
+        <w:numPr>
+          <w:ilvl w:val="0"/>
+          <w:numId w:val="10"/>
+        </w:numPr>
+        <w:spacing w:after="80" w:line="290" w:lineRule="auto"/>
+      </w:pPr>
+      <w:r>
+        <w:t xml:space="preserve">In cima trovi il riquadro </w:t>
+      </w:r>
+      <w:r>
+        <w:rPr>
+          <w:b/>
+          <w:bCs/>
+        </w:rPr>
+        <w:t>Stato del sito</w:t>
+      </w:r>
+      <w:r>
+        <w:t xml:space="preserve">. La riga colorata </w:t>
+      </w:r>
+      <w:r>
+        <w:rPr>
+          <w:b/>
+          <w:bCs/>
+        </w:rPr>
+        <w:t>Adesso</w:t>
+      </w:r>
+      <w:r>
+        <w:t xml:space="preserve"> dice in parole semplici cosa vede in questo momento un visitatore (verde = invii aperti, giallo = invii programmati, grigio = invii chiusi).</w:t>
+      </w:r>
+    </w:p>
+    <w:p>
+      <w:pPr>
+        <w:pStyle w:val="Paragrafoelenco"/>
+        <w:numPr>
+          <w:ilvl w:val="0"/>
+          <w:numId w:val="10"/>
+        </w:numPr>
+        <w:spacing w:after="80" w:line="290" w:lineRule="auto"/>
+      </w:pPr>
+      <w:r>
+        <w:t xml:space="preserve">Scegli cosa deve fare il sito: </w:t>
+      </w:r>
+      <w:r>
+        <w:rPr>
+          <w:b/>
+          <w:bCs/>
+        </w:rPr>
+        <w:t>Invio foto</w:t>
+      </w:r>
+      <w:r>
+        <w:t xml:space="preserve"> oppure </w:t>
+      </w:r>
+      <w:r>
+        <w:rPr>
+          <w:b/>
+          <w:bCs/>
+        </w:rPr>
+        <w:t>Scarica edizione</w:t>
+      </w:r>
+      <w:r>
+        <w:t xml:space="preserve"> (vedi sotto).</w:t>
+      </w:r>
+    </w:p>
+    <w:p>
+      <w:pPr>
+        <w:pStyle w:val="Paragrafoelenco"/>
+        <w:numPr>
+          <w:ilvl w:val="0"/>
+          <w:numId w:val="10"/>
+        </w:numPr>
+        <w:spacing w:after="80" w:line="290" w:lineRule="auto"/>
+      </w:pPr>
+      <w:r>
+        <w:t xml:space="preserve">Premi </w:t>
+      </w:r>
+      <w:r>
+        <w:rPr>
+          <w:b/>
+          <w:bCs/>
+        </w:rPr>
+        <w:t>Salva</w:t>
+      </w:r>
+      <w:r>
+        <w:t xml:space="preserve">. Compare il messaggio </w:t>
+      </w:r>
+      <w:r>
+        <w:rPr>
+          <w:b/>
+          <w:bCs/>
+        </w:rPr>
+        <w:t>Impostazioni salvate</w:t>
+      </w:r>
+      <w:r>
+        <w:t xml:space="preserve"> e la riga Adesso si aggiorna.</w:t>
+      </w:r>
+    </w:p>
+    <w:p>
+      <w:pPr>
+        <w:pStyle w:val="Titolo2"/>
+      </w:pPr>
+      <w:bookmarkStart w:id="18" w:name="_Toc243217774"/>
+      <w:r>
+        <w:t>Invio foto: raccogliere le foto per l'annuario</w:t>
+      </w:r>
+      <w:bookmarkEnd w:id="18"/>
+    </w:p>
+    <w:p>
+      <w:pPr>
+        <w:spacing w:after="120" w:line="290" w:lineRule="auto"/>
+      </w:pPr>
+      <w:r>
+        <w:t xml:space="preserve">Scegli </w:t>
+      </w:r>
+      <w:r>
+        <w:rPr>
+          <w:b/>
+          <w:bCs/>
+        </w:rPr>
+        <w:t>Invio foto</w:t>
+      </w:r>
+      <w:r>
+        <w:t xml:space="preserve"> e compila:</w:t>
       </w:r>
     </w:p>
     <w:p>
@@ -5622,17 +5815,24 @@
         <w:spacing w:after="60" w:line="290" w:lineRule="auto"/>
       </w:pPr>
       <w:r>
-        <w:t xml:space="preserve">nell'Archivio compare il riquadro </w:t>
-      </w:r>
-      <w:r>
-        <w:rPr>
-          <w:b/>
-          <w:bCs/>
-        </w:rPr>
-        <w:t>Manda la tua foto per l'Annuario (anno)</w:t>
-      </w:r>
-      <w:r>
-        <w:t>;</w:t>
+        <w:rPr>
+          <w:b/>
+          <w:bCs/>
+        </w:rPr>
+        <w:t>Anno dell'edizione</w:t>
+      </w:r>
+      <w:r>
+        <w:t xml:space="preserve">: l'anno dell'annuario che stai preparando, per esempio </w:t>
+      </w:r>
+      <w:r>
+        <w:rPr>
+          <w:b/>
+          <w:bCs/>
+        </w:rPr>
+        <w:t>2027</w:t>
+      </w:r>
+      <w:r>
+        <w:t xml:space="preserve"> (è l'edizione dell'anno accademico 2026-27). Le foto inviate vengono assegnate a quest'anno e finiranno nel suo PDF;</w:t>
       </w:r>
     </w:p>
     <w:p>
@@ -5645,7 +5845,52 @@
         <w:spacing w:after="60" w:line="290" w:lineRule="auto"/>
       </w:pPr>
       <w:r>
-        <w:t xml:space="preserve">in Home il pulsante in basso a destra diventa </w:t>
+        <w:rPr>
+          <w:b/>
+          <w:bCs/>
+        </w:rPr>
+        <w:t>Apertura invii</w:t>
+      </w:r>
+      <w:r>
+        <w:t xml:space="preserve"> e </w:t>
+      </w:r>
+      <w:r>
+        <w:rPr>
+          <w:b/>
+          <w:bCs/>
+        </w:rPr>
+        <w:t>Chiusura invii</w:t>
+      </w:r>
+      <w:r>
+        <w:t xml:space="preserve">: data e ora, sempre in </w:t>
+      </w:r>
+      <w:r>
+        <w:rPr>
+          <w:b/>
+          <w:bCs/>
+        </w:rPr>
+        <w:t>ora italiana</w:t>
+      </w:r>
+      <w:r>
+        <w:t>. Gli invii si aprono e si chiudono da soli a quegli orari.</w:t>
+      </w:r>
+    </w:p>
+    <w:p>
+      <w:pPr>
+        <w:spacing w:after="120" w:line="290" w:lineRule="auto"/>
+      </w:pPr>
+      <w:r>
+        <w:t xml:space="preserve">Mentre gli invii sono aperti, nell'Archivio compare il riquadro </w:t>
+      </w:r>
+      <w:r>
+        <w:rPr>
+          <w:b/>
+          <w:bCs/>
+        </w:rPr>
+        <w:t>Manda la tua foto per l'Annuario (anno)</w:t>
+      </w:r>
+      <w:r>
+        <w:t xml:space="preserve"> e in Home il pulsante in basso a destra diventa </w:t>
       </w:r>
       <w:r>
         <w:rPr>
@@ -5655,141 +5900,17 @@
         <w:t>Invia la tua foto</w:t>
       </w:r>
       <w:r>
+        <w:t xml:space="preserve">. Prima dell'apertura e dopo la chiusura il sito propone da solo il download dell'edizione scelta in </w:t>
+      </w:r>
+      <w:r>
+        <w:rPr>
+          <w:b/>
+          <w:bCs/>
+        </w:rPr>
+        <w:t>Edizione da scaricare</w:t>
+      </w:r>
+      <w:r>
         <w:t>.</w:t>
-      </w:r>
-    </w:p>
-    <w:p>
-      <w:pPr>
-        <w:spacing w:after="120" w:line="290" w:lineRule="auto"/>
-      </w:pPr>
-      <w:r>
-        <w:t xml:space="preserve">Quando gli invii sono chiusi, il riquadro sparisce e il pulsante in Home torna a </w:t>
-      </w:r>
-      <w:r>
-        <w:rPr>
-          <w:b/>
-          <w:bCs/>
-        </w:rPr>
-        <w:t>Scarica l'ultima edizione</w:t>
-      </w:r>
-      <w:r>
-        <w:t>. Tutto avviene da solo, in base alle date.</w:t>
-      </w:r>
-    </w:p>
-    <w:p>
-      <w:pPr>
-        <w:pStyle w:val="Titolo2"/>
-      </w:pPr>
-      <w:bookmarkStart w:id="18" w:name="_Toc241915717"/>
-      <w:r>
-        <w:t>Cambiare anno e date</w:t>
-      </w:r>
-      <w:bookmarkEnd w:id="18"/>
-    </w:p>
-    <w:p>
-      <w:pPr>
-        <w:pStyle w:val="Paragrafoelenco"/>
-        <w:numPr>
-          <w:ilvl w:val="0"/>
-          <w:numId w:val="10"/>
-        </w:numPr>
-        <w:spacing w:after="80" w:line="290" w:lineRule="auto"/>
-      </w:pPr>
-      <w:r>
-        <w:t xml:space="preserve">Apri con l'editor il file </w:t>
-      </w:r>
-      <w:r>
-        <w:rPr>
-          <w:rFonts w:ascii="Consolas" w:eastAsia="Consolas" w:hAnsi="Consolas" w:cs="Consolas"/>
-          <w:color w:val="002B49"/>
-          <w:shd w:val="clear" w:color="auto" w:fill="EEF3F7"/>
-        </w:rPr>
-        <w:t>src/config/current-edition.ts</w:t>
-      </w:r>
-      <w:r>
-        <w:t xml:space="preserve"> (nella cartella del progetto).</w:t>
-      </w:r>
-    </w:p>
-    <w:p>
-      <w:pPr>
-        <w:pStyle w:val="Paragrafoelenco"/>
-        <w:numPr>
-          <w:ilvl w:val="0"/>
-          <w:numId w:val="10"/>
-        </w:numPr>
-        <w:spacing w:after="80" w:line="290" w:lineRule="auto"/>
-      </w:pPr>
-      <w:r>
-        <w:t>Modifica solo i valori dopo i due punti, lasciando virgole e virgolette come sono. Per esempio, per l'edizione 2027:</w:t>
-      </w:r>
-    </w:p>
-    <w:p>
-      <w:pPr>
-        <w:pBdr>
-          <w:left w:val="single" w:sz="12" w:space="6" w:color="0066B2"/>
-        </w:pBdr>
-        <w:shd w:val="clear" w:color="auto" w:fill="EEF3F7"/>
-        <w:spacing w:before="80"/>
-        <w:ind w:left="240" w:right="240"/>
-      </w:pPr>
-      <w:r>
-        <w:rPr>
-          <w:rFonts w:ascii="Consolas" w:eastAsia="Consolas" w:hAnsi="Consolas" w:cs="Consolas"/>
-          <w:color w:val="002B49"/>
-          <w:sz w:val="20"/>
-          <w:szCs w:val="20"/>
-        </w:rPr>
-        <w:t>year: 2027,</w:t>
-      </w:r>
-    </w:p>
-    <w:p>
-      <w:pPr>
-        <w:pBdr>
-          <w:left w:val="single" w:sz="12" w:space="6" w:color="0066B2"/>
-        </w:pBdr>
-        <w:shd w:val="clear" w:color="auto" w:fill="EEF3F7"/>
-        <w:ind w:left="240" w:right="240"/>
-      </w:pPr>
-      <w:r>
-        <w:rPr>
-          <w:rFonts w:ascii="Consolas" w:eastAsia="Consolas" w:hAnsi="Consolas" w:cs="Consolas"/>
-          <w:color w:val="002B49"/>
-          <w:sz w:val="20"/>
-          <w:szCs w:val="20"/>
-        </w:rPr>
-        <w:t>submissionsOpenAt: "2027-01-01T00:00:00+01:00",</w:t>
-      </w:r>
-    </w:p>
-    <w:p>
-      <w:pPr>
-        <w:pBdr>
-          <w:left w:val="single" w:sz="12" w:space="6" w:color="0066B2"/>
-        </w:pBdr>
-        <w:shd w:val="clear" w:color="auto" w:fill="EEF3F7"/>
-        <w:spacing w:after="160"/>
-        <w:ind w:left="240" w:right="240"/>
-      </w:pPr>
-      <w:r>
-        <w:rPr>
-          <w:rFonts w:ascii="Consolas" w:eastAsia="Consolas" w:hAnsi="Consolas" w:cs="Consolas"/>
-          <w:color w:val="002B49"/>
-          <w:sz w:val="20"/>
-          <w:szCs w:val="20"/>
-        </w:rPr>
-        <w:t>submissionsCloseAt: "2027-05-31T23:59:59+02:00",</w:t>
-      </w:r>
-    </w:p>
-    <w:p>
-      <w:pPr>
-        <w:pStyle w:val="Paragrafoelenco"/>
-        <w:numPr>
-          <w:ilvl w:val="0"/>
-          <w:numId w:val="10"/>
-        </w:numPr>
-        <w:spacing w:after="80" w:line="290" w:lineRule="auto"/>
-      </w:pPr>
-      <w:r>
-        <w:t>Salva e pubblica la modifica (capitolo 3).</w:t>
       </w:r>
     </w:p>
     <w:p>
@@ -5810,7 +5931,104 @@
         <w:t xml:space="preserve">Nota. </w:t>
       </w:r>
       <w:r>
-        <w:t xml:space="preserve">Nelle date, </w:t>
+        <w:t>Puoi impostare le date in anticipo: per esempio a settembre programmi gli invii da gennaio a maggio, e la riga Adesso ti conferma "invii programmati".</w:t>
+      </w:r>
+    </w:p>
+    <w:p>
+      <w:pPr>
+        <w:pStyle w:val="Titolo2"/>
+      </w:pPr>
+      <w:bookmarkStart w:id="19" w:name="_Toc243217775"/>
+      <w:r>
+        <w:t>Scarica edizione: invii chiusi</w:t>
+      </w:r>
+      <w:bookmarkEnd w:id="19"/>
+    </w:p>
+    <w:p>
+      <w:pPr>
+        <w:spacing w:after="120" w:line="290" w:lineRule="auto"/>
+      </w:pPr>
+      <w:r>
+        <w:t xml:space="preserve">Scegli </w:t>
+      </w:r>
+      <w:r>
+        <w:rPr>
+          <w:b/>
+          <w:bCs/>
+        </w:rPr>
+        <w:t>Scarica edizione</w:t>
+      </w:r>
+      <w:r>
+        <w:t xml:space="preserve"> per chiudere subito gli invii (anche prima della data di chiusura). In </w:t>
+      </w:r>
+      <w:r>
+        <w:rPr>
+          <w:b/>
+          <w:bCs/>
+        </w:rPr>
+        <w:t>Edizione da scaricare</w:t>
+      </w:r>
+      <w:r>
+        <w:t xml:space="preserve"> scegli quale annuario propone la Home con il pulsante </w:t>
+      </w:r>
+      <w:r>
+        <w:rPr>
+          <w:b/>
+          <w:bCs/>
+        </w:rPr>
+        <w:t>Scarica l'ultima edizione</w:t>
+      </w:r>
+      <w:r>
+        <w:t>. L'elenco contiene le edizioni pubblicate nell'Archivio (capitolo 7).</w:t>
+      </w:r>
+    </w:p>
+    <w:p>
+      <w:pPr>
+        <w:pBdr>
+          <w:left w:val="single" w:sz="24" w:space="8" w:color="0066B2"/>
+        </w:pBdr>
+        <w:shd w:val="clear" w:color="auto" w:fill="E8F1F9"/>
+        <w:spacing w:before="120" w:after="200" w:line="290" w:lineRule="auto"/>
+        <w:ind w:left="200" w:right="200"/>
+      </w:pPr>
+      <w:r>
+        <w:rPr>
+          <w:b/>
+          <w:bCs/>
+          <w:color w:val="0066B2"/>
+        </w:rPr>
+        <w:t xml:space="preserve">Nota. </w:t>
+      </w:r>
+      <w:r>
+        <w:t>Le date che avevi impostato restano salvate: quando torni su Invio foto le ritrovi già compilate.</w:t>
+      </w:r>
+    </w:p>
+    <w:p>
+      <w:pPr>
+        <w:pStyle w:val="Titolo2"/>
+      </w:pPr>
+      <w:bookmarkStart w:id="20" w:name="_Toc243217776"/>
+      <w:r>
+        <w:t>Limite di foto per persona</w:t>
+      </w:r>
+      <w:bookmarkEnd w:id="20"/>
+    </w:p>
+    <w:p>
+      <w:pPr>
+        <w:spacing w:after="120" w:line="290" w:lineRule="auto"/>
+      </w:pPr>
+      <w:r>
+        <w:t xml:space="preserve">Ogni persona può mandare </w:t>
+      </w:r>
+      <w:r>
+        <w:rPr>
+          <w:b/>
+          <w:bCs/>
+        </w:rPr>
+        <w:t>1 foto singola e fino a 3 di gruppo</w:t>
+      </w:r>
+      <w:r>
+        <w:t xml:space="preserve"> per edizione: il sito rifiuta da solo gli invii in più, con un messaggio chiaro. Questi numeri sono nel file </w:t>
       </w:r>
       <w:r>
         <w:rPr>
@@ -5818,10 +6036,10 @@
           <w:color w:val="002B49"/>
           <w:shd w:val="clear" w:color="auto" w:fill="EEF3F7"/>
         </w:rPr>
-        <w:t>+01:00</w:t>
-      </w:r>
-      <w:r>
-        <w:t xml:space="preserve"> è l'ora solare italiana (inverno) e </w:t>
+        <w:t>src/config/current-edition.ts</w:t>
+      </w:r>
+      <w:r>
+        <w:t xml:space="preserve"> (</w:t>
       </w:r>
       <w:r>
         <w:rPr>
@@ -5829,28 +6047,10 @@
           <w:color w:val="002B49"/>
           <w:shd w:val="clear" w:color="auto" w:fill="EEF3F7"/>
         </w:rPr>
-        <w:t>+02:00</w:t>
-      </w:r>
-      <w:r>
-        <w:t xml:space="preserve"> l'ora legale (estate). Il formato è anno-mese-giorno, poi T, poi l'ora.</w:t>
-      </w:r>
-    </w:p>
-    <w:p>
-      <w:pPr>
-        <w:pStyle w:val="Titolo2"/>
-      </w:pPr>
-      <w:bookmarkStart w:id="19" w:name="_Toc241915718"/>
-      <w:r>
-        <w:t>Aprire o chiudere a mano, senza toccare le date</w:t>
-      </w:r>
-      <w:bookmarkEnd w:id="19"/>
-    </w:p>
-    <w:p>
-      <w:pPr>
-        <w:spacing w:after="120" w:line="290" w:lineRule="auto"/>
-      </w:pPr>
-      <w:r>
-        <w:t xml:space="preserve">Nello stesso file c'è la riga </w:t>
+        <w:t>maxSinglePerPerson</w:t>
+      </w:r>
+      <w:r>
+        <w:t xml:space="preserve"> e </w:t>
       </w:r>
       <w:r>
         <w:rPr>
@@ -5858,10 +6058,193 @@
           <w:color w:val="002B49"/>
           <w:shd w:val="clear" w:color="auto" w:fill="EEF3F7"/>
         </w:rPr>
-        <w:t>forceSubmissionOpen</w:t>
-      </w:r>
-      <w:r>
-        <w:t>:</w:t>
+        <w:t>maxGroupPerPerson</w:t>
+      </w:r>
+      <w:r>
+        <w:t>); se mai volessi cambiarli, modifica solo i numeri e pubblica (capitolo 3).</w:t>
+      </w:r>
+    </w:p>
+    <w:p>
+      <w:pPr>
+        <w:pBdr>
+          <w:left w:val="single" w:sz="24" w:space="8" w:color="B45309"/>
+        </w:pBdr>
+        <w:shd w:val="clear" w:color="auto" w:fill="FDF1E7"/>
+        <w:spacing w:before="120" w:after="200" w:line="290" w:lineRule="auto"/>
+        <w:ind w:left="200" w:right="200"/>
+      </w:pPr>
+      <w:r>
+        <w:rPr>
+          <w:b/>
+          <w:bCs/>
+          <w:color w:val="B45309"/>
+        </w:rPr>
+        <w:t xml:space="preserve">Attenzione. </w:t>
+      </w:r>
+      <w:r>
+        <w:t xml:space="preserve">Non cambiare la variabile </w:t>
+      </w:r>
+      <w:r>
+        <w:rPr>
+          <w:rFonts w:ascii="Consolas" w:eastAsia="Consolas" w:hAnsi="Consolas" w:cs="Consolas"/>
+          <w:color w:val="002B49"/>
+          <w:shd w:val="clear" w:color="auto" w:fill="EEF3F7"/>
+        </w:rPr>
+        <w:t>EMAIL_HASH_SECRET</w:t>
+      </w:r>
+      <w:r>
+        <w:t xml:space="preserve"> su Vercel mentre gli invii sono aperti: il sito perderebbe il conto di chi ha già mandato foto (vedi capitolo 9).</w:t>
+      </w:r>
+    </w:p>
+    <w:p>
+      <w:pPr>
+        <w:pStyle w:val="Titolo1"/>
+        <w:pageBreakBefore/>
+      </w:pPr>
+      <w:bookmarkStart w:id="21" w:name="_Toc243217777"/>
+      <w:r>
+        <w:lastRenderedPageBreak/>
+        <w:t>6. Creare il PDF dell'annuario</w:t>
+      </w:r>
+      <w:bookmarkEnd w:id="21"/>
+    </w:p>
+    <w:p>
+      <w:pPr>
+        <w:spacing w:after="120" w:line="290" w:lineRule="auto"/>
+      </w:pPr>
+      <w:r>
+        <w:t>Quando gli invii sono chiusi e hai approvato le foto dell'Archivio, puoi creare il PDF. Lo script usa lo stesso stile della prima edizione:</w:t>
+      </w:r>
+    </w:p>
+    <w:p>
+      <w:pPr>
+        <w:pStyle w:val="Paragrafoelenco"/>
+        <w:numPr>
+          <w:ilvl w:val="0"/>
+          <w:numId w:val="3"/>
+        </w:numPr>
+        <w:spacing w:after="60" w:line="290" w:lineRule="auto"/>
+      </w:pPr>
+      <w:r>
+        <w:t>copertina con la scritta ANNUARIO DEL PN, il cherubino e l'anno accademico (per esempio "Edizione 2026-27"), calcolato da solo;</w:t>
+      </w:r>
+    </w:p>
+    <w:p>
+      <w:pPr>
+        <w:pStyle w:val="Paragrafoelenco"/>
+        <w:numPr>
+          <w:ilvl w:val="0"/>
+          <w:numId w:val="3"/>
+        </w:numPr>
+        <w:spacing w:after="60" w:line="290" w:lineRule="auto"/>
+      </w:pPr>
+      <w:r>
+        <w:t>pagina 1 con la premessa e la legenda delle facoltà, uguale alla prima edizione;</w:t>
+      </w:r>
+    </w:p>
+    <w:p>
+      <w:pPr>
+        <w:pStyle w:val="Paragrafoelenco"/>
+        <w:numPr>
+          <w:ilvl w:val="0"/>
+          <w:numId w:val="3"/>
+        </w:numPr>
+        <w:spacing w:after="60" w:line="290" w:lineRule="auto"/>
+      </w:pPr>
+      <w:r>
+        <w:t>foto singole, nove per pagina, in ordine alfabetico per cognome, con icona della facoltà, nome e frase;</w:t>
+      </w:r>
+    </w:p>
+    <w:p>
+      <w:pPr>
+        <w:pStyle w:val="Paragrafoelenco"/>
+        <w:numPr>
+          <w:ilvl w:val="0"/>
+          <w:numId w:val="3"/>
+        </w:numPr>
+        <w:spacing w:after="60" w:line="290" w:lineRule="auto"/>
+      </w:pPr>
+      <w:r>
+        <w:t>foto di gruppo con nomi e didascalia: le verticali alternate a sinistra e a destra, le orizzontali centrate a tutta larghezza, come nella prima edizione;</w:t>
+      </w:r>
+    </w:p>
+    <w:p>
+      <w:pPr>
+        <w:pStyle w:val="Paragrafoelenco"/>
+        <w:numPr>
+          <w:ilvl w:val="0"/>
+          <w:numId w:val="3"/>
+        </w:numPr>
+        <w:spacing w:after="60" w:line="290" w:lineRule="auto"/>
+      </w:pPr>
+      <w:r>
+        <w:t>cornice blu, cherubino in alto e numero di pagina su ogni pagina.</w:t>
+      </w:r>
+    </w:p>
+    <w:p>
+      <w:pPr>
+        <w:spacing w:after="120" w:line="290" w:lineRule="auto"/>
+      </w:pPr>
+      <w:r>
+        <w:t xml:space="preserve">Nel PDF entrano </w:t>
+      </w:r>
+      <w:r>
+        <w:rPr>
+          <w:b/>
+          <w:bCs/>
+        </w:rPr>
+        <w:t>solo le foto dell'Archivio approvate</w:t>
+      </w:r>
+      <w:r>
+        <w:t xml:space="preserve"> per quell'anno. Hall of Fame e Annuario Storico non hanno un PDF.</w:t>
+      </w:r>
+    </w:p>
+    <w:p>
+      <w:pPr>
+        <w:pStyle w:val="Titolo2"/>
+      </w:pPr>
+      <w:bookmarkStart w:id="22" w:name="_Toc243217778"/>
+      <w:r>
+        <w:t>La copertina: logo e scritta "Edizione 2027-28"</w:t>
+      </w:r>
+      <w:bookmarkEnd w:id="22"/>
+    </w:p>
+    <w:p>
+      <w:pPr>
+        <w:spacing w:after="120" w:line="290" w:lineRule="auto"/>
+      </w:pPr>
+      <w:r>
+        <w:t xml:space="preserve">La prima pagina del PDF è creata in automatico: in alto </w:t>
+      </w:r>
+      <w:r>
+        <w:rPr>
+          <w:b/>
+          <w:bCs/>
+        </w:rPr>
+        <w:t>ANNUARIO DEL PN</w:t>
+      </w:r>
+      <w:r>
+        <w:t xml:space="preserve">, al centro il cherubino e in basso la scritta dell'edizione. </w:t>
+      </w:r>
+      <w:r>
+        <w:rPr>
+          <w:b/>
+          <w:bCs/>
+        </w:rPr>
+        <w:t>Non c'è nessuna immagine da preparare a mano.</w:t>
+      </w:r>
+      <w:r>
+        <w:t xml:space="preserve"> La scritta dipende dall'anno dell'edizione (l'</w:t>
+      </w:r>
+      <w:r>
+        <w:rPr>
+          <w:b/>
+          <w:bCs/>
+        </w:rPr>
+        <w:t>Anno dell'edizione</w:t>
+      </w:r>
+      <w:r>
+        <w:t xml:space="preserve"> impostato nel pannello, capitolo 5) ed è l'anno accademico corrispondente:</w:t>
       </w:r>
     </w:p>
     <w:tbl>
@@ -5879,550 +6262,7 @@
           <w:left w:w="10" w:type="dxa"/>
           <w:right w:w="10" w:type="dxa"/>
         </w:tblCellMar>
-        <w:tblLook w:val="04A0" w:firstRow="1" w:lastRow="0" w:firstColumn="1" w:lastColumn="0" w:noHBand="0" w:noVBand="1"/>
-      </w:tblPr>
-      <w:tblGrid>
-        <w:gridCol w:w="2200"/>
-        <w:gridCol w:w="6826"/>
-      </w:tblGrid>
-      <w:tr>
-        <w:tblPrEx>
-          <w:tblCellMar>
-            <w:top w:w="0" w:type="dxa"/>
-            <w:bottom w:w="0" w:type="dxa"/>
-          </w:tblCellMar>
-        </w:tblPrEx>
-        <w:trPr>
-          <w:tblHeader/>
-        </w:trPr>
-        <w:tc>
-          <w:tcPr>
-            <w:tcW w:w="2200" w:type="dxa"/>
-            <w:tcBorders>
-              <w:top w:val="single" w:sz="4" w:space="0" w:color="C9D6E2"/>
-              <w:left w:val="single" w:sz="4" w:space="0" w:color="C9D6E2"/>
-              <w:bottom w:val="single" w:sz="4" w:space="0" w:color="C9D6E2"/>
-              <w:right w:val="single" w:sz="4" w:space="0" w:color="C9D6E2"/>
-            </w:tcBorders>
-            <w:shd w:val="clear" w:color="auto" w:fill="002B49"/>
-            <w:tcMar>
-              <w:top w:w="80" w:type="dxa"/>
-              <w:left w:w="120" w:type="dxa"/>
-              <w:bottom w:w="80" w:type="dxa"/>
-              <w:right w:w="120" w:type="dxa"/>
-            </w:tcMar>
-          </w:tcPr>
-          <w:p>
-            <w:pPr>
-              <w:spacing w:line="276" w:lineRule="auto"/>
-            </w:pPr>
-            <w:r>
-              <w:rPr>
-                <w:b/>
-                <w:bCs/>
-                <w:color w:val="FFFFFF"/>
-              </w:rPr>
-              <w:t>Valore</w:t>
-            </w:r>
-          </w:p>
-        </w:tc>
-        <w:tc>
-          <w:tcPr>
-            <w:tcW w:w="6826" w:type="dxa"/>
-            <w:tcBorders>
-              <w:top w:val="single" w:sz="4" w:space="0" w:color="C9D6E2"/>
-              <w:left w:val="single" w:sz="4" w:space="0" w:color="C9D6E2"/>
-              <w:bottom w:val="single" w:sz="4" w:space="0" w:color="C9D6E2"/>
-              <w:right w:val="single" w:sz="4" w:space="0" w:color="C9D6E2"/>
-            </w:tcBorders>
-            <w:shd w:val="clear" w:color="auto" w:fill="002B49"/>
-            <w:tcMar>
-              <w:top w:w="80" w:type="dxa"/>
-              <w:left w:w="120" w:type="dxa"/>
-              <w:bottom w:w="80" w:type="dxa"/>
-              <w:right w:w="120" w:type="dxa"/>
-            </w:tcMar>
-          </w:tcPr>
-          <w:p>
-            <w:pPr>
-              <w:spacing w:line="276" w:lineRule="auto"/>
-            </w:pPr>
-            <w:r>
-              <w:rPr>
-                <w:b/>
-                <w:bCs/>
-                <w:color w:val="FFFFFF"/>
-              </w:rPr>
-              <w:t>Effetto</w:t>
-            </w:r>
-          </w:p>
-        </w:tc>
-      </w:tr>
-      <w:tr>
-        <w:tblPrEx>
-          <w:tblCellMar>
-            <w:top w:w="0" w:type="dxa"/>
-            <w:bottom w:w="0" w:type="dxa"/>
-          </w:tblCellMar>
-        </w:tblPrEx>
-        <w:tc>
-          <w:tcPr>
-            <w:tcW w:w="2200" w:type="dxa"/>
-            <w:tcBorders>
-              <w:top w:val="single" w:sz="4" w:space="0" w:color="C9D6E2"/>
-              <w:left w:val="single" w:sz="4" w:space="0" w:color="C9D6E2"/>
-              <w:bottom w:val="single" w:sz="4" w:space="0" w:color="C9D6E2"/>
-              <w:right w:val="single" w:sz="4" w:space="0" w:color="C9D6E2"/>
-            </w:tcBorders>
-            <w:tcMar>
-              <w:top w:w="80" w:type="dxa"/>
-              <w:left w:w="120" w:type="dxa"/>
-              <w:bottom w:w="80" w:type="dxa"/>
-              <w:right w:w="120" w:type="dxa"/>
-            </w:tcMar>
-          </w:tcPr>
-          <w:p>
-            <w:pPr>
-              <w:spacing w:line="276" w:lineRule="auto"/>
-            </w:pPr>
-            <w:r>
-              <w:rPr>
-                <w:rFonts w:ascii="Consolas" w:eastAsia="Consolas" w:hAnsi="Consolas" w:cs="Consolas"/>
-                <w:color w:val="002B49"/>
-                <w:shd w:val="clear" w:color="auto" w:fill="EEF3F7"/>
-              </w:rPr>
-              <w:t>null</w:t>
-            </w:r>
-          </w:p>
-        </w:tc>
-        <w:tc>
-          <w:tcPr>
-            <w:tcW w:w="6826" w:type="dxa"/>
-            <w:tcBorders>
-              <w:top w:val="single" w:sz="4" w:space="0" w:color="C9D6E2"/>
-              <w:left w:val="single" w:sz="4" w:space="0" w:color="C9D6E2"/>
-              <w:bottom w:val="single" w:sz="4" w:space="0" w:color="C9D6E2"/>
-              <w:right w:val="single" w:sz="4" w:space="0" w:color="C9D6E2"/>
-            </w:tcBorders>
-            <w:tcMar>
-              <w:top w:w="80" w:type="dxa"/>
-              <w:left w:w="120" w:type="dxa"/>
-              <w:bottom w:w="80" w:type="dxa"/>
-              <w:right w:w="120" w:type="dxa"/>
-            </w:tcMar>
-          </w:tcPr>
-          <w:p>
-            <w:pPr>
-              <w:spacing w:line="276" w:lineRule="auto"/>
-            </w:pPr>
-            <w:r>
-              <w:t>Normale: decidono le date (consigliato).</w:t>
-            </w:r>
-          </w:p>
-        </w:tc>
-      </w:tr>
-      <w:tr>
-        <w:tblPrEx>
-          <w:tblCellMar>
-            <w:top w:w="0" w:type="dxa"/>
-            <w:bottom w:w="0" w:type="dxa"/>
-          </w:tblCellMar>
-        </w:tblPrEx>
-        <w:tc>
-          <w:tcPr>
-            <w:tcW w:w="2200" w:type="dxa"/>
-            <w:tcBorders>
-              <w:top w:val="single" w:sz="4" w:space="0" w:color="C9D6E2"/>
-              <w:left w:val="single" w:sz="4" w:space="0" w:color="C9D6E2"/>
-              <w:bottom w:val="single" w:sz="4" w:space="0" w:color="C9D6E2"/>
-              <w:right w:val="single" w:sz="4" w:space="0" w:color="C9D6E2"/>
-            </w:tcBorders>
-            <w:tcMar>
-              <w:top w:w="80" w:type="dxa"/>
-              <w:left w:w="120" w:type="dxa"/>
-              <w:bottom w:w="80" w:type="dxa"/>
-              <w:right w:w="120" w:type="dxa"/>
-            </w:tcMar>
-          </w:tcPr>
-          <w:p>
-            <w:pPr>
-              <w:spacing w:line="276" w:lineRule="auto"/>
-            </w:pPr>
-            <w:r>
-              <w:rPr>
-                <w:rFonts w:ascii="Consolas" w:eastAsia="Consolas" w:hAnsi="Consolas" w:cs="Consolas"/>
-                <w:color w:val="002B49"/>
-                <w:shd w:val="clear" w:color="auto" w:fill="EEF3F7"/>
-              </w:rPr>
-              <w:t>true</w:t>
-            </w:r>
-          </w:p>
-        </w:tc>
-        <w:tc>
-          <w:tcPr>
-            <w:tcW w:w="6826" w:type="dxa"/>
-            <w:tcBorders>
-              <w:top w:val="single" w:sz="4" w:space="0" w:color="C9D6E2"/>
-              <w:left w:val="single" w:sz="4" w:space="0" w:color="C9D6E2"/>
-              <w:bottom w:val="single" w:sz="4" w:space="0" w:color="C9D6E2"/>
-              <w:right w:val="single" w:sz="4" w:space="0" w:color="C9D6E2"/>
-            </w:tcBorders>
-            <w:tcMar>
-              <w:top w:w="80" w:type="dxa"/>
-              <w:left w:w="120" w:type="dxa"/>
-              <w:bottom w:w="80" w:type="dxa"/>
-              <w:right w:w="120" w:type="dxa"/>
-            </w:tcMar>
-          </w:tcPr>
-          <w:p>
-            <w:pPr>
-              <w:spacing w:line="276" w:lineRule="auto"/>
-            </w:pPr>
-            <w:r>
-              <w:t>Invii sempre aperti, qualunque sia la data.</w:t>
-            </w:r>
-          </w:p>
-        </w:tc>
-      </w:tr>
-      <w:tr>
-        <w:tblPrEx>
-          <w:tblCellMar>
-            <w:top w:w="0" w:type="dxa"/>
-            <w:bottom w:w="0" w:type="dxa"/>
-          </w:tblCellMar>
-        </w:tblPrEx>
-        <w:tc>
-          <w:tcPr>
-            <w:tcW w:w="2200" w:type="dxa"/>
-            <w:tcBorders>
-              <w:top w:val="single" w:sz="4" w:space="0" w:color="C9D6E2"/>
-              <w:left w:val="single" w:sz="4" w:space="0" w:color="C9D6E2"/>
-              <w:bottom w:val="single" w:sz="4" w:space="0" w:color="C9D6E2"/>
-              <w:right w:val="single" w:sz="4" w:space="0" w:color="C9D6E2"/>
-            </w:tcBorders>
-            <w:tcMar>
-              <w:top w:w="80" w:type="dxa"/>
-              <w:left w:w="120" w:type="dxa"/>
-              <w:bottom w:w="80" w:type="dxa"/>
-              <w:right w:w="120" w:type="dxa"/>
-            </w:tcMar>
-          </w:tcPr>
-          <w:p>
-            <w:pPr>
-              <w:spacing w:line="276" w:lineRule="auto"/>
-            </w:pPr>
-            <w:r>
-              <w:rPr>
-                <w:rFonts w:ascii="Consolas" w:eastAsia="Consolas" w:hAnsi="Consolas" w:cs="Consolas"/>
-                <w:color w:val="002B49"/>
-                <w:shd w:val="clear" w:color="auto" w:fill="EEF3F7"/>
-              </w:rPr>
-              <w:t>false</w:t>
-            </w:r>
-          </w:p>
-        </w:tc>
-        <w:tc>
-          <w:tcPr>
-            <w:tcW w:w="6826" w:type="dxa"/>
-            <w:tcBorders>
-              <w:top w:val="single" w:sz="4" w:space="0" w:color="C9D6E2"/>
-              <w:left w:val="single" w:sz="4" w:space="0" w:color="C9D6E2"/>
-              <w:bottom w:val="single" w:sz="4" w:space="0" w:color="C9D6E2"/>
-              <w:right w:val="single" w:sz="4" w:space="0" w:color="C9D6E2"/>
-            </w:tcBorders>
-            <w:tcMar>
-              <w:top w:w="80" w:type="dxa"/>
-              <w:left w:w="120" w:type="dxa"/>
-              <w:bottom w:w="80" w:type="dxa"/>
-              <w:right w:w="120" w:type="dxa"/>
-            </w:tcMar>
-          </w:tcPr>
-          <w:p>
-            <w:pPr>
-              <w:spacing w:line="276" w:lineRule="auto"/>
-            </w:pPr>
-            <w:r>
-              <w:t>Invii sempre chiusi, qualunque sia la data.</w:t>
-            </w:r>
-          </w:p>
-        </w:tc>
-      </w:tr>
-    </w:tbl>
-    <w:p>
-      <w:pPr>
-        <w:spacing w:after="120"/>
-      </w:pPr>
-    </w:p>
-    <w:p>
-      <w:pPr>
-        <w:spacing w:after="120" w:line="290" w:lineRule="auto"/>
-      </w:pPr>
-      <w:r>
-        <w:t xml:space="preserve">Scrivi il valore senza virgolette, per esempio </w:t>
-      </w:r>
-      <w:r>
-        <w:rPr>
-          <w:rFonts w:ascii="Consolas" w:eastAsia="Consolas" w:hAnsi="Consolas" w:cs="Consolas"/>
-          <w:color w:val="002B49"/>
-          <w:shd w:val="clear" w:color="auto" w:fill="EEF3F7"/>
-        </w:rPr>
-        <w:t>forceSubmissionOpen: false as boolean | null,</w:t>
-      </w:r>
-      <w:r>
-        <w:t xml:space="preserve"> e poi pubblica.</w:t>
-      </w:r>
-    </w:p>
-    <w:p>
-      <w:pPr>
-        <w:pStyle w:val="Titolo2"/>
-      </w:pPr>
-      <w:bookmarkStart w:id="20" w:name="_Toc241915719"/>
-      <w:r>
-        <w:t>Limite di foto per persona</w:t>
-      </w:r>
-      <w:bookmarkEnd w:id="20"/>
-    </w:p>
-    <w:p>
-      <w:pPr>
-        <w:spacing w:after="120" w:line="290" w:lineRule="auto"/>
-      </w:pPr>
-      <w:r>
-        <w:t xml:space="preserve">Sempre nello stesso file, </w:t>
-      </w:r>
-      <w:r>
-        <w:rPr>
-          <w:rFonts w:ascii="Consolas" w:eastAsia="Consolas" w:hAnsi="Consolas" w:cs="Consolas"/>
-          <w:color w:val="002B49"/>
-          <w:shd w:val="clear" w:color="auto" w:fill="EEF3F7"/>
-        </w:rPr>
-        <w:t>maxSinglePerPerson: 1</w:t>
-      </w:r>
-      <w:r>
-        <w:t xml:space="preserve"> e </w:t>
-      </w:r>
-      <w:r>
-        <w:rPr>
-          <w:rFonts w:ascii="Consolas" w:eastAsia="Consolas" w:hAnsi="Consolas" w:cs="Consolas"/>
-          <w:color w:val="002B49"/>
-          <w:shd w:val="clear" w:color="auto" w:fill="EEF3F7"/>
-        </w:rPr>
-        <w:t>maxGroupPerPerson: 3</w:t>
-      </w:r>
-      <w:r>
-        <w:t xml:space="preserve"> indicano quante foto singole e di gruppo può mandare ogni persona per edizione. Il sito rifiuta da solo gli invii in più, con un messaggio chiaro.</w:t>
-      </w:r>
-    </w:p>
-    <w:p>
-      <w:pPr>
-        <w:pBdr>
-          <w:left w:val="single" w:sz="24" w:space="8" w:color="B45309"/>
-        </w:pBdr>
-        <w:shd w:val="clear" w:color="auto" w:fill="FDF1E7"/>
-        <w:spacing w:before="120" w:after="200" w:line="290" w:lineRule="auto"/>
-        <w:ind w:left="200" w:right="200"/>
-      </w:pPr>
-      <w:r>
-        <w:rPr>
-          <w:b/>
-          <w:bCs/>
-          <w:color w:val="B45309"/>
-        </w:rPr>
-        <w:t xml:space="preserve">Attenzione. </w:t>
-      </w:r>
-      <w:r>
-        <w:t xml:space="preserve">Non cambiare la variabile </w:t>
-      </w:r>
-      <w:r>
-        <w:rPr>
-          <w:rFonts w:ascii="Consolas" w:eastAsia="Consolas" w:hAnsi="Consolas" w:cs="Consolas"/>
-          <w:color w:val="002B49"/>
-          <w:shd w:val="clear" w:color="auto" w:fill="EEF3F7"/>
-        </w:rPr>
-        <w:t>EMAIL_HASH_SECRET</w:t>
-      </w:r>
-      <w:r>
-        <w:t xml:space="preserve"> su Vercel mentre gli invii sono aperti: il sito perderebbe il conto di chi ha già mandato foto (vedi capitolo 9).</w:t>
-      </w:r>
-    </w:p>
-    <w:p>
-      <w:pPr>
-        <w:pStyle w:val="Titolo1"/>
-        <w:pageBreakBefore/>
-      </w:pPr>
-      <w:bookmarkStart w:id="21" w:name="_Toc241915720"/>
-      <w:r>
-        <w:lastRenderedPageBreak/>
-        <w:t>6. Creare il PDF dell'annuario</w:t>
-      </w:r>
-      <w:bookmarkEnd w:id="21"/>
-    </w:p>
-    <w:p>
-      <w:pPr>
-        <w:spacing w:after="120" w:line="290" w:lineRule="auto"/>
-      </w:pPr>
-      <w:r>
-        <w:t>Quando gli invii sono chiusi e hai approvato le foto dell'Archivio, puoi creare il PDF. Lo script usa lo stesso stile della prima edizione:</w:t>
-      </w:r>
-    </w:p>
-    <w:p>
-      <w:pPr>
-        <w:pStyle w:val="Paragrafoelenco"/>
-        <w:numPr>
-          <w:ilvl w:val="0"/>
-          <w:numId w:val="3"/>
-        </w:numPr>
-        <w:spacing w:after="60" w:line="290" w:lineRule="auto"/>
-      </w:pPr>
-      <w:r>
-        <w:t>copertina con la scritta ANNUARIO DEL PN, il cherubino e l'anno accademico (per esempio "Edizione 2026-27"), calcolato da solo;</w:t>
-      </w:r>
-    </w:p>
-    <w:p>
-      <w:pPr>
-        <w:pStyle w:val="Paragrafoelenco"/>
-        <w:numPr>
-          <w:ilvl w:val="0"/>
-          <w:numId w:val="3"/>
-        </w:numPr>
-        <w:spacing w:after="60" w:line="290" w:lineRule="auto"/>
-      </w:pPr>
-      <w:r>
-        <w:t>pagina 1 con la premessa e la legenda delle facoltà, uguale alla prima edizione;</w:t>
-      </w:r>
-    </w:p>
-    <w:p>
-      <w:pPr>
-        <w:pStyle w:val="Paragrafoelenco"/>
-        <w:numPr>
-          <w:ilvl w:val="0"/>
-          <w:numId w:val="3"/>
-        </w:numPr>
-        <w:spacing w:after="60" w:line="290" w:lineRule="auto"/>
-      </w:pPr>
-      <w:r>
-        <w:t>foto singole, nove per pagina, in ordine alfabetico per cognome, con icona della facoltà, nome e frase;</w:t>
-      </w:r>
-    </w:p>
-    <w:p>
-      <w:pPr>
-        <w:pStyle w:val="Paragrafoelenco"/>
-        <w:numPr>
-          <w:ilvl w:val="0"/>
-          <w:numId w:val="3"/>
-        </w:numPr>
-        <w:spacing w:after="60" w:line="290" w:lineRule="auto"/>
-      </w:pPr>
-      <w:r>
-        <w:t>foto di gruppo con nomi e didascalia: le verticali alternate a sinistra e a destra, le orizzontali centrate a tutta larghezza, come nella prima edizione;</w:t>
-      </w:r>
-    </w:p>
-    <w:p>
-      <w:pPr>
-        <w:pStyle w:val="Paragrafoelenco"/>
-        <w:numPr>
-          <w:ilvl w:val="0"/>
-          <w:numId w:val="3"/>
-        </w:numPr>
-        <w:spacing w:after="60" w:line="290" w:lineRule="auto"/>
-      </w:pPr>
-      <w:r>
-        <w:t>cornice blu, cherubino in alto e numero di pagina su ogni pagina.</w:t>
-      </w:r>
-    </w:p>
-    <w:p>
-      <w:pPr>
-        <w:spacing w:after="120" w:line="290" w:lineRule="auto"/>
-      </w:pPr>
-      <w:r>
-        <w:t xml:space="preserve">Nel PDF entrano </w:t>
-      </w:r>
-      <w:r>
-        <w:rPr>
-          <w:b/>
-          <w:bCs/>
-        </w:rPr>
-        <w:t>solo le foto dell'Archivio approvate</w:t>
-      </w:r>
-      <w:r>
-        <w:t xml:space="preserve"> per quell'anno. Hall of Fame e Annuario Storico non hanno un PDF.</w:t>
-      </w:r>
-    </w:p>
-    <w:p>
-      <w:pPr>
-        <w:pStyle w:val="Titolo2"/>
-      </w:pPr>
-      <w:bookmarkStart w:id="22" w:name="_Toc241915721"/>
-      <w:r>
-        <w:t>La copertina: logo e scritta "Edizione 2027-28"</w:t>
-      </w:r>
-      <w:bookmarkEnd w:id="22"/>
-    </w:p>
-    <w:p>
-      <w:pPr>
-        <w:spacing w:after="120" w:line="290" w:lineRule="auto"/>
-      </w:pPr>
-      <w:r>
-        <w:t xml:space="preserve">La prima pagina del PDF è creata in automatico: in alto </w:t>
-      </w:r>
-      <w:r>
-        <w:rPr>
-          <w:b/>
-          <w:bCs/>
-        </w:rPr>
-        <w:t>ANNUARIO DEL PN</w:t>
-      </w:r>
-      <w:r>
-        <w:t xml:space="preserve">, al centro il cherubino e in basso la scritta dell'edizione. </w:t>
-      </w:r>
-      <w:r>
-        <w:rPr>
-          <w:b/>
-          <w:bCs/>
-        </w:rPr>
-        <w:t>Non c'è nessuna immagine da preparare a mano.</w:t>
-      </w:r>
-      <w:r>
-        <w:t xml:space="preserve"> La scritta dipende dall'anno dell'edizione (il valore </w:t>
-      </w:r>
-      <w:r>
-        <w:rPr>
-          <w:rFonts w:ascii="Consolas" w:eastAsia="Consolas" w:hAnsi="Consolas" w:cs="Consolas"/>
-          <w:color w:val="002B49"/>
-          <w:shd w:val="clear" w:color="auto" w:fill="EEF3F7"/>
-        </w:rPr>
-        <w:t>year</w:t>
-      </w:r>
-      <w:r>
-        <w:t xml:space="preserve"> del file </w:t>
-      </w:r>
-      <w:r>
-        <w:rPr>
-          <w:rFonts w:ascii="Consolas" w:eastAsia="Consolas" w:hAnsi="Consolas" w:cs="Consolas"/>
-          <w:color w:val="002B49"/>
-          <w:shd w:val="clear" w:color="auto" w:fill="EEF3F7"/>
-        </w:rPr>
-        <w:t>src/config/current-edition.ts</w:t>
-      </w:r>
-      <w:r>
-        <w:t>, capitolo 5) ed è l'anno accademico corrispondente:</w:t>
-      </w:r>
-    </w:p>
-    <w:tbl>
-      <w:tblPr>
-        <w:tblW w:w="9026" w:type="dxa"/>
-        <w:tblBorders>
-          <w:top w:val="single" w:sz="4" w:space="0" w:color="auto"/>
-          <w:left w:val="single" w:sz="4" w:space="0" w:color="auto"/>
-          <w:bottom w:val="single" w:sz="4" w:space="0" w:color="auto"/>
-          <w:right w:val="single" w:sz="4" w:space="0" w:color="auto"/>
-          <w:insideH w:val="single" w:sz="4" w:space="0" w:color="auto"/>
-          <w:insideV w:val="single" w:sz="4" w:space="0" w:color="auto"/>
-        </w:tblBorders>
-        <w:tblCellMar>
-          <w:left w:w="10" w:type="dxa"/>
-          <w:right w:w="10" w:type="dxa"/>
-        </w:tblCellMar>
-        <w:tblLook w:val="04A0" w:firstRow="1" w:lastRow="0" w:firstColumn="1" w:lastColumn="0" w:noHBand="0" w:noVBand="1"/>
+        <w:tblLook w:val="0000" w:firstRow="0" w:lastRow="0" w:firstColumn="0" w:lastColumn="0" w:noHBand="0" w:noVBand="0"/>
       </w:tblPr>
       <w:tblGrid>
         <w:gridCol w:w="4000"/>
@@ -6782,29 +6622,17 @@
         <w:spacing w:after="120" w:line="290" w:lineRule="auto"/>
       </w:pPr>
       <w:r>
-        <w:t xml:space="preserve">Quindi, per ogni nuovo anno, basta aggiornare </w:t>
-      </w:r>
-      <w:r>
-        <w:rPr>
-          <w:rFonts w:ascii="Consolas" w:eastAsia="Consolas" w:hAnsi="Consolas" w:cs="Consolas"/>
-          <w:color w:val="002B49"/>
-          <w:shd w:val="clear" w:color="auto" w:fill="EEF3F7"/>
-        </w:rPr>
-        <w:t>year</w:t>
-      </w:r>
-      <w:r>
-        <w:t xml:space="preserve"> nel file </w:t>
-      </w:r>
-      <w:r>
-        <w:rPr>
-          <w:rFonts w:ascii="Consolas" w:eastAsia="Consolas" w:hAnsi="Consolas" w:cs="Consolas"/>
-          <w:color w:val="002B49"/>
-          <w:shd w:val="clear" w:color="auto" w:fill="EEF3F7"/>
-        </w:rPr>
-        <w:t>current-edition.ts</w:t>
-      </w:r>
-      <w:r>
-        <w:t xml:space="preserve"> (lo fai comunque per aprire gli invii) e la copertina si aggiorna da sola. Per esempio, per avere </w:t>
+        <w:t>Quindi la copertina si aggiorna da sola con l'</w:t>
+      </w:r>
+      <w:r>
+        <w:rPr>
+          <w:b/>
+          <w:bCs/>
+        </w:rPr>
+        <w:t>Anno dell'edizione</w:t>
+      </w:r>
+      <w:r>
+        <w:t xml:space="preserve"> impostato nel pannello (capitolo 5). Per esempio, per avere </w:t>
       </w:r>
       <w:r>
         <w:rPr>
@@ -6814,15 +6642,14 @@
         <w:t>Edizione 2027-28</w:t>
       </w:r>
       <w:r>
-        <w:t xml:space="preserve"> scrivi </w:t>
-      </w:r>
-      <w:r>
-        <w:rPr>
-          <w:rFonts w:ascii="Consolas" w:eastAsia="Consolas" w:hAnsi="Consolas" w:cs="Consolas"/>
-          <w:color w:val="002B49"/>
-          <w:shd w:val="clear" w:color="auto" w:fill="EEF3F7"/>
-        </w:rPr>
-        <w:t>year: 2028,</w:t>
+        <w:t xml:space="preserve"> l'anno dell'edizione deve essere </w:t>
+      </w:r>
+      <w:r>
+        <w:rPr>
+          <w:b/>
+          <w:bCs/>
+        </w:rPr>
+        <w:t>2028</w:t>
       </w:r>
       <w:r>
         <w:t>.</w:t>
@@ -6916,11 +6743,10 @@
           <w:bCs/>
           <w:color w:val="0066B2"/>
         </w:rPr>
-        <w:lastRenderedPageBreak/>
         <w:t xml:space="preserve">Nota. </w:t>
       </w:r>
       <w:r>
-        <w:t xml:space="preserve">La scritta in copertina si crea solo quando generi il PDF. Se hai già generato un PDF con l'anno sbagliato, correggi </w:t>
+        <w:t xml:space="preserve">La scritta in copertina si crea solo quando generi il PDF. Se hai già generato un PDF con l'anno sbagliato, correggi l'anno nel pannello (oppure usa l'opzione </w:t>
       </w:r>
       <w:r>
         <w:rPr>
@@ -6928,17 +6754,6 @@
           <w:color w:val="002B49"/>
           <w:shd w:val="clear" w:color="auto" w:fill="EEF3F7"/>
         </w:rPr>
-        <w:t>year</w:t>
-      </w:r>
-      <w:r>
-        <w:t xml:space="preserve"> (oppure usa l'opzione </w:t>
-      </w:r>
-      <w:r>
-        <w:rPr>
-          <w:rFonts w:ascii="Consolas" w:eastAsia="Consolas" w:hAnsi="Consolas" w:cs="Consolas"/>
-          <w:color w:val="002B49"/>
-          <w:shd w:val="clear" w:color="auto" w:fill="EEF3F7"/>
-        </w:rPr>
         <w:t>--year=2028</w:t>
       </w:r>
       <w:r>
@@ -6949,8 +6764,9 @@
       <w:pPr>
         <w:pStyle w:val="Titolo2"/>
       </w:pPr>
-      <w:bookmarkStart w:id="23" w:name="_Toc241915722"/>
-      <w:r>
+      <w:bookmarkStart w:id="23" w:name="_Toc243217779"/>
+      <w:r>
+        <w:lastRenderedPageBreak/>
         <w:t>Premessa</w:t>
       </w:r>
       <w:bookmarkEnd w:id="23"/>
@@ -7066,7 +6882,7 @@
       <w:pPr>
         <w:pStyle w:val="Titolo2"/>
       </w:pPr>
-      <w:bookmarkStart w:id="24" w:name="_Toc241915723"/>
+      <w:bookmarkStart w:id="24" w:name="_Toc243217780"/>
       <w:r>
         <w:t>Generare il PDF</w:t>
       </w:r>
@@ -7159,7 +6975,7 @@
         <w:t>annuario-del-pn-2027.pdf</w:t>
       </w:r>
       <w:r>
-        <w:t xml:space="preserve"> (con l'anno configurato nel capitolo 5).</w:t>
+        <w:t xml:space="preserve"> (con l'anno dell'edizione impostato nel pannello, capitolo 5).</w:t>
       </w:r>
     </w:p>
     <w:p>
@@ -7179,7 +6995,7 @@
       <w:pPr>
         <w:pStyle w:val="Titolo2"/>
       </w:pPr>
-      <w:bookmarkStart w:id="25" w:name="_Toc241915724"/>
+      <w:bookmarkStart w:id="25" w:name="_Toc243217781"/>
       <w:r>
         <w:t>Opzioni utili</w:t>
       </w:r>
@@ -7241,18 +7057,7 @@
         <w:t>--year</w:t>
       </w:r>
       <w:r>
-        <w:t xml:space="preserve">: crea il PDF di un altro anno (di default quello del file </w:t>
-      </w:r>
-      <w:r>
-        <w:rPr>
-          <w:rFonts w:ascii="Consolas" w:eastAsia="Consolas" w:hAnsi="Consolas" w:cs="Consolas"/>
-          <w:color w:val="002B49"/>
-          <w:shd w:val="clear" w:color="auto" w:fill="EEF3F7"/>
-        </w:rPr>
-        <w:t>current-edition.ts</w:t>
-      </w:r>
-      <w:r>
-        <w:t>); cambia anche la scritta in copertina.</w:t>
+        <w:t>: crea il PDF di un altro anno (di default l'anno dell'edizione impostato nel pannello); cambia anche la scritta in copertina.</w:t>
       </w:r>
     </w:p>
     <w:p>
@@ -7302,7 +7107,7 @@
         <w:pStyle w:val="Titolo1"/>
         <w:pageBreakBefore/>
       </w:pPr>
-      <w:bookmarkStart w:id="26" w:name="_Toc241915725"/>
+      <w:bookmarkStart w:id="26" w:name="_Toc243217782"/>
       <w:r>
         <w:lastRenderedPageBreak/>
         <w:t>7. Pubblicare una nuova edizione nell'Archivio</w:t>
@@ -7314,17 +7119,17 @@
         <w:spacing w:after="120" w:line="290" w:lineRule="auto"/>
       </w:pPr>
       <w:r>
-        <w:t xml:space="preserve">Il PDF creato nel capitolo 6 resta sul tuo computer finché non lo aggiungi all'Archivio. Una volta pubblicato, il pulsante </w:t>
-      </w:r>
-      <w:r>
-        <w:rPr>
-          <w:b/>
-          <w:bCs/>
-        </w:rPr>
-        <w:t>Scarica l'ultima edizione</w:t>
-      </w:r>
-      <w:r>
-        <w:t xml:space="preserve"> della Home scaricherà automaticamente questa edizione (la più recente).</w:t>
+        <w:t xml:space="preserve">Il PDF creato nel capitolo 6 resta sul tuo computer finché non lo aggiungi all'Archivio. Una volta pubblicato, la nuova edizione compare nell'Archivio e nell'elenco </w:t>
+      </w:r>
+      <w:r>
+        <w:rPr>
+          <w:b/>
+          <w:bCs/>
+        </w:rPr>
+        <w:t>Edizione da scaricare</w:t>
+      </w:r>
+      <w:r>
+        <w:t xml:space="preserve"> del pannello: sceglila lì perché la Home la proponga (capitolo 5).</w:t>
       </w:r>
     </w:p>
     <w:p>
@@ -7428,7 +7233,49 @@
         <w:t>src/config/editions.ts</w:t>
       </w:r>
       <w:r>
-        <w:t xml:space="preserve"> e aggiungi un nuovo blocco nell'elenco, sotto quello dell'edizione precedente, seguendo questo modello (attenzione a parentesi e virgole):</w:t>
+        <w:t xml:space="preserve">. Contiene </w:t>
+      </w:r>
+      <w:r>
+        <w:rPr>
+          <w:b/>
+          <w:bCs/>
+        </w:rPr>
+        <w:t>un solo elenco</w:t>
+      </w:r>
+      <w:r>
+        <w:t xml:space="preserve">, che inizia con </w:t>
+      </w:r>
+      <w:r>
+        <w:rPr>
+          <w:rFonts w:ascii="Consolas" w:eastAsia="Consolas" w:hAnsi="Consolas" w:cs="Consolas"/>
+          <w:color w:val="002B49"/>
+          <w:shd w:val="clear" w:color="auto" w:fill="EEF3F7"/>
+        </w:rPr>
+        <w:t>export const editions</w:t>
+      </w:r>
+      <w:r>
+        <w:t xml:space="preserve"> e finisce con </w:t>
+      </w:r>
+      <w:r>
+        <w:rPr>
+          <w:rFonts w:ascii="Consolas" w:eastAsia="Consolas" w:hAnsi="Consolas" w:cs="Consolas"/>
+          <w:color w:val="002B49"/>
+          <w:shd w:val="clear" w:color="auto" w:fill="EEF3F7"/>
+        </w:rPr>
+        <w:t>];</w:t>
+      </w:r>
+      <w:r>
+        <w:t xml:space="preserve">. </w:t>
+      </w:r>
+      <w:r>
+        <w:rPr>
+          <w:b/>
+          <w:bCs/>
+        </w:rPr>
+        <w:t>Dentro</w:t>
+      </w:r>
+      <w:r>
+        <w:t xml:space="preserve"> quell'elenco, subito dopo il blocco dell'edizione precedente, aggiungi un nuovo blocco seguendo questo modello (attenzione a parentesi e virgole):</w:t>
       </w:r>
     </w:p>
     <w:p>
@@ -7574,6 +7421,40 @@
         <w:spacing w:after="80" w:line="290" w:lineRule="auto"/>
       </w:pPr>
       <w:r>
+        <w:t xml:space="preserve">Non scrivere una seconda riga </w:t>
+      </w:r>
+      <w:r>
+        <w:rPr>
+          <w:rFonts w:ascii="Consolas" w:eastAsia="Consolas" w:hAnsi="Consolas" w:cs="Consolas"/>
+          <w:color w:val="002B49"/>
+          <w:shd w:val="clear" w:color="auto" w:fill="EEF3F7"/>
+        </w:rPr>
+        <w:t>export const editions</w:t>
+      </w:r>
+      <w:r>
+        <w:t xml:space="preserve"> e non aggiungere edizioni che non hanno ancora il PDF: il sito non si pubblicherebbe (su Vercel la pubblicazione risulterebbe </w:t>
+      </w:r>
+      <w:r>
+        <w:rPr>
+          <w:b/>
+          <w:bCs/>
+        </w:rPr>
+        <w:t>Error</w:t>
+      </w:r>
+      <w:r>
+        <w:t>).</w:t>
+      </w:r>
+    </w:p>
+    <w:p>
+      <w:pPr>
+        <w:pStyle w:val="Paragrafoelenco"/>
+        <w:numPr>
+          <w:ilvl w:val="0"/>
+          <w:numId w:val="13"/>
+        </w:numPr>
+        <w:spacing w:after="80" w:line="290" w:lineRule="auto"/>
+      </w:pPr>
+      <w:r>
         <w:t>Salva e pubblica (capitolo 3).</w:t>
       </w:r>
     </w:p>
@@ -7603,7 +7484,7 @@
         <w:pStyle w:val="Titolo1"/>
         <w:pageBreakBefore/>
       </w:pPr>
-      <w:bookmarkStart w:id="27" w:name="_Toc241915726"/>
+      <w:bookmarkStart w:id="27" w:name="_Toc243217783"/>
       <w:r>
         <w:lastRenderedPageBreak/>
         <w:t>8. Altre modifiche frequenti</w:t>
@@ -7614,7 +7495,7 @@
       <w:pPr>
         <w:pStyle w:val="Titolo2"/>
       </w:pPr>
-      <w:bookmarkStart w:id="28" w:name="_Toc241915727"/>
+      <w:bookmarkStart w:id="28" w:name="_Toc243217784"/>
       <w:r>
         <w:t>Cambiare la foto di sfondo della Home</w:t>
       </w:r>
@@ -7698,7 +7579,7 @@
       <w:pPr>
         <w:pStyle w:val="Titolo2"/>
       </w:pPr>
-      <w:bookmarkStart w:id="29" w:name="_Toc241915728"/>
+      <w:bookmarkStart w:id="29" w:name="_Toc243217785"/>
       <w:r>
         <w:t>Cambiare i testi del sito</w:t>
       </w:r>
@@ -7738,7 +7619,7 @@
           <w:left w:w="10" w:type="dxa"/>
           <w:right w:w="10" w:type="dxa"/>
         </w:tblCellMar>
-        <w:tblLook w:val="04A0" w:firstRow="1" w:lastRow="0" w:firstColumn="1" w:lastColumn="0" w:noHBand="0" w:noVBand="1"/>
+        <w:tblLook w:val="0000" w:firstRow="0" w:lastRow="0" w:firstColumn="0" w:lastColumn="0" w:noHBand="0" w:noVBand="0"/>
       </w:tblPr>
       <w:tblGrid>
         <w:gridCol w:w="4600"/>
@@ -8400,7 +8281,7 @@
         <w:pStyle w:val="Titolo1"/>
         <w:pageBreakBefore/>
       </w:pPr>
-      <w:bookmarkStart w:id="30" w:name="_Toc241915729"/>
+      <w:bookmarkStart w:id="30" w:name="_Toc243217786"/>
       <w:r>
         <w:lastRenderedPageBreak/>
         <w:t>9. Password, chiavi e variabili d'ambiente</w:t>
@@ -8481,7 +8362,7 @@
           <w:left w:w="10" w:type="dxa"/>
           <w:right w:w="10" w:type="dxa"/>
         </w:tblCellMar>
-        <w:tblLook w:val="04A0" w:firstRow="1" w:lastRow="0" w:firstColumn="1" w:lastColumn="0" w:noHBand="0" w:noVBand="1"/>
+        <w:tblLook w:val="0000" w:firstRow="0" w:lastRow="0" w:firstColumn="0" w:lastColumn="0" w:noHBand="0" w:noVBand="0"/>
       </w:tblPr>
       <w:tblGrid>
         <w:gridCol w:w="2900"/>
@@ -9086,7 +8967,7 @@
       <w:pPr>
         <w:pStyle w:val="Titolo2"/>
       </w:pPr>
-      <w:bookmarkStart w:id="31" w:name="_Toc241915730"/>
+      <w:bookmarkStart w:id="31" w:name="_Toc243217787"/>
       <w:r>
         <w:t>Recuperare il file .env.local su un nuovo computer</w:t>
       </w:r>
@@ -9305,7 +9186,7 @@
         <w:pStyle w:val="Titolo1"/>
         <w:pageBreakBefore/>
       </w:pPr>
-      <w:bookmarkStart w:id="32" w:name="_Toc241915731"/>
+      <w:bookmarkStart w:id="32" w:name="_Toc243217788"/>
       <w:r>
         <w:lastRenderedPageBreak/>
         <w:t>10. Privacy e regole</w:t>
@@ -9459,7 +9340,7 @@
         <w:pStyle w:val="Titolo1"/>
         <w:pageBreakBefore/>
       </w:pPr>
-      <w:bookmarkStart w:id="33" w:name="_Toc241915732"/>
+      <w:bookmarkStart w:id="33" w:name="_Toc243217789"/>
       <w:r>
         <w:lastRenderedPageBreak/>
         <w:t>11. Se qualcosa va storto</w:t>
@@ -9481,7 +9362,7 @@
           <w:left w:w="10" w:type="dxa"/>
           <w:right w:w="10" w:type="dxa"/>
         </w:tblCellMar>
-        <w:tblLook w:val="04A0" w:firstRow="1" w:lastRow="0" w:firstColumn="1" w:lastColumn="0" w:noHBand="0" w:noVBand="1"/>
+        <w:tblLook w:val="0000" w:firstRow="0" w:lastRow="0" w:firstColumn="0" w:lastColumn="0" w:noHBand="0" w:noVBand="0"/>
       </w:tblPr>
       <w:tblGrid>
         <w:gridCol w:w="3400"/>
@@ -9588,7 +9469,7 @@
               <w:spacing w:line="276" w:lineRule="auto"/>
             </w:pPr>
             <w:r>
-              <w:t>Il sito online non si è aggiornato dopo la pubblicazione.</w:t>
+              <w:t>Ho modificato dei file e su Vercel la pubblicazione risulta Error.</w:t>
             </w:r>
           </w:p>
         </w:tc>
@@ -9613,7 +9494,28 @@
               <w:spacing w:line="276" w:lineRule="auto"/>
             </w:pPr>
             <w:r>
-              <w:t>Aspetta 2-3 minuti e ricarica la pagina. Poi controlla su Vercel → Deployments (capitolo 3). Se c'è Error, manda i Logs a chi ti aiuta: nel frattempo il sito resta com'era.</w:t>
+              <w:t xml:space="preserve">C'è un errore di scrittura in un file (spesso una parentesi o una virgola, o un elenco ripetuto in </w:t>
+            </w:r>
+            <w:r>
+              <w:rPr>
+                <w:rFonts w:ascii="Consolas" w:eastAsia="Consolas" w:hAnsi="Consolas" w:cs="Consolas"/>
+                <w:color w:val="002B49"/>
+                <w:shd w:val="clear" w:color="auto" w:fill="EEF3F7"/>
+              </w:rPr>
+              <w:t>editions.ts</w:t>
+            </w:r>
+            <w:r>
+              <w:t xml:space="preserve">). Il sito online resta com'era, quindi nessun danno per i visitatori. Apri la pubblicazione su Vercel, clicca </w:t>
+            </w:r>
+            <w:r>
+              <w:rPr>
+                <w:b/>
+                <w:bCs/>
+              </w:rPr>
+              <w:t>Building</w:t>
+            </w:r>
+            <w:r>
+              <w:t xml:space="preserve"> per leggere l'errore: indica il file e la riga. Se non capisci, chiedi aiuto prima di riprovare.</w:t>
             </w:r>
           </w:p>
         </w:tc>
@@ -9646,7 +9548,7 @@
               <w:spacing w:line="276" w:lineRule="auto"/>
             </w:pPr>
             <w:r>
-              <w:t>Una foto approvata non compare nella galleria.</w:t>
+              <w:t>Il sito online non si è aggiornato dopo la pubblicazione.</w:t>
             </w:r>
           </w:p>
         </w:tc>
@@ -9671,7 +9573,7 @@
               <w:spacing w:line="276" w:lineRule="auto"/>
             </w:pPr>
             <w:r>
-              <w:t>Ricarica la pagina. Controlla nel pannello che sia nella sezione giusta e nella scheda Approvate. Le foto dell'Archivio non compaiono mai sul sito: vanno solo nel PDF.</w:t>
+              <w:t>Aspetta 2-3 minuti e ricarica la pagina. Poi controlla su Vercel → Deployments (capitolo 3). Se c'è Error, manda i Logs a chi ti aiuta: nel frattempo il sito resta com'era.</w:t>
             </w:r>
           </w:p>
         </w:tc>
@@ -9704,7 +9606,7 @@
               <w:spacing w:line="276" w:lineRule="auto"/>
             </w:pPr>
             <w:r>
-              <w:t>Il pannello dice che manca ADMIN_PASSWORD_HASH.</w:t>
+              <w:t>Una foto approvata non compare nella galleria.</w:t>
             </w:r>
           </w:p>
         </w:tc>
@@ -9729,7 +9631,7 @@
               <w:spacing w:line="276" w:lineRule="auto"/>
             </w:pPr>
             <w:r>
-              <w:t>L'impronta della password non è impostata su Vercel, oppure dopo averla impostata non hai fatto il Redeploy (capitolo 4).</w:t>
+              <w:t>Ricarica la pagina. Controlla nel pannello che sia nella sezione giusta e nella scheda Approvate. Le foto dell'Archivio non compaiono mai sul sito: vanno solo nel PDF.</w:t>
             </w:r>
           </w:p>
         </w:tc>
@@ -9762,7 +9664,7 @@
               <w:spacing w:line="276" w:lineRule="auto"/>
             </w:pPr>
             <w:r>
-              <w:t>La password giusta viene rifiutata.</w:t>
+              <w:t>Il pannello dice che manca ADMIN_PASSWORD_HASH.</w:t>
             </w:r>
           </w:p>
         </w:tc>
@@ -9787,18 +9689,7 @@
               <w:spacing w:line="276" w:lineRule="auto"/>
             </w:pPr>
             <w:r>
-              <w:t xml:space="preserve">Controlla di aver incollato su Vercel l'impronta intera (inizia con </w:t>
-            </w:r>
-            <w:r>
-              <w:rPr>
-                <w:rFonts w:ascii="Consolas" w:eastAsia="Consolas" w:hAnsi="Consolas" w:cs="Consolas"/>
-                <w:color w:val="002B49"/>
-                <w:shd w:val="clear" w:color="auto" w:fill="EEF3F7"/>
-              </w:rPr>
-              <w:t>pbkdf2-sha256:</w:t>
-            </w:r>
-            <w:r>
-              <w:t xml:space="preserve"> e non deve avere spazi in più) e di aver fatto il Redeploy.</w:t>
+              <w:t>L'impronta della password non è impostata su Vercel, oppure dopo averla impostata non hai fatto il Redeploy (capitolo 4).</w:t>
             </w:r>
           </w:p>
         </w:tc>
@@ -9831,7 +9722,7 @@
               <w:spacing w:line="276" w:lineRule="auto"/>
             </w:pPr>
             <w:r>
-              <w:t>Ho dimenticato la password del pannello.</w:t>
+              <w:t>La password giusta viene rifiutata.</w:t>
             </w:r>
           </w:p>
         </w:tc>
@@ -9856,7 +9747,7 @@
               <w:spacing w:line="276" w:lineRule="auto"/>
             </w:pPr>
             <w:r>
-              <w:t xml:space="preserve">Non si può recuperare, perché non è salvata da nessuna parte: creane una nuova con </w:t>
+              <w:t xml:space="preserve">Controlla di aver incollato su Vercel l'impronta intera (inizia con </w:t>
             </w:r>
             <w:r>
               <w:rPr>
@@ -9864,10 +9755,10 @@
                 <w:color w:val="002B49"/>
                 <w:shd w:val="clear" w:color="auto" w:fill="EEF3F7"/>
               </w:rPr>
-              <w:t>npm run admin:hash</w:t>
-            </w:r>
-            <w:r>
-              <w:t xml:space="preserve"> (capitolo 4), aggiorna l'impronta su Vercel e fai il Redeploy.</w:t>
+              <w:t>pbkdf2-sha256:</w:t>
+            </w:r>
+            <w:r>
+              <w:t xml:space="preserve"> e non deve avere spazi in più) e di aver fatto il Redeploy.</w:t>
             </w:r>
           </w:p>
         </w:tc>
@@ -9900,7 +9791,7 @@
               <w:spacing w:line="276" w:lineRule="auto"/>
             </w:pPr>
             <w:r>
-              <w:t>Una persona dice che il sito rifiuta la sua foto.</w:t>
+              <w:t>Ho dimenticato la password del pannello.</w:t>
             </w:r>
           </w:p>
         </w:tc>
@@ -9925,7 +9816,18 @@
               <w:spacing w:line="276" w:lineRule="auto"/>
             </w:pPr>
             <w:r>
-              <w:t>Il messaggio sul sito spiega il motivo: email non Unipi, immagine oltre 5 MB, formato non supportato (si accettano solo JPG, PNG e WebP: le foto HEIC dell'iPhone vanno prima convertite, ma di solito l'iPhone lo fa da solo), limite di invii raggiunto, oppure invii chiusi. Per l'Archivio il limite è 1 singola e 3 di gruppo a persona.</w:t>
+              <w:t xml:space="preserve">Non si può recuperare, perché non è salvata da nessuna parte: creane una nuova con </w:t>
+            </w:r>
+            <w:r>
+              <w:rPr>
+                <w:rFonts w:ascii="Consolas" w:eastAsia="Consolas" w:hAnsi="Consolas" w:cs="Consolas"/>
+                <w:color w:val="002B49"/>
+                <w:shd w:val="clear" w:color="auto" w:fill="EEF3F7"/>
+              </w:rPr>
+              <w:t>npm run admin:hash</w:t>
+            </w:r>
+            <w:r>
+              <w:t xml:space="preserve"> (capitolo 4), aggiorna l'impronta su Vercel e fai il Redeploy.</w:t>
             </w:r>
           </w:p>
         </w:tc>
@@ -9958,7 +9860,7 @@
               <w:spacing w:line="276" w:lineRule="auto"/>
             </w:pPr>
             <w:r>
-              <w:t>Lo script del PDF dice "Nessuna foto approvata".</w:t>
+              <w:t>Una persona dice che il sito rifiuta la sua foto.</w:t>
             </w:r>
           </w:p>
         </w:tc>
@@ -9983,7 +9885,7 @@
               <w:spacing w:line="276" w:lineRule="auto"/>
             </w:pPr>
             <w:r>
-              <w:t>Nel pannello, sezione Archivio, controlla di aver approvato le foto. Verifica anche l'anno (capitolo 5 e opzione --year).</w:t>
+              <w:t>Il messaggio sul sito spiega il motivo: email non Unipi, immagine oltre 5 MB, formato non supportato (si accettano solo JPG, PNG e WebP: le foto HEIC dell'iPhone vanno prima convertite, ma di solito l'iPhone lo fa da solo), limite di invii raggiunto, oppure invii chiusi. Per l'Archivio il limite è 1 singola e 3 di gruppo a persona.</w:t>
             </w:r>
           </w:p>
         </w:tc>
@@ -10016,7 +9918,7 @@
               <w:spacing w:line="276" w:lineRule="auto"/>
             </w:pPr>
             <w:r>
-              <w:t>Il terminale dice che un comando non esiste (npm, git, vercel).</w:t>
+              <w:t>Lo script del PDF dice "Nessuna foto approvata".</w:t>
             </w:r>
           </w:p>
         </w:tc>
@@ -10041,7 +9943,7 @@
               <w:spacing w:line="276" w:lineRule="auto"/>
             </w:pPr>
             <w:r>
-              <w:t>Manca il programma: installalo (capitolo 2), poi chiudi e riapri il terminale.</w:t>
+              <w:t>Nel pannello, sezione Archivio, controlla di aver approvato le foto. Verifica anche l'anno (capitolo 5 e opzione --year).</w:t>
             </w:r>
           </w:p>
         </w:tc>
@@ -10074,18 +9976,7 @@
               <w:spacing w:line="276" w:lineRule="auto"/>
             </w:pPr>
             <w:r>
-              <w:t xml:space="preserve">Il comando </w:t>
-            </w:r>
-            <w:r>
-              <w:rPr>
-                <w:rFonts w:ascii="Consolas" w:eastAsia="Consolas" w:hAnsi="Consolas" w:cs="Consolas"/>
-                <w:color w:val="002B49"/>
-                <w:shd w:val="clear" w:color="auto" w:fill="EEF3F7"/>
-              </w:rPr>
-              <w:t>npm run db:push</w:t>
-            </w:r>
-            <w:r>
-              <w:t xml:space="preserve"> si blocca con un errore.</w:t>
+              <w:t>Il terminale dice che un comando non esiste (npm, git, vercel).</w:t>
             </w:r>
           </w:p>
         </w:tc>
@@ -10110,6 +10001,75 @@
               <w:spacing w:line="276" w:lineRule="auto"/>
             </w:pPr>
             <w:r>
+              <w:t>Manca il programma: installalo (capitolo 2), poi chiudi e riapri il terminale.</w:t>
+            </w:r>
+          </w:p>
+        </w:tc>
+      </w:tr>
+      <w:tr>
+        <w:tblPrEx>
+          <w:tblCellMar>
+            <w:top w:w="0" w:type="dxa"/>
+            <w:bottom w:w="0" w:type="dxa"/>
+          </w:tblCellMar>
+        </w:tblPrEx>
+        <w:tc>
+          <w:tcPr>
+            <w:tcW w:w="3400" w:type="dxa"/>
+            <w:tcBorders>
+              <w:top w:val="single" w:sz="4" w:space="0" w:color="C9D6E2"/>
+              <w:left w:val="single" w:sz="4" w:space="0" w:color="C9D6E2"/>
+              <w:bottom w:val="single" w:sz="4" w:space="0" w:color="C9D6E2"/>
+              <w:right w:val="single" w:sz="4" w:space="0" w:color="C9D6E2"/>
+            </w:tcBorders>
+            <w:tcMar>
+              <w:top w:w="80" w:type="dxa"/>
+              <w:left w:w="120" w:type="dxa"/>
+              <w:bottom w:w="80" w:type="dxa"/>
+              <w:right w:w="120" w:type="dxa"/>
+            </w:tcMar>
+          </w:tcPr>
+          <w:p>
+            <w:pPr>
+              <w:spacing w:line="276" w:lineRule="auto"/>
+            </w:pPr>
+            <w:r>
+              <w:t xml:space="preserve">Il comando </w:t>
+            </w:r>
+            <w:r>
+              <w:rPr>
+                <w:rFonts w:ascii="Consolas" w:eastAsia="Consolas" w:hAnsi="Consolas" w:cs="Consolas"/>
+                <w:color w:val="002B49"/>
+                <w:shd w:val="clear" w:color="auto" w:fill="EEF3F7"/>
+              </w:rPr>
+              <w:t>npm run db:push</w:t>
+            </w:r>
+            <w:r>
+              <w:t xml:space="preserve"> si blocca con un errore.</w:t>
+            </w:r>
+          </w:p>
+        </w:tc>
+        <w:tc>
+          <w:tcPr>
+            <w:tcW w:w="5626" w:type="dxa"/>
+            <w:tcBorders>
+              <w:top w:val="single" w:sz="4" w:space="0" w:color="C9D6E2"/>
+              <w:left w:val="single" w:sz="4" w:space="0" w:color="C9D6E2"/>
+              <w:bottom w:val="single" w:sz="4" w:space="0" w:color="C9D6E2"/>
+              <w:right w:val="single" w:sz="4" w:space="0" w:color="C9D6E2"/>
+            </w:tcBorders>
+            <w:tcMar>
+              <w:top w:w="80" w:type="dxa"/>
+              <w:left w:w="120" w:type="dxa"/>
+              <w:bottom w:w="80" w:type="dxa"/>
+              <w:right w:w="120" w:type="dxa"/>
+            </w:tcMar>
+          </w:tcPr>
+          <w:p>
+            <w:pPr>
+              <w:spacing w:line="276" w:lineRule="auto"/>
+            </w:pPr>
+            <w:r>
               <w:t>È un problema noto dello strumento con questo database: non usarlo. Le modifiche alla struttura del database vanno fatte da chi sviluppa il sito.</w:t>
             </w:r>
           </w:p>
@@ -10126,7 +10086,7 @@
         <w:pStyle w:val="Titolo1"/>
         <w:pageBreakBefore/>
       </w:pPr>
-      <w:bookmarkStart w:id="34" w:name="_Toc241915733"/>
+      <w:bookmarkStart w:id="34" w:name="_Toc243217790"/>
       <w:r>
         <w:lastRenderedPageBreak/>
         <w:t>12. Promemoria di ogni anno</w:t>
@@ -10158,18 +10118,7 @@
         <w:t>Prima di aprire gli invii</w:t>
       </w:r>
       <w:r>
-        <w:t xml:space="preserve">: aggiorna anno e date in </w:t>
-      </w:r>
-      <w:r>
-        <w:rPr>
-          <w:rFonts w:ascii="Consolas" w:eastAsia="Consolas" w:hAnsi="Consolas" w:cs="Consolas"/>
-          <w:color w:val="002B49"/>
-          <w:shd w:val="clear" w:color="auto" w:fill="EEF3F7"/>
-        </w:rPr>
-        <w:t>current-edition.ts</w:t>
-      </w:r>
-      <w:r>
-        <w:t xml:space="preserve"> e pubblica (capitolo 5).</w:t>
+        <w:t>: nel pannello, riquadro Stato del sito, scegli Invio foto con anno e date dell'edizione e premi Salva (capitolo 5).</w:t>
       </w:r>
     </w:p>
     <w:p>
@@ -10246,7 +10195,17 @@
         <w:spacing w:after="80" w:line="290" w:lineRule="auto"/>
       </w:pPr>
       <w:r>
-        <w:t>Pubblica il PDF nell'Archivio con la sua copertina (capitolo 7). Da quel momento la Home scarica la nuova edizione.</w:t>
+        <w:t xml:space="preserve">Pubblica il PDF nell'Archivio con la sua copertina (capitolo 7), poi nel pannello scegli </w:t>
+      </w:r>
+      <w:r>
+        <w:rPr>
+          <w:b/>
+          <w:bCs/>
+        </w:rPr>
+        <w:t>Scarica edizione</w:t>
+      </w:r>
+      <w:r>
+        <w:t xml:space="preserve"> con la nuova edizione e premi Salva.</w:t>
       </w:r>
     </w:p>
     <w:p>
@@ -10381,10 +10340,10 @@
 <file path=word/numbering.xml><?xml version="1.0" encoding="utf-8"?>
 <w:numbering xmlns:wpc="http://schemas.microsoft.com/office/word/2010/wordprocessingCanvas" xmlns:cx="http://schemas.microsoft.com/office/drawing/2014/chartex" xmlns:cx1="http://schemas.microsoft.com/office/drawing/2015/9/8/chartex" xmlns:cx2="http://schemas.microsoft.com/office/drawing/2015/10/21/chartex" xmlns:cx3="http://schemas.microsoft.com/office/drawing/2016/5/9/chartex" xmlns:cx4="http://schemas.microsoft.com/office/drawing/2016/5/10/chartex" xmlns:cx5="http://schemas.microsoft.com/office/drawing/2016/5/11/chartex" xmlns:cx6="http://schemas.microsoft.com/office/drawing/2016/5/12/chartex" xmlns:cx7="http://schemas.microsoft.com/office/drawing/2016/5/13/chartex" xmlns:cx8="http://schemas.microsoft.com/office/drawing/2016/5/14/chartex" xmlns:mc="http://schemas.openxmlformats.org/markup-compatibility/2006" xmlns:aink="http://schemas.microsoft.com/office/drawing/2016/ink" xmlns:am3d="http://schemas.microsoft.com/office/drawing/2017/model3d" xmlns:o="urn:schemas-microsoft-com:office:office" xmlns:oel="http://schemas.microsoft.com/office/2019/extlst" xmlns:r="http://schemas.openxmlformats.org/officeDocument/2006/relationships" xmlns:m="http://schemas.openxmlformats.org/officeDocument/2006/math" xmlns:v="urn:schemas-microsoft-com:vml" xmlns:wp14="http://schemas.microsoft.com/office/word/2010/wordprocessingDrawing" xmlns:wp="http://schemas.openxmlformats.org/drawingml/2006/wordprocessingDrawing" xmlns:w10="urn:schemas-microsoft-com:office:word" xmlns:w="http://schemas.openxmlformats.org/wordprocessingml/2006/main" xmlns:w14="http://schemas.microsoft.com/office/word/2010/wordml" xmlns:w15="http://schemas.microsoft.com/office/word/2012/wordml" xmlns:w16cex="http://schemas.microsoft.com/office/word/2018/wordml/cex" xmlns:w16cid="http://schemas.microsoft.com/office/word/2016/wordml/cid" xmlns:w16="http://schemas.microsoft.com/office/word/2018/wordml" xmlns:w16sdtdh="http://schemas.microsoft.com/office/word/2020/wordml/sdtdatahash" xmlns:w16se="http://schemas.microsoft.com/office/word/2015/wordml/symex" xmlns:wpg="http://schemas.microsoft.com/office/word/2010/wordprocessingGroup" xmlns:wpi="http://schemas.microsoft.com/office/word/2010/wordprocessingInk" xmlns:wne="http://schemas.microsoft.com/office/word/2006/wordml" xmlns:wps="http://schemas.microsoft.com/office/word/2010/wordprocessingShape" mc:Ignorable="w14 w15 w16se w16cid w16 w16cex w16sdtdh wp14">
   <w:abstractNum w:abstractNumId="0" w15:restartNumberingAfterBreak="0">
-    <w:nsid w:val="20D670ED"/>
+    <w:nsid w:val="0A534ADD"/>
     <w:multiLevelType w:val="hybridMultilevel"/>
-    <w:tmpl w:val="E424B8D2"/>
-    <w:lvl w:ilvl="0" w:tplc="D794F624">
+    <w:tmpl w:val="9992F19C"/>
+    <w:lvl w:ilvl="0" w:tplc="8788CE1A">
       <w:start w:val="1"/>
       <w:numFmt w:val="decimal"/>
       <w:lvlText w:val="%1."/>
@@ -10398,138 +10357,52 @@
         <w:color w:val="002B49"/>
       </w:rPr>
     </w:lvl>
-    <w:lvl w:ilvl="1" w:tplc="89E45C98">
+    <w:lvl w:ilvl="1" w:tplc="798EBF5A">
       <w:numFmt w:val="decimal"/>
       <w:lvlText w:val=""/>
       <w:lvlJc w:val="left"/>
     </w:lvl>
-    <w:lvl w:ilvl="2" w:tplc="A48E5DB8">
+    <w:lvl w:ilvl="2" w:tplc="6ED8BDC8">
       <w:numFmt w:val="decimal"/>
       <w:lvlText w:val=""/>
       <w:lvlJc w:val="left"/>
     </w:lvl>
-    <w:lvl w:ilvl="3" w:tplc="BAAC0648">
+    <w:lvl w:ilvl="3" w:tplc="4650FF40">
       <w:numFmt w:val="decimal"/>
       <w:lvlText w:val=""/>
       <w:lvlJc w:val="left"/>
     </w:lvl>
-    <w:lvl w:ilvl="4" w:tplc="3C329932">
+    <w:lvl w:ilvl="4" w:tplc="E82456C0">
       <w:numFmt w:val="decimal"/>
       <w:lvlText w:val=""/>
       <w:lvlJc w:val="left"/>
     </w:lvl>
-    <w:lvl w:ilvl="5" w:tplc="BC70A7AC">
+    <w:lvl w:ilvl="5" w:tplc="6FB04930">
       <w:numFmt w:val="decimal"/>
       <w:lvlText w:val=""/>
       <w:lvlJc w:val="left"/>
     </w:lvl>
-    <w:lvl w:ilvl="6" w:tplc="ECA884D6">
+    <w:lvl w:ilvl="6" w:tplc="1BD04B84">
       <w:numFmt w:val="decimal"/>
       <w:lvlText w:val=""/>
       <w:lvlJc w:val="left"/>
     </w:lvl>
-    <w:lvl w:ilvl="7" w:tplc="6610F902">
+    <w:lvl w:ilvl="7" w:tplc="7770A760">
       <w:numFmt w:val="decimal"/>
       <w:lvlText w:val=""/>
       <w:lvlJc w:val="left"/>
     </w:lvl>
-    <w:lvl w:ilvl="8" w:tplc="48C06C06">
+    <w:lvl w:ilvl="8" w:tplc="A686E450">
       <w:numFmt w:val="decimal"/>
       <w:lvlText w:val=""/>
       <w:lvlJc w:val="left"/>
     </w:lvl>
   </w:abstractNum>
   <w:abstractNum w:abstractNumId="1" w15:restartNumberingAfterBreak="0">
-    <w:nsid w:val="24B57F82"/>
+    <w:nsid w:val="12A336E1"/>
     <w:multiLevelType w:val="hybridMultilevel"/>
-    <w:tmpl w:val="F73C3EF4"/>
-    <w:lvl w:ilvl="0" w:tplc="71DA4E84">
-      <w:start w:val="1"/>
-      <w:numFmt w:val="bullet"/>
-      <w:lvlText w:val="●"/>
-      <w:lvlJc w:val="left"/>
-      <w:pPr>
-        <w:ind w:left="720" w:hanging="360"/>
-      </w:pPr>
-    </w:lvl>
-    <w:lvl w:ilvl="1" w:tplc="B1B03188">
-      <w:start w:val="1"/>
-      <w:numFmt w:val="bullet"/>
-      <w:lvlText w:val="○"/>
-      <w:lvlJc w:val="left"/>
-      <w:pPr>
-        <w:ind w:left="1440" w:hanging="360"/>
-      </w:pPr>
-    </w:lvl>
-    <w:lvl w:ilvl="2" w:tplc="A15CB96E">
-      <w:start w:val="1"/>
-      <w:numFmt w:val="bullet"/>
-      <w:lvlText w:val="■"/>
-      <w:lvlJc w:val="left"/>
-      <w:pPr>
-        <w:ind w:left="2160" w:hanging="360"/>
-      </w:pPr>
-    </w:lvl>
-    <w:lvl w:ilvl="3" w:tplc="44480360">
-      <w:start w:val="1"/>
-      <w:numFmt w:val="bullet"/>
-      <w:lvlText w:val="●"/>
-      <w:lvlJc w:val="left"/>
-      <w:pPr>
-        <w:ind w:left="2880" w:hanging="360"/>
-      </w:pPr>
-    </w:lvl>
-    <w:lvl w:ilvl="4" w:tplc="EA0A19B4">
-      <w:start w:val="1"/>
-      <w:numFmt w:val="bullet"/>
-      <w:lvlText w:val="○"/>
-      <w:lvlJc w:val="left"/>
-      <w:pPr>
-        <w:ind w:left="3600" w:hanging="360"/>
-      </w:pPr>
-    </w:lvl>
-    <w:lvl w:ilvl="5" w:tplc="95F2D5A6">
-      <w:start w:val="1"/>
-      <w:numFmt w:val="bullet"/>
-      <w:lvlText w:val="■"/>
-      <w:lvlJc w:val="left"/>
-      <w:pPr>
-        <w:ind w:left="4320" w:hanging="360"/>
-      </w:pPr>
-    </w:lvl>
-    <w:lvl w:ilvl="6" w:tplc="EF96F204">
-      <w:start w:val="1"/>
-      <w:numFmt w:val="bullet"/>
-      <w:lvlText w:val="●"/>
-      <w:lvlJc w:val="left"/>
-      <w:pPr>
-        <w:ind w:left="5040" w:hanging="360"/>
-      </w:pPr>
-    </w:lvl>
-    <w:lvl w:ilvl="7" w:tplc="246EFEE8">
-      <w:start w:val="1"/>
-      <w:numFmt w:val="bullet"/>
-      <w:lvlText w:val="●"/>
-      <w:lvlJc w:val="left"/>
-      <w:pPr>
-        <w:ind w:left="5760" w:hanging="360"/>
-      </w:pPr>
-    </w:lvl>
-    <w:lvl w:ilvl="8" w:tplc="D7627D4A">
-      <w:start w:val="1"/>
-      <w:numFmt w:val="bullet"/>
-      <w:lvlText w:val="●"/>
-      <w:lvlJc w:val="left"/>
-      <w:pPr>
-        <w:ind w:left="6480" w:hanging="360"/>
-      </w:pPr>
-    </w:lvl>
-  </w:abstractNum>
-  <w:abstractNum w:abstractNumId="2" w15:restartNumberingAfterBreak="0">
-    <w:nsid w:val="4CD72A35"/>
-    <w:multiLevelType w:val="hybridMultilevel"/>
-    <w:tmpl w:val="F65EF4D8"/>
-    <w:lvl w:ilvl="0" w:tplc="C6740260">
+    <w:tmpl w:val="23469AEC"/>
+    <w:lvl w:ilvl="0" w:tplc="F942EB3C">
       <w:start w:val="1"/>
       <w:numFmt w:val="bullet"/>
       <w:lvlText w:val="•"/>
@@ -10541,144 +10414,230 @@
         <w:color w:val="0066B2"/>
       </w:rPr>
     </w:lvl>
-    <w:lvl w:ilvl="1" w:tplc="7AD85028">
+    <w:lvl w:ilvl="1" w:tplc="F7620182">
       <w:numFmt w:val="decimal"/>
       <w:lvlText w:val=""/>
       <w:lvlJc w:val="left"/>
     </w:lvl>
-    <w:lvl w:ilvl="2" w:tplc="99ACC4D2">
+    <w:lvl w:ilvl="2" w:tplc="55F4F026">
       <w:numFmt w:val="decimal"/>
       <w:lvlText w:val=""/>
       <w:lvlJc w:val="left"/>
     </w:lvl>
-    <w:lvl w:ilvl="3" w:tplc="4260F2F6">
+    <w:lvl w:ilvl="3" w:tplc="7C52C55E">
       <w:numFmt w:val="decimal"/>
       <w:lvlText w:val=""/>
       <w:lvlJc w:val="left"/>
     </w:lvl>
-    <w:lvl w:ilvl="4" w:tplc="8D50D95E">
+    <w:lvl w:ilvl="4" w:tplc="49CC9BB8">
       <w:numFmt w:val="decimal"/>
       <w:lvlText w:val=""/>
       <w:lvlJc w:val="left"/>
     </w:lvl>
-    <w:lvl w:ilvl="5" w:tplc="64D01F90">
+    <w:lvl w:ilvl="5" w:tplc="8A76679C">
       <w:numFmt w:val="decimal"/>
       <w:lvlText w:val=""/>
       <w:lvlJc w:val="left"/>
     </w:lvl>
-    <w:lvl w:ilvl="6" w:tplc="42F883BE">
+    <w:lvl w:ilvl="6" w:tplc="5BE0FEA8">
       <w:numFmt w:val="decimal"/>
       <w:lvlText w:val=""/>
       <w:lvlJc w:val="left"/>
     </w:lvl>
-    <w:lvl w:ilvl="7" w:tplc="749012DC">
+    <w:lvl w:ilvl="7" w:tplc="3D30C92E">
       <w:numFmt w:val="decimal"/>
       <w:lvlText w:val=""/>
       <w:lvlJc w:val="left"/>
     </w:lvl>
-    <w:lvl w:ilvl="8" w:tplc="F95C045A">
+    <w:lvl w:ilvl="8" w:tplc="630C2A20">
       <w:numFmt w:val="decimal"/>
       <w:lvlText w:val=""/>
       <w:lvlJc w:val="left"/>
     </w:lvl>
   </w:abstractNum>
-  <w:num w:numId="1" w16cid:durableId="750615673">
+  <w:abstractNum w:abstractNumId="2" w15:restartNumberingAfterBreak="0">
+    <w:nsid w:val="27866BD5"/>
+    <w:multiLevelType w:val="hybridMultilevel"/>
+    <w:tmpl w:val="39FAAB3C"/>
+    <w:lvl w:ilvl="0" w:tplc="A02AF866">
+      <w:start w:val="1"/>
+      <w:numFmt w:val="bullet"/>
+      <w:lvlText w:val="●"/>
+      <w:lvlJc w:val="left"/>
+      <w:pPr>
+        <w:ind w:left="720" w:hanging="360"/>
+      </w:pPr>
+    </w:lvl>
+    <w:lvl w:ilvl="1" w:tplc="F2261EC8">
+      <w:start w:val="1"/>
+      <w:numFmt w:val="bullet"/>
+      <w:lvlText w:val="○"/>
+      <w:lvlJc w:val="left"/>
+      <w:pPr>
+        <w:ind w:left="1440" w:hanging="360"/>
+      </w:pPr>
+    </w:lvl>
+    <w:lvl w:ilvl="2" w:tplc="421A2C80">
+      <w:start w:val="1"/>
+      <w:numFmt w:val="bullet"/>
+      <w:lvlText w:val="■"/>
+      <w:lvlJc w:val="left"/>
+      <w:pPr>
+        <w:ind w:left="2160" w:hanging="360"/>
+      </w:pPr>
+    </w:lvl>
+    <w:lvl w:ilvl="3" w:tplc="80CC7196">
+      <w:start w:val="1"/>
+      <w:numFmt w:val="bullet"/>
+      <w:lvlText w:val="●"/>
+      <w:lvlJc w:val="left"/>
+      <w:pPr>
+        <w:ind w:left="2880" w:hanging="360"/>
+      </w:pPr>
+    </w:lvl>
+    <w:lvl w:ilvl="4" w:tplc="EC08773E">
+      <w:start w:val="1"/>
+      <w:numFmt w:val="bullet"/>
+      <w:lvlText w:val="○"/>
+      <w:lvlJc w:val="left"/>
+      <w:pPr>
+        <w:ind w:left="3600" w:hanging="360"/>
+      </w:pPr>
+    </w:lvl>
+    <w:lvl w:ilvl="5" w:tplc="0442A362">
+      <w:start w:val="1"/>
+      <w:numFmt w:val="bullet"/>
+      <w:lvlText w:val="■"/>
+      <w:lvlJc w:val="left"/>
+      <w:pPr>
+        <w:ind w:left="4320" w:hanging="360"/>
+      </w:pPr>
+    </w:lvl>
+    <w:lvl w:ilvl="6" w:tplc="940034C8">
+      <w:start w:val="1"/>
+      <w:numFmt w:val="bullet"/>
+      <w:lvlText w:val="●"/>
+      <w:lvlJc w:val="left"/>
+      <w:pPr>
+        <w:ind w:left="5040" w:hanging="360"/>
+      </w:pPr>
+    </w:lvl>
+    <w:lvl w:ilvl="7" w:tplc="6D9A127E">
+      <w:start w:val="1"/>
+      <w:numFmt w:val="bullet"/>
+      <w:lvlText w:val="●"/>
+      <w:lvlJc w:val="left"/>
+      <w:pPr>
+        <w:ind w:left="5760" w:hanging="360"/>
+      </w:pPr>
+    </w:lvl>
+    <w:lvl w:ilvl="8" w:tplc="B8A87EB2">
+      <w:start w:val="1"/>
+      <w:numFmt w:val="bullet"/>
+      <w:lvlText w:val="●"/>
+      <w:lvlJc w:val="left"/>
+      <w:pPr>
+        <w:ind w:left="6480" w:hanging="360"/>
+      </w:pPr>
+    </w:lvl>
+  </w:abstractNum>
+  <w:num w:numId="1" w16cid:durableId="962423752">
+    <w:abstractNumId w:val="2"/>
+    <w:lvlOverride w:ilvl="0">
+      <w:startOverride w:val="1"/>
+    </w:lvlOverride>
+  </w:num>
+  <w:num w:numId="2" w16cid:durableId="929584321">
+    <w:abstractNumId w:val="0"/>
+    <w:lvlOverride w:ilvl="0">
+      <w:startOverride w:val="1"/>
+    </w:lvlOverride>
+  </w:num>
+  <w:num w:numId="3" w16cid:durableId="159077901">
     <w:abstractNumId w:val="1"/>
     <w:lvlOverride w:ilvl="0">
       <w:startOverride w:val="1"/>
     </w:lvlOverride>
   </w:num>
-  <w:num w:numId="2" w16cid:durableId="1226723053">
+  <w:num w:numId="4" w16cid:durableId="1549105666">
     <w:abstractNumId w:val="0"/>
     <w:lvlOverride w:ilvl="0">
       <w:startOverride w:val="1"/>
     </w:lvlOverride>
   </w:num>
-  <w:num w:numId="3" w16cid:durableId="970669113">
-    <w:abstractNumId w:val="2"/>
-    <w:lvlOverride w:ilvl="0">
-      <w:startOverride w:val="1"/>
-    </w:lvlOverride>
-  </w:num>
-  <w:num w:numId="4" w16cid:durableId="392823363">
+  <w:num w:numId="5" w16cid:durableId="1879780393">
     <w:abstractNumId w:val="0"/>
     <w:lvlOverride w:ilvl="0">
       <w:startOverride w:val="1"/>
     </w:lvlOverride>
   </w:num>
-  <w:num w:numId="5" w16cid:durableId="55016399">
+  <w:num w:numId="6" w16cid:durableId="465660923">
     <w:abstractNumId w:val="0"/>
     <w:lvlOverride w:ilvl="0">
       <w:startOverride w:val="1"/>
     </w:lvlOverride>
   </w:num>
-  <w:num w:numId="6" w16cid:durableId="200214350">
+  <w:num w:numId="7" w16cid:durableId="2077850860">
     <w:abstractNumId w:val="0"/>
     <w:lvlOverride w:ilvl="0">
       <w:startOverride w:val="1"/>
     </w:lvlOverride>
   </w:num>
-  <w:num w:numId="7" w16cid:durableId="1357387081">
+  <w:num w:numId="8" w16cid:durableId="1659655020">
     <w:abstractNumId w:val="0"/>
     <w:lvlOverride w:ilvl="0">
       <w:startOverride w:val="1"/>
     </w:lvlOverride>
   </w:num>
-  <w:num w:numId="8" w16cid:durableId="1853370167">
+  <w:num w:numId="9" w16cid:durableId="737047352">
     <w:abstractNumId w:val="0"/>
     <w:lvlOverride w:ilvl="0">
       <w:startOverride w:val="1"/>
     </w:lvlOverride>
   </w:num>
-  <w:num w:numId="9" w16cid:durableId="2025668061">
+  <w:num w:numId="10" w16cid:durableId="1027871637">
     <w:abstractNumId w:val="0"/>
     <w:lvlOverride w:ilvl="0">
       <w:startOverride w:val="1"/>
     </w:lvlOverride>
   </w:num>
-  <w:num w:numId="10" w16cid:durableId="1103841507">
+  <w:num w:numId="11" w16cid:durableId="133303644">
     <w:abstractNumId w:val="0"/>
     <w:lvlOverride w:ilvl="0">
       <w:startOverride w:val="1"/>
     </w:lvlOverride>
   </w:num>
-  <w:num w:numId="11" w16cid:durableId="1702126535">
+  <w:num w:numId="12" w16cid:durableId="154222781">
     <w:abstractNumId w:val="0"/>
     <w:lvlOverride w:ilvl="0">
       <w:startOverride w:val="1"/>
     </w:lvlOverride>
   </w:num>
-  <w:num w:numId="12" w16cid:durableId="24715560">
+  <w:num w:numId="13" w16cid:durableId="1329168209">
     <w:abstractNumId w:val="0"/>
     <w:lvlOverride w:ilvl="0">
       <w:startOverride w:val="1"/>
     </w:lvlOverride>
   </w:num>
-  <w:num w:numId="13" w16cid:durableId="639698407">
+  <w:num w:numId="14" w16cid:durableId="2076200423">
     <w:abstractNumId w:val="0"/>
     <w:lvlOverride w:ilvl="0">
       <w:startOverride w:val="1"/>
     </w:lvlOverride>
   </w:num>
-  <w:num w:numId="14" w16cid:durableId="1603949823">
+  <w:num w:numId="15" w16cid:durableId="2048290656">
     <w:abstractNumId w:val="0"/>
     <w:lvlOverride w:ilvl="0">
       <w:startOverride w:val="1"/>
     </w:lvlOverride>
   </w:num>
-  <w:num w:numId="15" w16cid:durableId="2048606337">
+  <w:num w:numId="16" w16cid:durableId="1836263342">
     <w:abstractNumId w:val="0"/>
     <w:lvlOverride w:ilvl="0">
       <w:startOverride w:val="1"/>
     </w:lvlOverride>
   </w:num>
-  <w:num w:numId="16" w16cid:durableId="867108805">
-    <w:abstractNumId w:val="0"/>
-    <w:lvlOverride w:ilvl="0">
-      <w:startOverride w:val="1"/>
-    </w:lvlOverride>
-  </w:num>
-  <w:num w:numId="17" w16cid:durableId="676007193">
+  <w:num w:numId="17" w16cid:durableId="1983926891">
     <w:abstractNumId w:val="0"/>
     <w:lvlOverride w:ilvl="0">
       <w:startOverride w:val="1"/>
@@ -11301,7 +11260,7 @@
     <w:autoRedefine/>
     <w:uiPriority w:val="39"/>
     <w:unhideWhenUsed/>
-    <w:rsid w:val="00FB7500"/>
+    <w:rsid w:val="00963625"/>
     <w:pPr>
       <w:spacing w:after="100"/>
     </w:pPr>
@@ -11313,7 +11272,7 @@
     <w:autoRedefine/>
     <w:uiPriority w:val="39"/>
     <w:unhideWhenUsed/>
-    <w:rsid w:val="00FB7500"/>
+    <w:rsid w:val="00963625"/>
     <w:pPr>
       <w:spacing w:after="100"/>
       <w:ind w:left="220"/>

</xml_diff>

<commit_message>
Invio foto dalla Home, edizioni come anno accademico (2026-2027), pannello admin in una schermata
Co-Authored-By: Claude Opus 5.5 <noreply@anthropic.com>
</commit_message>
<xml_diff>
--- a/ADMIN_GUIDE.docx
+++ b/ADMIN_GUIDE.docx
@@ -12,7 +12,7 @@
           <w:noProof/>
         </w:rPr>
         <w:drawing>
-          <wp:inline distT="0" distB="0" distL="0" distR="0" wp14:anchorId="6396ADF5" wp14:editId="269C8066">
+          <wp:inline distT="0" distB="0" distL="0" distR="0" wp14:anchorId="41F06050" wp14:editId="3DABB3AE">
             <wp:extent cx="1809750" cy="1809750"/>
             <wp:effectExtent l="0" t="0" r="0" b="0"/>
             <wp:docPr id="1" name="Immagine 1"/>
@@ -134,7 +134,7 @@
     <w:sdt>
       <w:sdtPr>
         <w:alias w:val="Indice"/>
-        <w:id w:val="-1223983555"/>
+        <w:id w:val="-1496492653"/>
       </w:sdtPr>
       <w:sdtEndPr/>
       <w:sdtContent>
@@ -162,7 +162,7 @@
           <w:r>
             <w:fldChar w:fldCharType="separate"/>
           </w:r>
-          <w:hyperlink w:anchor="_Toc243217756" w:history="1">
+          <w:hyperlink w:anchor="_Toc243223496" w:history="1">
             <w:r>
               <w:rPr>
                 <w:rStyle w:val="Collegamentoipertestuale"/>
@@ -186,7 +186,7 @@
               <w:rPr>
                 <w:noProof/>
               </w:rPr>
-              <w:instrText xml:space="preserve"> PAGEREF _Toc243217756 \h </w:instrText>
+              <w:instrText xml:space="preserve"> PAGEREF _Toc243223496 \h </w:instrText>
             </w:r>
             <w:r>
               <w:rPr>
@@ -228,7 +228,7 @@
               <w14:ligatures w14:val="standardContextual"/>
             </w:rPr>
           </w:pPr>
-          <w:hyperlink w:anchor="_Toc243217757" w:history="1">
+          <w:hyperlink w:anchor="_Toc243223497" w:history="1">
             <w:r>
               <w:rPr>
                 <w:rStyle w:val="Collegamentoipertestuale"/>
@@ -252,7 +252,7 @@
               <w:rPr>
                 <w:noProof/>
               </w:rPr>
-              <w:instrText xml:space="preserve"> PAGEREF _Toc243217757 \h </w:instrText>
+              <w:instrText xml:space="preserve"> PAGEREF _Toc243223497 \h </w:instrText>
             </w:r>
             <w:r>
               <w:rPr>
@@ -294,7 +294,7 @@
               <w14:ligatures w14:val="standardContextual"/>
             </w:rPr>
           </w:pPr>
-          <w:hyperlink w:anchor="_Toc243217758" w:history="1">
+          <w:hyperlink w:anchor="_Toc243223498" w:history="1">
             <w:r>
               <w:rPr>
                 <w:rStyle w:val="Collegamentoipertestuale"/>
@@ -318,7 +318,7 @@
               <w:rPr>
                 <w:noProof/>
               </w:rPr>
-              <w:instrText xml:space="preserve"> PAGEREF _Toc243217758 \h </w:instrText>
+              <w:instrText xml:space="preserve"> PAGEREF _Toc243223498 \h </w:instrText>
             </w:r>
             <w:r>
               <w:rPr>
@@ -360,7 +360,7 @@
               <w14:ligatures w14:val="standardContextual"/>
             </w:rPr>
           </w:pPr>
-          <w:hyperlink w:anchor="_Toc243217759" w:history="1">
+          <w:hyperlink w:anchor="_Toc243223499" w:history="1">
             <w:r>
               <w:rPr>
                 <w:rStyle w:val="Collegamentoipertestuale"/>
@@ -384,7 +384,7 @@
               <w:rPr>
                 <w:noProof/>
               </w:rPr>
-              <w:instrText xml:space="preserve"> PAGEREF _Toc243217759 \h </w:instrText>
+              <w:instrText xml:space="preserve"> PAGEREF _Toc243223499 \h </w:instrText>
             </w:r>
             <w:r>
               <w:rPr>
@@ -426,7 +426,7 @@
               <w14:ligatures w14:val="standardContextual"/>
             </w:rPr>
           </w:pPr>
-          <w:hyperlink w:anchor="_Toc243217760" w:history="1">
+          <w:hyperlink w:anchor="_Toc243223500" w:history="1">
             <w:r>
               <w:rPr>
                 <w:rStyle w:val="Collegamentoipertestuale"/>
@@ -450,7 +450,7 @@
               <w:rPr>
                 <w:noProof/>
               </w:rPr>
-              <w:instrText xml:space="preserve"> PAGEREF _Toc243217760 \h </w:instrText>
+              <w:instrText xml:space="preserve"> PAGEREF _Toc243223500 \h </w:instrText>
             </w:r>
             <w:r>
               <w:rPr>
@@ -492,7 +492,7 @@
               <w14:ligatures w14:val="standardContextual"/>
             </w:rPr>
           </w:pPr>
-          <w:hyperlink w:anchor="_Toc243217761" w:history="1">
+          <w:hyperlink w:anchor="_Toc243223501" w:history="1">
             <w:r>
               <w:rPr>
                 <w:rStyle w:val="Collegamentoipertestuale"/>
@@ -516,7 +516,7 @@
               <w:rPr>
                 <w:noProof/>
               </w:rPr>
-              <w:instrText xml:space="preserve"> PAGEREF _Toc243217761 \h </w:instrText>
+              <w:instrText xml:space="preserve"> PAGEREF _Toc243223501 \h </w:instrText>
             </w:r>
             <w:r>
               <w:rPr>
@@ -558,7 +558,7 @@
               <w14:ligatures w14:val="standardContextual"/>
             </w:rPr>
           </w:pPr>
-          <w:hyperlink w:anchor="_Toc243217762" w:history="1">
+          <w:hyperlink w:anchor="_Toc243223502" w:history="1">
             <w:r>
               <w:rPr>
                 <w:rStyle w:val="Collegamentoipertestuale"/>
@@ -582,7 +582,7 @@
               <w:rPr>
                 <w:noProof/>
               </w:rPr>
-              <w:instrText xml:space="preserve"> PAGEREF _Toc243217762 \h </w:instrText>
+              <w:instrText xml:space="preserve"> PAGEREF _Toc243223502 \h </w:instrText>
             </w:r>
             <w:r>
               <w:rPr>
@@ -624,7 +624,7 @@
               <w14:ligatures w14:val="standardContextual"/>
             </w:rPr>
           </w:pPr>
-          <w:hyperlink w:anchor="_Toc243217763" w:history="1">
+          <w:hyperlink w:anchor="_Toc243223503" w:history="1">
             <w:r>
               <w:rPr>
                 <w:rStyle w:val="Collegamentoipertestuale"/>
@@ -648,7 +648,7 @@
               <w:rPr>
                 <w:noProof/>
               </w:rPr>
-              <w:instrText xml:space="preserve"> PAGEREF _Toc243217763 \h </w:instrText>
+              <w:instrText xml:space="preserve"> PAGEREF _Toc243223503 \h </w:instrText>
             </w:r>
             <w:r>
               <w:rPr>
@@ -690,7 +690,7 @@
               <w14:ligatures w14:val="standardContextual"/>
             </w:rPr>
           </w:pPr>
-          <w:hyperlink w:anchor="_Toc243217764" w:history="1">
+          <w:hyperlink w:anchor="_Toc243223504" w:history="1">
             <w:r>
               <w:rPr>
                 <w:rStyle w:val="Collegamentoipertestuale"/>
@@ -714,7 +714,7 @@
               <w:rPr>
                 <w:noProof/>
               </w:rPr>
-              <w:instrText xml:space="preserve"> PAGEREF _Toc243217764 \h </w:instrText>
+              <w:instrText xml:space="preserve"> PAGEREF _Toc243223504 \h </w:instrText>
             </w:r>
             <w:r>
               <w:rPr>
@@ -756,7 +756,7 @@
               <w14:ligatures w14:val="standardContextual"/>
             </w:rPr>
           </w:pPr>
-          <w:hyperlink w:anchor="_Toc243217765" w:history="1">
+          <w:hyperlink w:anchor="_Toc243223505" w:history="1">
             <w:r>
               <w:rPr>
                 <w:rStyle w:val="Collegamentoipertestuale"/>
@@ -780,7 +780,7 @@
               <w:rPr>
                 <w:noProof/>
               </w:rPr>
-              <w:instrText xml:space="preserve"> PAGEREF _Toc243217765 \h </w:instrText>
+              <w:instrText xml:space="preserve"> PAGEREF _Toc243223505 \h </w:instrText>
             </w:r>
             <w:r>
               <w:rPr>
@@ -822,7 +822,7 @@
               <w14:ligatures w14:val="standardContextual"/>
             </w:rPr>
           </w:pPr>
-          <w:hyperlink w:anchor="_Toc243217766" w:history="1">
+          <w:hyperlink w:anchor="_Toc243223506" w:history="1">
             <w:r>
               <w:rPr>
                 <w:rStyle w:val="Collegamentoipertestuale"/>
@@ -846,7 +846,7 @@
               <w:rPr>
                 <w:noProof/>
               </w:rPr>
-              <w:instrText xml:space="preserve"> PAGEREF _Toc243217766 \h </w:instrText>
+              <w:instrText xml:space="preserve"> PAGEREF _Toc243223506 \h </w:instrText>
             </w:r>
             <w:r>
               <w:rPr>
@@ -888,7 +888,7 @@
               <w14:ligatures w14:val="standardContextual"/>
             </w:rPr>
           </w:pPr>
-          <w:hyperlink w:anchor="_Toc243217767" w:history="1">
+          <w:hyperlink w:anchor="_Toc243223507" w:history="1">
             <w:r>
               <w:rPr>
                 <w:rStyle w:val="Collegamentoipertestuale"/>
@@ -912,7 +912,7 @@
               <w:rPr>
                 <w:noProof/>
               </w:rPr>
-              <w:instrText xml:space="preserve"> PAGEREF _Toc243217767 \h </w:instrText>
+              <w:instrText xml:space="preserve"> PAGEREF _Toc243223507 \h </w:instrText>
             </w:r>
             <w:r>
               <w:rPr>
@@ -954,7 +954,7 @@
               <w14:ligatures w14:val="standardContextual"/>
             </w:rPr>
           </w:pPr>
-          <w:hyperlink w:anchor="_Toc243217768" w:history="1">
+          <w:hyperlink w:anchor="_Toc243223508" w:history="1">
             <w:r>
               <w:rPr>
                 <w:rStyle w:val="Collegamentoipertestuale"/>
@@ -978,7 +978,7 @@
               <w:rPr>
                 <w:noProof/>
               </w:rPr>
-              <w:instrText xml:space="preserve"> PAGEREF _Toc243217768 \h </w:instrText>
+              <w:instrText xml:space="preserve"> PAGEREF _Toc243223508 \h </w:instrText>
             </w:r>
             <w:r>
               <w:rPr>
@@ -1020,7 +1020,7 @@
               <w14:ligatures w14:val="standardContextual"/>
             </w:rPr>
           </w:pPr>
-          <w:hyperlink w:anchor="_Toc243217769" w:history="1">
+          <w:hyperlink w:anchor="_Toc243223509" w:history="1">
             <w:r>
               <w:rPr>
                 <w:rStyle w:val="Collegamentoipertestuale"/>
@@ -1044,7 +1044,7 @@
               <w:rPr>
                 <w:noProof/>
               </w:rPr>
-              <w:instrText xml:space="preserve"> PAGEREF _Toc243217769 \h </w:instrText>
+              <w:instrText xml:space="preserve"> PAGEREF _Toc243223509 \h </w:instrText>
             </w:r>
             <w:r>
               <w:rPr>
@@ -1086,7 +1086,7 @@
               <w14:ligatures w14:val="standardContextual"/>
             </w:rPr>
           </w:pPr>
-          <w:hyperlink w:anchor="_Toc243217770" w:history="1">
+          <w:hyperlink w:anchor="_Toc243223510" w:history="1">
             <w:r>
               <w:rPr>
                 <w:rStyle w:val="Collegamentoipertestuale"/>
@@ -1110,7 +1110,7 @@
               <w:rPr>
                 <w:noProof/>
               </w:rPr>
-              <w:instrText xml:space="preserve"> PAGEREF _Toc243217770 \h </w:instrText>
+              <w:instrText xml:space="preserve"> PAGEREF _Toc243223510 \h </w:instrText>
             </w:r>
             <w:r>
               <w:rPr>
@@ -1152,7 +1152,7 @@
               <w14:ligatures w14:val="standardContextual"/>
             </w:rPr>
           </w:pPr>
-          <w:hyperlink w:anchor="_Toc243217771" w:history="1">
+          <w:hyperlink w:anchor="_Toc243223511" w:history="1">
             <w:r>
               <w:rPr>
                 <w:rStyle w:val="Collegamentoipertestuale"/>
@@ -1176,7 +1176,7 @@
               <w:rPr>
                 <w:noProof/>
               </w:rPr>
-              <w:instrText xml:space="preserve"> PAGEREF _Toc243217771 \h </w:instrText>
+              <w:instrText xml:space="preserve"> PAGEREF _Toc243223511 \h </w:instrText>
             </w:r>
             <w:r>
               <w:rPr>
@@ -1218,7 +1218,7 @@
               <w14:ligatures w14:val="standardContextual"/>
             </w:rPr>
           </w:pPr>
-          <w:hyperlink w:anchor="_Toc243217772" w:history="1">
+          <w:hyperlink w:anchor="_Toc243223512" w:history="1">
             <w:r>
               <w:rPr>
                 <w:rStyle w:val="Collegamentoipertestuale"/>
@@ -1242,7 +1242,7 @@
               <w:rPr>
                 <w:noProof/>
               </w:rPr>
-              <w:instrText xml:space="preserve"> PAGEREF _Toc243217772 \h </w:instrText>
+              <w:instrText xml:space="preserve"> PAGEREF _Toc243223512 \h </w:instrText>
             </w:r>
             <w:r>
               <w:rPr>
@@ -1284,7 +1284,7 @@
               <w14:ligatures w14:val="standardContextual"/>
             </w:rPr>
           </w:pPr>
-          <w:hyperlink w:anchor="_Toc243217773" w:history="1">
+          <w:hyperlink w:anchor="_Toc243223513" w:history="1">
             <w:r>
               <w:rPr>
                 <w:rStyle w:val="Collegamentoipertestuale"/>
@@ -1308,7 +1308,7 @@
               <w:rPr>
                 <w:noProof/>
               </w:rPr>
-              <w:instrText xml:space="preserve"> PAGEREF _Toc243217773 \h </w:instrText>
+              <w:instrText xml:space="preserve"> PAGEREF _Toc243223513 \h </w:instrText>
             </w:r>
             <w:r>
               <w:rPr>
@@ -1350,7 +1350,7 @@
               <w14:ligatures w14:val="standardContextual"/>
             </w:rPr>
           </w:pPr>
-          <w:hyperlink w:anchor="_Toc243217774" w:history="1">
+          <w:hyperlink w:anchor="_Toc243223514" w:history="1">
             <w:r>
               <w:rPr>
                 <w:rStyle w:val="Collegamentoipertestuale"/>
@@ -1374,7 +1374,7 @@
               <w:rPr>
                 <w:noProof/>
               </w:rPr>
-              <w:instrText xml:space="preserve"> PAGEREF _Toc243217774 \h </w:instrText>
+              <w:instrText xml:space="preserve"> PAGEREF _Toc243223514 \h </w:instrText>
             </w:r>
             <w:r>
               <w:rPr>
@@ -1416,7 +1416,7 @@
               <w14:ligatures w14:val="standardContextual"/>
             </w:rPr>
           </w:pPr>
-          <w:hyperlink w:anchor="_Toc243217775" w:history="1">
+          <w:hyperlink w:anchor="_Toc243223515" w:history="1">
             <w:r>
               <w:rPr>
                 <w:rStyle w:val="Collegamentoipertestuale"/>
@@ -1440,7 +1440,7 @@
               <w:rPr>
                 <w:noProof/>
               </w:rPr>
-              <w:instrText xml:space="preserve"> PAGEREF _Toc243217775 \h </w:instrText>
+              <w:instrText xml:space="preserve"> PAGEREF _Toc243223515 \h </w:instrText>
             </w:r>
             <w:r>
               <w:rPr>
@@ -1482,7 +1482,7 @@
               <w14:ligatures w14:val="standardContextual"/>
             </w:rPr>
           </w:pPr>
-          <w:hyperlink w:anchor="_Toc243217776" w:history="1">
+          <w:hyperlink w:anchor="_Toc243223516" w:history="1">
             <w:r>
               <w:rPr>
                 <w:rStyle w:val="Collegamentoipertestuale"/>
@@ -1506,7 +1506,7 @@
               <w:rPr>
                 <w:noProof/>
               </w:rPr>
-              <w:instrText xml:space="preserve"> PAGEREF _Toc243217776 \h </w:instrText>
+              <w:instrText xml:space="preserve"> PAGEREF _Toc243223516 \h </w:instrText>
             </w:r>
             <w:r>
               <w:rPr>
@@ -1548,7 +1548,7 @@
               <w14:ligatures w14:val="standardContextual"/>
             </w:rPr>
           </w:pPr>
-          <w:hyperlink w:anchor="_Toc243217777" w:history="1">
+          <w:hyperlink w:anchor="_Toc243223517" w:history="1">
             <w:r>
               <w:rPr>
                 <w:rStyle w:val="Collegamentoipertestuale"/>
@@ -1572,7 +1572,7 @@
               <w:rPr>
                 <w:noProof/>
               </w:rPr>
-              <w:instrText xml:space="preserve"> PAGEREF _Toc243217777 \h </w:instrText>
+              <w:instrText xml:space="preserve"> PAGEREF _Toc243223517 \h </w:instrText>
             </w:r>
             <w:r>
               <w:rPr>
@@ -1614,13 +1614,13 @@
               <w14:ligatures w14:val="standardContextual"/>
             </w:rPr>
           </w:pPr>
-          <w:hyperlink w:anchor="_Toc243217778" w:history="1">
+          <w:hyperlink w:anchor="_Toc243223518" w:history="1">
             <w:r>
               <w:rPr>
                 <w:rStyle w:val="Collegamentoipertestuale"/>
                 <w:noProof/>
               </w:rPr>
-              <w:t>La copertina: logo e scritta "Edizione 2027-28"</w:t>
+              <w:t>La copertina: logo e scritta "Edizione 2027-2028"</w:t>
             </w:r>
             <w:r>
               <w:rPr>
@@ -1638,7 +1638,7 @@
               <w:rPr>
                 <w:noProof/>
               </w:rPr>
-              <w:instrText xml:space="preserve"> PAGEREF _Toc243217778 \h </w:instrText>
+              <w:instrText xml:space="preserve"> PAGEREF _Toc243223518 \h </w:instrText>
             </w:r>
             <w:r>
               <w:rPr>
@@ -1680,7 +1680,7 @@
               <w14:ligatures w14:val="standardContextual"/>
             </w:rPr>
           </w:pPr>
-          <w:hyperlink w:anchor="_Toc243217779" w:history="1">
+          <w:hyperlink w:anchor="_Toc243223519" w:history="1">
             <w:r>
               <w:rPr>
                 <w:rStyle w:val="Collegamentoipertestuale"/>
@@ -1704,7 +1704,7 @@
               <w:rPr>
                 <w:noProof/>
               </w:rPr>
-              <w:instrText xml:space="preserve"> PAGEREF _Toc243217779 \h </w:instrText>
+              <w:instrText xml:space="preserve"> PAGEREF _Toc243223519 \h </w:instrText>
             </w:r>
             <w:r>
               <w:rPr>
@@ -1746,7 +1746,7 @@
               <w14:ligatures w14:val="standardContextual"/>
             </w:rPr>
           </w:pPr>
-          <w:hyperlink w:anchor="_Toc243217780" w:history="1">
+          <w:hyperlink w:anchor="_Toc243223520" w:history="1">
             <w:r>
               <w:rPr>
                 <w:rStyle w:val="Collegamentoipertestuale"/>
@@ -1770,7 +1770,7 @@
               <w:rPr>
                 <w:noProof/>
               </w:rPr>
-              <w:instrText xml:space="preserve"> PAGEREF _Toc243217780 \h </w:instrText>
+              <w:instrText xml:space="preserve"> PAGEREF _Toc243223520 \h </w:instrText>
             </w:r>
             <w:r>
               <w:rPr>
@@ -1812,7 +1812,7 @@
               <w14:ligatures w14:val="standardContextual"/>
             </w:rPr>
           </w:pPr>
-          <w:hyperlink w:anchor="_Toc243217781" w:history="1">
+          <w:hyperlink w:anchor="_Toc243223521" w:history="1">
             <w:r>
               <w:rPr>
                 <w:rStyle w:val="Collegamentoipertestuale"/>
@@ -1836,7 +1836,7 @@
               <w:rPr>
                 <w:noProof/>
               </w:rPr>
-              <w:instrText xml:space="preserve"> PAGEREF _Toc243217781 \h </w:instrText>
+              <w:instrText xml:space="preserve"> PAGEREF _Toc243223521 \h </w:instrText>
             </w:r>
             <w:r>
               <w:rPr>
@@ -1878,7 +1878,7 @@
               <w14:ligatures w14:val="standardContextual"/>
             </w:rPr>
           </w:pPr>
-          <w:hyperlink w:anchor="_Toc243217782" w:history="1">
+          <w:hyperlink w:anchor="_Toc243223522" w:history="1">
             <w:r>
               <w:rPr>
                 <w:rStyle w:val="Collegamentoipertestuale"/>
@@ -1902,7 +1902,7 @@
               <w:rPr>
                 <w:noProof/>
               </w:rPr>
-              <w:instrText xml:space="preserve"> PAGEREF _Toc243217782 \h </w:instrText>
+              <w:instrText xml:space="preserve"> PAGEREF _Toc243223522 \h </w:instrText>
             </w:r>
             <w:r>
               <w:rPr>
@@ -1944,7 +1944,7 @@
               <w14:ligatures w14:val="standardContextual"/>
             </w:rPr>
           </w:pPr>
-          <w:hyperlink w:anchor="_Toc243217783" w:history="1">
+          <w:hyperlink w:anchor="_Toc243223523" w:history="1">
             <w:r>
               <w:rPr>
                 <w:rStyle w:val="Collegamentoipertestuale"/>
@@ -1968,7 +1968,7 @@
               <w:rPr>
                 <w:noProof/>
               </w:rPr>
-              <w:instrText xml:space="preserve"> PAGEREF _Toc243217783 \h </w:instrText>
+              <w:instrText xml:space="preserve"> PAGEREF _Toc243223523 \h </w:instrText>
             </w:r>
             <w:r>
               <w:rPr>
@@ -2010,7 +2010,7 @@
               <w14:ligatures w14:val="standardContextual"/>
             </w:rPr>
           </w:pPr>
-          <w:hyperlink w:anchor="_Toc243217784" w:history="1">
+          <w:hyperlink w:anchor="_Toc243223524" w:history="1">
             <w:r>
               <w:rPr>
                 <w:rStyle w:val="Collegamentoipertestuale"/>
@@ -2034,7 +2034,7 @@
               <w:rPr>
                 <w:noProof/>
               </w:rPr>
-              <w:instrText xml:space="preserve"> PAGEREF _Toc243217784 \h </w:instrText>
+              <w:instrText xml:space="preserve"> PAGEREF _Toc243223524 \h </w:instrText>
             </w:r>
             <w:r>
               <w:rPr>
@@ -2076,7 +2076,7 @@
               <w14:ligatures w14:val="standardContextual"/>
             </w:rPr>
           </w:pPr>
-          <w:hyperlink w:anchor="_Toc243217785" w:history="1">
+          <w:hyperlink w:anchor="_Toc243223525" w:history="1">
             <w:r>
               <w:rPr>
                 <w:rStyle w:val="Collegamentoipertestuale"/>
@@ -2100,7 +2100,7 @@
               <w:rPr>
                 <w:noProof/>
               </w:rPr>
-              <w:instrText xml:space="preserve"> PAGEREF _Toc243217785 \h </w:instrText>
+              <w:instrText xml:space="preserve"> PAGEREF _Toc243223525 \h </w:instrText>
             </w:r>
             <w:r>
               <w:rPr>
@@ -2142,7 +2142,7 @@
               <w14:ligatures w14:val="standardContextual"/>
             </w:rPr>
           </w:pPr>
-          <w:hyperlink w:anchor="_Toc243217786" w:history="1">
+          <w:hyperlink w:anchor="_Toc243223526" w:history="1">
             <w:r>
               <w:rPr>
                 <w:rStyle w:val="Collegamentoipertestuale"/>
@@ -2166,7 +2166,7 @@
               <w:rPr>
                 <w:noProof/>
               </w:rPr>
-              <w:instrText xml:space="preserve"> PAGEREF _Toc243217786 \h </w:instrText>
+              <w:instrText xml:space="preserve"> PAGEREF _Toc243223526 \h </w:instrText>
             </w:r>
             <w:r>
               <w:rPr>
@@ -2208,7 +2208,7 @@
               <w14:ligatures w14:val="standardContextual"/>
             </w:rPr>
           </w:pPr>
-          <w:hyperlink w:anchor="_Toc243217787" w:history="1">
+          <w:hyperlink w:anchor="_Toc243223527" w:history="1">
             <w:r>
               <w:rPr>
                 <w:rStyle w:val="Collegamentoipertestuale"/>
@@ -2232,7 +2232,7 @@
               <w:rPr>
                 <w:noProof/>
               </w:rPr>
-              <w:instrText xml:space="preserve"> PAGEREF _Toc243217787 \h </w:instrText>
+              <w:instrText xml:space="preserve"> PAGEREF _Toc243223527 \h </w:instrText>
             </w:r>
             <w:r>
               <w:rPr>
@@ -2274,7 +2274,7 @@
               <w14:ligatures w14:val="standardContextual"/>
             </w:rPr>
           </w:pPr>
-          <w:hyperlink w:anchor="_Toc243217788" w:history="1">
+          <w:hyperlink w:anchor="_Toc243223528" w:history="1">
             <w:r>
               <w:rPr>
                 <w:rStyle w:val="Collegamentoipertestuale"/>
@@ -2298,7 +2298,7 @@
               <w:rPr>
                 <w:noProof/>
               </w:rPr>
-              <w:instrText xml:space="preserve"> PAGEREF _Toc243217788 \h </w:instrText>
+              <w:instrText xml:space="preserve"> PAGEREF _Toc243223528 \h </w:instrText>
             </w:r>
             <w:r>
               <w:rPr>
@@ -2340,7 +2340,7 @@
               <w14:ligatures w14:val="standardContextual"/>
             </w:rPr>
           </w:pPr>
-          <w:hyperlink w:anchor="_Toc243217789" w:history="1">
+          <w:hyperlink w:anchor="_Toc243223529" w:history="1">
             <w:r>
               <w:rPr>
                 <w:rStyle w:val="Collegamentoipertestuale"/>
@@ -2364,7 +2364,7 @@
               <w:rPr>
                 <w:noProof/>
               </w:rPr>
-              <w:instrText xml:space="preserve"> PAGEREF _Toc243217789 \h </w:instrText>
+              <w:instrText xml:space="preserve"> PAGEREF _Toc243223529 \h </w:instrText>
             </w:r>
             <w:r>
               <w:rPr>
@@ -2406,7 +2406,7 @@
               <w14:ligatures w14:val="standardContextual"/>
             </w:rPr>
           </w:pPr>
-          <w:hyperlink w:anchor="_Toc243217790" w:history="1">
+          <w:hyperlink w:anchor="_Toc243223530" w:history="1">
             <w:r>
               <w:rPr>
                 <w:rStyle w:val="Collegamentoipertestuale"/>
@@ -2430,7 +2430,7 @@
               <w:rPr>
                 <w:noProof/>
               </w:rPr>
-              <w:instrText xml:space="preserve"> PAGEREF _Toc243217790 \h </w:instrText>
+              <w:instrText xml:space="preserve"> PAGEREF _Toc243223530 \h </w:instrText>
             </w:r>
             <w:r>
               <w:rPr>
@@ -2469,7 +2469,7 @@
         <w:pStyle w:val="Titolo1"/>
         <w:pageBreakBefore/>
       </w:pPr>
-      <w:bookmarkStart w:id="0" w:name="_Toc243217756"/>
+      <w:bookmarkStart w:id="0" w:name="_Toc243223496"/>
       <w:r>
         <w:lastRenderedPageBreak/>
         <w:t>1. Come è fatto il sito</w:t>
@@ -3110,7 +3110,7 @@
       <w:pPr>
         <w:pStyle w:val="Titolo2"/>
       </w:pPr>
-      <w:bookmarkStart w:id="1" w:name="_Toc243217757"/>
+      <w:bookmarkStart w:id="1" w:name="_Toc243223497"/>
       <w:r>
         <w:t>Il giro di una foto</w:t>
       </w:r>
@@ -3214,7 +3214,7 @@
       <w:pPr>
         <w:pStyle w:val="Titolo2"/>
       </w:pPr>
-      <w:bookmarkStart w:id="2" w:name="_Toc243217758"/>
+      <w:bookmarkStart w:id="2" w:name="_Toc243223498"/>
       <w:r>
         <w:t>Parole che incontrerai</w:t>
       </w:r>
@@ -3833,7 +3833,7 @@
         <w:pStyle w:val="Titolo1"/>
         <w:pageBreakBefore/>
       </w:pPr>
-      <w:bookmarkStart w:id="3" w:name="_Toc243217759"/>
+      <w:bookmarkStart w:id="3" w:name="_Toc243223499"/>
       <w:r>
         <w:lastRenderedPageBreak/>
         <w:t>2. Preparare il computer (una volta sola)</w:t>
@@ -3862,7 +3862,7 @@
       <w:pPr>
         <w:pStyle w:val="Titolo2"/>
       </w:pPr>
-      <w:bookmarkStart w:id="4" w:name="_Toc243217760"/>
+      <w:bookmarkStart w:id="4" w:name="_Toc243223500"/>
       <w:r>
         <w:t>Programmi da installare</w:t>
       </w:r>
@@ -3977,7 +3977,7 @@
       <w:pPr>
         <w:pStyle w:val="Titolo2"/>
       </w:pPr>
-      <w:bookmarkStart w:id="5" w:name="_Toc243217761"/>
+      <w:bookmarkStart w:id="5" w:name="_Toc243223501"/>
       <w:r>
         <w:t>Aprire il terminale nella cartella del progetto</w:t>
       </w:r>
@@ -4069,7 +4069,7 @@
       <w:pPr>
         <w:pStyle w:val="Titolo2"/>
       </w:pPr>
-      <w:bookmarkStart w:id="6" w:name="_Toc243217762"/>
+      <w:bookmarkStart w:id="6" w:name="_Toc243223502"/>
       <w:r>
         <w:t>La prima volta dopo aver scaricato il progetto</w:t>
       </w:r>
@@ -4114,7 +4114,7 @@
       <w:pPr>
         <w:pStyle w:val="Titolo2"/>
       </w:pPr>
-      <w:bookmarkStart w:id="7" w:name="_Toc243217763"/>
+      <w:bookmarkStart w:id="7" w:name="_Toc243223503"/>
       <w:r>
         <w:t>Il file segreto .env.local</w:t>
       </w:r>
@@ -4144,7 +4144,7 @@
         <w:pStyle w:val="Titolo1"/>
         <w:pageBreakBefore/>
       </w:pPr>
-      <w:bookmarkStart w:id="8" w:name="_Toc243217764"/>
+      <w:bookmarkStart w:id="8" w:name="_Toc243223504"/>
       <w:r>
         <w:lastRenderedPageBreak/>
         <w:t>3. Pubblicare una modifica sul sito online</w:t>
@@ -4281,7 +4281,7 @@
       <w:pPr>
         <w:pStyle w:val="Titolo2"/>
       </w:pPr>
-      <w:bookmarkStart w:id="9" w:name="_Toc243217765"/>
+      <w:bookmarkStart w:id="9" w:name="_Toc243223505"/>
       <w:r>
         <w:t>Controllare che sia andato tutto bene</w:t>
       </w:r>
@@ -4433,7 +4433,7 @@
         <w:pStyle w:val="Titolo1"/>
         <w:pageBreakBefore/>
       </w:pPr>
-      <w:bookmarkStart w:id="10" w:name="_Toc243217766"/>
+      <w:bookmarkStart w:id="10" w:name="_Toc243223506"/>
       <w:r>
         <w:lastRenderedPageBreak/>
         <w:t>4. Il pannello admin: stato del sito e moderazione</w:t>
@@ -4462,7 +4462,7 @@
       <w:pPr>
         <w:pStyle w:val="Titolo2"/>
       </w:pPr>
-      <w:bookmarkStart w:id="11" w:name="_Toc243217767"/>
+      <w:bookmarkStart w:id="11" w:name="_Toc243223507"/>
       <w:r>
         <w:t>Entrare nel pannello</w:t>
       </w:r>
@@ -4551,7 +4551,7 @@
       <w:pPr>
         <w:pStyle w:val="Titolo2"/>
       </w:pPr>
-      <w:bookmarkStart w:id="12" w:name="_Toc243217768"/>
+      <w:bookmarkStart w:id="12" w:name="_Toc243223508"/>
       <w:r>
         <w:t>Com'è fatto il pannello</w:t>
       </w:r>
@@ -4567,7 +4567,17 @@
         <w:spacing w:after="60" w:line="290" w:lineRule="auto"/>
       </w:pPr>
       <w:r>
-        <w:t xml:space="preserve">In cima c'è il riquadro </w:t>
+        <w:t xml:space="preserve">Da computer il pannello sta tutto in </w:t>
+      </w:r>
+      <w:r>
+        <w:rPr>
+          <w:b/>
+          <w:bCs/>
+        </w:rPr>
+        <w:t>una sola schermata</w:t>
+      </w:r>
+      <w:r>
+        <w:t xml:space="preserve">, senza scorrere. A sinistra c'è il riquadro </w:t>
       </w:r>
       <w:r>
         <w:rPr>
@@ -4590,7 +4600,7 @@
         <w:spacing w:after="60" w:line="290" w:lineRule="auto"/>
       </w:pPr>
       <w:r>
-        <w:t xml:space="preserve">Sotto, in </w:t>
+        <w:t xml:space="preserve">A destra, in </w:t>
       </w:r>
       <w:r>
         <w:rPr>
@@ -4643,27 +4653,27 @@
         <w:spacing w:after="60" w:line="290" w:lineRule="auto"/>
       </w:pPr>
       <w:r>
-        <w:t xml:space="preserve">Sotto ci sono due schede: </w:t>
-      </w:r>
-      <w:r>
-        <w:rPr>
-          <w:b/>
-          <w:bCs/>
-        </w:rPr>
-        <w:t>In attesa</w:t>
-      </w:r>
-      <w:r>
-        <w:t xml:space="preserve"> (da controllare) e </w:t>
-      </w:r>
-      <w:r>
-        <w:rPr>
-          <w:b/>
-          <w:bCs/>
-        </w:rPr>
-        <w:t>Approvate</w:t>
-      </w:r>
-      <w:r>
-        <w:t>.</w:t>
+        <w:t xml:space="preserve">Le foto si vedono </w:t>
+      </w:r>
+      <w:r>
+        <w:rPr>
+          <w:b/>
+          <w:bCs/>
+        </w:rPr>
+        <w:t>8 alla volta</w:t>
+      </w:r>
+      <w:r>
+        <w:t xml:space="preserve">: se ce ne sono di più, in basso compare </w:t>
+      </w:r>
+      <w:r>
+        <w:rPr>
+          <w:b/>
+          <w:bCs/>
+        </w:rPr>
+        <w:t>Pagina 1 di N</w:t>
+      </w:r>
+      <w:r>
+        <w:t xml:space="preserve"> con le frecce per passare alle successive.</w:t>
       </w:r>
     </w:p>
     <w:p>
@@ -4676,6 +4686,39 @@
         <w:spacing w:after="60" w:line="290" w:lineRule="auto"/>
       </w:pPr>
       <w:r>
+        <w:t xml:space="preserve">Sotto ci sono due schede: </w:t>
+      </w:r>
+      <w:r>
+        <w:rPr>
+          <w:b/>
+          <w:bCs/>
+        </w:rPr>
+        <w:t>In attesa</w:t>
+      </w:r>
+      <w:r>
+        <w:t xml:space="preserve"> (da controllare) e </w:t>
+      </w:r>
+      <w:r>
+        <w:rPr>
+          <w:b/>
+          <w:bCs/>
+        </w:rPr>
+        <w:t>Approvate</w:t>
+      </w:r>
+      <w:r>
+        <w:t>.</w:t>
+      </w:r>
+    </w:p>
+    <w:p>
+      <w:pPr>
+        <w:pStyle w:val="Paragrafoelenco"/>
+        <w:numPr>
+          <w:ilvl w:val="0"/>
+          <w:numId w:val="3"/>
+        </w:numPr>
+        <w:spacing w:after="60" w:line="290" w:lineRule="auto"/>
+      </w:pPr>
+      <w:r>
         <w:t>Ogni foto mostra nome, facoltà, frase o didascalia (per l'Archivio) e data di invio. Cliccando sull'immagine la apri a grandezza piena.</w:t>
       </w:r>
     </w:p>
@@ -4683,7 +4726,7 @@
       <w:pPr>
         <w:pStyle w:val="Titolo2"/>
       </w:pPr>
-      <w:bookmarkStart w:id="13" w:name="_Toc243217769"/>
+      <w:bookmarkStart w:id="13" w:name="_Toc243223509"/>
       <w:r>
         <w:t>Cosa fanno i pulsanti</w:t>
       </w:r>
@@ -4986,7 +5029,7 @@
       <w:pPr>
         <w:pStyle w:val="Titolo2"/>
       </w:pPr>
-      <w:bookmarkStart w:id="14" w:name="_Toc243217770"/>
+      <w:bookmarkStart w:id="14" w:name="_Toc243223510"/>
       <w:r>
         <w:t>Cosa controllare prima di approvare</w:t>
       </w:r>
@@ -5041,6 +5084,7 @@
         <w:spacing w:after="60" w:line="290" w:lineRule="auto"/>
       </w:pPr>
       <w:r>
+        <w:lastRenderedPageBreak/>
         <w:t>Archivio: la frase delle foto singole è breve e adatta alla stampa; le foto di gruppo hanno una didascalia comprensibile.</w:t>
       </w:r>
     </w:p>
@@ -5048,9 +5092,8 @@
       <w:pPr>
         <w:pStyle w:val="Titolo2"/>
       </w:pPr>
-      <w:bookmarkStart w:id="15" w:name="_Toc243217771"/>
-      <w:r>
-        <w:lastRenderedPageBreak/>
+      <w:bookmarkStart w:id="15" w:name="_Toc243223511"/>
+      <w:r>
         <w:t>Impostare o cambiare la password del pannello</w:t>
       </w:r>
       <w:bookmarkEnd w:id="15"/>
@@ -5406,7 +5449,7 @@
       <w:pPr>
         <w:pStyle w:val="Titolo2"/>
       </w:pPr>
-      <w:bookmarkStart w:id="16" w:name="_Toc243217772"/>
+      <w:bookmarkStart w:id="16" w:name="_Toc243223512"/>
       <w:r>
         <w:t>Disconnettere tutti i dispositivi</w:t>
       </w:r>
@@ -5561,6 +5604,7 @@
         <w:spacing w:after="80" w:line="290" w:lineRule="auto"/>
       </w:pPr>
       <w:r>
+        <w:lastRenderedPageBreak/>
         <w:t xml:space="preserve">Fai il </w:t>
       </w:r>
       <w:r>
@@ -5597,7 +5641,6 @@
           <w:bCs/>
           <w:color w:val="0066B2"/>
         </w:rPr>
-        <w:lastRenderedPageBreak/>
         <w:t xml:space="preserve">Nota. </w:t>
       </w:r>
       <w:r>
@@ -5620,7 +5663,7 @@
         <w:pStyle w:val="Titolo1"/>
         <w:pageBreakBefore/>
       </w:pPr>
-      <w:bookmarkStart w:id="17" w:name="_Toc243217773"/>
+      <w:bookmarkStart w:id="17" w:name="_Toc243223513"/>
       <w:r>
         <w:lastRenderedPageBreak/>
         <w:t>5. Aprire e chiudere gli invii per l'annuario</w:t>
@@ -5688,7 +5731,7 @@
         <w:spacing w:after="80" w:line="290" w:lineRule="auto"/>
       </w:pPr>
       <w:r>
-        <w:t xml:space="preserve">In cima trovi il riquadro </w:t>
+        <w:t xml:space="preserve">A sinistra trovi il riquadro </w:t>
       </w:r>
       <w:r>
         <w:rPr>
@@ -5781,7 +5824,7 @@
       <w:pPr>
         <w:pStyle w:val="Titolo2"/>
       </w:pPr>
-      <w:bookmarkStart w:id="18" w:name="_Toc243217774"/>
+      <w:bookmarkStart w:id="18" w:name="_Toc243223514"/>
       <w:r>
         <w:t>Invio foto: raccogliere le foto per l'annuario</w:t>
       </w:r>
@@ -5819,20 +5862,20 @@
           <w:b/>
           <w:bCs/>
         </w:rPr>
-        <w:t>Anno dell'edizione</w:t>
-      </w:r>
-      <w:r>
-        <w:t xml:space="preserve">: l'anno dell'annuario che stai preparando, per esempio </w:t>
-      </w:r>
-      <w:r>
-        <w:rPr>
-          <w:b/>
-          <w:bCs/>
-        </w:rPr>
-        <w:t>2027</w:t>
-      </w:r>
-      <w:r>
-        <w:t xml:space="preserve"> (è l'edizione dell'anno accademico 2026-27). Le foto inviate vengono assegnate a quest'anno e finiranno nel suo PDF;</w:t>
+        <w:t>Edizione da raccogliere</w:t>
+      </w:r>
+      <w:r>
+        <w:t xml:space="preserve">: l'annuario che stai preparando, per esempio </w:t>
+      </w:r>
+      <w:r>
+        <w:rPr>
+          <w:b/>
+          <w:bCs/>
+        </w:rPr>
+        <w:t>Annuario 2026-2027</w:t>
+      </w:r>
+      <w:r>
+        <w:t>. Le foto inviate vengono assegnate a questa edizione e finiranno nel suo PDF;</w:t>
       </w:r>
     </w:p>
     <w:p>
@@ -5887,10 +5930,10 @@
           <w:b/>
           <w:bCs/>
         </w:rPr>
-        <w:t>Manda la tua foto per l'Annuario (anno)</w:t>
-      </w:r>
-      <w:r>
-        <w:t xml:space="preserve"> e in Home il pulsante in basso a destra diventa </w:t>
+        <w:t>Manda la tua foto per l'Annuario 2026-2027</w:t>
+      </w:r>
+      <w:r>
+        <w:t xml:space="preserve"> (con l'edizione scelta) e in Home il pulsante in basso a destra diventa </w:t>
       </w:r>
       <w:r>
         <w:rPr>
@@ -5900,7 +5943,7 @@
         <w:t>Invia la tua foto</w:t>
       </w:r>
       <w:r>
-        <w:t xml:space="preserve">. Prima dell'apertura e dopo la chiusura il sito propone da solo il download dell'edizione scelta in </w:t>
+        <w:t xml:space="preserve">, che apre direttamente il modulo di invio. Prima dell'apertura e dopo la chiusura il sito propone da solo il download dell'edizione scelta in </w:t>
       </w:r>
       <w:r>
         <w:rPr>
@@ -5938,7 +5981,7 @@
       <w:pPr>
         <w:pStyle w:val="Titolo2"/>
       </w:pPr>
-      <w:bookmarkStart w:id="19" w:name="_Toc243217775"/>
+      <w:bookmarkStart w:id="19" w:name="_Toc243223515"/>
       <w:r>
         <w:t>Scarica edizione: invii chiusi</w:t>
       </w:r>
@@ -6007,7 +6050,7 @@
       <w:pPr>
         <w:pStyle w:val="Titolo2"/>
       </w:pPr>
-      <w:bookmarkStart w:id="20" w:name="_Toc243217776"/>
+      <w:bookmarkStart w:id="20" w:name="_Toc243223516"/>
       <w:r>
         <w:t>Limite di foto per persona</w:t>
       </w:r>
@@ -6101,7 +6144,7 @@
         <w:pStyle w:val="Titolo1"/>
         <w:pageBreakBefore/>
       </w:pPr>
-      <w:bookmarkStart w:id="21" w:name="_Toc243217777"/>
+      <w:bookmarkStart w:id="21" w:name="_Toc243223517"/>
       <w:r>
         <w:lastRenderedPageBreak/>
         <w:t>6. Creare il PDF dell'annuario</w:t>
@@ -6126,7 +6169,7 @@
         <w:spacing w:after="60" w:line="290" w:lineRule="auto"/>
       </w:pPr>
       <w:r>
-        <w:t>copertina con la scritta ANNUARIO DEL PN, il cherubino e l'anno accademico (per esempio "Edizione 2026-27"), calcolato da solo;</w:t>
+        <w:t>copertina con la scritta ANNUARIO DEL PN, il cherubino e l'anno accademico (per esempio "Edizione 2026-2027"), calcolato da solo;</w:t>
       </w:r>
     </w:p>
     <w:p>
@@ -6203,9 +6246,9 @@
       <w:pPr>
         <w:pStyle w:val="Titolo2"/>
       </w:pPr>
-      <w:bookmarkStart w:id="22" w:name="_Toc243217778"/>
-      <w:r>
-        <w:t>La copertina: logo e scritta "Edizione 2027-28"</w:t>
+      <w:bookmarkStart w:id="22" w:name="_Toc243223518"/>
+      <w:r>
+        <w:t>La copertina: logo e scritta "Edizione 2027-2028"</w:t>
       </w:r>
       <w:bookmarkEnd w:id="22"/>
     </w:p>
@@ -6241,10 +6284,10 @@
           <w:b/>
           <w:bCs/>
         </w:rPr>
-        <w:t>Anno dell'edizione</w:t>
-      </w:r>
-      <w:r>
-        <w:t xml:space="preserve"> impostato nel pannello, capitolo 5) ed è l'anno accademico corrispondente:</w:t>
+        <w:t>Edizione da raccogliere</w:t>
+      </w:r>
+      <w:r>
+        <w:t xml:space="preserve"> impostata nel pannello, capitolo 5) ed è l'anno accademico corrispondente:</w:t>
       </w:r>
     </w:p>
     <w:tbl>
@@ -6305,25 +6348,7 @@
                 <w:bCs/>
                 <w:color w:val="FFFFFF"/>
               </w:rPr>
-              <w:t>Anno dell'edizione (</w:t>
-            </w:r>
-            <w:r>
-              <w:rPr>
-                <w:rFonts w:ascii="Consolas" w:eastAsia="Consolas" w:hAnsi="Consolas" w:cs="Consolas"/>
-                <w:b/>
-                <w:bCs/>
-                <w:color w:val="002B49"/>
-                <w:shd w:val="clear" w:color="auto" w:fill="EEF3F7"/>
-              </w:rPr>
-              <w:t>year</w:t>
-            </w:r>
-            <w:r>
-              <w:rPr>
-                <w:b/>
-                <w:bCs/>
-                <w:color w:val="FFFFFF"/>
-              </w:rPr>
-              <w:t>)</w:t>
+              <w:t>Edizione scelta nel pannello</w:t>
             </w:r>
           </w:p>
         </w:tc>
@@ -6387,12 +6412,7 @@
               <w:spacing w:line="276" w:lineRule="auto"/>
             </w:pPr>
             <w:r>
-              <w:rPr>
-                <w:rFonts w:ascii="Consolas" w:eastAsia="Consolas" w:hAnsi="Consolas" w:cs="Consolas"/>
-                <w:color w:val="002B49"/>
-                <w:shd w:val="clear" w:color="auto" w:fill="EEF3F7"/>
-              </w:rPr>
-              <w:t>2027</w:t>
+              <w:t>Annuario 2026-2027</w:t>
             </w:r>
           </w:p>
         </w:tc>
@@ -6417,7 +6437,7 @@
               <w:spacing w:line="276" w:lineRule="auto"/>
             </w:pPr>
             <w:r>
-              <w:t>Edizione 2026-27</w:t>
+              <w:t>Edizione 2026-2027</w:t>
             </w:r>
           </w:p>
         </w:tc>
@@ -6450,12 +6470,7 @@
               <w:spacing w:line="276" w:lineRule="auto"/>
             </w:pPr>
             <w:r>
-              <w:rPr>
-                <w:rFonts w:ascii="Consolas" w:eastAsia="Consolas" w:hAnsi="Consolas" w:cs="Consolas"/>
-                <w:color w:val="002B49"/>
-                <w:shd w:val="clear" w:color="auto" w:fill="EEF3F7"/>
-              </w:rPr>
-              <w:t>2028</w:t>
+              <w:t>Annuario 2027-2028</w:t>
             </w:r>
           </w:p>
         </w:tc>
@@ -6480,7 +6495,7 @@
               <w:spacing w:line="276" w:lineRule="auto"/>
             </w:pPr>
             <w:r>
-              <w:t>Edizione 2027-28</w:t>
+              <w:t>Edizione 2027-2028</w:t>
             </w:r>
           </w:p>
         </w:tc>
@@ -6513,12 +6528,7 @@
               <w:spacing w:line="276" w:lineRule="auto"/>
             </w:pPr>
             <w:r>
-              <w:rPr>
-                <w:rFonts w:ascii="Consolas" w:eastAsia="Consolas" w:hAnsi="Consolas" w:cs="Consolas"/>
-                <w:color w:val="002B49"/>
-                <w:shd w:val="clear" w:color="auto" w:fill="EEF3F7"/>
-              </w:rPr>
-              <w:t>2029</w:t>
+              <w:t>Annuario 2028-2029</w:t>
             </w:r>
           </w:p>
         </w:tc>
@@ -6543,7 +6553,7 @@
               <w:spacing w:line="276" w:lineRule="auto"/>
             </w:pPr>
             <w:r>
-              <w:t>Edizione 2028-29</w:t>
+              <w:t>Edizione 2028-2029</w:t>
             </w:r>
           </w:p>
         </w:tc>
@@ -6576,12 +6586,7 @@
               <w:spacing w:line="276" w:lineRule="auto"/>
             </w:pPr>
             <w:r>
-              <w:rPr>
-                <w:rFonts w:ascii="Consolas" w:eastAsia="Consolas" w:hAnsi="Consolas" w:cs="Consolas"/>
-                <w:color w:val="002B49"/>
-                <w:shd w:val="clear" w:color="auto" w:fill="EEF3F7"/>
-              </w:rPr>
-              <w:t>2030</w:t>
+              <w:t>Annuario 2029-2030</w:t>
             </w:r>
           </w:p>
         </w:tc>
@@ -6606,7 +6611,7 @@
               <w:spacing w:line="276" w:lineRule="auto"/>
             </w:pPr>
             <w:r>
-              <w:t>Edizione 2029-30</w:t>
+              <w:t>Edizione 2029-2030</w:t>
             </w:r>
           </w:p>
         </w:tc>
@@ -6622,37 +6627,27 @@
         <w:spacing w:after="120" w:line="290" w:lineRule="auto"/>
       </w:pPr>
       <w:r>
-        <w:t>Quindi la copertina si aggiorna da sola con l'</w:t>
-      </w:r>
-      <w:r>
-        <w:rPr>
-          <w:b/>
-          <w:bCs/>
-        </w:rPr>
-        <w:t>Anno dell'edizione</w:t>
-      </w:r>
-      <w:r>
-        <w:t xml:space="preserve"> impostato nel pannello (capitolo 5). Per esempio, per avere </w:t>
-      </w:r>
-      <w:r>
-        <w:rPr>
-          <w:b/>
-          <w:bCs/>
-        </w:rPr>
-        <w:t>Edizione 2027-28</w:t>
-      </w:r>
-      <w:r>
-        <w:t xml:space="preserve"> l'anno dell'edizione deve essere </w:t>
-      </w:r>
-      <w:r>
-        <w:rPr>
-          <w:b/>
-          <w:bCs/>
-        </w:rPr>
-        <w:t>2028</w:t>
-      </w:r>
-      <w:r>
-        <w:t>.</w:t>
+        <w:t xml:space="preserve">Quindi la copertina si aggiorna da sola con l'edizione impostata nel pannello (capitolo 5): per avere </w:t>
+      </w:r>
+      <w:r>
+        <w:rPr>
+          <w:b/>
+          <w:bCs/>
+        </w:rPr>
+        <w:t>Edizione 2027-2028</w:t>
+      </w:r>
+      <w:r>
+        <w:t xml:space="preserve"> scegli </w:t>
+      </w:r>
+      <w:r>
+        <w:rPr>
+          <w:b/>
+          <w:bCs/>
+        </w:rPr>
+        <w:t>Annuario 2027-2028</w:t>
+      </w:r>
+      <w:r>
+        <w:t>. Lo stesso nome compare in tutto il sito (Home, Archivio e modulo di invio).</w:t>
       </w:r>
     </w:p>
     <w:p>
@@ -6743,6 +6738,7 @@
           <w:bCs/>
           <w:color w:val="0066B2"/>
         </w:rPr>
+        <w:lastRenderedPageBreak/>
         <w:t xml:space="preserve">Nota. </w:t>
       </w:r>
       <w:r>
@@ -6764,9 +6760,8 @@
       <w:pPr>
         <w:pStyle w:val="Titolo2"/>
       </w:pPr>
-      <w:bookmarkStart w:id="23" w:name="_Toc243217779"/>
-      <w:r>
-        <w:lastRenderedPageBreak/>
+      <w:bookmarkStart w:id="23" w:name="_Toc243223519"/>
+      <w:r>
         <w:t>Premessa</w:t>
       </w:r>
       <w:bookmarkEnd w:id="23"/>
@@ -6882,7 +6877,7 @@
       <w:pPr>
         <w:pStyle w:val="Titolo2"/>
       </w:pPr>
-      <w:bookmarkStart w:id="24" w:name="_Toc243217780"/>
+      <w:bookmarkStart w:id="24" w:name="_Toc243223520"/>
       <w:r>
         <w:t>Generare il PDF</w:t>
       </w:r>
@@ -6995,7 +6990,7 @@
       <w:pPr>
         <w:pStyle w:val="Titolo2"/>
       </w:pPr>
-      <w:bookmarkStart w:id="25" w:name="_Toc243217781"/>
+      <w:bookmarkStart w:id="25" w:name="_Toc243223521"/>
       <w:r>
         <w:t>Opzioni utili</w:t>
       </w:r>
@@ -7078,7 +7073,7 @@
         <w:t>--subtitle</w:t>
       </w:r>
       <w:r>
-        <w:t>: sostituisce la scritta automatica della copertina (di default l'anno accademico, per esempio "Edizione 2026-27").</w:t>
+        <w:t>: sostituisce la scritta automatica della copertina (di default l'anno accademico, per esempio "Edizione 2026-2027").</w:t>
       </w:r>
     </w:p>
     <w:p>
@@ -7107,7 +7102,7 @@
         <w:pStyle w:val="Titolo1"/>
         <w:pageBreakBefore/>
       </w:pPr>
-      <w:bookmarkStart w:id="26" w:name="_Toc243217782"/>
+      <w:bookmarkStart w:id="26" w:name="_Toc243223522"/>
       <w:r>
         <w:lastRenderedPageBreak/>
         <w:t>7. Pubblicare una nuova edizione nell'Archivio</w:t>
@@ -7187,7 +7182,7 @@
         <w:t>prima pagina</w:t>
       </w:r>
       <w:r>
-        <w:t xml:space="preserve"> (quella con il logo e la scritta "Edizione 2026-27"), salvalo in formato .jpg e copialo nella cartella </w:t>
+        <w:t xml:space="preserve"> (quella con il logo e la scritta "Edizione 2026-2027"), salvalo in formato .jpg e copialo nella cartella </w:t>
       </w:r>
       <w:r>
         <w:rPr>
@@ -7484,7 +7479,7 @@
         <w:pStyle w:val="Titolo1"/>
         <w:pageBreakBefore/>
       </w:pPr>
-      <w:bookmarkStart w:id="27" w:name="_Toc243217783"/>
+      <w:bookmarkStart w:id="27" w:name="_Toc243223523"/>
       <w:r>
         <w:lastRenderedPageBreak/>
         <w:t>8. Altre modifiche frequenti</w:t>
@@ -7495,7 +7490,7 @@
       <w:pPr>
         <w:pStyle w:val="Titolo2"/>
       </w:pPr>
-      <w:bookmarkStart w:id="28" w:name="_Toc243217784"/>
+      <w:bookmarkStart w:id="28" w:name="_Toc243223524"/>
       <w:r>
         <w:t>Cambiare la foto di sfondo della Home</w:t>
       </w:r>
@@ -7579,7 +7574,7 @@
       <w:pPr>
         <w:pStyle w:val="Titolo2"/>
       </w:pPr>
-      <w:bookmarkStart w:id="29" w:name="_Toc243217785"/>
+      <w:bookmarkStart w:id="29" w:name="_Toc243223525"/>
       <w:r>
         <w:t>Cambiare i testi del sito</w:t>
       </w:r>
@@ -8281,7 +8276,7 @@
         <w:pStyle w:val="Titolo1"/>
         <w:pageBreakBefore/>
       </w:pPr>
-      <w:bookmarkStart w:id="30" w:name="_Toc243217786"/>
+      <w:bookmarkStart w:id="30" w:name="_Toc243223526"/>
       <w:r>
         <w:lastRenderedPageBreak/>
         <w:t>9. Password, chiavi e variabili d'ambiente</w:t>
@@ -8967,7 +8962,7 @@
       <w:pPr>
         <w:pStyle w:val="Titolo2"/>
       </w:pPr>
-      <w:bookmarkStart w:id="31" w:name="_Toc243217787"/>
+      <w:bookmarkStart w:id="31" w:name="_Toc243223527"/>
       <w:r>
         <w:t>Recuperare il file .env.local su un nuovo computer</w:t>
       </w:r>
@@ -9186,7 +9181,7 @@
         <w:pStyle w:val="Titolo1"/>
         <w:pageBreakBefore/>
       </w:pPr>
-      <w:bookmarkStart w:id="32" w:name="_Toc243217788"/>
+      <w:bookmarkStart w:id="32" w:name="_Toc243223528"/>
       <w:r>
         <w:lastRenderedPageBreak/>
         <w:t>10. Privacy e regole</w:t>
@@ -9340,7 +9335,7 @@
         <w:pStyle w:val="Titolo1"/>
         <w:pageBreakBefore/>
       </w:pPr>
-      <w:bookmarkStart w:id="33" w:name="_Toc243217789"/>
+      <w:bookmarkStart w:id="33" w:name="_Toc243223529"/>
       <w:r>
         <w:lastRenderedPageBreak/>
         <w:t>11. Se qualcosa va storto</w:t>
@@ -10086,7 +10081,7 @@
         <w:pStyle w:val="Titolo1"/>
         <w:pageBreakBefore/>
       </w:pPr>
-      <w:bookmarkStart w:id="34" w:name="_Toc243217790"/>
+      <w:bookmarkStart w:id="34" w:name="_Toc243223530"/>
       <w:r>
         <w:lastRenderedPageBreak/>
         <w:t>12. Promemoria di ogni anno</w:t>
@@ -10118,7 +10113,7 @@
         <w:t>Prima di aprire gli invii</w:t>
       </w:r>
       <w:r>
-        <w:t>: nel pannello, riquadro Stato del sito, scegli Invio foto con anno e date dell'edizione e premi Salva (capitolo 5).</w:t>
+        <w:t>: nel pannello, riquadro Stato del sito, scegli Invio foto con edizione e date e premi Salva (capitolo 5).</w:t>
       </w:r>
     </w:p>
     <w:p>
@@ -10182,7 +10177,7 @@
         <w:t>content/premessa-ANNO.txt</w:t>
       </w:r>
       <w:r>
-        <w:t>. Genera il PDF (capitolo 6) e controlla che in copertina ci sia l'anno accademico giusto (per esempio "Edizione 2027-28" per l'edizione 2028).</w:t>
+        <w:t>. Genera il PDF (capitolo 6) e controlla che in copertina ci sia l'anno accademico giusto (per esempio "Edizione 2027-2028" per l'Annuario 2027-2028).</w:t>
       </w:r>
     </w:p>
     <w:p>
@@ -10340,10 +10335,67 @@
 <file path=word/numbering.xml><?xml version="1.0" encoding="utf-8"?>
 <w:numbering xmlns:wpc="http://schemas.microsoft.com/office/word/2010/wordprocessingCanvas" xmlns:cx="http://schemas.microsoft.com/office/drawing/2014/chartex" xmlns:cx1="http://schemas.microsoft.com/office/drawing/2015/9/8/chartex" xmlns:cx2="http://schemas.microsoft.com/office/drawing/2015/10/21/chartex" xmlns:cx3="http://schemas.microsoft.com/office/drawing/2016/5/9/chartex" xmlns:cx4="http://schemas.microsoft.com/office/drawing/2016/5/10/chartex" xmlns:cx5="http://schemas.microsoft.com/office/drawing/2016/5/11/chartex" xmlns:cx6="http://schemas.microsoft.com/office/drawing/2016/5/12/chartex" xmlns:cx7="http://schemas.microsoft.com/office/drawing/2016/5/13/chartex" xmlns:cx8="http://schemas.microsoft.com/office/drawing/2016/5/14/chartex" xmlns:mc="http://schemas.openxmlformats.org/markup-compatibility/2006" xmlns:aink="http://schemas.microsoft.com/office/drawing/2016/ink" xmlns:am3d="http://schemas.microsoft.com/office/drawing/2017/model3d" xmlns:o="urn:schemas-microsoft-com:office:office" xmlns:oel="http://schemas.microsoft.com/office/2019/extlst" xmlns:r="http://schemas.openxmlformats.org/officeDocument/2006/relationships" xmlns:m="http://schemas.openxmlformats.org/officeDocument/2006/math" xmlns:v="urn:schemas-microsoft-com:vml" xmlns:wp14="http://schemas.microsoft.com/office/word/2010/wordprocessingDrawing" xmlns:wp="http://schemas.openxmlformats.org/drawingml/2006/wordprocessingDrawing" xmlns:w10="urn:schemas-microsoft-com:office:word" xmlns:w="http://schemas.openxmlformats.org/wordprocessingml/2006/main" xmlns:w14="http://schemas.microsoft.com/office/word/2010/wordml" xmlns:w15="http://schemas.microsoft.com/office/word/2012/wordml" xmlns:w16cex="http://schemas.microsoft.com/office/word/2018/wordml/cex" xmlns:w16cid="http://schemas.microsoft.com/office/word/2016/wordml/cid" xmlns:w16="http://schemas.microsoft.com/office/word/2018/wordml" xmlns:w16sdtdh="http://schemas.microsoft.com/office/word/2020/wordml/sdtdatahash" xmlns:w16se="http://schemas.microsoft.com/office/word/2015/wordml/symex" xmlns:wpg="http://schemas.microsoft.com/office/word/2010/wordprocessingGroup" xmlns:wpi="http://schemas.microsoft.com/office/word/2010/wordprocessingInk" xmlns:wne="http://schemas.microsoft.com/office/word/2006/wordml" xmlns:wps="http://schemas.microsoft.com/office/word/2010/wordprocessingShape" mc:Ignorable="w14 w15 w16se w16cid w16 w16cex w16sdtdh wp14">
   <w:abstractNum w:abstractNumId="0" w15:restartNumberingAfterBreak="0">
-    <w:nsid w:val="0A534ADD"/>
+    <w:nsid w:val="04A9742E"/>
     <w:multiLevelType w:val="hybridMultilevel"/>
-    <w:tmpl w:val="9992F19C"/>
-    <w:lvl w:ilvl="0" w:tplc="8788CE1A">
+    <w:tmpl w:val="CE30B592"/>
+    <w:lvl w:ilvl="0" w:tplc="4F947588">
+      <w:start w:val="1"/>
+      <w:numFmt w:val="bullet"/>
+      <w:lvlText w:val="•"/>
+      <w:lvlJc w:val="left"/>
+      <w:pPr>
+        <w:ind w:left="540" w:hanging="300"/>
+      </w:pPr>
+      <w:rPr>
+        <w:color w:val="0066B2"/>
+      </w:rPr>
+    </w:lvl>
+    <w:lvl w:ilvl="1" w:tplc="45EAA174">
+      <w:numFmt w:val="decimal"/>
+      <w:lvlText w:val=""/>
+      <w:lvlJc w:val="left"/>
+    </w:lvl>
+    <w:lvl w:ilvl="2" w:tplc="7D0C9C12">
+      <w:numFmt w:val="decimal"/>
+      <w:lvlText w:val=""/>
+      <w:lvlJc w:val="left"/>
+    </w:lvl>
+    <w:lvl w:ilvl="3" w:tplc="D56C4D8E">
+      <w:numFmt w:val="decimal"/>
+      <w:lvlText w:val=""/>
+      <w:lvlJc w:val="left"/>
+    </w:lvl>
+    <w:lvl w:ilvl="4" w:tplc="C2DA9E3A">
+      <w:numFmt w:val="decimal"/>
+      <w:lvlText w:val=""/>
+      <w:lvlJc w:val="left"/>
+    </w:lvl>
+    <w:lvl w:ilvl="5" w:tplc="C088D74C">
+      <w:numFmt w:val="decimal"/>
+      <w:lvlText w:val=""/>
+      <w:lvlJc w:val="left"/>
+    </w:lvl>
+    <w:lvl w:ilvl="6" w:tplc="2CDEB476">
+      <w:numFmt w:val="decimal"/>
+      <w:lvlText w:val=""/>
+      <w:lvlJc w:val="left"/>
+    </w:lvl>
+    <w:lvl w:ilvl="7" w:tplc="98ECFFC8">
+      <w:numFmt w:val="decimal"/>
+      <w:lvlText w:val=""/>
+      <w:lvlJc w:val="left"/>
+    </w:lvl>
+    <w:lvl w:ilvl="8" w:tplc="56B83EDE">
+      <w:numFmt w:val="decimal"/>
+      <w:lvlText w:val=""/>
+      <w:lvlJc w:val="left"/>
+    </w:lvl>
+  </w:abstractNum>
+  <w:abstractNum w:abstractNumId="1" w15:restartNumberingAfterBreak="0">
+    <w:nsid w:val="25027C9E"/>
+    <w:multiLevelType w:val="hybridMultilevel"/>
+    <w:tmpl w:val="F6886AD4"/>
+    <w:lvl w:ilvl="0" w:tplc="BC1AE802">
       <w:start w:val="1"/>
       <w:numFmt w:val="decimal"/>
       <w:lvlText w:val="%1."/>
@@ -10357,109 +10409,52 @@
         <w:color w:val="002B49"/>
       </w:rPr>
     </w:lvl>
-    <w:lvl w:ilvl="1" w:tplc="798EBF5A">
+    <w:lvl w:ilvl="1" w:tplc="1774045C">
       <w:numFmt w:val="decimal"/>
       <w:lvlText w:val=""/>
       <w:lvlJc w:val="left"/>
     </w:lvl>
-    <w:lvl w:ilvl="2" w:tplc="6ED8BDC8">
+    <w:lvl w:ilvl="2" w:tplc="A69C491A">
       <w:numFmt w:val="decimal"/>
       <w:lvlText w:val=""/>
       <w:lvlJc w:val="left"/>
     </w:lvl>
-    <w:lvl w:ilvl="3" w:tplc="4650FF40">
+    <w:lvl w:ilvl="3" w:tplc="FC68D6CC">
       <w:numFmt w:val="decimal"/>
       <w:lvlText w:val=""/>
       <w:lvlJc w:val="left"/>
     </w:lvl>
-    <w:lvl w:ilvl="4" w:tplc="E82456C0">
+    <w:lvl w:ilvl="4" w:tplc="D34C9D90">
       <w:numFmt w:val="decimal"/>
       <w:lvlText w:val=""/>
       <w:lvlJc w:val="left"/>
     </w:lvl>
-    <w:lvl w:ilvl="5" w:tplc="6FB04930">
+    <w:lvl w:ilvl="5" w:tplc="29FE61E8">
       <w:numFmt w:val="decimal"/>
       <w:lvlText w:val=""/>
       <w:lvlJc w:val="left"/>
     </w:lvl>
-    <w:lvl w:ilvl="6" w:tplc="1BD04B84">
+    <w:lvl w:ilvl="6" w:tplc="867A5D3C">
       <w:numFmt w:val="decimal"/>
       <w:lvlText w:val=""/>
       <w:lvlJc w:val="left"/>
     </w:lvl>
-    <w:lvl w:ilvl="7" w:tplc="7770A760">
+    <w:lvl w:ilvl="7" w:tplc="1C986CE8">
       <w:numFmt w:val="decimal"/>
       <w:lvlText w:val=""/>
       <w:lvlJc w:val="left"/>
     </w:lvl>
-    <w:lvl w:ilvl="8" w:tplc="A686E450">
-      <w:numFmt w:val="decimal"/>
-      <w:lvlText w:val=""/>
-      <w:lvlJc w:val="left"/>
-    </w:lvl>
-  </w:abstractNum>
-  <w:abstractNum w:abstractNumId="1" w15:restartNumberingAfterBreak="0">
-    <w:nsid w:val="12A336E1"/>
-    <w:multiLevelType w:val="hybridMultilevel"/>
-    <w:tmpl w:val="23469AEC"/>
-    <w:lvl w:ilvl="0" w:tplc="F942EB3C">
-      <w:start w:val="1"/>
-      <w:numFmt w:val="bullet"/>
-      <w:lvlText w:val="•"/>
-      <w:lvlJc w:val="left"/>
-      <w:pPr>
-        <w:ind w:left="540" w:hanging="300"/>
-      </w:pPr>
-      <w:rPr>
-        <w:color w:val="0066B2"/>
-      </w:rPr>
-    </w:lvl>
-    <w:lvl w:ilvl="1" w:tplc="F7620182">
-      <w:numFmt w:val="decimal"/>
-      <w:lvlText w:val=""/>
-      <w:lvlJc w:val="left"/>
-    </w:lvl>
-    <w:lvl w:ilvl="2" w:tplc="55F4F026">
-      <w:numFmt w:val="decimal"/>
-      <w:lvlText w:val=""/>
-      <w:lvlJc w:val="left"/>
-    </w:lvl>
-    <w:lvl w:ilvl="3" w:tplc="7C52C55E">
-      <w:numFmt w:val="decimal"/>
-      <w:lvlText w:val=""/>
-      <w:lvlJc w:val="left"/>
-    </w:lvl>
-    <w:lvl w:ilvl="4" w:tplc="49CC9BB8">
-      <w:numFmt w:val="decimal"/>
-      <w:lvlText w:val=""/>
-      <w:lvlJc w:val="left"/>
-    </w:lvl>
-    <w:lvl w:ilvl="5" w:tplc="8A76679C">
-      <w:numFmt w:val="decimal"/>
-      <w:lvlText w:val=""/>
-      <w:lvlJc w:val="left"/>
-    </w:lvl>
-    <w:lvl w:ilvl="6" w:tplc="5BE0FEA8">
-      <w:numFmt w:val="decimal"/>
-      <w:lvlText w:val=""/>
-      <w:lvlJc w:val="left"/>
-    </w:lvl>
-    <w:lvl w:ilvl="7" w:tplc="3D30C92E">
-      <w:numFmt w:val="decimal"/>
-      <w:lvlText w:val=""/>
-      <w:lvlJc w:val="left"/>
-    </w:lvl>
-    <w:lvl w:ilvl="8" w:tplc="630C2A20">
+    <w:lvl w:ilvl="8" w:tplc="9E48D4BA">
       <w:numFmt w:val="decimal"/>
       <w:lvlText w:val=""/>
       <w:lvlJc w:val="left"/>
     </w:lvl>
   </w:abstractNum>
   <w:abstractNum w:abstractNumId="2" w15:restartNumberingAfterBreak="0">
-    <w:nsid w:val="27866BD5"/>
+    <w:nsid w:val="3AE2212D"/>
     <w:multiLevelType w:val="hybridMultilevel"/>
-    <w:tmpl w:val="39FAAB3C"/>
-    <w:lvl w:ilvl="0" w:tplc="A02AF866">
+    <w:tmpl w:val="E01AC248"/>
+    <w:lvl w:ilvl="0" w:tplc="D34499BA">
       <w:start w:val="1"/>
       <w:numFmt w:val="bullet"/>
       <w:lvlText w:val="●"/>
@@ -10468,7 +10463,7 @@
         <w:ind w:left="720" w:hanging="360"/>
       </w:pPr>
     </w:lvl>
-    <w:lvl w:ilvl="1" w:tplc="F2261EC8">
+    <w:lvl w:ilvl="1" w:tplc="E06AC1B2">
       <w:start w:val="1"/>
       <w:numFmt w:val="bullet"/>
       <w:lvlText w:val="○"/>
@@ -10477,7 +10472,7 @@
         <w:ind w:left="1440" w:hanging="360"/>
       </w:pPr>
     </w:lvl>
-    <w:lvl w:ilvl="2" w:tplc="421A2C80">
+    <w:lvl w:ilvl="2" w:tplc="53EAB3D0">
       <w:start w:val="1"/>
       <w:numFmt w:val="bullet"/>
       <w:lvlText w:val="■"/>
@@ -10486,7 +10481,7 @@
         <w:ind w:left="2160" w:hanging="360"/>
       </w:pPr>
     </w:lvl>
-    <w:lvl w:ilvl="3" w:tplc="80CC7196">
+    <w:lvl w:ilvl="3" w:tplc="D02A8A84">
       <w:start w:val="1"/>
       <w:numFmt w:val="bullet"/>
       <w:lvlText w:val="●"/>
@@ -10495,7 +10490,7 @@
         <w:ind w:left="2880" w:hanging="360"/>
       </w:pPr>
     </w:lvl>
-    <w:lvl w:ilvl="4" w:tplc="EC08773E">
+    <w:lvl w:ilvl="4" w:tplc="52063CD8">
       <w:start w:val="1"/>
       <w:numFmt w:val="bullet"/>
       <w:lvlText w:val="○"/>
@@ -10504,7 +10499,7 @@
         <w:ind w:left="3600" w:hanging="360"/>
       </w:pPr>
     </w:lvl>
-    <w:lvl w:ilvl="5" w:tplc="0442A362">
+    <w:lvl w:ilvl="5" w:tplc="963AD872">
       <w:start w:val="1"/>
       <w:numFmt w:val="bullet"/>
       <w:lvlText w:val="■"/>
@@ -10513,7 +10508,7 @@
         <w:ind w:left="4320" w:hanging="360"/>
       </w:pPr>
     </w:lvl>
-    <w:lvl w:ilvl="6" w:tplc="940034C8">
+    <w:lvl w:ilvl="6" w:tplc="1A80FAAA">
       <w:start w:val="1"/>
       <w:numFmt w:val="bullet"/>
       <w:lvlText w:val="●"/>
@@ -10522,7 +10517,7 @@
         <w:ind w:left="5040" w:hanging="360"/>
       </w:pPr>
     </w:lvl>
-    <w:lvl w:ilvl="7" w:tplc="6D9A127E">
+    <w:lvl w:ilvl="7" w:tplc="FA4CC876">
       <w:start w:val="1"/>
       <w:numFmt w:val="bullet"/>
       <w:lvlText w:val="●"/>
@@ -10531,7 +10526,7 @@
         <w:ind w:left="5760" w:hanging="360"/>
       </w:pPr>
     </w:lvl>
-    <w:lvl w:ilvl="8" w:tplc="B8A87EB2">
+    <w:lvl w:ilvl="8" w:tplc="1002849C">
       <w:start w:val="1"/>
       <w:numFmt w:val="bullet"/>
       <w:lvlText w:val="●"/>
@@ -10541,104 +10536,104 @@
       </w:pPr>
     </w:lvl>
   </w:abstractNum>
-  <w:num w:numId="1" w16cid:durableId="962423752">
+  <w:num w:numId="1" w16cid:durableId="109858707">
     <w:abstractNumId w:val="2"/>
     <w:lvlOverride w:ilvl="0">
       <w:startOverride w:val="1"/>
     </w:lvlOverride>
   </w:num>
-  <w:num w:numId="2" w16cid:durableId="929584321">
+  <w:num w:numId="2" w16cid:durableId="1467047726">
+    <w:abstractNumId w:val="1"/>
+    <w:lvlOverride w:ilvl="0">
+      <w:startOverride w:val="1"/>
+    </w:lvlOverride>
+  </w:num>
+  <w:num w:numId="3" w16cid:durableId="424764488">
     <w:abstractNumId w:val="0"/>
     <w:lvlOverride w:ilvl="0">
       <w:startOverride w:val="1"/>
     </w:lvlOverride>
   </w:num>
-  <w:num w:numId="3" w16cid:durableId="159077901">
+  <w:num w:numId="4" w16cid:durableId="2056542606">
     <w:abstractNumId w:val="1"/>
     <w:lvlOverride w:ilvl="0">
       <w:startOverride w:val="1"/>
     </w:lvlOverride>
   </w:num>
-  <w:num w:numId="4" w16cid:durableId="1549105666">
-    <w:abstractNumId w:val="0"/>
+  <w:num w:numId="5" w16cid:durableId="418792987">
+    <w:abstractNumId w:val="1"/>
     <w:lvlOverride w:ilvl="0">
       <w:startOverride w:val="1"/>
     </w:lvlOverride>
   </w:num>
-  <w:num w:numId="5" w16cid:durableId="1879780393">
-    <w:abstractNumId w:val="0"/>
+  <w:num w:numId="6" w16cid:durableId="1525940307">
+    <w:abstractNumId w:val="1"/>
     <w:lvlOverride w:ilvl="0">
       <w:startOverride w:val="1"/>
     </w:lvlOverride>
   </w:num>
-  <w:num w:numId="6" w16cid:durableId="465660923">
-    <w:abstractNumId w:val="0"/>
+  <w:num w:numId="7" w16cid:durableId="405881148">
+    <w:abstractNumId w:val="1"/>
     <w:lvlOverride w:ilvl="0">
       <w:startOverride w:val="1"/>
     </w:lvlOverride>
   </w:num>
-  <w:num w:numId="7" w16cid:durableId="2077850860">
-    <w:abstractNumId w:val="0"/>
+  <w:num w:numId="8" w16cid:durableId="223296261">
+    <w:abstractNumId w:val="1"/>
     <w:lvlOverride w:ilvl="0">
       <w:startOverride w:val="1"/>
     </w:lvlOverride>
   </w:num>
-  <w:num w:numId="8" w16cid:durableId="1659655020">
-    <w:abstractNumId w:val="0"/>
+  <w:num w:numId="9" w16cid:durableId="2042435482">
+    <w:abstractNumId w:val="1"/>
     <w:lvlOverride w:ilvl="0">
       <w:startOverride w:val="1"/>
     </w:lvlOverride>
   </w:num>
-  <w:num w:numId="9" w16cid:durableId="737047352">
-    <w:abstractNumId w:val="0"/>
+  <w:num w:numId="10" w16cid:durableId="880291306">
+    <w:abstractNumId w:val="1"/>
     <w:lvlOverride w:ilvl="0">
       <w:startOverride w:val="1"/>
     </w:lvlOverride>
   </w:num>
-  <w:num w:numId="10" w16cid:durableId="1027871637">
-    <w:abstractNumId w:val="0"/>
+  <w:num w:numId="11" w16cid:durableId="1646661642">
+    <w:abstractNumId w:val="1"/>
     <w:lvlOverride w:ilvl="0">
       <w:startOverride w:val="1"/>
     </w:lvlOverride>
   </w:num>
-  <w:num w:numId="11" w16cid:durableId="133303644">
-    <w:abstractNumId w:val="0"/>
+  <w:num w:numId="12" w16cid:durableId="757363389">
+    <w:abstractNumId w:val="1"/>
     <w:lvlOverride w:ilvl="0">
       <w:startOverride w:val="1"/>
     </w:lvlOverride>
   </w:num>
-  <w:num w:numId="12" w16cid:durableId="154222781">
-    <w:abstractNumId w:val="0"/>
+  <w:num w:numId="13" w16cid:durableId="1991061304">
+    <w:abstractNumId w:val="1"/>
     <w:lvlOverride w:ilvl="0">
       <w:startOverride w:val="1"/>
     </w:lvlOverride>
   </w:num>
-  <w:num w:numId="13" w16cid:durableId="1329168209">
-    <w:abstractNumId w:val="0"/>
+  <w:num w:numId="14" w16cid:durableId="1684242380">
+    <w:abstractNumId w:val="1"/>
     <w:lvlOverride w:ilvl="0">
       <w:startOverride w:val="1"/>
     </w:lvlOverride>
   </w:num>
-  <w:num w:numId="14" w16cid:durableId="2076200423">
-    <w:abstractNumId w:val="0"/>
+  <w:num w:numId="15" w16cid:durableId="546339738">
+    <w:abstractNumId w:val="1"/>
     <w:lvlOverride w:ilvl="0">
       <w:startOverride w:val="1"/>
     </w:lvlOverride>
   </w:num>
-  <w:num w:numId="15" w16cid:durableId="2048290656">
-    <w:abstractNumId w:val="0"/>
+  <w:num w:numId="16" w16cid:durableId="839198709">
+    <w:abstractNumId w:val="1"/>
     <w:lvlOverride w:ilvl="0">
       <w:startOverride w:val="1"/>
     </w:lvlOverride>
   </w:num>
-  <w:num w:numId="16" w16cid:durableId="1836263342">
-    <w:abstractNumId w:val="0"/>
-    <w:lvlOverride w:ilvl="0">
-      <w:startOverride w:val="1"/>
-    </w:lvlOverride>
-  </w:num>
-  <w:num w:numId="17" w16cid:durableId="1983926891">
-    <w:abstractNumId w:val="0"/>
+  <w:num w:numId="17" w16cid:durableId="1718502846">
+    <w:abstractNumId w:val="1"/>
     <w:lvlOverride w:ilvl="0">
       <w:startOverride w:val="1"/>
     </w:lvlOverride>
@@ -11260,7 +11255,7 @@
     <w:autoRedefine/>
     <w:uiPriority w:val="39"/>
     <w:unhideWhenUsed/>
-    <w:rsid w:val="00963625"/>
+    <w:rsid w:val="00C20CBA"/>
     <w:pPr>
       <w:spacing w:after="100"/>
     </w:pPr>
@@ -11272,7 +11267,7 @@
     <w:autoRedefine/>
     <w:uiPriority w:val="39"/>
     <w:unhideWhenUsed/>
-    <w:rsid w:val="00963625"/>
+    <w:rsid w:val="00C20CBA"/>
     <w:pPr>
       <w:spacing w:after="100"/>
       <w:ind w:left="220"/>

</xml_diff>